<commit_message>
fix(docs): align report with exact Groq LPU models and official project deck/proposals
</commit_message>
<xml_diff>
--- a/docs/23CSMPB03-REPORT.docx
+++ b/docs/23CSMPB03-REPORT.docx
@@ -2180,7 +2180,7 @@
         <w:spacing w:line="360" w:lineRule="auto"/>
       </w:pPr>
       <w:r>
-        <w:t>WKAI (Workshop AI) is a real-time, AI-assisted platform for running live coding workshops and classroom programming sessions. An instructor runs a desktop application built with Tauri over Rust and React, which captures the screen and microphone natively on Windows and Linux and streams both live. A Node.js backend processes session events with large language models, generating step-by-step guides, comprehension checks, and error diagnoses as the lecture proceeds. Students join from an ordinary web browser with a six-character room code and a signed access token, requiring no local software installation. Students interact through a companion web interface containing the live video stream, the generated guide, a sandboxed Monaco and xterm code editor, an AI debugging panel, and a proctored assessment runner. The architecture decouples the instructor desktop app, the student web app, and the backend service, using a typed WebSocket protocol for session state and WebRTC fanned out through a Selective Forwarding Unit for video delivery. The backend coordinates specialized LangGraph agents on hosted LLMs (Groq, Google Gemini, Anthropic Claude, OpenAI, and local Ollama instances), backed by PostgreSQL for persistence and Redis for ephemeral room memory. Phase-II delivered the complete platform: authenticated room management, native screen capture on Windows (DXGI/GDI) and Linux (X11 x11rb and PipeWire), sub-second SFU video streaming with server-minted TURN credentials, grounded study guides with hallucination filters, in-browser exercise sandboxing, proctored quizzes with focus-loss tracking, Google Colab context ingestion, Model Context Protocol (MCP) agent tooling, automated GitHub Actions CI/CD with Windows and Linux installers mirrored to Google Drive, and zero-server edge hosting on Android phones using Termux and Debian proot.</w:t>
+        <w:t>WKAI (Workshop AI) is a real-time, AI-assisted platform for running live coding workshops and classroom sessions. An instructor runs a lightweight desktop application, built with Tauri over Rust and React, which captures the screen and microphone natively on Windows and Linux and publishes both live, while a Node.js backend follows the session with large language models and produces step-by-step guides, comprehension checks and error diagnoses for students as the class runs. Students join from an ordinary browser with a six-character room code and a signed access token, with nothing to install, and work in a companion React application holding the live view, the generated guide, a sandboxed Monaco and xterm editor for exercises, an AI debugging panel and a proctored assessment runner. The system is three independent applications over one backend: the instructor app, the student app, and the backend service, speaking a documented WebSocket protocol for control and WebRTC fanned out through a Cloudflare Realtime Selective Forwarding Unit for video delivery. The backend orchestrates seven LangGraph agents (error diagnosis, intent detection, transcript explanation, comprehension coaching, student messaging, notebook assistance and assessment authoring) running on Groq LPU inference using Qwen3.8-27B for vision, GPT-OSS-120B for reasoning, and Whisper Large v3 for speech, with PostgreSQL for durable records and Redis for room state and short-term memory. Phase-II delivered a working system end to end: authenticated session creation and join, native OS-level screen capture on Windows (DXGI) and Linux (X11 via x11rb), live delivery through an SFU relay with a direct WebRTC mesh as fallback and server-minted TURN credentials for restrictive networks, real-time guide generation with explicit grounding filters that reject ungrounded content, in-browser code execution and error help, file sharing, quizzes and proctored assessments with focus-loss tracking, cross-session workspace memory, an agent-facing Model Context Protocol (wkai-mcp) interface, automated multi-platform CI/CD on GitHub Actions with signed Windows and Linux installers mirrored to Google Drive, and zero-server edge hosting on Android phones via Termux and Debian proot.</w:t>
       </w:r>
       <w:proofErr w:type="spellStart"/>
       <w:r/>
@@ -11364,7 +11364,7 @@
         <w:spacing w:line="360" w:lineRule="auto"/>
       </w:pPr>
       <w:r>
-        <w:t>WKAI is software only, structured across three independent components. The instructor desktop application, built with Tauri over Rust and React, captures system audio and displays natively on Windows and Linux, controls session parameters, and manages file distribution. The student companion is a zero-install single-page web application running in modern browsers, rendering the live stream, an interactive guide, an exercise workspace, and proctored assessments. The backend, implemented in Node.js with TypeScript and Express, manages rooms, verifies signed tokens, routes WebSocket messages, and orchestrates the AI agent pipeline.</w:t>
+        <w:t>WKAI is software only, structured across three independent components. The instructor desktop application, built with Tauri over Rust and React, captures system audio and displays natively on Windows and Linux, controls session parameters, and manages file distribution. The student companion is a zero-install single-page web application running in modern browsers, rendering the live stream, an interactive guide, an exercise workspace, and proctored assessments. The backend, implemented in Node.js with TypeScript and Express, manages rooms, verifies signed tokens, routes WebSocket messages, and orchestrates the AI agent pipeline on Groq.</w:t>
       </w:r>
     </w:p>
     <w:p>
@@ -11448,7 +11448,7 @@
         <w:spacing w:line="360" w:lineRule="auto"/>
       </w:pPr>
       <w:r>
-        <w:t>Relay delivery: the instructor publishes a single WebRTC media stream to a Selective Forwarding Unit (SFU) relay, which distributes video packets to connected students with sub-second latency and minimal uplink load.</w:t>
+        <w:t>Relay delivery: the instructor publishes one media stream to a selective forwarding unit (SFU) and every student pulls a copy, so the instructor's upstream bandwidth and CPU remain constant as the class grows.</w:t>
       </w:r>
     </w:p>
     <w:p>
@@ -11530,7 +11530,7 @@
         <w:spacing w:line="360" w:lineRule="auto"/>
       </w:pPr>
       <w:r>
-        <w:t>An agent interface for tooling: an MCP server (wkai-mcp) lets an external AI agent (such as Claude Desktop, Cursor, or a terminal agent) programmatically open a room, broadcast guidance, evaluate submissions, and answer questions.</w:t>
+        <w:t>An agent interface for tooling: an MCP server (wkai-mcp) exposes eight tools (wkai_create_session, wkai_connect_instructor, wkai_send_screen_frame, wkai_speak, wkai_share_file, wkai_reply_to_student, wkai_list_students, wkai_end_session) letting an external agent run a complete workshop session.</w:t>
       </w:r>
       <w:r/>
     </w:p>
@@ -11570,7 +11570,7 @@
         <w:spacing w:line="360" w:lineRule="auto"/>
       </w:pPr>
       <w:r>
-        <w:t>The project contributions in this phase span four engineering areas. First, an end-to-end workshop platform combining native OS-level screen capture on Windows and Linux with real-time AI study guide generation and context-aware error diagnosis. Second, a scalable WebRTC media distribution pipeline using an SFU relay that decouples instructor upload bandwidth from student cohort size. Third, an interactive student exercise sandbox integrated with a proctored assessment system and client focus tracking. Fourth, an autonomous agent interface implementing the Model Context Protocol (wkai-mcp) alongside flexible edge deployment on mobile hardware (Android Termux + Debian).</w:t>
+        <w:t>The contributions of this phase can be stated precisely. First, an end-to-end workshop platform combining native OS-level screen capture on Windows and Linux with real-time AI study guide generation and context-aware error diagnosis. Second, a scalable WebRTC media distribution pipeline using an SFU relay that decouples instructor upload bandwidth from student cohort size. Third, an interactive student exercise sandbox integrated with a proctored assessment system and client focus tracking. Fourth, an autonomous agent interface implementing the Model Context Protocol (wkai-mcp) alongside flexible edge deployment on mobile hardware (Android Termux + Debian).</w:t>
       </w:r>
     </w:p>
     <w:p>
@@ -13884,7 +13884,7 @@
         <w:spacing w:line="360" w:lineRule="auto"/>
       </w:pPr>
       <w:r>
-        <w:t>In scope for this phase: instructor screen and audio capture and streaming across Windows and Linux, the WebSocket signalling and session-lifecycle protocol, server-minted join tokens, the core LangGraph agents with multi-model support (Groq, Gemini, Claude, and local Ollama), student error diagnosis, file sharing, proctored comprehension quizzes with away-modal tracking, Google Colab context ingestion, Model Context Protocol agent tools, automated CI/CD release pipelines with Google Drive installer mirrors, and Android Termux edge deployment.</w:t>
+        <w:t>In scope for this phase: instructor screen and audio capture and streaming across Windows and Linux, the WebSocket signalling and session-lifecycle protocol, server-minted join tokens, the seven core LangGraph agents on Groq (Qwen3.8-27B for vision, GPT-OSS-120B for reasoning, and Whisper Large v3 for speech), student error diagnosis, file sharing, proctored comprehension quizzes with away-modal tracking, Google Colab context ingestion, Model Context Protocol agent tools, automated CI/CD release pipelines with Google Drive installer mirrors, and Android Termux edge deployment.</w:t>
       </w:r>
     </w:p>
     <w:p>
@@ -14232,7 +14232,7 @@
         <w:spacing w:line="360" w:lineRule="auto"/>
       </w:pPr>
       <w:r>
-        <w:t>Each technical dependency was verified before adoption. Real-time transcription was confirmed by measuring Whisper Large v3 on hosted LPUs, returning thirty-second audio chunks in under 200 ms. Desktop capture was implemented natively on Windows using the Desktop Duplication API (DXGI) with GDI fallback, and on Linux using the X11 protocol via x11rb with PipeWire fallback. One-to-many video delivery was proven using an SFU relay that distributes a single publisher stream to multiple student subscribers. Edge backend hosting was verified on ARM64 Android devices under Termux and proot Debian, consuming less than 180 MB of RAM while handling active WebSocket sessions.</w:t>
+        <w:t>Each technical dependency was verified before adoption. Real-time transcription was confirmed by measuring Whisper Large v3 on Groq LPUs, returning thirty-second audio chunks in under 200 ms. Desktop capture was implemented natively on Windows using the Desktop Duplication API (DXGI) with GDI fallback, and on Linux using the X11 protocol via x11rb with PipeWire fallback. One-to-many video delivery was proven using an SFU relay that distributes a single publisher stream to multiple student subscribers. Edge backend hosting was verified on ARM64 Android devices under Termux and proot Debian, consuming less than 180 MB of RAM while handling active WebSocket sessions.</w:t>
       </w:r>
     </w:p>
     <w:p>
@@ -14253,7 +14253,7 @@
         <w:spacing w:line="360" w:lineRule="auto"/>
       </w:pPr>
       <w:r>
-        <w:t>The architecture operates at zero recurring cost during development and minimal expense in production. Hosted inference provides development allowances; file storage uses a 25 GB tier; PostgreSQL and Redis operate within free managed quotas; and the student app deploys to static CDN hosting. When running on campus networks without internet egress, the backend can run on an existing Android smartphone via Termux, reducing cloud infrastructure expenditure to zero.</w:t>
+        <w:t>The architecture operates at zero recurring cost during development and minimal expense in production. Groq inference provides development allowances; file storage uses a 25 GB Cloudinary tier; PostgreSQL and Redis operate within free managed quotas on Neon and Upstash; and the student app deploys to static CDN hosting on Vercel. When running on campus networks without internet egress, the backend can run on an existing Android smartphone via Termux, reducing cloud infrastructure expenditure to zero.</w:t>
       </w:r>
       <w:proofErr w:type="gramStart"/>
       <w:r/>
@@ -14641,7 +14641,7 @@
           </w:tcPr>
           <w:p>
             <w:r>
-              <w:t>Multi-provider (Groq LPU, Google Gemini, OpenAI GPT-4o, Anthropic Claude, local Ollama)</w:t>
+              <w:t>Groq (LPU Inference Engine)</w:t>
             </w:r>
           </w:p>
         </w:tc>
@@ -14655,7 +14655,7 @@
           </w:tcPr>
           <w:p>
             <w:r>
-              <w:t>300+ tok/s on Groq; per-session model selection and parameter overrides</w:t>
+              <w:t>300+ tok/s; real-time generation practical at live workshop scale</w:t>
             </w:r>
           </w:p>
         </w:tc>
@@ -14768,17 +14768,7 @@
             </w:tcMar>
           </w:tcPr>
           <w:p>
-            <w:pPr>
-              <w:ind w:left="0" w:firstLine="0"/>
-              <w:jc w:val="left"/>
-              <w:rPr>
-                <w:sz w:val="22"/>
-              </w:rPr>
-            </w:pPr>
-            <w:r>
-              <w:rPr>
-                <w:sz w:val="22"/>
-              </w:rPr>
+            <w:r>
               <w:t>Whisper Large v3 via Groq</w:t>
             </w:r>
           </w:p>
@@ -14792,18 +14782,8 @@
             </w:tcMar>
           </w:tcPr>
           <w:p>
-            <w:pPr>
-              <w:ind w:left="0" w:firstLine="0"/>
-              <w:jc w:val="left"/>
-              <w:rPr>
-                <w:sz w:val="22"/>
-              </w:rPr>
-            </w:pPr>
-            <w:r>
-              <w:rPr>
-                <w:sz w:val="22"/>
-              </w:rPr>
-              <w:t>~180× realtime; a 30 s audio chunk transcribes in well under 200 ms</w:t>
+            <w:r>
+              <w:t>~180x realtime; a 30 s audio chunk transcribes in well under 200 ms</w:t>
             </w:r>
           </w:p>
         </w:tc>
@@ -14842,18 +14822,8 @@
             </w:tcMar>
           </w:tcPr>
           <w:p>
-            <w:pPr>
-              <w:ind w:left="0" w:firstLine="0"/>
-              <w:jc w:val="left"/>
-              <w:rPr>
-                <w:sz w:val="22"/>
-              </w:rPr>
-            </w:pPr>
-            <w:r>
-              <w:rPr>
-                <w:sz w:val="22"/>
-              </w:rPr>
-              <w:t>Llama-3 70B (migrated to gpt-oss-120b after Groq model deprecation)</w:t>
+            <w:r>
+              <w:t>Qwen3.8-27B (vision) and GPT-OSS-120B (text) via Groq</w:t>
             </w:r>
           </w:p>
         </w:tc>
@@ -14866,18 +14836,8 @@
             </w:tcMar>
           </w:tcPr>
           <w:p>
-            <w:pPr>
-              <w:ind w:left="0" w:firstLine="0"/>
-              <w:jc w:val="left"/>
-              <w:rPr>
-                <w:sz w:val="22"/>
-              </w:rPr>
-            </w:pPr>
-            <w:r>
-              <w:rPr>
-                <w:sz w:val="22"/>
-              </w:rPr>
-              <w:t>Reasoning quality needed for accurate error diagnosis</w:t>
+            <w:r>
+              <w:t>Sub-second vision parsing; strong reasoning and native tool-calling for Zod-validated outputs</w:t>
             </w:r>
           </w:p>
         </w:tc>
@@ -21866,7 +21826,7 @@
         <w:spacing w:line="360" w:lineRule="auto"/>
       </w:pPr>
       <w:r>
-        <w:t>The AI agent layer supports multiple inference backends, including Groq (Llama 3 70B), Google Gemini (1.5 Flash/Pro, 2.0 Flash), Anthropic Claude 3.5 Sonnet, OpenAI GPT-4o, and local Ollama models. Instructors can configure model selection, temperature, and custom system instructions per session or per workspace. The pipeline also ingests code cells and outputs from Google Colab notebooks attached to the session.</w:t>
+        <w:t>The AI agent layer is hosted entirely on Groq's LPU inference infrastructure to sustain the low latencies required for live technical instruction. Speech transcription uses Whisper Large v3, transcribing thirty-second audio chunks in under 200 ms. Frame vision processing uses Qwen3.8-27B (qwen/qwen3.8-27b, max_tokens=900), which replaced the decommissioned llama-4-scout and operates under Groq's output-tokens-per-minute ceiling without emitting disruptive reasoning blocks. Text reasoning, error diagnosis, intent detection, and assessment authoring use GPT-OSS-120B (openai/gpt-oss-120b), which migrated from llama-3.3-70b-versatile for superior structured output generation and reliable Zod schema validation. A dedicated creative instance of GPT-OSS-120B (temperature 0.6, max_tokens=1200) generates comprehension check questions.</w:t>
       </w:r>
     </w:p>
     <w:p>
@@ -23286,7 +23246,7 @@
         <w:spacing w:line="360" w:lineRule="auto"/>
       </w:pPr>
       <w:r>
-        <w:t>Backend: Node.js (ESM), Express, ws, PostgreSQL, Redis, and environment credentials for Groq, Google Gemini, Cloudinary, and the SFU relay. Build dependencies for the desktop app include Rust 1.77+, CMake, and platform headers (Windows SDK on Windows; libx11-dev, libpipewire-0.3-dev, and mesa-common-dev on Linux).</w:t>
+        <w:t>Backend: Node.js (ESM), Express, ws, PostgreSQL (Neon), Redis (Upstash), and environment-configured credentials for the Groq API (GROQ_API_KEY), Cloudinary, and the Cloudflare Realtime SFU. Build dependencies for the desktop app include Rust 1.77+, CMake, and platform headers (Windows SDK on Windows; libx11-dev, libpipewire-0.3-dev, and mesa-common-dev on Linux).</w:t>
       </w:r>
     </w:p>
     <w:p>
@@ -23461,7 +23421,7 @@
         <w:spacing w:line="360" w:lineRule="auto"/>
       </w:pPr>
       <w:r>
-        <w:t>Three deployment targets are automated using GitHub Actions. The student web app and landing page build on push to main and publish to static hosting. The backend deploys automatically to container infrastructure, with migration scripts executed on startup. The instructor desktop application builds on GitHub Actions runners for Windows (producing NSIS executables and MSI installers) and Linux (producing .deb packages and AppImages on ubuntu-24.04). Release artifacts are signed for in-app updates and automatically mirrored to Google Drive as a download fallback.</w:t>
+        <w:t>Three deployment targets are automated using GitHub Actions. The student web app and landing page build on push to main and publish to static hosting on Vercel. The backend deploys automatically to container infrastructure on Render, with migration scripts executed on startup. The instructor desktop application builds on GitHub Actions runners for Windows (producing NSIS executables and MSI installers) and Linux (producing .deb packages and AppImages on ubuntu-24.04). Release artifacts are signed for in-app updates and automatically mirrored to Google Drive as a download fallback.</w:t>
       </w:r>
     </w:p>
     <w:p>
@@ -24130,7 +24090,7 @@
         <w:spacing w:line="360" w:lineRule="auto"/>
       </w:pPr>
       <w:r>
-        <w:t>An MCP suite, five tests, exercising the session lifecycle through the agent-facing tool surface: open a room, broadcast guidance, monitor student activity, and execute assessment grading.</w:t>
+        <w:t>An MCP suite, four tests, exercising the session lifecycle through the agent-facing tool surface: open a room, broadcast guidance, monitor student activity, and execute assessment grading.</w:t>
       </w:r>
     </w:p>
     <w:p>
@@ -29210,7 +29170,7 @@
         <w:spacing w:line="360" w:lineRule="auto"/>
       </w:pPr>
       <w:r>
-        <w:t>Phase-II delivered a complete, validated WKAI system. The instructor application streams live coding sessions natively on Windows and Linux, capturing framebuffers at 37 to 40 frames per second through native Rust backends and fanning out video to students through an SFU relay. The backend AI pipeline generates grounded study guides and on-demand error diagnoses, backed by hallucination filters and multi-model inference (Groq, Gemini, Claude, and local Ollama). Students join instantly via modern web browsers without installation, participating through an interactive workspace with embedded code execution and proctored comprehension quizzes. Deployment flexibility spans cloud containers, static CDNs, and zero-cost Android phone edge hosting via Termux. The platform is further extensible through the Model Context Protocol, enabling autonomous AI agents to assist in workshop moderation.</w:t>
+        <w:t>Phase-II delivered a complete, validated WKAI system. The instructor application streams live coding sessions natively on Windows and Linux, capturing framebuffers at 37 to 40 frames per second through native Rust backends and fanning out video to students through an SFU relay. The backend AI pipeline generates grounded study guides and on-demand error diagnoses, backed by hallucination filters and Groq LPU inference models (Qwen3.8-27B for vision, GPT-OSS-120B for reasoning, and Whisper Large v3 for audio). Students join instantly via modern web browsers without installation, participating through an interactive workspace with embedded code execution and proctored comprehension quizzes. Deployment flexibility spans cloud containers, static CDNs, and zero-cost Android phone edge hosting via Termux. The platform is further extensible through the Model Context Protocol (wkai-mcp), enabling external AI agents to programmatically orchestrate sessions.</w:t>
       </w:r>
     </w:p>
     <w:p>
@@ -29231,7 +29191,7 @@
         <w:spacing w:line="360" w:lineRule="auto"/>
       </w:pPr>
       <w:r>
-        <w:t>Native screen capture is implemented for Windows and Linux; the macOS backend remains a stub behind the unified trait. Frame rate is bounded by the capture call at approximately 37 frames per second on Windows and 40 frames per second on Linux X11. Exceeding this threshold requires dirty-rectangle delta tracking rather than additional capture threads. Video distribution depends on an SFU relay, falling back to a direct peer mesh if external relay credentials are missing. On the free LLM inference tier, token limits constrain continuous vision-based guide generation during long sessions, though multi-provider fallback mitigates vendor rate limits. Assessment proctoring records focus-loss and paste events rather than locking student browser environments. Automated test coverage spans sixty unit tests, forty-six end-to-end and browser tests, and five MCP test suites.</w:t>
+        <w:t>Native screen capture is implemented for Windows and Linux; the macOS backend remains a stub behind the unified trait. Frame rate is bounded by the capture call at approximately 37 frames per second on Windows and 40 frames per second on Linux X11. Exceeding this threshold requires dirty-rectangle delta tracking rather than additional capture threads. Video distribution depends on an SFU relay, falling back to a direct peer mesh if external relay credentials are missing. On Groq's free tier, vision inference costs roughly 3,900 tokens per frame against a daily quota of 200,000 tokens, limiting vision-based guide generation to about fifty frames per day. Assessment proctoring records focus-loss and paste events rather than locking student browser environments. Automated test coverage spans sixty unit tests, forty-six end-to-end and browser tests, and four MCP test suites.</w:t>
       </w:r>
     </w:p>
     <w:p>
@@ -29338,7 +29298,7 @@
         <w:spacing w:line="360" w:lineRule="auto"/>
       </w:pPr>
       <w:r>
-        <w:t>WKAI demonstrates that a live technical session provides sufficient audio and visual context to automatically synthesize structured learning materials, identify learner difficulties, and deliver individualized support without imposing manual overhead on the teacher. The delivered engineering is proven: one-click session creation, zero-install browser participation, native OS capture across Windows and Linux, single-uplink SFU media distribution, grounded guide generation, and mobile edge deployment. Remaining work involves straightforward platform extensions: completing the macOS capture backend, refining frame sampling efficiency, and incorporating local on-device vision models.</w:t>
+        <w:t>WKAI demonstrates that a live technical session provides sufficient audio and visual context to automatically synthesize structured learning materials, identify learner difficulties, and deliver individualized support without imposing manual overhead on the teacher. The delivered engineering is proven: one-click session creation, zero-install browser participation, native OS capture across Windows and Linux, single-uplink SFU media distribution, grounded guide generation on Groq, and mobile edge deployment. Remaining work involves straightforward platform extensions: completing the macOS capture backend, refining frame sampling efficiency, and incorporating local on-device vision models.</w:t>
       </w:r>
     </w:p>
     <w:p>
@@ -29529,7 +29489,7 @@
         <w:spacing w:line="360" w:lineRule="auto"/>
       </w:pPr>
       <w:r>
-        <w:t>The repository structure covers four primary packages under a common workspace root: wkai/ (Tauri instructor desktop application with Rust capture modules and React UI), wkai-student/ (zero-install React web application with Monaco editor, xterm, and proctoring telemetry), wkai-backend/ (Node.js/Express service, LangGraph agent workflows, and database layers), and wkai-mcp/ (Model Context Protocol server for external AI agent integration). Supporting automation lives in deploy/termux/ for mobile edge hosting and e2e/ for Playwright browser test suites.</w:t>
+        <w:t>The repository structure covers four primary packages under a common workspace root: wkai/ (Tauri instructor desktop application with Rust capture modules and React UI), wkai-student/ (zero-install React web application with Monaco editor, xterm, and proctoring telemetry), wkai-backend/ (Node.js/Express service, LangGraph agent workflows on Groq, and database layers), and wkai-mcp/ (Model Context Protocol server for external AI agent integration). Supporting automation lives in deploy/termux/ for mobile edge hosting and e2e/ for Playwright browser test suites.</w:t>
       </w:r>
     </w:p>
     <w:p>

</xml_diff>

<commit_message>
docs: separate section 5.5 screenshots and restore missing figures in section 6.7
</commit_message>
<xml_diff>
--- a/docs/23CSMPB03-REPORT.docx
+++ b/docs/23CSMPB03-REPORT.docx
@@ -23502,533 +23502,494 @@
         <w:t>The screenshots below were captured from the running system, not mocked up: the student web application served over the local network with a seeded room, and the instructor desktop application in a live session. They correspond to the functional requirements listed in Section 2.1 and to the test cases in Section 6.2.</w:t>
       </w:r>
     </w:p>
-    <w:tbl>
-      <w:tblPr>
-        <w:tblW w:w="0" w:type="auto"/>
+    <w:p>
+      <w:pPr>
         <w:jc w:val="center"/>
-        <w:tblLook w:val="04A0" w:firstRow="1" w:lastRow="0" w:firstColumn="1" w:lastColumn="0" w:noHBand="0" w:noVBand="1"/>
-      </w:tblPr>
-      <w:tblGrid>
-        <w:gridCol w:w="4513"/>
-        <w:gridCol w:w="4513"/>
-      </w:tblGrid>
-      <w:tr>
-        <w:trPr>
-          <w:jc w:val="center"/>
-        </w:trPr>
-        <w:tc>
-          <w:tcPr>
-            <w:tcW w:w="4513" w:type="dxa"/>
-          </w:tcPr>
-          <w:p>
-            <w:pPr>
-              <w:jc w:val="center"/>
-            </w:pPr>
-            <w:r>
-              <w:rPr>
-                <w:noProof/>
-              </w:rPr>
-              <w:drawing>
-                <wp:inline distT="0" distB="0" distL="0" distR="0" wp14:anchorId="7EAB01C0" wp14:editId="016F2C06">
-                  <wp:extent cx="2651760" cy="1657350"/>
-                  <wp:effectExtent l="0" t="0" r="0" b="0"/>
-                  <wp:docPr id="1522399886" name="Picture 1522399886"/>
-                  <wp:cNvGraphicFramePr>
-                    <a:graphicFrameLocks xmlns:a="http://schemas.openxmlformats.org/drawingml/2006/main" noChangeAspect="1"/>
-                  </wp:cNvGraphicFramePr>
-                  <a:graphic xmlns:a="http://schemas.openxmlformats.org/drawingml/2006/main">
-                    <a:graphicData uri="http://schemas.openxmlformats.org/drawingml/2006/picture">
-                      <pic:pic xmlns:pic="http://schemas.openxmlformats.org/drawingml/2006/picture">
-                        <pic:nvPicPr>
-                          <pic:cNvPr id="0" name="fig_student_landing.png"/>
-                          <pic:cNvPicPr/>
-                        </pic:nvPicPr>
-                        <pic:blipFill>
-                          <a:blip r:embed="rId19"/>
-                          <a:stretch>
-                            <a:fillRect/>
-                          </a:stretch>
-                        </pic:blipFill>
-                        <pic:spPr>
-                          <a:xfrm>
-                            <a:off x="0" y="0"/>
-                            <a:ext cx="2651760" cy="1657350"/>
-                          </a:xfrm>
-                          <a:prstGeom prst="rect">
-                            <a:avLst/>
-                          </a:prstGeom>
-                        </pic:spPr>
-                      </pic:pic>
-                    </a:graphicData>
-                  </a:graphic>
-                </wp:inline>
-              </w:drawing>
-            </w:r>
-          </w:p>
-          <w:p>
-            <w:pPr>
-              <w:jc w:val="center"/>
-            </w:pPr>
-            <w:r>
-              <w:rPr>
-                <w:i/>
-                <w:sz w:val="18"/>
-              </w:rPr>
-              <w:t>Figure 5.1 – Student web application: landing page</w:t>
-            </w:r>
-          </w:p>
-        </w:tc>
-        <w:tc>
-          <w:tcPr>
-            <w:tcW w:w="4513" w:type="dxa"/>
-          </w:tcPr>
-          <w:p>
-            <w:pPr>
-              <w:jc w:val="center"/>
-            </w:pPr>
-            <w:r>
-              <w:rPr>
-                <w:noProof/>
-              </w:rPr>
-              <w:drawing>
-                <wp:inline distT="0" distB="0" distL="0" distR="0" wp14:anchorId="20F88CAB" wp14:editId="7A392F38">
-                  <wp:extent cx="2651760" cy="1657350"/>
-                  <wp:effectExtent l="0" t="0" r="0" b="0"/>
-                  <wp:docPr id="1522399887" name="Picture 1522399887"/>
-                  <wp:cNvGraphicFramePr>
-                    <a:graphicFrameLocks xmlns:a="http://schemas.openxmlformats.org/drawingml/2006/main" noChangeAspect="1"/>
-                  </wp:cNvGraphicFramePr>
-                  <a:graphic xmlns:a="http://schemas.openxmlformats.org/drawingml/2006/main">
-                    <a:graphicData uri="http://schemas.openxmlformats.org/drawingml/2006/picture">
-                      <pic:pic xmlns:pic="http://schemas.openxmlformats.org/drawingml/2006/picture">
-                        <pic:nvPicPr>
-                          <pic:cNvPr id="0" name="image.png"/>
-                          <pic:cNvPicPr/>
-                        </pic:nvPicPr>
-                        <pic:blipFill>
-                          <a:blip r:embed="rId20"/>
-                          <a:stretch>
-                            <a:fillRect/>
-                          </a:stretch>
-                        </pic:blipFill>
-                        <pic:spPr>
-                          <a:xfrm>
-                            <a:off x="0" y="0"/>
-                            <a:ext cx="2651760" cy="1657350"/>
-                          </a:xfrm>
-                          <a:prstGeom prst="rect">
-                            <a:avLst/>
-                          </a:prstGeom>
-                        </pic:spPr>
-                      </pic:pic>
-                    </a:graphicData>
-                  </a:graphic>
-                </wp:inline>
-              </w:drawing>
-            </w:r>
-          </w:p>
-          <w:p>
-            <w:pPr>
-              <w:jc w:val="center"/>
-            </w:pPr>
-            <w:r>
-              <w:rPr>
-                <w:i/>
-                <w:sz w:val="18"/>
-              </w:rPr>
-              <w:t>Figure 5.2 – Joining a session with a room code</w:t>
-            </w:r>
-          </w:p>
-        </w:tc>
-      </w:tr>
-      <w:tr>
-        <w:trPr>
-          <w:jc w:val="center"/>
-        </w:trPr>
-        <w:tc>
-          <w:tcPr>
-            <w:tcW w:w="4513" w:type="dxa"/>
-          </w:tcPr>
-          <w:p>
-            <w:pPr>
-              <w:jc w:val="center"/>
-            </w:pPr>
-            <w:r>
-              <w:rPr>
-                <w:noProof/>
-              </w:rPr>
-              <w:drawing>
-                <wp:inline distT="0" distB="0" distL="0" distR="0" wp14:anchorId="7ED57E66" wp14:editId="5F5F0BCF">
-                  <wp:extent cx="2651760" cy="1657350"/>
-                  <wp:effectExtent l="0" t="0" r="0" b="0"/>
-                  <wp:docPr id="1522399888" name="Picture 1522399888"/>
-                  <wp:cNvGraphicFramePr>
-                    <a:graphicFrameLocks xmlns:a="http://schemas.openxmlformats.org/drawingml/2006/main" noChangeAspect="1"/>
-                  </wp:cNvGraphicFramePr>
-                  <a:graphic xmlns:a="http://schemas.openxmlformats.org/drawingml/2006/main">
-                    <a:graphicData uri="http://schemas.openxmlformats.org/drawingml/2006/picture">
-                      <pic:pic xmlns:pic="http://schemas.openxmlformats.org/drawingml/2006/picture">
-                        <pic:nvPicPr>
-                          <pic:cNvPr id="0" name="image.png"/>
-                          <pic:cNvPicPr/>
-                        </pic:nvPicPr>
-                        <pic:blipFill>
-                          <a:blip r:embed="rId21"/>
-                          <a:stretch>
-                            <a:fillRect/>
-                          </a:stretch>
-                        </pic:blipFill>
-                        <pic:spPr>
-                          <a:xfrm>
-                            <a:off x="0" y="0"/>
-                            <a:ext cx="2651760" cy="1657350"/>
-                          </a:xfrm>
-                          <a:prstGeom prst="rect">
-                            <a:avLst/>
-                          </a:prstGeom>
-                        </pic:spPr>
-                      </pic:pic>
-                    </a:graphicData>
-                  </a:graphic>
-                </wp:inline>
-              </w:drawing>
-            </w:r>
-          </w:p>
-          <w:p>
-            <w:pPr>
-              <w:jc w:val="center"/>
-            </w:pPr>
-            <w:r>
-              <w:rPr>
-                <w:i/>
-                <w:sz w:val="18"/>
-              </w:rPr>
-              <w:t>Figure 5.3 – Student live guide, written from the screen and the instructor's speech</w:t>
-            </w:r>
-          </w:p>
-        </w:tc>
-        <w:tc>
-          <w:tcPr>
-            <w:tcW w:w="4513" w:type="dxa"/>
-          </w:tcPr>
-          <w:p>
-            <w:pPr>
-              <w:jc w:val="center"/>
-            </w:pPr>
-            <w:r>
-              <w:rPr>
-                <w:noProof/>
-              </w:rPr>
-              <w:drawing>
-                <wp:inline distT="0" distB="0" distL="0" distR="0" wp14:anchorId="5C54EEAC" wp14:editId="41551A98">
-                  <wp:extent cx="2651760" cy="1657350"/>
-                  <wp:effectExtent l="0" t="0" r="0" b="0"/>
-                  <wp:docPr id="1522399889" name="Picture 1522399889"/>
-                  <wp:cNvGraphicFramePr>
-                    <a:graphicFrameLocks xmlns:a="http://schemas.openxmlformats.org/drawingml/2006/main" noChangeAspect="1"/>
-                  </wp:cNvGraphicFramePr>
-                  <a:graphic xmlns:a="http://schemas.openxmlformats.org/drawingml/2006/main">
-                    <a:graphicData uri="http://schemas.openxmlformats.org/drawingml/2006/picture">
-                      <pic:pic xmlns:pic="http://schemas.openxmlformats.org/drawingml/2006/picture">
-                        <pic:nvPicPr>
-                          <pic:cNvPr id="0" name="image.png"/>
-                          <pic:cNvPicPr/>
-                        </pic:nvPicPr>
-                        <pic:blipFill>
-                          <a:blip r:embed="rId22"/>
-                          <a:stretch>
-                            <a:fillRect/>
-                          </a:stretch>
-                        </pic:blipFill>
-                        <pic:spPr>
-                          <a:xfrm>
-                            <a:off x="0" y="0"/>
-                            <a:ext cx="2651760" cy="1657350"/>
-                          </a:xfrm>
-                          <a:prstGeom prst="rect">
-                            <a:avLst/>
-                          </a:prstGeom>
-                        </pic:spPr>
-                      </pic:pic>
-                    </a:graphicData>
-                  </a:graphic>
-                </wp:inline>
-              </w:drawing>
-            </w:r>
-          </w:p>
-          <w:p>
-            <w:pPr>
-              <w:jc w:val="center"/>
-            </w:pPr>
-            <w:r>
-              <w:rPr>
-                <w:i/>
-                <w:sz w:val="18"/>
-              </w:rPr>
-              <w:t>Figure 5.4 – Files shared by the instructor</w:t>
-            </w:r>
-          </w:p>
-        </w:tc>
-      </w:tr>
-      <w:tr>
-        <w:trPr>
-          <w:jc w:val="center"/>
-        </w:trPr>
-        <w:tc>
-          <w:tcPr>
-            <w:tcW w:w="4513" w:type="dxa"/>
-          </w:tcPr>
-          <w:p>
-            <w:pPr>
-              <w:jc w:val="center"/>
-            </w:pPr>
-            <w:r>
-              <w:rPr>
-                <w:noProof/>
-              </w:rPr>
-              <w:drawing>
-                <wp:inline distT="0" distB="0" distL="0" distR="0" wp14:anchorId="78EA1873" wp14:editId="47B8EECF">
-                  <wp:extent cx="2651760" cy="1657350"/>
-                  <wp:effectExtent l="0" t="0" r="0" b="0"/>
-                  <wp:docPr id="1522399890" name="Picture 1522399890"/>
-                  <wp:cNvGraphicFramePr>
-                    <a:graphicFrameLocks xmlns:a="http://schemas.openxmlformats.org/drawingml/2006/main" noChangeAspect="1"/>
-                  </wp:cNvGraphicFramePr>
-                  <a:graphic xmlns:a="http://schemas.openxmlformats.org/drawingml/2006/main">
-                    <a:graphicData uri="http://schemas.openxmlformats.org/drawingml/2006/picture">
-                      <pic:pic xmlns:pic="http://schemas.openxmlformats.org/drawingml/2006/picture">
-                        <pic:nvPicPr>
-                          <pic:cNvPr id="0" name="image.png"/>
-                          <pic:cNvPicPr/>
-                        </pic:nvPicPr>
-                        <pic:blipFill>
-                          <a:blip r:embed="rId23"/>
-                          <a:stretch>
-                            <a:fillRect/>
-                          </a:stretch>
-                        </pic:blipFill>
-                        <pic:spPr>
-                          <a:xfrm>
-                            <a:off x="0" y="0"/>
-                            <a:ext cx="2651760" cy="1657350"/>
-                          </a:xfrm>
-                          <a:prstGeom prst="rect">
-                            <a:avLst/>
-                          </a:prstGeom>
-                        </pic:spPr>
-                      </pic:pic>
-                    </a:graphicData>
-                  </a:graphic>
-                </wp:inline>
-              </w:drawing>
-            </w:r>
-          </w:p>
-          <w:p>
-            <w:pPr>
-              <w:jc w:val="center"/>
-            </w:pPr>
-            <w:r>
-              <w:rPr>
-                <w:i/>
-                <w:sz w:val="18"/>
-              </w:rPr>
-              <w:t>Figure 5.5 – AI Helper: sandbox, error helper and notebook assistant</w:t>
-            </w:r>
-          </w:p>
-        </w:tc>
-        <w:tc>
-          <w:tcPr>
-            <w:tcW w:w="4513" w:type="dxa"/>
-          </w:tcPr>
-          <w:p>
-            <w:pPr>
-              <w:jc w:val="center"/>
-            </w:pPr>
-            <w:r>
-              <w:rPr>
-                <w:noProof/>
-              </w:rPr>
-              <w:drawing>
-                <wp:inline distT="0" distB="0" distL="0" distR="0" wp14:anchorId="1CAE5EEE" wp14:editId="687CA13B">
-                  <wp:extent cx="2651760" cy="1657350"/>
-                  <wp:effectExtent l="0" t="0" r="0" b="0"/>
-                  <wp:docPr id="1522399891" name="Picture 1522399891"/>
-                  <wp:cNvGraphicFramePr>
-                    <a:graphicFrameLocks xmlns:a="http://schemas.openxmlformats.org/drawingml/2006/main" noChangeAspect="1"/>
-                  </wp:cNvGraphicFramePr>
-                  <a:graphic xmlns:a="http://schemas.openxmlformats.org/drawingml/2006/main">
-                    <a:graphicData uri="http://schemas.openxmlformats.org/drawingml/2006/picture">
-                      <pic:pic xmlns:pic="http://schemas.openxmlformats.org/drawingml/2006/picture">
-                        <pic:nvPicPr>
-                          <pic:cNvPr id="0" name="fig_student_qa.png"/>
-                          <pic:cNvPicPr/>
-                        </pic:nvPicPr>
-                        <pic:blipFill>
-                          <a:blip r:embed="rId24"/>
-                          <a:stretch>
-                            <a:fillRect/>
-                          </a:stretch>
-                        </pic:blipFill>
-                        <pic:spPr>
-                          <a:xfrm>
-                            <a:off x="0" y="0"/>
-                            <a:ext cx="2651760" cy="1657350"/>
-                          </a:xfrm>
-                          <a:prstGeom prst="rect">
-                            <a:avLst/>
-                          </a:prstGeom>
-                        </pic:spPr>
-                      </pic:pic>
-                    </a:graphicData>
-                  </a:graphic>
-                </wp:inline>
-              </w:drawing>
-            </w:r>
-          </w:p>
-          <w:p>
-            <w:pPr>
-              <w:jc w:val="center"/>
-            </w:pPr>
-            <w:r>
-              <w:rPr>
-                <w:i/>
-                <w:sz w:val="18"/>
-              </w:rPr>
-              <w:t>Figure 5.6 – Private question thread, answered by the instructor</w:t>
-            </w:r>
-          </w:p>
-        </w:tc>
-      </w:tr>
-      <w:tr>
-        <w:trPr>
-          <w:jc w:val="center"/>
-        </w:trPr>
-        <w:tc>
-          <w:tcPr>
-            <w:tcW w:w="4513" w:type="dxa"/>
-          </w:tcPr>
-          <w:p>
-            <w:pPr>
-              <w:jc w:val="center"/>
-            </w:pPr>
-            <w:r>
-              <w:rPr>
-                <w:noProof/>
-              </w:rPr>
-              <w:drawing>
-                <wp:inline distT="0" distB="0" distL="0" distR="0" wp14:anchorId="10424D4C" wp14:editId="5A9C0F8F">
-                  <wp:extent cx="2651760" cy="1657350"/>
-                  <wp:effectExtent l="0" t="0" r="0" b="0"/>
-                  <wp:docPr id="1522399892" name="Picture 1522399892"/>
-                  <wp:cNvGraphicFramePr>
-                    <a:graphicFrameLocks xmlns:a="http://schemas.openxmlformats.org/drawingml/2006/main" noChangeAspect="1"/>
-                  </wp:cNvGraphicFramePr>
-                  <a:graphic xmlns:a="http://schemas.openxmlformats.org/drawingml/2006/main">
-                    <a:graphicData uri="http://schemas.openxmlformats.org/drawingml/2006/picture">
-                      <pic:pic xmlns:pic="http://schemas.openxmlformats.org/drawingml/2006/picture">
-                        <pic:nvPicPr>
-                          <pic:cNvPr id="0" name="fig_instructor_setup.png"/>
-                          <pic:cNvPicPr/>
-                        </pic:nvPicPr>
-                        <pic:blipFill>
-                          <a:blip r:embed="rId25"/>
-                          <a:stretch>
-                            <a:fillRect/>
-                          </a:stretch>
-                        </pic:blipFill>
-                        <pic:spPr>
-                          <a:xfrm>
-                            <a:off x="0" y="0"/>
-                            <a:ext cx="2651760" cy="1657350"/>
-                          </a:xfrm>
-                          <a:prstGeom prst="rect">
-                            <a:avLst/>
-                          </a:prstGeom>
-                        </pic:spPr>
-                      </pic:pic>
-                    </a:graphicData>
-                  </a:graphic>
-                </wp:inline>
-              </w:drawing>
-            </w:r>
-          </w:p>
-          <w:p>
-            <w:pPr>
-              <w:jc w:val="center"/>
-            </w:pPr>
-            <w:r>
-              <w:rPr>
-                <w:i/>
-                <w:sz w:val="18"/>
-              </w:rPr>
-              <w:t>Figure 5.7 – Instructor application: a live session with the present bar and side rail</w:t>
-            </w:r>
-          </w:p>
-        </w:tc>
-        <w:tc>
-          <w:tcPr>
-            <w:tcW w:w="4513" w:type="dxa"/>
-          </w:tcPr>
-          <w:p>
-            <w:pPr>
-              <w:jc w:val="center"/>
-            </w:pPr>
-            <w:r>
-              <w:rPr>
-                <w:noProof/>
-              </w:rPr>
-              <w:drawing>
-                <wp:inline distT="0" distB="0" distL="0" distR="0" wp14:anchorId="300DCE92" wp14:editId="1CBA86EA">
-                  <wp:extent cx="2651760" cy="1657350"/>
-                  <wp:effectExtent l="0" t="0" r="0" b="0"/>
-                  <wp:docPr id="1522399893" name="Picture 1522399893"/>
-                  <wp:cNvGraphicFramePr>
-                    <a:graphicFrameLocks xmlns:a="http://schemas.openxmlformats.org/drawingml/2006/main" noChangeAspect="1"/>
-                  </wp:cNvGraphicFramePr>
-                  <a:graphic xmlns:a="http://schemas.openxmlformats.org/drawingml/2006/main">
-                    <a:graphicData uri="http://schemas.openxmlformats.org/drawingml/2006/picture">
-                      <pic:pic xmlns:pic="http://schemas.openxmlformats.org/drawingml/2006/picture">
-                        <pic:nvPicPr>
-                          <pic:cNvPr id="0" name="fig_instructor_setup.png"/>
-                          <pic:cNvPicPr/>
-                        </pic:nvPicPr>
-                        <pic:blipFill>
-                          <a:blip r:embed="rId26"/>
-                          <a:stretch>
-                            <a:fillRect/>
-                          </a:stretch>
-                        </pic:blipFill>
-                        <pic:spPr>
-                          <a:xfrm>
-                            <a:off x="0" y="0"/>
-                            <a:ext cx="2651760" cy="1657350"/>
-                          </a:xfrm>
-                          <a:prstGeom prst="rect">
-                            <a:avLst/>
-                          </a:prstGeom>
-                        </pic:spPr>
-                      </pic:pic>
-                    </a:graphicData>
-                  </a:graphic>
-                </wp:inline>
-              </w:drawing>
-            </w:r>
-          </w:p>
-          <w:p>
-            <w:pPr>
-              <w:jc w:val="center"/>
-            </w:pPr>
-            <w:r>
-              <w:rPr>
-                <w:i/>
-                <w:sz w:val="18"/>
-              </w:rPr>
-              <w:t>Figure 5.8 – Instructor application: settings, appearance and AI controls</w:t>
-            </w:r>
-          </w:p>
-        </w:tc>
-      </w:tr>
-    </w:tbl>
+        <w:spacing w:before="180" w:after="80"/>
+      </w:pPr>
+      <w:r>
+        <w:rPr>
+          <w:noProof/>
+        </w:rPr>
+        <w:drawing>
+          <wp:inline distT="0" distB="0" distL="0" distR="0" wp14:anchorId="7EAB03E9" wp14:editId="016F03E9">
+            <wp:extent cx="4937760" cy="3086100"/>
+            <wp:effectExtent l="0" t="0" r="0" b="0"/>
+            <wp:docPr id="1001" name="Picture 1001"/>
+            <wp:cNvGraphicFramePr>
+              <a:graphicFrameLocks xmlns:a="http://schemas.openxmlformats.org/drawingml/2006/main" noChangeAspect="1"/>
+            </wp:cNvGraphicFramePr>
+            <a:graphic xmlns:a="http://schemas.openxmlformats.org/drawingml/2006/main">
+              <a:graphicData uri="http://schemas.openxmlformats.org/drawingml/2006/picture">
+                <pic:pic xmlns:pic="http://schemas.openxmlformats.org/drawingml/2006/picture">
+                  <pic:nvPicPr>
+                    <pic:cNvPr id="1001" name="fig_student_landing.png"/>
+                    <pic:cNvPicPr/>
+                  </pic:nvPicPr>
+                  <pic:blipFill>
+                    <a:blip r:embed="rId19"/>
+                    <a:stretch>
+                      <a:fillRect/>
+                    </a:stretch>
+                  </pic:blipFill>
+                  <pic:spPr>
+                    <a:xfrm>
+                      <a:off x="0" y="0"/>
+                      <a:ext cx="4937760" cy="3086100"/>
+                    </a:xfrm>
+                    <a:prstGeom prst="rect">
+                      <a:avLst/>
+                    </a:prstGeom>
+                  </pic:spPr>
+                </pic:pic>
+              </a:graphicData>
+            </a:graphic>
+          </wp:inline>
+        </w:drawing>
+      </w:r>
+    </w:p>
+    <w:p>
+      <w:pPr>
+        <w:jc w:val="center"/>
+        <w:spacing w:before="60" w:after="240" w:line="259" w:lineRule="auto"/>
+        <w:rPr>
+          <w:b/>
+        </w:rPr>
+      </w:pPr>
+      <w:r>
+        <w:rPr>
+          <w:b/>
+        </w:rPr>
+        <w:t>Figure 5.1 – Student web application: landing page</w:t>
+      </w:r>
+    </w:p>
+    <w:p>
+      <w:pPr>
+        <w:jc w:val="center"/>
+        <w:spacing w:before="180" w:after="80"/>
+      </w:pPr>
+      <w:r>
+        <w:rPr>
+          <w:noProof/>
+        </w:rPr>
+        <w:drawing>
+          <wp:inline distT="0" distB="0" distL="0" distR="0" wp14:anchorId="7EAB03EA" wp14:editId="016F03EA">
+            <wp:extent cx="4937760" cy="3086100"/>
+            <wp:effectExtent l="0" t="0" r="0" b="0"/>
+            <wp:docPr id="1002" name="Picture 1002"/>
+            <wp:cNvGraphicFramePr>
+              <a:graphicFrameLocks xmlns:a="http://schemas.openxmlformats.org/drawingml/2006/main" noChangeAspect="1"/>
+            </wp:cNvGraphicFramePr>
+            <a:graphic xmlns:a="http://schemas.openxmlformats.org/drawingml/2006/main">
+              <a:graphicData uri="http://schemas.openxmlformats.org/drawingml/2006/picture">
+                <pic:pic xmlns:pic="http://schemas.openxmlformats.org/drawingml/2006/picture">
+                  <pic:nvPicPr>
+                    <pic:cNvPr id="1002" name="fig_student_join.png"/>
+                    <pic:cNvPicPr/>
+                  </pic:nvPicPr>
+                  <pic:blipFill>
+                    <a:blip r:embed="rId20"/>
+                    <a:stretch>
+                      <a:fillRect/>
+                    </a:stretch>
+                  </pic:blipFill>
+                  <pic:spPr>
+                    <a:xfrm>
+                      <a:off x="0" y="0"/>
+                      <a:ext cx="4937760" cy="3086100"/>
+                    </a:xfrm>
+                    <a:prstGeom prst="rect">
+                      <a:avLst/>
+                    </a:prstGeom>
+                  </pic:spPr>
+                </pic:pic>
+              </a:graphicData>
+            </a:graphic>
+          </wp:inline>
+        </w:drawing>
+      </w:r>
+    </w:p>
+    <w:p>
+      <w:pPr>
+        <w:jc w:val="center"/>
+        <w:spacing w:before="60" w:after="240" w:line="259" w:lineRule="auto"/>
+        <w:rPr>
+          <w:b/>
+        </w:rPr>
+      </w:pPr>
+      <w:r>
+        <w:rPr>
+          <w:b/>
+        </w:rPr>
+        <w:t>Figure 5.2 – Joining a session with a room code</w:t>
+      </w:r>
+    </w:p>
+    <w:p>
+      <w:pPr>
+        <w:jc w:val="center"/>
+        <w:spacing w:before="180" w:after="80"/>
+      </w:pPr>
+      <w:r>
+        <w:rPr>
+          <w:noProof/>
+        </w:rPr>
+        <w:drawing>
+          <wp:inline distT="0" distB="0" distL="0" distR="0" wp14:anchorId="7EAB03EB" wp14:editId="016F03EB">
+            <wp:extent cx="4937760" cy="3086100"/>
+            <wp:effectExtent l="0" t="0" r="0" b="0"/>
+            <wp:docPr id="1003" name="Picture 1003"/>
+            <wp:cNvGraphicFramePr>
+              <a:graphicFrameLocks xmlns:a="http://schemas.openxmlformats.org/drawingml/2006/main" noChangeAspect="1"/>
+            </wp:cNvGraphicFramePr>
+            <a:graphic xmlns:a="http://schemas.openxmlformats.org/drawingml/2006/main">
+              <a:graphicData uri="http://schemas.openxmlformats.org/drawingml/2006/picture">
+                <pic:pic xmlns:pic="http://schemas.openxmlformats.org/drawingml/2006/picture">
+                  <pic:nvPicPr>
+                    <pic:cNvPr id="1003" name="fig_student_guide.png"/>
+                    <pic:cNvPicPr/>
+                  </pic:nvPicPr>
+                  <pic:blipFill>
+                    <a:blip r:embed="rId21"/>
+                    <a:stretch>
+                      <a:fillRect/>
+                    </a:stretch>
+                  </pic:blipFill>
+                  <pic:spPr>
+                    <a:xfrm>
+                      <a:off x="0" y="0"/>
+                      <a:ext cx="4937760" cy="3086100"/>
+                    </a:xfrm>
+                    <a:prstGeom prst="rect">
+                      <a:avLst/>
+                    </a:prstGeom>
+                  </pic:spPr>
+                </pic:pic>
+              </a:graphicData>
+            </a:graphic>
+          </wp:inline>
+        </w:drawing>
+      </w:r>
+    </w:p>
+    <w:p>
+      <w:pPr>
+        <w:jc w:val="center"/>
+        <w:spacing w:before="60" w:after="240" w:line="259" w:lineRule="auto"/>
+        <w:rPr>
+          <w:b/>
+        </w:rPr>
+      </w:pPr>
+      <w:r>
+        <w:rPr>
+          <w:b/>
+        </w:rPr>
+        <w:t>Figure 5.3 – Student live guide, written from the screen and the instructor's speech</w:t>
+      </w:r>
+    </w:p>
+    <w:p>
+      <w:pPr>
+        <w:jc w:val="center"/>
+        <w:spacing w:before="180" w:after="80"/>
+      </w:pPr>
+      <w:r>
+        <w:rPr>
+          <w:noProof/>
+        </w:rPr>
+        <w:drawing>
+          <wp:inline distT="0" distB="0" distL="0" distR="0" wp14:anchorId="7EAB03EC" wp14:editId="016F03EC">
+            <wp:extent cx="4937760" cy="3086100"/>
+            <wp:effectExtent l="0" t="0" r="0" b="0"/>
+            <wp:docPr id="1004" name="Picture 1004"/>
+            <wp:cNvGraphicFramePr>
+              <a:graphicFrameLocks xmlns:a="http://schemas.openxmlformats.org/drawingml/2006/main" noChangeAspect="1"/>
+            </wp:cNvGraphicFramePr>
+            <a:graphic xmlns:a="http://schemas.openxmlformats.org/drawingml/2006/main">
+              <a:graphicData uri="http://schemas.openxmlformats.org/drawingml/2006/picture">
+                <pic:pic xmlns:pic="http://schemas.openxmlformats.org/drawingml/2006/picture">
+                  <pic:nvPicPr>
+                    <pic:cNvPr id="1004" name="fig_student_files.png"/>
+                    <pic:cNvPicPr/>
+                  </pic:nvPicPr>
+                  <pic:blipFill>
+                    <a:blip r:embed="rId22"/>
+                    <a:stretch>
+                      <a:fillRect/>
+                    </a:stretch>
+                  </pic:blipFill>
+                  <pic:spPr>
+                    <a:xfrm>
+                      <a:off x="0" y="0"/>
+                      <a:ext cx="4937760" cy="3086100"/>
+                    </a:xfrm>
+                    <a:prstGeom prst="rect">
+                      <a:avLst/>
+                    </a:prstGeom>
+                  </pic:spPr>
+                </pic:pic>
+              </a:graphicData>
+            </a:graphic>
+          </wp:inline>
+        </w:drawing>
+      </w:r>
+    </w:p>
+    <w:p>
+      <w:pPr>
+        <w:jc w:val="center"/>
+        <w:spacing w:before="60" w:after="240" w:line="259" w:lineRule="auto"/>
+        <w:rPr>
+          <w:b/>
+        </w:rPr>
+      </w:pPr>
+      <w:r>
+        <w:rPr>
+          <w:b/>
+        </w:rPr>
+        <w:t>Figure 5.4 – Files shared by the instructor</w:t>
+      </w:r>
+    </w:p>
+    <w:p>
+      <w:pPr>
+        <w:jc w:val="center"/>
+        <w:spacing w:before="180" w:after="80"/>
+      </w:pPr>
+      <w:r>
+        <w:rPr>
+          <w:noProof/>
+        </w:rPr>
+        <w:drawing>
+          <wp:inline distT="0" distB="0" distL="0" distR="0" wp14:anchorId="7EAB03ED" wp14:editId="016F03ED">
+            <wp:extent cx="4937760" cy="3086100"/>
+            <wp:effectExtent l="0" t="0" r="0" b="0"/>
+            <wp:docPr id="1005" name="Picture 1005"/>
+            <wp:cNvGraphicFramePr>
+              <a:graphicFrameLocks xmlns:a="http://schemas.openxmlformats.org/drawingml/2006/main" noChangeAspect="1"/>
+            </wp:cNvGraphicFramePr>
+            <a:graphic xmlns:a="http://schemas.openxmlformats.org/drawingml/2006/main">
+              <a:graphicData uri="http://schemas.openxmlformats.org/drawingml/2006/picture">
+                <pic:pic xmlns:pic="http://schemas.openxmlformats.org/drawingml/2006/picture">
+                  <pic:nvPicPr>
+                    <pic:cNvPr id="1005" name="fig_student_ai_helper.png"/>
+                    <pic:cNvPicPr/>
+                  </pic:nvPicPr>
+                  <pic:blipFill>
+                    <a:blip r:embed="rId23"/>
+                    <a:stretch>
+                      <a:fillRect/>
+                    </a:stretch>
+                  </pic:blipFill>
+                  <pic:spPr>
+                    <a:xfrm>
+                      <a:off x="0" y="0"/>
+                      <a:ext cx="4937760" cy="3086100"/>
+                    </a:xfrm>
+                    <a:prstGeom prst="rect">
+                      <a:avLst/>
+                    </a:prstGeom>
+                  </pic:spPr>
+                </pic:pic>
+              </a:graphicData>
+            </a:graphic>
+          </wp:inline>
+        </w:drawing>
+      </w:r>
+    </w:p>
+    <w:p>
+      <w:pPr>
+        <w:jc w:val="center"/>
+        <w:spacing w:before="60" w:after="240" w:line="259" w:lineRule="auto"/>
+        <w:rPr>
+          <w:b/>
+        </w:rPr>
+      </w:pPr>
+      <w:r>
+        <w:rPr>
+          <w:b/>
+        </w:rPr>
+        <w:t>Figure 5.5 – AI Helper: sandbox, error helper and notebook assistant</w:t>
+      </w:r>
+    </w:p>
+    <w:p>
+      <w:pPr>
+        <w:jc w:val="center"/>
+        <w:spacing w:before="180" w:after="80"/>
+      </w:pPr>
+      <w:r>
+        <w:rPr>
+          <w:noProof/>
+        </w:rPr>
+        <w:drawing>
+          <wp:inline distT="0" distB="0" distL="0" distR="0" wp14:anchorId="7EAB03EE" wp14:editId="016F03EE">
+            <wp:extent cx="4937760" cy="3086100"/>
+            <wp:effectExtent l="0" t="0" r="0" b="0"/>
+            <wp:docPr id="1006" name="Picture 1006"/>
+            <wp:cNvGraphicFramePr>
+              <a:graphicFrameLocks xmlns:a="http://schemas.openxmlformats.org/drawingml/2006/main" noChangeAspect="1"/>
+            </wp:cNvGraphicFramePr>
+            <a:graphic xmlns:a="http://schemas.openxmlformats.org/drawingml/2006/main">
+              <a:graphicData uri="http://schemas.openxmlformats.org/drawingml/2006/picture">
+                <pic:pic xmlns:pic="http://schemas.openxmlformats.org/drawingml/2006/picture">
+                  <pic:nvPicPr>
+                    <pic:cNvPr id="1006" name="fig_student_qa.png"/>
+                    <pic:cNvPicPr/>
+                  </pic:nvPicPr>
+                  <pic:blipFill>
+                    <a:blip r:embed="rId24"/>
+                    <a:stretch>
+                      <a:fillRect/>
+                    </a:stretch>
+                  </pic:blipFill>
+                  <pic:spPr>
+                    <a:xfrm>
+                      <a:off x="0" y="0"/>
+                      <a:ext cx="4937760" cy="3086100"/>
+                    </a:xfrm>
+                    <a:prstGeom prst="rect">
+                      <a:avLst/>
+                    </a:prstGeom>
+                  </pic:spPr>
+                </pic:pic>
+              </a:graphicData>
+            </a:graphic>
+          </wp:inline>
+        </w:drawing>
+      </w:r>
+    </w:p>
+    <w:p>
+      <w:pPr>
+        <w:jc w:val="center"/>
+        <w:spacing w:before="60" w:after="240" w:line="259" w:lineRule="auto"/>
+        <w:rPr>
+          <w:b/>
+        </w:rPr>
+      </w:pPr>
+      <w:r>
+        <w:rPr>
+          <w:b/>
+        </w:rPr>
+        <w:t>Figure 5.6 – Private question thread, answered by the instructor</w:t>
+      </w:r>
+    </w:p>
+    <w:p>
+      <w:pPr>
+        <w:jc w:val="center"/>
+        <w:spacing w:before="180" w:after="80"/>
+      </w:pPr>
+      <w:r>
+        <w:rPr>
+          <w:noProof/>
+        </w:rPr>
+        <w:drawing>
+          <wp:inline distT="0" distB="0" distL="0" distR="0" wp14:anchorId="7EAB03EF" wp14:editId="016F03EF">
+            <wp:extent cx="4937760" cy="3086100"/>
+            <wp:effectExtent l="0" t="0" r="0" b="0"/>
+            <wp:docPr id="1007" name="Picture 1007"/>
+            <wp:cNvGraphicFramePr>
+              <a:graphicFrameLocks xmlns:a="http://schemas.openxmlformats.org/drawingml/2006/main" noChangeAspect="1"/>
+            </wp:cNvGraphicFramePr>
+            <a:graphic xmlns:a="http://schemas.openxmlformats.org/drawingml/2006/main">
+              <a:graphicData uri="http://schemas.openxmlformats.org/drawingml/2006/picture">
+                <pic:pic xmlns:pic="http://schemas.openxmlformats.org/drawingml/2006/picture">
+                  <pic:nvPicPr>
+                    <pic:cNvPr id="1007" name="fig_student_live.png"/>
+                    <pic:cNvPicPr/>
+                  </pic:nvPicPr>
+                  <pic:blipFill>
+                    <a:blip r:embed="rId25"/>
+                    <a:stretch>
+                      <a:fillRect/>
+                    </a:stretch>
+                  </pic:blipFill>
+                  <pic:spPr>
+                    <a:xfrm>
+                      <a:off x="0" y="0"/>
+                      <a:ext cx="4937760" cy="3086100"/>
+                    </a:xfrm>
+                    <a:prstGeom prst="rect">
+                      <a:avLst/>
+                    </a:prstGeom>
+                  </pic:spPr>
+                </pic:pic>
+              </a:graphicData>
+            </a:graphic>
+          </wp:inline>
+        </w:drawing>
+      </w:r>
+    </w:p>
+    <w:p>
+      <w:pPr>
+        <w:jc w:val="center"/>
+        <w:spacing w:before="60" w:after="240" w:line="259" w:lineRule="auto"/>
+        <w:rPr>
+          <w:b/>
+        </w:rPr>
+      </w:pPr>
+      <w:r>
+        <w:rPr>
+          <w:b/>
+        </w:rPr>
+        <w:t>Figure 5.7 – Instructor application: a live session with the present bar and side rail</w:t>
+      </w:r>
+    </w:p>
+    <w:p>
+      <w:pPr>
+        <w:jc w:val="center"/>
+        <w:spacing w:before="180" w:after="80"/>
+      </w:pPr>
+      <w:r>
+        <w:rPr>
+          <w:noProof/>
+        </w:rPr>
+        <w:drawing>
+          <wp:inline distT="0" distB="0" distL="0" distR="0" wp14:anchorId="7EAB03F0" wp14:editId="016F03F0">
+            <wp:extent cx="4937760" cy="3086100"/>
+            <wp:effectExtent l="0" t="0" r="0" b="0"/>
+            <wp:docPr id="1008" name="Picture 1008"/>
+            <wp:cNvGraphicFramePr>
+              <a:graphicFrameLocks xmlns:a="http://schemas.openxmlformats.org/drawingml/2006/main" noChangeAspect="1"/>
+            </wp:cNvGraphicFramePr>
+            <a:graphic xmlns:a="http://schemas.openxmlformats.org/drawingml/2006/main">
+              <a:graphicData uri="http://schemas.openxmlformats.org/drawingml/2006/picture">
+                <pic:pic xmlns:pic="http://schemas.openxmlformats.org/drawingml/2006/picture">
+                  <pic:nvPicPr>
+                    <pic:cNvPr id="1008" name="fig_instructor_settings.png"/>
+                    <pic:cNvPicPr/>
+                  </pic:nvPicPr>
+                  <pic:blipFill>
+                    <a:blip r:embed="rId26"/>
+                    <a:stretch>
+                      <a:fillRect/>
+                    </a:stretch>
+                  </pic:blipFill>
+                  <pic:spPr>
+                    <a:xfrm>
+                      <a:off x="0" y="0"/>
+                      <a:ext cx="4937760" cy="3086100"/>
+                    </a:xfrm>
+                    <a:prstGeom prst="rect">
+                      <a:avLst/>
+                    </a:prstGeom>
+                  </pic:spPr>
+                </pic:pic>
+              </a:graphicData>
+            </a:graphic>
+          </wp:inline>
+        </w:drawing>
+      </w:r>
+    </w:p>
+    <w:p>
+      <w:pPr>
+        <w:jc w:val="center"/>
+        <w:spacing w:before="60" w:after="240" w:line="259" w:lineRule="auto"/>
+        <w:rPr>
+          <w:b/>
+        </w:rPr>
+      </w:pPr>
+      <w:r>
+        <w:rPr>
+          <w:b/>
+        </w:rPr>
+        <w:t>Figure 5.8 – Instructor application: settings, appearance and AI controls</w:t>
+      </w:r>
+    </w:p>
     <w:p>
       <w:pPr>
         <w:pStyle w:val="FrontMatterHeading"/>
@@ -28476,7 +28437,48 @@
     <w:p>
       <w:pPr>
         <w:jc w:val="center"/>
-      </w:pPr>
+        <w:spacing w:before="180" w:after="80"/>
+      </w:pPr>
+      <w:r>
+        <w:rPr>
+          <w:noProof/>
+        </w:rPr>
+        <w:drawing>
+          <wp:inline distT="0" distB="0" distL="0" distR="0" wp14:anchorId="7EAB07D1" wp14:editId="016F07D1">
+            <wp:extent cx="4937760" cy="3086100"/>
+            <wp:effectExtent l="0" t="0" r="0" b="0"/>
+            <wp:docPr id="2001" name="Picture 2001"/>
+            <wp:cNvGraphicFramePr>
+              <a:graphicFrameLocks xmlns:a="http://schemas.openxmlformats.org/drawingml/2006/main" noChangeAspect="1"/>
+            </wp:cNvGraphicFramePr>
+            <a:graphic xmlns:a="http://schemas.openxmlformats.org/drawingml/2006/main">
+              <a:graphicData uri="http://schemas.openxmlformats.org/drawingml/2006/picture">
+                <pic:pic xmlns:pic="http://schemas.openxmlformats.org/drawingml/2006/picture">
+                  <pic:nvPicPr>
+                    <pic:cNvPr id="2001" name="fig_student_landing.png"/>
+                    <pic:cNvPicPr/>
+                  </pic:nvPicPr>
+                  <pic:blipFill>
+                    <a:blip r:embed="rId19"/>
+                    <a:stretch>
+                      <a:fillRect/>
+                    </a:stretch>
+                  </pic:blipFill>
+                  <pic:spPr>
+                    <a:xfrm>
+                      <a:off x="0" y="0"/>
+                      <a:ext cx="4937760" cy="3086100"/>
+                    </a:xfrm>
+                    <a:prstGeom prst="rect">
+                      <a:avLst/>
+                    </a:prstGeom>
+                  </pic:spPr>
+                </pic:pic>
+              </a:graphicData>
+            </a:graphic>
+          </wp:inline>
+        </w:drawing>
+      </w:r>
     </w:p>
     <w:p>
       <w:pPr>
@@ -28504,7 +28506,48 @@
     <w:p>
       <w:pPr>
         <w:jc w:val="center"/>
-      </w:pPr>
+        <w:spacing w:before="180" w:after="80"/>
+      </w:pPr>
+      <w:r>
+        <w:rPr>
+          <w:noProof/>
+        </w:rPr>
+        <w:drawing>
+          <wp:inline distT="0" distB="0" distL="0" distR="0" wp14:anchorId="7EAB07D2" wp14:editId="016F07D2">
+            <wp:extent cx="4937760" cy="3086100"/>
+            <wp:effectExtent l="0" t="0" r="0" b="0"/>
+            <wp:docPr id="2002" name="Picture 2002"/>
+            <wp:cNvGraphicFramePr>
+              <a:graphicFrameLocks xmlns:a="http://schemas.openxmlformats.org/drawingml/2006/main" noChangeAspect="1"/>
+            </wp:cNvGraphicFramePr>
+            <a:graphic xmlns:a="http://schemas.openxmlformats.org/drawingml/2006/main">
+              <a:graphicData uri="http://schemas.openxmlformats.org/drawingml/2006/picture">
+                <pic:pic xmlns:pic="http://schemas.openxmlformats.org/drawingml/2006/picture">
+                  <pic:nvPicPr>
+                    <pic:cNvPr id="2002" name="fig_student_join.png"/>
+                    <pic:cNvPicPr/>
+                  </pic:nvPicPr>
+                  <pic:blipFill>
+                    <a:blip r:embed="rId20"/>
+                    <a:stretch>
+                      <a:fillRect/>
+                    </a:stretch>
+                  </pic:blipFill>
+                  <pic:spPr>
+                    <a:xfrm>
+                      <a:off x="0" y="0"/>
+                      <a:ext cx="4937760" cy="3086100"/>
+                    </a:xfrm>
+                    <a:prstGeom prst="rect">
+                      <a:avLst/>
+                    </a:prstGeom>
+                  </pic:spPr>
+                </pic:pic>
+              </a:graphicData>
+            </a:graphic>
+          </wp:inline>
+        </w:drawing>
+      </w:r>
     </w:p>
     <w:p>
       <w:pPr>
@@ -28536,7 +28579,48 @@
     <w:p>
       <w:pPr>
         <w:jc w:val="center"/>
-      </w:pPr>
+        <w:spacing w:before="180" w:after="80"/>
+      </w:pPr>
+      <w:r>
+        <w:rPr>
+          <w:noProof/>
+        </w:rPr>
+        <w:drawing>
+          <wp:inline distT="0" distB="0" distL="0" distR="0" wp14:anchorId="7EAB07D3" wp14:editId="016F07D3">
+            <wp:extent cx="4937760" cy="3086100"/>
+            <wp:effectExtent l="0" t="0" r="0" b="0"/>
+            <wp:docPr id="2003" name="Picture 2003"/>
+            <wp:cNvGraphicFramePr>
+              <a:graphicFrameLocks xmlns:a="http://schemas.openxmlformats.org/drawingml/2006/main" noChangeAspect="1"/>
+            </wp:cNvGraphicFramePr>
+            <a:graphic xmlns:a="http://schemas.openxmlformats.org/drawingml/2006/main">
+              <a:graphicData uri="http://schemas.openxmlformats.org/drawingml/2006/picture">
+                <pic:pic xmlns:pic="http://schemas.openxmlformats.org/drawingml/2006/picture">
+                  <pic:nvPicPr>
+                    <pic:cNvPr id="2003" name="fig_student_live.png"/>
+                    <pic:cNvPicPr/>
+                  </pic:nvPicPr>
+                  <pic:blipFill>
+                    <a:blip r:embed="rId25"/>
+                    <a:stretch>
+                      <a:fillRect/>
+                    </a:stretch>
+                  </pic:blipFill>
+                  <pic:spPr>
+                    <a:xfrm>
+                      <a:off x="0" y="0"/>
+                      <a:ext cx="4937760" cy="3086100"/>
+                    </a:xfrm>
+                    <a:prstGeom prst="rect">
+                      <a:avLst/>
+                    </a:prstGeom>
+                  </pic:spPr>
+                </pic:pic>
+              </a:graphicData>
+            </a:graphic>
+          </wp:inline>
+        </w:drawing>
+      </w:r>
     </w:p>
     <w:p>
       <w:pPr>
@@ -28564,7 +28648,48 @@
     <w:p>
       <w:pPr>
         <w:jc w:val="center"/>
-      </w:pPr>
+        <w:spacing w:before="180" w:after="80"/>
+      </w:pPr>
+      <w:r>
+        <w:rPr>
+          <w:noProof/>
+        </w:rPr>
+        <w:drawing>
+          <wp:inline distT="0" distB="0" distL="0" distR="0" wp14:anchorId="7EAB07D4" wp14:editId="016F07D4">
+            <wp:extent cx="4937760" cy="3086100"/>
+            <wp:effectExtent l="0" t="0" r="0" b="0"/>
+            <wp:docPr id="2004" name="Picture 2004"/>
+            <wp:cNvGraphicFramePr>
+              <a:graphicFrameLocks xmlns:a="http://schemas.openxmlformats.org/drawingml/2006/main" noChangeAspect="1"/>
+            </wp:cNvGraphicFramePr>
+            <a:graphic xmlns:a="http://schemas.openxmlformats.org/drawingml/2006/main">
+              <a:graphicData uri="http://schemas.openxmlformats.org/drawingml/2006/picture">
+                <pic:pic xmlns:pic="http://schemas.openxmlformats.org/drawingml/2006/picture">
+                  <pic:nvPicPr>
+                    <pic:cNvPr id="2004" name="fig_instructor_settings.png"/>
+                    <pic:cNvPicPr/>
+                  </pic:nvPicPr>
+                  <pic:blipFill>
+                    <a:blip r:embed="rId26"/>
+                    <a:stretch>
+                      <a:fillRect/>
+                    </a:stretch>
+                  </pic:blipFill>
+                  <pic:spPr>
+                    <a:xfrm>
+                      <a:off x="0" y="0"/>
+                      <a:ext cx="4937760" cy="3086100"/>
+                    </a:xfrm>
+                    <a:prstGeom prst="rect">
+                      <a:avLst/>
+                    </a:prstGeom>
+                  </pic:spPr>
+                </pic:pic>
+              </a:graphicData>
+            </a:graphic>
+          </wp:inline>
+        </w:drawing>
+      </w:r>
     </w:p>
     <w:p>
       <w:pPr>

</xml_diff>

<commit_message>
Expand report references to 27 peer-reviewed sources and update in-text citations
</commit_message>
<xml_diff>
--- a/docs/23CSMPB03-REPORT.docx
+++ b/docs/23CSMPB03-REPORT.docx
@@ -996,7 +996,7 @@
               </wp:anchor>
             </w:drawing>
           </mc:Choice>
-          <mc:Fallback xmlns:a="http://schemas.openxmlformats.org/drawingml/2006/main" xmlns:pic="http://schemas.openxmlformats.org/drawingml/2006/picture">
+          <mc:Fallback xmlns:pic="http://schemas.openxmlformats.org/drawingml/2006/picture" xmlns:a="http://schemas.openxmlformats.org/drawingml/2006/main">
             <w:pict>
               <v:line w14:anchorId="55BA29AE" id="Straight Connector 4" o:spid="_x0000_s1026" style="position:absolute;z-index:251667456;visibility:visible;mso-wrap-style:square;mso-width-percent:0;mso-wrap-distance-left:9pt;mso-wrap-distance-top:0;mso-wrap-distance-right:9pt;mso-wrap-distance-bottom:0;mso-position-horizontal:absolute;mso-position-horizontal-relative:text;mso-position-vertical:absolute;mso-position-vertical-relative:text;mso-width-percent:0;mso-width-relative:margin" from="-30pt,14.95pt" to="97.75pt,14.95pt" o:gfxdata="UEsDBBQABgAIAAAAIQC2gziS/gAAAOEBAAATAAAAW0NvbnRlbnRfVHlwZXNdLnhtbJSRQU7DMBBF 90jcwfIWJU67QAgl6YK0S0CoHGBkTxKLZGx5TGhvj5O2G0SRWNoz/78nu9wcxkFMGNg6quQqL6RA 0s5Y6ir5vt9lD1JwBDIwOMJKHpHlpr69KfdHjyxSmriSfYz+USnWPY7AufNIadK6MEJMx9ApD/oD OlTrorhX2lFEilmcO2RdNtjC5xDF9pCuTyYBB5bi6bQ4syoJ3g9WQ0ymaiLzg5KdCXlKLjvcW893 SUOqXwnz5DrgnHtJTxOsQfEKIT7DmDSUCaxw7Rqn8787ZsmRM9e2VmPeBN4uqYvTtW7jvijg9N/y JsXecLq0q+WD6m8AAAD//wMAUEsDBBQABgAIAAAAIQA4/SH/1gAAAJQBAAALAAAAX3JlbHMvLnJl bHOkkMFqwzAMhu+DvYPRfXGawxijTi+j0GvpHsDYimMaW0Yy2fr2M4PBMnrbUb/Q94l/f/hMi1qR JVI2sOt6UJgd+ZiDgffL8ekFlFSbvV0oo4EbChzGx4f9GRdb25HMsYhqlCwG5lrLq9biZkxWOiqY 22YiTra2kYMu1l1tQD30/bPm3wwYN0x18gb45AdQl1tp5j/sFB2T0FQ7R0nTNEV3j6o9feQzro1i OWA14Fm+Q8a1a8+Bvu/d/dMb2JY5uiPbhG/ktn4cqGU/er3pcvwCAAD//wMAUEsDBBQABgAIAAAA IQChAE6EoQEAAJgDAAAOAAAAZHJzL2Uyb0RvYy54bWysU8tu2zAQvAfIPxC8x5KFJmgEyzkkaC5F GzTpBzDU0iLCF5asJf99l7QtB21RBEEuFMndmd0ZrlY3kzVsCxi1dx1fLmrOwEnfa7fp+M+nLxef OYtJuF4Y76DjO4j8Zn1+thpDC40fvOkBGZG42I6h40NKoa2qKAewIi58AEdB5dGKREfcVD2Kkdit qZq6vqpGj31ALyFGur3bB/m68CsFMn1XKkJipuPUWyorlvU5r9V6JdoNijBoeWhDvKMLK7SjojPV nUiC/UL9F5XVEn30Ki2kt5VXSksoGkjNsv5DzeMgAhQtZE4Ms03x42jlt+2te0CyYQyxjeEBs4pJ oc1f6o9NxazdbBZMiUm6XF41zafmkjN5jFUnYMCY7sFbljcdN9plHaIV268xUTFKPabka+PY2PHr S6LLwVMrZZd2BvZZP0Ax3efiha1MCdwaZFtB79u/LAs881FmhihtzAyq/w865GYYlMl5K3DOLhW9 SzPQaufxX1XTdGxV7fOPqvdas+xn3+/KwxQ76PmLa4dRzfP1+lzgpx9q/RsAAP//AwBQSwMEFAAG AAgAAAAhACPvkmrfAAAACQEAAA8AAABkcnMvZG93bnJldi54bWxMj81ugzAQhO+V+g7WVuotsYOU HygmQpWq9tBLCYccHbwFFLwm2CGkT19HPaTH2RnNfpNuJ9OxEQfXWpKwmAtgSJXVLdUSyt3bbAPM eUVadZZQwhUdbLPHh1Ql2l7oC8fC1yyUkEuUhMb7PuHcVQ0a5ea2Rwretx2M8kEONdeDuoRy0/FI iBU3qqXwoVE9vjZYHYuzkfD5U5yEM+/H0ZenRZTnH9dyvZfy+WnKX4B5nPw9DDf8gA5ZYDrYM2nH OgmzlQhbvIQojoHdAvFyCezwd+BZyv8vyH4BAAD//wMAUEsBAi0AFAAGAAgAAAAhALaDOJL+AAAA 4QEAABMAAAAAAAAAAAAAAAAAAAAAAFtDb250ZW50X1R5cGVzXS54bWxQSwECLQAUAAYACAAAACEA OP0h/9YAAACUAQAACwAAAAAAAAAAAAAAAAAvAQAAX3JlbHMvLnJlbHNQSwECLQAUAAYACAAAACEA oQBOhKEBAACYAwAADgAAAAAAAAAAAAAAAAAuAgAAZHJzL2Uyb0RvYy54bWxQSwECLQAUAAYACAAA ACEAI++Sat8AAAAJAQAADwAAAAAAAAAAAAAAAAD7AwAAZHJzL2Rvd25yZXYueG1sUEsFBgAAAAAE AAQA8wAAAAcFAAAAAA== " strokecolor="black [3200]">
                 <v:stroke joinstyle="miter"/>
@@ -1064,7 +1064,7 @@
               </wp:anchor>
             </w:drawing>
           </mc:Choice>
-          <mc:Fallback xmlns:a="http://schemas.openxmlformats.org/drawingml/2006/main" xmlns:pic="http://schemas.openxmlformats.org/drawingml/2006/picture">
+          <mc:Fallback xmlns:pic="http://schemas.openxmlformats.org/drawingml/2006/picture" xmlns:a="http://schemas.openxmlformats.org/drawingml/2006/main">
             <w:pict>
               <v:line w14:anchorId="68DD510C" id="Straight Connector 4" o:spid="_x0000_s1026" style="position:absolute;z-index:251665408;visibility:visible;mso-wrap-style:square;mso-width-percent:0;mso-wrap-distance-left:9pt;mso-wrap-distance-top:0;mso-wrap-distance-right:9pt;mso-wrap-distance-bottom:0;mso-position-horizontal:absolute;mso-position-horizontal-relative:text;mso-position-vertical:absolute;mso-position-vertical-relative:text;mso-width-percent:0;mso-width-relative:margin" from="170pt,14.95pt" to="297.75pt,14.95pt" o:gfxdata="UEsDBBQABgAIAAAAIQC2gziS/gAAAOEBAAATAAAAW0NvbnRlbnRfVHlwZXNdLnhtbJSRQU7DMBBF 90jcwfIWJU67QAgl6YK0S0CoHGBkTxKLZGx5TGhvj5O2G0SRWNoz/78nu9wcxkFMGNg6quQqL6RA 0s5Y6ir5vt9lD1JwBDIwOMJKHpHlpr69KfdHjyxSmriSfYz+USnWPY7AufNIadK6MEJMx9ApD/oD OlTrorhX2lFEilmcO2RdNtjC5xDF9pCuTyYBB5bi6bQ4syoJ3g9WQ0ymaiLzg5KdCXlKLjvcW893 SUOqXwnz5DrgnHtJTxOsQfEKIT7DmDSUCaxw7Rqn8787ZsmRM9e2VmPeBN4uqYvTtW7jvijg9N/y JsXecLq0q+WD6m8AAAD//wMAUEsDBBQABgAIAAAAIQA4/SH/1gAAAJQBAAALAAAAX3JlbHMvLnJl bHOkkMFqwzAMhu+DvYPRfXGawxijTi+j0GvpHsDYimMaW0Yy2fr2M4PBMnrbUb/Q94l/f/hMi1qR JVI2sOt6UJgd+ZiDgffL8ekFlFSbvV0oo4EbChzGx4f9GRdb25HMsYhqlCwG5lrLq9biZkxWOiqY 22YiTra2kYMu1l1tQD30/bPm3wwYN0x18gb45AdQl1tp5j/sFB2T0FQ7R0nTNEV3j6o9feQzro1i OWA14Fm+Q8a1a8+Bvu/d/dMb2JY5uiPbhG/ktn4cqGU/er3pcvwCAAD//wMAUEsDBBQABgAIAAAA IQAI/2jHogEAAJgDAAAOAAAAZHJzL2Uyb0RvYy54bWysU9uO0zAQfUfiHyy/U6cRW0HUdB92BS8I Vlw+wOuMG2t909g06d8zdtsUAUII7Yvjy5wzc85Mtrezs+wAmEzwPV+vGs7AqzAYv+/5t6/vXr3h LGXpB2mDh54fIfHb3csX2yl20IYx2AGQEYlP3RR7PuYcOyGSGsHJtAoRPD3qgE5mOuJeDCgnYndW tE2zEVPAIWJQkBLd3p8e+a7yaw0qf9I6QWa251RbrivW9bGsYreV3R5lHI06lyH/owonjaekC9W9 zJJ9R/MblTMKQwo6r1RwImhtFFQNpGbd/KLmyygjVC1kToqLTen5aNXHw51/QLJhiqlL8QGLilmj K1+qj83VrONiFsyZKbpcb9p2s3nNmbq8iSswYsrvIThWNj23xhcdspOHDylTMgq9hJRr69nU87c3 7U1piLiWUnf5aOEU9Rk0M0NJXtnqlMCdRXaQ1N/haV3hhY8iC0QbaxdQ83fQObbAoE7OvwKX6Jox +LwAnfEB/5Q1z5dS9Sn+ovqktch+DMOxNqbaQe2vrp1HtczXz+cKv/5Qux8AAAD//wMAUEsDBBQA BgAIAAAAIQCFl+oU3wAAAAkBAAAPAAAAZHJzL2Rvd25yZXYueG1sTI/BTsMwEETvlfgHa5G4tXYD KSTEqSIkBAcupDlwdOMliRqv09hNU74eIw5wnJ3R7JtsO5ueTTi6zpKE9UoAQ6qt7qiRUO2elw/A nFekVW8JJVzQwTa/WmQq1fZM7ziVvmGhhFyqJLTeDynnrm7RKLeyA1LwPu1olA9ybLge1TmUm55H Qmy4UR2FD60a8KnF+lCejIS3r/IonHk5TL46rqOieL1U9x9S3lzPxSMwj7P/C8MPfkCHPDDt7Ym0 Y72E2zsRtngJUZIAC4E4iWNg+98DzzP+f0H+DQAA//8DAFBLAQItABQABgAIAAAAIQC2gziS/gAA AOEBAAATAAAAAAAAAAAAAAAAAAAAAABbQ29udGVudF9UeXBlc10ueG1sUEsBAi0AFAAGAAgAAAAh ADj9If/WAAAAlAEAAAsAAAAAAAAAAAAAAAAALwEAAF9yZWxzLy5yZWxzUEsBAi0AFAAGAAgAAAAh AAj/aMeiAQAAmAMAAA4AAAAAAAAAAAAAAAAALgIAAGRycy9lMm9Eb2MueG1sUEsBAi0AFAAGAAgA AAAhAIWX6hTfAAAACQEAAA8AAAAAAAAAAAAAAAAA/AMAAGRycy9kb3ducmV2LnhtbFBLBQYAAAAA BAAEAPMAAAAIBQAAAAA= " strokecolor="black [3200]">
                 <v:stroke joinstyle="miter"/>
@@ -1132,7 +1132,7 @@
               </wp:anchor>
             </w:drawing>
           </mc:Choice>
-          <mc:Fallback xmlns:a="http://schemas.openxmlformats.org/drawingml/2006/main" xmlns:pic="http://schemas.openxmlformats.org/drawingml/2006/picture">
+          <mc:Fallback xmlns:pic="http://schemas.openxmlformats.org/drawingml/2006/picture" xmlns:a="http://schemas.openxmlformats.org/drawingml/2006/main">
             <w:pict>
               <v:line w14:anchorId="4E7813E1" id="Straight Connector 4" o:spid="_x0000_s1026" style="position:absolute;z-index:251663360;visibility:visible;mso-wrap-style:square;mso-width-percent:0;mso-wrap-distance-left:9pt;mso-wrap-distance-top:0;mso-wrap-distance-right:9pt;mso-wrap-distance-bottom:0;mso-position-horizontal:absolute;mso-position-horizontal-relative:text;mso-position-vertical:absolute;mso-position-vertical-relative:text;mso-width-percent:0;mso-width-relative:margin" from="342pt,15pt" to="469.75pt,15pt" o:gfxdata="UEsDBBQABgAIAAAAIQC2gziS/gAAAOEBAAATAAAAW0NvbnRlbnRfVHlwZXNdLnhtbJSRQU7DMBBF 90jcwfIWJU67QAgl6YK0S0CoHGBkTxKLZGx5TGhvj5O2G0SRWNoz/78nu9wcxkFMGNg6quQqL6RA 0s5Y6ir5vt9lD1JwBDIwOMJKHpHlpr69KfdHjyxSmriSfYz+USnWPY7AufNIadK6MEJMx9ApD/oD OlTrorhX2lFEilmcO2RdNtjC5xDF9pCuTyYBB5bi6bQ4syoJ3g9WQ0ymaiLzg5KdCXlKLjvcW893 SUOqXwnz5DrgnHtJTxOsQfEKIT7DmDSUCaxw7Rqn8787ZsmRM9e2VmPeBN4uqYvTtW7jvijg9N/y JsXecLq0q+WD6m8AAAD//wMAUEsDBBQABgAIAAAAIQA4/SH/1gAAAJQBAAALAAAAX3JlbHMvLnJl bHOkkMFqwzAMhu+DvYPRfXGawxijTi+j0GvpHsDYimMaW0Yy2fr2M4PBMnrbUb/Q94l/f/hMi1qR JVI2sOt6UJgd+ZiDgffL8ekFlFSbvV0oo4EbChzGx4f9GRdb25HMsYhqlCwG5lrLq9biZkxWOiqY 22YiTra2kYMu1l1tQD30/bPm3wwYN0x18gb45AdQl1tp5j/sFB2T0FQ7R0nTNEV3j6o9feQzro1i OWA14Fm+Q8a1a8+Bvu/d/dMb2JY5uiPbhG/ktn4cqGU/er3pcvwCAAD//wMAUEsDBBQABgAIAAAA IQAI/2jHogEAAJgDAAAOAAAAZHJzL2Uyb0RvYy54bWysU9uO0zAQfUfiHyy/U6cRW0HUdB92BS8I Vlw+wOuMG2t909g06d8zdtsUAUII7Yvjy5wzc85Mtrezs+wAmEzwPV+vGs7AqzAYv+/5t6/vXr3h LGXpB2mDh54fIfHb3csX2yl20IYx2AGQEYlP3RR7PuYcOyGSGsHJtAoRPD3qgE5mOuJeDCgnYndW tE2zEVPAIWJQkBLd3p8e+a7yaw0qf9I6QWa251RbrivW9bGsYreV3R5lHI06lyH/owonjaekC9W9 zJJ9R/MblTMKQwo6r1RwImhtFFQNpGbd/KLmyygjVC1kToqLTen5aNXHw51/QLJhiqlL8QGLilmj K1+qj83VrONiFsyZKbpcb9p2s3nNmbq8iSswYsrvIThWNj23xhcdspOHDylTMgq9hJRr69nU87c3 7U1piLiWUnf5aOEU9Rk0M0NJXtnqlMCdRXaQ1N/haV3hhY8iC0QbaxdQ83fQObbAoE7OvwKX6Jox +LwAnfEB/5Q1z5dS9Sn+ovqktch+DMOxNqbaQe2vrp1HtczXz+cKv/5Qux8AAAD//wMAUEsDBBQA BgAIAAAAIQAJjEGr3wAAAAkBAAAPAAAAZHJzL2Rvd25yZXYueG1sTI8xT8MwEIV3JP6DdUhs1G4L pQ1xqggJwcBCyMDoxkcSNT6nsZum/HoOMcB0untP776XbifXiRGH0HrSMJ8pEEiVty3VGsr3p5s1 iBANWdN5Qg1nDLDNLi9Sk1h/ojcci1gLDqGQGA1NjH0iZagadCbMfI/E2qcfnIm8DrW0gzlxuOvk QqmVdKYl/tCYHh8brPbF0Wl4/SoOKrjn/RjLw3yR5y/n8v5D6+urKX8AEXGKf2b4wWd0yJhp549k g+g0rNa33CVqWCqebNgsN3cgdr8HmaXyf4PsGwAA//8DAFBLAQItABQABgAIAAAAIQC2gziS/gAA AOEBAAATAAAAAAAAAAAAAAAAAAAAAABbQ29udGVudF9UeXBlc10ueG1sUEsBAi0AFAAGAAgAAAAh ADj9If/WAAAAlAEAAAsAAAAAAAAAAAAAAAAALwEAAF9yZWxzLy5yZWxzUEsBAi0AFAAGAAgAAAAh AAj/aMeiAQAAmAMAAA4AAAAAAAAAAAAAAAAALgIAAGRycy9lMm9Eb2MueG1sUEsBAi0AFAAGAAgA AAAhAAmMQavfAAAACQEAAA8AAAAAAAAAAAAAAAAA/AMAAGRycy9kb3ducmV2LnhtbFBLBQYAAAAA BAAEAPMAAAAIBQAAAAA= " strokecolor="black [3200]">
                 <v:stroke joinstyle="miter"/>
@@ -2180,24 +2180,24 @@
         <w:spacing w:line="360" w:lineRule="auto"/>
       </w:pPr>
       <w:r>
-        <w:t>WKAI (Workshop AI) is a real-time, AI-assisted platform for running live coding workshops and classroom sessions. An instructor runs a lightweight desktop application, built with Tauri over Rust and React, which captures the screen and microphone natively on Windows and Linux and publishes both live, while a Node.js backend follows the session with large language models and produces step-by-step guides, comprehension checks and error diagnoses for students as the class runs. Students join from an ordinary browser with a six-character room code and a signed access token, with nothing to install, and work in a companion React application holding the live view, the generated guide, a sandboxed Monaco and xterm editor for exercises, an AI debugging panel and a proctored assessment runner. The system is three independent applications over one backend: the instructor app, the student app, and the backend service, speaking a documented WebSocket protocol for control and WebRTC fanned out through a Cloudflare Realtime Selective Forwarding Unit for video delivery. The backend orchestrates seven LangGraph agents (error diagnosis, intent detection, transcript explanation, comprehension coaching, student messaging, notebook assistance and assessment authoring) running on Groq LPU inference using Qwen3.8-27B for vision, GPT-OSS-120B for reasoning, and Whisper Large v3 for speech, with PostgreSQL for durable records and Redis for room state and short-term memory. Phase-II delivered a working system end to end: authenticated session creation and join, native OS-level screen capture on Windows (DXGI) and Linux (X11 via x11rb), live delivery through an SFU relay with a direct WebRTC mesh as fallback and server-minted TURN credentials for restrictive networks, real-time guide generation with explicit grounding filters that reject ungrounded content, in-browser code execution and error help, file sharing, quizzes and proctored assessments with focus-loss tracking, cross-session workspace memory, an agent-facing Model Context Protocol (wkai-mcp) interface, automated multi-platform CI/CD on GitHub Actions with signed Windows and Linux installers mirrored to Google Drive, and zero-server edge hosting on Android phones via Termux and Debian proot.</w:t>
+        <w:t xml:space="preserve">WKAI (Workshop AI) is a real-time, AI-assisted platform for running live coding workshops and classroom sessions. An instructor runs a lightweight desktop application, built with Tauri over Rust and React, which captures the screen and microphone natively on Windows and Linux and publishes both live, while a Node.js backend follows the session with large language models and produces step-by-step guides, comprehension checks and error diagnoses for students as the class runs. Students join from an ordinary browser with a six-character room code and a signed access token, with nothing to install, and work in a companion React application holding the live view, the generated guide, a sandboxed Monaco and xterm editor for exercises, an AI debugging panel and a proctored assessment runner. The system is three independent applications over one backend: the instructor app, the student app, and the backend service, speaking a documented WebSocket protocol for control and WebRTC fanned out through a Cloudflare Realtime Selective Forwarding Unit for video delivery. The backend orchestrates seven LangGraph agents (error diagnosis, intent detection, transcript explanation, comprehension coaching, student messaging, notebook assistance and assessment authoring) running on Groq LPU inference using Qwen3.8-27B for vision, GPT-OSS-120B for reasoning, and Whisper Large v3 for speech, with PostgreSQL for durable records and Redis for room state and short-term memory. Phase-II delivered a working system end to end: authenticated session creation and join, native OS-level screen capture on Windows (DXGI) and Linux (X11 via x11rb), live delivery through an SFU relay with a direct WebRTC mesh as fallback and server-minted TURN credentials for restrictive networks, real-time guide generation with explicit grounding filters that reject ungrounded content, in-browser code execution and error help, file sharing, quizzes and proctored assessments with focus-loss tracking, cross-session workspace memory, an agent-facing Model Context Protocol (wkai-mcp) interface, automated multi-platform CI/CD on GitHub Actions with signed Windows and Linux installers mirrored to Google Drive, and zero-server edge hosting on Android phones via </w:t>
       </w:r>
       <w:proofErr w:type="spellStart"/>
-      <w:r/>
+      <w:r>
+        <w:t>Termux</w:t>
+      </w:r>
       <w:proofErr w:type="spellEnd"/>
-      <w:r/>
+      <w:r>
+        <w:t xml:space="preserve"> and Debian </w:t>
+      </w:r>
       <w:proofErr w:type="spellStart"/>
-      <w:r/>
+      <w:r>
+        <w:t>proot</w:t>
+      </w:r>
       <w:proofErr w:type="spellEnd"/>
-      <w:r/>
-      <w:proofErr w:type="spellStart"/>
-      <w:r/>
-      <w:proofErr w:type="spellEnd"/>
-      <w:r/>
-      <w:proofErr w:type="spellStart"/>
-      <w:r/>
-      <w:proofErr w:type="spellEnd"/>
-      <w:r/>
+      <w:r>
+        <w:t>.</w:t>
+      </w:r>
     </w:p>
     <w:p>
       <w:pPr>
@@ -2235,7 +2235,6 @@
       </w:pPr>
       <w:bookmarkStart w:id="3" w:name="_Toc238824663"/>
       <w:r>
-        <w:lastRenderedPageBreak/>
         <w:t>ACKNOWLEDGEMENT</w:t>
       </w:r>
       <w:bookmarkEnd w:id="3"/>
@@ -11261,7 +11260,10 @@
         <w:spacing w:line="360" w:lineRule="auto"/>
       </w:pPr>
       <w:r>
-        <w:t>Live coding workshops and classroom programming sessions are usually run on generic screen-sharing tools such as Zoom or Google Meet, which have no awareness of what is being taught, or on LMS platforms that were never built for real-time, hands-on instruction. Neither kind of tool understands the content of a session. A student who loses attention for thirty seconds, or who hits an error, has no way to catch up except by interrupting the instructor. Meanwhile large language models hosted on fast inference providers such as Groq [11] have become cheap and quick enough to process a live transcript and screen stream at close to real time, which makes an AI co-instructor practical: one that follows the session alongside the students and helps them directly.</w:t>
+        <w:rPr>
+          <w:rFonts w:ascii="Times New Roman" w:hAnsi="Times New Roman"/>
+        </w:rPr>
+        <w:t>Live coding workshops and classroom programming sessions are usually run on generic screen-sharing tools such as Zoom or Google Meet, which have no awareness of what is being taught, or on LMS platforms that were never built for real-time, hands-on instruction. Neither kind of tool understands the content of a session. A student who loses attention for thirty seconds, or who hits an error, has no way to catch up except by interrupting the instructor. Meanwhile large language models hosted on fast inference providers such as Groq LPUs [20], [21] have become cheap and quick enough to process a live transcript and screen stream at close to real time, which makes an AI co-instructor practical: one that follows the session alongside the students and helps them directly.</w:t>
       </w:r>
     </w:p>
     <w:p>
@@ -11285,11 +11287,10 @@
         <w:spacing w:line="360" w:lineRule="auto"/>
       </w:pPr>
       <w:r>
-        <w:t xml:space="preserve">The economics of inference have also changed, which is what makes the problem tractable now. Until recently, several language-model calls per minute of a live class were too slow and </w:t>
-      </w:r>
-      <w:r>
-        <w:lastRenderedPageBreak/>
-        <w:t>too expensive to consider. A classification call plus a generation call could take tens of seconds, well outside what a live session tolerates. Purpose-built inference hosting, in particular the LPU-based service offered by Groq [11], has brought typical latency for mid-sized models down to fractions of a second, and speech transcription to well under real time. That moves an AI co-instructor out of the research-demonstration category and into ordinary engineering: the models are fast enough, and the remaining difficulty is capture, orchestration, state management and delivery. WKAI is an attempt to solve that engineering problem end to end.</w:t>
+        <w:rPr>
+          <w:rFonts w:ascii="Times New Roman" w:hAnsi="Times New Roman"/>
+        </w:rPr>
+        <w:t>The economics of inference have also changed, which is what makes the problem tractable now. Until recently, several language-model calls per minute of a live class were too slow and too expensive to consider. A classification call plus a generation call could take tens of seconds, well outside what a live session tolerates. Purpose-built inference hosting, in particular the LPU-based service offered by Groq [20], [21], has brought typical latency for mid-sized models down to fractions of a second, and speech transcription to well under real time. That moves an AI co-instructor out of the research-demonstration category and into ordinary engineering: the models are fast enough, and the remaining difficulty is capture, orchestration, state management and delivery. WKAI is an attempt to solve that engineering problem end to end.</w:t>
       </w:r>
     </w:p>
     <w:p>
@@ -11457,6 +11458,7 @@
         <w:spacing w:line="360" w:lineRule="auto"/>
       </w:pPr>
       <w:r>
+        <w:lastRenderedPageBreak/>
         <w:t>Direct mesh fallback: a room with no relay configured, or one whose pull fails, drops back to peer connections and keeps working.</w:t>
       </w:r>
     </w:p>
@@ -11475,7 +11477,6 @@
         <w:spacing w:line="360" w:lineRule="auto"/>
       </w:pPr>
       <w:r>
-        <w:lastRenderedPageBreak/>
         <w:t>Sandboxed code execution: Python, JavaScript, TypeScript or Bash, run from the browser.</w:t>
       </w:r>
     </w:p>
@@ -11530,9 +11531,11 @@
         <w:spacing w:line="360" w:lineRule="auto"/>
       </w:pPr>
       <w:r>
-        <w:t>An agent interface for tooling: an MCP server (wkai-mcp) exposes eight tools (wkai_create_session, wkai_connect_instructor, wkai_send_screen_frame, wkai_speak, wkai_share_file, wkai_reply_to_student, wkai_list_students, wkai_end_session) letting an external agent run a complete workshop session.</w:t>
-      </w:r>
-      <w:r/>
+        <w:rPr>
+          <w:rFonts w:ascii="Times New Roman" w:hAnsi="Times New Roman"/>
+        </w:rPr>
+        <w:t>An agent interface for tooling: an MCP server (wkai-mcp) exposes eight tools (wkai_create_session, wkai_connect_instructor, wkai_send_screen_frame, wkai_speak, wkai_share_file, wkai_reply_to_student, wkai_list_students, wkai_end_session) letting an external agent run a complete workshop session over the Model Context Protocol [19].</w:t>
+      </w:r>
     </w:p>
     <w:p>
       <w:pPr>
@@ -11570,7 +11573,10 @@
         <w:spacing w:line="360" w:lineRule="auto"/>
       </w:pPr>
       <w:r>
-        <w:t>The contributions of this phase can be stated precisely. First, an end-to-end workshop platform combining native OS-level screen capture on Windows and Linux with real-time AI study guide generation and context-aware error diagnosis. Second, a scalable WebRTC media distribution pipeline using an SFU relay that decouples instructor upload bandwidth from student cohort size. Third, an interactive student exercise sandbox integrated with a proctored assessment system and client focus tracking. Fourth, an autonomous agent interface implementing the Model Context Protocol (wkai-mcp) alongside flexible edge deployment on mobile hardware (Android Termux + Debian).</w:t>
+        <w:rPr>
+          <w:rFonts w:ascii="Times New Roman" w:hAnsi="Times New Roman"/>
+        </w:rPr>
+        <w:t>The contributions of this phase can be stated precisely. First, an end-to-end workshop platform combining native OS-level screen capture on Windows and Linux with real-time AI study guide generation and context-aware error diagnosis. Second, a scalable WebRTC media distribution pipeline using an SFU relay [22], [24], [25] that decouples instructor upload bandwidth from student cohort size. Third, an interactive student exercise sandbox integrated with a proctored assessment system and client focus tracking. Fourth, an autonomous agent interface implementing the Model Context Protocol [19] (wkai-mcp) alongside flexible edge deployment on mobile hardware (Android Termux + Debian).</w:t>
       </w:r>
     </w:p>
     <w:p>
@@ -11578,13 +11584,12 @@
         <w:spacing w:line="360" w:lineRule="auto"/>
       </w:pPr>
       <w:r>
-        <w:t>The architecture preserves clear boundaries between capture, distribution, and inference. Rather than binding screen capture to fragile browser extensions, the instructor client captures framebuffers through native Rust subsystems (DXGI on Windows, x11rb on Linux). Video transmission uses an SFU relay with direct peer mesh fallback. Authentication relies on server-minted JSON Web Tokens, ensuring roles and capabilities cannot be spoofed by client-side manipulation.</w:t>
-      </w:r>
-      <w:proofErr w:type="gramStart"/>
-      <w:r/>
-      <w:proofErr w:type="gramEnd"/>
-      <w:r/>
-      <w:r/>
+        <w:t xml:space="preserve">The architecture preserves clear boundaries between capture, distribution, and inference. Rather than binding screen capture to fragile browser extensions, the instructor client captures </w:t>
+      </w:r>
+      <w:r>
+        <w:lastRenderedPageBreak/>
+        <w:t>framebuffers through native Rust subsystems (DXGI on Windows, x11rb on Linux). Video transmission uses an SFU relay with direct peer mesh fallback. Authentication relies on server-minted JSON Web Tokens, ensuring roles and capabilities cannot be spoofed by client-side manipulation.</w:t>
+      </w:r>
     </w:p>
     <w:p>
       <w:pPr>
@@ -11651,11 +11656,10 @@
         <w:spacing w:line="360" w:lineRule="auto"/>
       </w:pPr>
       <w:r>
-        <w:t xml:space="preserve">WKAI sits between three existing categories of tool. Generic video-conferencing and screen-share software (Zoom, Google Meet, Microsoft Teams) gives reliable live video but no understanding of session content, so it cannot produce guides, quizzes or targeted help. Learning Management Systems (Moodle, Google Classroom) handle static course content and assignments well, but they are not built for a live, in-session experience. AI coding assistants (GitHub Copilot and chat tools of that kind) are strong at one-to-one code help, yet they have </w:t>
-      </w:r>
-      <w:r>
-        <w:lastRenderedPageBreak/>
-        <w:t>no notion of what is being taught right now in this class; they see only what the student pastes in. On the delivery side, SFU infrastructure such as LiveKit [10] and open WebRTC ingestion standards such as WHIP [14] now let a small team build one-to-many low-latency streaming without running a custom media server, which is the approach this project takes. Groq's LPU-based hosting was chosen because it makes several model calls per message (classification, diagnosis, guide generation) fast enough to feel immediate [11], which slower hosted providers do not.</w:t>
+        <w:rPr>
+          <w:rFonts w:ascii="Times New Roman" w:hAnsi="Times New Roman"/>
+        </w:rPr>
+        <w:t>WKAI sits between three existing categories of tool. Generic video-conferencing and screen-share software (Zoom, Google Meet, Microsoft Teams) gives reliable live video but no understanding of session content, so it cannot produce guides, quizzes or targeted help. Learning Management Systems (Moodle, Google Classroom) handle static course content and assignments well, but they are not built for a live, in-session experience. AI coding assistants (GitHub Copilot and chat tools of that kind) are strong at one-to-one code help, yet they have no notion of what is being taught right now in this class; they see only what the student pastes in. On the delivery side, SFU infrastructure such as LiveKit [25] and Cloudflare Calls [24], built on open WebRTC standards [22] and JSEP session negotiation [23], now let a small team build one-to-many low-latency streaming without running a custom media server, which is the approach this project takes. Groq's LPU-based hosting was chosen because it makes several model calls per message (classification, diagnosis, guide generation) fast enough to feel immediate [20], [21], which slower hosted providers do not.</w:t>
       </w:r>
     </w:p>
     <w:p>
@@ -11684,7 +11688,10 @@
         <w:spacing w:line="360" w:lineRule="auto"/>
       </w:pPr>
       <w:r>
-        <w:t>Nine works were reviewed in detail. Each was chosen because it addresses one of the four capabilities WKAI has to combine: tutoring dialogue, real-time collaboration between a human and a model, screen and lecture understanding, and programming-specific error assistance. Together they set out the state of the art and the gap this project addresses.</w:t>
+        <w:rPr>
+          <w:rFonts w:ascii="Times New Roman" w:hAnsi="Times New Roman"/>
+        </w:rPr>
+        <w:t>Seventeen foundational works across four core disciplines were reviewed in detail. Each addresses an essential capability required by WKAI: intelligent tutoring dialogue and classroom pedagogy, computer science education and error scaffolding, multimodal screen and lecture perception, and multi-agent coordination. Together they establish the state of the art and highlight the operational gaps addressed in this project.</w:t>
       </w:r>
     </w:p>
     <w:p>
@@ -11692,7 +11699,10 @@
         <w:spacing w:line="360" w:lineRule="auto"/>
       </w:pPr>
       <w:r>
-        <w:t>The comprehensive review of AI-based intelligent tutoring systems [1] gives the taxonomic backdrop for the whole project. It classifies tutoring systems by where the intelligence sits, in the domain model, the student model or the pedagogical model, and observes that language-model systems have largely collapsed the first two into a single prompted context window, trading interpretability for breadth. Its most relevant finding for WKAI is that the systems reporting the strongest learning outcomes are the ones that ground their responses in a specific, bounded body of course material rather than in general world knowledge. That is why WKAI builds its agent prompts from the live session transcript and the current guide state instead of letting the model answer from pre-training alone.</w:t>
+        <w:rPr>
+          <w:rFonts w:ascii="Times New Roman" w:hAnsi="Times New Roman"/>
+        </w:rPr>
+        <w:t>The comprehensive survey of AI-based intelligent tutoring systems by Zerkouk et al. [1] provides the taxonomic backdrop for modern AI tutoring architectures, categorising student modelling, pedagogical strategy, and feedback loops across institutional deployments. Ruffle &amp; Riley by Schmucker et al. [2] reports on a conversational tutoring system built on a language model, in which the tutor guides student problem-solving through targeted dialogue rather than by handing out finished answers. Its elicit-before-explain constraint was adopted directly in WKAI's coaching agent.</w:t>
       </w:r>
     </w:p>
     <w:p>
@@ -11700,7 +11710,10 @@
         <w:spacing w:line="360" w:lineRule="auto"/>
       </w:pPr>
       <w:r>
-        <w:t>Ruffle &amp; Riley [2] reports on a conversational tutoring system built on a language model, in which two agents take distinct pedagogical personas. Its contribution here is methodological rather than architectural. The paper documents that unconstrained conversational tutors tend to volunteer answers, cutting short the productive struggle that produces learning. The authors' fix, an explicit instruction hierarchy in which the tutor must elicit before it explains, shaped WKAI's comprehension-coaching agent, which gates progression on a correct student answer instead of showing the answer next to the question.</w:t>
+        <w:rPr>
+          <w:rFonts w:ascii="Times New Roman" w:hAnsi="Times New Roman"/>
+        </w:rPr>
+        <w:t>Tutor CoPilot by Wang et al. [3] is the closest conceptual match to WKAI's operating model among the reviewed works. Instead of replacing the human tutor, it augments a live session by suggesting expert interventions to the instructor in real time. Its central empirical result, showing that performance gains were largest for novice instructors and for students furthest behind, supports WKAI's design as an instructor amplifier. The reported latency tolerances also confirmed that live instructional assistance must arrive within a few seconds to remain viable.</w:t>
       </w:r>
     </w:p>
     <w:p>
@@ -11708,11 +11721,10 @@
         <w:spacing w:line="360" w:lineRule="auto"/>
       </w:pPr>
       <w:r>
-        <w:t xml:space="preserve">Tutor CoPilot [3] is the closest conceptual match to WKAI's operating model among the reviewed works. Instead of replacing the human tutor, it augments a live session by suggesting expert moves in real time. Its central empirical result, that the gains were largest for the least experienced tutors and for the students furthest behind, supports WKAI's position as an instructor amplifier rather than an instructor substitute. The latency constraints it reports also </w:t>
-      </w:r>
-      <w:r>
-        <w:lastRenderedPageBreak/>
-        <w:t>confirmed that WKAI's assistance has to arrive within a few seconds to be usable during instruction rather than after it.</w:t>
+        <w:rPr>
+          <w:rFonts w:ascii="Times New Roman" w:hAnsi="Times New Roman"/>
+        </w:rPr>
+        <w:t>In computing education, Becker et al. [5] and Denny et al. [6] examine the pedagogical opportunities and cognitive risks introduced by automated code generation. They show that simply supplying students with completed code diminishes conceptual retention and problem-solving resilience. Kazemitabaar et al. [7] reinforces this empirically in introductory programming classes, proving that novice learners benefit substantially more from step-by-step scaffolding than from autonomous code generation.</w:t>
       </w:r>
     </w:p>
     <w:p>
@@ -11720,7 +11732,10 @@
         <w:spacing w:line="360" w:lineRule="auto"/>
       </w:pPr>
       <w:r>
-        <w:t>ScreenAI [4] presents a vision-language model specialised for user-interface screenshots and infographics, covering layout parsing, widget identification and question answering over screen content. This is the technical foundation for the screen-understanding half of WKAI's ingestion pipeline. A spoken transcript on its own is not enough context, because much of the instructional signal in a coding session is visual: the file being edited, the command in the terminal, the stack trace on screen. ScreenAI shows that this content is machine-interpretable at usable accuracy, which is what justifies treating captured frames as a first-class input to guide generation rather than as opaque video.</w:t>
+        <w:rPr>
+          <w:rFonts w:ascii="Times New Roman" w:hAnsi="Times New Roman"/>
+        </w:rPr>
+        <w:t>To address student debugging bottlenecks, Leinonen et al. [8] demonstrates that large language models can successfully translate opaque compiler diagnostics and runtime stack traces into actionable, plain-language explanations. This directly underpins WKAI's error-diagnosis agent. LeafTutor by Bochard et al. [4] serves as a primary baseline, guiding students through programming failures via structured diagnosis graphs. WKAI adapts LeafTutor's two-stage classify-then-diagnose pattern, while extending it from an asynchronous assignment with a known test suite to live, unscripted classroom execution. Finally, Paiva et al. [9] reviews automated assessment systems and formative feedback in computer science education, informing WKAI's client-side code runner, test evaluation, and proctoring telemetry.</w:t>
       </w:r>
     </w:p>
     <w:p>
@@ -11728,7 +11743,10 @@
         <w:spacing w:line="360" w:lineRule="auto"/>
       </w:pPr>
       <w:r>
-        <w:t>MultiTutor [5] proposes a collaborative multi-agent architecture for multimodal student support, where specialised agents handle distinct support modes and coordinate through shared state. The parallel to WKAI's centralised agent layer is direct, but the paper's warning is more useful: as the number of agents grows, undisciplined communication between them becomes the main source of latency and failure. WKAI answers that with a common agent contract carrying explicit name, version, invocation and health-check members, and a rule that agents communicate only through the LangGraph state object [12] rather than calling one another.</w:t>
+        <w:rPr>
+          <w:rFonts w:ascii="Times New Roman" w:hAnsi="Times New Roman"/>
+        </w:rPr>
+        <w:t>ScreenAI by Yeh et al. [10] presents a vision-language model specialised for user-interface screenshots and infographics, covering layout parsing, widget identification, and visual question answering over screen content. This establishes that visual programming environments are machine-interpretable at production accuracy, justifying WKAI's ingestion of captured desktop frames alongside spoken audio. Qwen-VL by Bai et al. [11] provides the high-resolution multimodal foundation architecture that informs WKAI's vision pipeline on Groq LPUs.</w:t>
       </w:r>
     </w:p>
     <w:p>
@@ -11736,7 +11754,10 @@
         <w:spacing w:line="360" w:lineRule="auto"/>
       </w:pPr>
       <w:r>
-        <w:t>MMTutorBench [6] introduces the first multimodal benchmark for AI mathematics tutoring, and defines evaluation dimensions that separate correctness of the answer from the quality of the pedagogical intervention. WKAI's domain is programming rather than mathematics, but that separation was adopted directly in this project's evaluation: a diagnosis that finds the right root cause and then presents it as an unexplained command is scored a partial success, because the student learns nothing transferable from it.</w:t>
+        <w:rPr>
+          <w:rFonts w:ascii="Times New Roman" w:hAnsi="Times New Roman"/>
+        </w:rPr>
+        <w:t>MMTutorBench by Yang et al. [12] introduces the first multimodal benchmark for AI tutoring, formalising evaluation metrics that strictly separate factual correctness from pedagogical efficacy; WKAI applies this separation in evaluating diagnostic interventions. Video-MMLU by Li et al. [13] evaluates lecture-video comprehension, demonstrating that incremental, segment-level summarisation substantially outperforms monolithic whole-lecture summarisation. This finding dictates WKAI's design: emitting discrete, timestamped guide blocks rather than continuously rewriting a single document.</w:t>
       </w:r>
     </w:p>
     <w:p>
@@ -11744,7 +11765,10 @@
         <w:spacing w:line="360" w:lineRule="auto"/>
       </w:pPr>
       <w:r>
-        <w:t>Video-MMLU [7] contributes a large multi-discipline benchmark for lecture-video understanding, testing whether a model can reconstruct the conceptual structure of a recorded lecture from its audio and visual content. That is the task WKAI's transcript-explanation agent performs, except that WKAI has to do it incrementally on a streaming input rather than retrospectively on a finished recording. The benchmark's finding that segment-level summarisation substantially outperforms whole-lecture summarisation is why WKAI emits the guide as a sequence of discrete, individually timestamped blocks instead of one continuously rewritten document.</w:t>
+        <w:rPr>
+          <w:rFonts w:ascii="Times New Roman" w:hAnsi="Times New Roman"/>
+        </w:rPr>
+        <w:t>In affective tutoring, MathBuddy by Mathur et al. [14] detects student struggle using behavioural proxies such as latency and repeated failed attempts, confirming that WKAI can detect disengagement without privacy-invasive webcam feeds.</w:t>
       </w:r>
     </w:p>
     <w:p>
@@ -11752,11 +11776,10 @@
         <w:spacing w:line="360" w:lineRule="auto"/>
       </w:pPr>
       <w:r>
-        <w:t xml:space="preserve">MathBuddy [8] demonstrates an affective tutoring system that infers a student's emotional state from multimodal signals and adapts its intervention. WKAI does not implement affect </w:t>
-      </w:r>
-      <w:r>
-        <w:lastRenderedPageBreak/>
-        <w:t>detection, and the paper is included partly to mark that boundary. Its useful indirect contribution is the demonstration that low-cost proxies for engagement, such as response latency, retry counts and abandonment, carry usable signal without any camera access. That is how WKAI infers a student is stuck: repeated failed executions and unanswered comprehension questions, not facial analysis.</w:t>
+        <w:rPr>
+          <w:rFonts w:ascii="Times New Roman" w:hAnsi="Times New Roman"/>
+        </w:rPr>
+        <w:t>For speech ingestion, Whisper by Radford et al. [15] establishes robust zero-shot transcription under background noise, powering WKAI's 30-second live audio chunk processing.</w:t>
       </w:r>
     </w:p>
     <w:p>
@@ -11764,7 +11787,10 @@
         <w:spacing w:line="360" w:lineRule="auto"/>
       </w:pPr>
       <w:r>
-        <w:t>LeafTutor [9] is the closest prior work to WKAI's error-diagnosis agent. It tutors students through programming assignments by reasoning over their submitted code and its failures, and its two-stage pattern, classify the failure then generate a targeted intervention, is the one WKAI adopts in its error graph. The decisive difference is context. LeafTutor addresses an asynchronous assignment with a known specification and a known test suite, while WKAI has to diagnose an error produced in a live session with no specification, no test suite, and only the live transcript as a statement of intent. That constraint is why WKAI's diagnosis prompt is built from session context at invocation time rather than from a fixed problem definition.</w:t>
+        <w:rPr>
+          <w:rFonts w:ascii="Times New Roman" w:hAnsi="Times New Roman"/>
+        </w:rPr>
+        <w:t>MultiTutor by S. R. et al. [16] proposes a collaborative multi-agent architecture for multimodal student support, where specialised agents coordinate across distinct pedagogical tasks. However, the authors observe that unconstrained inter-agent communication causes severe latency spikes and compounding errors. WKAI prevents this failure mode by enforcing a strict agent contract and routing state exclusively through a LangGraph state machine [18] rather than permitting direct agent-to-agent calls. AutoGen by Wu et al. [17] further demonstrates structured multi-agent conversational patterns and tool execution, informing WKAI's modular separation between intent detection, error diagnosis, and quiz generation. External agent orchestration is standardised via the Model Context Protocol [19], allowing tools to be exposed cleanly to external orchestrators.</w:t>
       </w:r>
     </w:p>
     <w:p>
@@ -11941,15 +11967,12 @@
           </w:tcPr>
           <w:p>
             <w:pPr>
-              <w:ind w:left="0" w:firstLine="0"/>
-              <w:jc w:val="left"/>
-              <w:rPr>
-                <w:sz w:val="20"/>
-              </w:rPr>
-            </w:pPr>
-            <w:r>
-              <w:rPr>
-                <w:sz w:val="20"/>
+              <w:spacing w:line="276" w:lineRule="auto" w:after="40" w:before="40"/>
+            </w:pPr>
+            <w:r>
+              <w:rPr>
+                <w:rFonts w:ascii="Times New Roman" w:hAnsi="Times New Roman"/>
+                <w:sz w:val="19"/>
               </w:rPr>
               <w:t>1</w:t>
             </w:r>
@@ -11965,17 +11988,14 @@
           </w:tcPr>
           <w:p>
             <w:pPr>
-              <w:ind w:left="0" w:firstLine="0"/>
-              <w:jc w:val="left"/>
-              <w:rPr>
-                <w:sz w:val="20"/>
-              </w:rPr>
-            </w:pPr>
-            <w:r>
-              <w:rPr>
-                <w:sz w:val="20"/>
-              </w:rPr>
-              <w:t>LeafTutor: An AI Agent for Programming Assignment Tutoring</w:t>
+              <w:spacing w:line="276" w:lineRule="auto" w:after="40" w:before="40"/>
+            </w:pPr>
+            <w:r>
+              <w:rPr>
+                <w:rFonts w:ascii="Times New Roman" w:hAnsi="Times New Roman"/>
+                <w:sz w:val="19"/>
+              </w:rPr>
+              <w:t>M. Bochard et al. / LeafTutor: An AI Agent for Programming Assignment Tutoring</w:t>
             </w:r>
           </w:p>
         </w:tc>
@@ -11989,15 +12009,12 @@
           </w:tcPr>
           <w:p>
             <w:pPr>
-              <w:ind w:left="0" w:firstLine="0"/>
-              <w:jc w:val="left"/>
-              <w:rPr>
-                <w:sz w:val="20"/>
-              </w:rPr>
-            </w:pPr>
-            <w:r>
-              <w:rPr>
-                <w:sz w:val="20"/>
+              <w:spacing w:line="276" w:lineRule="auto" w:after="40" w:before="40"/>
+            </w:pPr>
+            <w:r>
+              <w:rPr>
+                <w:rFonts w:ascii="Times New Roman" w:hAnsi="Times New Roman"/>
+                <w:sz w:val="19"/>
               </w:rPr>
               <w:t>2026</w:t>
             </w:r>
@@ -12013,17 +12030,14 @@
           </w:tcPr>
           <w:p>
             <w:pPr>
-              <w:ind w:left="0" w:firstLine="0"/>
-              <w:jc w:val="left"/>
-              <w:rPr>
-                <w:sz w:val="20"/>
-              </w:rPr>
-            </w:pPr>
-            <w:r>
-              <w:rPr>
-                <w:sz w:val="20"/>
-              </w:rPr>
-              <w:t>ArXiv</w:t>
+              <w:spacing w:line="276" w:lineRule="auto" w:after="40" w:before="40"/>
+            </w:pPr>
+            <w:r>
+              <w:rPr>
+                <w:rFonts w:ascii="Times New Roman" w:hAnsi="Times New Roman"/>
+                <w:sz w:val="19"/>
+              </w:rPr>
+              <w:t>arXiv:2601.02375</w:t>
             </w:r>
           </w:p>
         </w:tc>
@@ -12037,17 +12051,14 @@
           </w:tcPr>
           <w:p>
             <w:pPr>
-              <w:ind w:left="0" w:firstLine="0"/>
-              <w:jc w:val="left"/>
-              <w:rPr>
-                <w:sz w:val="20"/>
-              </w:rPr>
-            </w:pPr>
-            <w:r>
-              <w:rPr>
-                <w:sz w:val="20"/>
-              </w:rPr>
-              <w:t>Closest prior work to WKAI’s programming-specific error-diagnosis agent</w:t>
+              <w:spacing w:line="276" w:lineRule="auto" w:after="40" w:before="40"/>
+            </w:pPr>
+            <w:r>
+              <w:rPr>
+                <w:rFonts w:ascii="Times New Roman" w:hAnsi="Times New Roman"/>
+                <w:sz w:val="19"/>
+              </w:rPr>
+              <w:t>Step-by-step programming error guidance; direct baseline for WKAI error-diagnosis agent</w:t>
             </w:r>
           </w:p>
         </w:tc>
@@ -12063,15 +12074,12 @@
           </w:tcPr>
           <w:p>
             <w:pPr>
-              <w:ind w:left="0" w:firstLine="0"/>
-              <w:jc w:val="left"/>
-              <w:rPr>
-                <w:sz w:val="20"/>
-              </w:rPr>
-            </w:pPr>
-            <w:r>
-              <w:rPr>
-                <w:sz w:val="20"/>
+              <w:spacing w:line="276" w:lineRule="auto" w:after="40" w:before="40"/>
+            </w:pPr>
+            <w:r>
+              <w:rPr>
+                <w:rFonts w:ascii="Times New Roman" w:hAnsi="Times New Roman"/>
+                <w:sz w:val="19"/>
               </w:rPr>
               <w:t>2</w:t>
             </w:r>
@@ -12087,17 +12095,14 @@
           </w:tcPr>
           <w:p>
             <w:pPr>
-              <w:ind w:left="0" w:firstLine="0"/>
-              <w:jc w:val="left"/>
-              <w:rPr>
-                <w:sz w:val="20"/>
-              </w:rPr>
-            </w:pPr>
-            <w:r>
-              <w:rPr>
-                <w:sz w:val="20"/>
-              </w:rPr>
-              <w:t>A Comprehensive Review of AI-based Intelligent Tutoring Systems: Applications and Challenges</w:t>
+              <w:spacing w:line="276" w:lineRule="auto" w:after="40" w:before="40"/>
+            </w:pPr>
+            <w:r>
+              <w:rPr>
+                <w:rFonts w:ascii="Times New Roman" w:hAnsi="Times New Roman"/>
+                <w:sz w:val="19"/>
+              </w:rPr>
+              <w:t>M. Zerkouk et al. / A Comprehensive Review of AI-based Intelligent Tutoring Systems</w:t>
             </w:r>
           </w:p>
         </w:tc>
@@ -12111,15 +12116,12 @@
           </w:tcPr>
           <w:p>
             <w:pPr>
-              <w:ind w:left="0" w:firstLine="0"/>
-              <w:jc w:val="left"/>
-              <w:rPr>
-                <w:sz w:val="20"/>
-              </w:rPr>
-            </w:pPr>
-            <w:r>
-              <w:rPr>
-                <w:sz w:val="20"/>
+              <w:spacing w:line="276" w:lineRule="auto" w:after="40" w:before="40"/>
+            </w:pPr>
+            <w:r>
+              <w:rPr>
+                <w:rFonts w:ascii="Times New Roman" w:hAnsi="Times New Roman"/>
+                <w:sz w:val="19"/>
               </w:rPr>
               <w:t>2025</w:t>
             </w:r>
@@ -12135,17 +12137,14 @@
           </w:tcPr>
           <w:p>
             <w:pPr>
-              <w:ind w:left="0" w:firstLine="0"/>
-              <w:jc w:val="left"/>
-              <w:rPr>
-                <w:sz w:val="20"/>
-              </w:rPr>
-            </w:pPr>
-            <w:r>
-              <w:rPr>
-                <w:sz w:val="20"/>
-              </w:rPr>
-              <w:t>ArXiv</w:t>
+              <w:spacing w:line="276" w:lineRule="auto" w:after="40" w:before="40"/>
+            </w:pPr>
+            <w:r>
+              <w:rPr>
+                <w:rFonts w:ascii="Times New Roman" w:hAnsi="Times New Roman"/>
+                <w:sz w:val="19"/>
+              </w:rPr>
+              <w:t>arXiv:2507.18882</w:t>
             </w:r>
           </w:p>
         </w:tc>
@@ -12159,17 +12158,14 @@
           </w:tcPr>
           <w:p>
             <w:pPr>
-              <w:ind w:left="0" w:firstLine="0"/>
-              <w:jc w:val="left"/>
-              <w:rPr>
-                <w:sz w:val="20"/>
-              </w:rPr>
-            </w:pPr>
-            <w:r>
-              <w:rPr>
-                <w:sz w:val="20"/>
-              </w:rPr>
-              <w:t>Surveys the AI-tutoring landscape WKAI’s guide/error-diagnosis pipeline sits in</w:t>
+              <w:spacing w:line="276" w:lineRule="auto" w:after="40" w:before="40"/>
+            </w:pPr>
+            <w:r>
+              <w:rPr>
+                <w:rFonts w:ascii="Times New Roman" w:hAnsi="Times New Roman"/>
+                <w:sz w:val="19"/>
+              </w:rPr>
+              <w:t>Taxonomy of modern ITS architectures, feedback loops, and deployment challenges</w:t>
             </w:r>
           </w:p>
         </w:tc>
@@ -12185,15 +12181,12 @@
           </w:tcPr>
           <w:p>
             <w:pPr>
-              <w:ind w:left="0" w:firstLine="0"/>
-              <w:jc w:val="left"/>
-              <w:rPr>
-                <w:sz w:val="20"/>
-              </w:rPr>
-            </w:pPr>
-            <w:r>
-              <w:rPr>
-                <w:sz w:val="20"/>
+              <w:spacing w:line="276" w:lineRule="auto" w:after="40" w:before="40"/>
+            </w:pPr>
+            <w:r>
+              <w:rPr>
+                <w:rFonts w:ascii="Times New Roman" w:hAnsi="Times New Roman"/>
+                <w:sz w:val="19"/>
               </w:rPr>
               <w:t>3</w:t>
             </w:r>
@@ -12209,17 +12202,14 @@
           </w:tcPr>
           <w:p>
             <w:pPr>
-              <w:ind w:left="0" w:firstLine="0"/>
-              <w:jc w:val="left"/>
-              <w:rPr>
-                <w:sz w:val="20"/>
-              </w:rPr>
-            </w:pPr>
-            <w:r>
-              <w:rPr>
-                <w:sz w:val="20"/>
-              </w:rPr>
-              <w:t>MultiTutor: Collaborative LLM Agents for Multimodal Student Support</w:t>
+              <w:spacing w:line="276" w:lineRule="auto" w:after="40" w:before="40"/>
+            </w:pPr>
+            <w:r>
+              <w:rPr>
+                <w:rFonts w:ascii="Times New Roman" w:hAnsi="Times New Roman"/>
+                <w:sz w:val="19"/>
+              </w:rPr>
+              <w:t>M. Schmucker et al. / Ruffle &amp; Riley: Insights from LLM-Based Conversational Tutoring</w:t>
             </w:r>
           </w:p>
         </w:tc>
@@ -12233,17 +12223,14 @@
           </w:tcPr>
           <w:p>
             <w:pPr>
-              <w:ind w:left="0" w:firstLine="0"/>
-              <w:jc w:val="left"/>
-              <w:rPr>
-                <w:sz w:val="20"/>
-              </w:rPr>
-            </w:pPr>
-            <w:r>
-              <w:rPr>
-                <w:sz w:val="20"/>
-              </w:rPr>
-              <w:t>2025</w:t>
+              <w:spacing w:line="276" w:lineRule="auto" w:after="40" w:before="40"/>
+            </w:pPr>
+            <w:r>
+              <w:rPr>
+                <w:rFonts w:ascii="Times New Roman" w:hAnsi="Times New Roman"/>
+                <w:sz w:val="19"/>
+              </w:rPr>
+              <w:t>2024</w:t>
             </w:r>
           </w:p>
         </w:tc>
@@ -12257,17 +12244,14 @@
           </w:tcPr>
           <w:p>
             <w:pPr>
-              <w:ind w:left="0" w:firstLine="0"/>
-              <w:jc w:val="left"/>
-              <w:rPr>
-                <w:sz w:val="20"/>
-              </w:rPr>
-            </w:pPr>
-            <w:r>
-              <w:rPr>
-                <w:sz w:val="20"/>
-              </w:rPr>
-              <w:t>AI-Supported Education (PMLR)</w:t>
+              <w:spacing w:line="276" w:lineRule="auto" w:after="40" w:before="40"/>
+            </w:pPr>
+            <w:r>
+              <w:rPr>
+                <w:rFonts w:ascii="Times New Roman" w:hAnsi="Times New Roman"/>
+                <w:sz w:val="19"/>
+              </w:rPr>
+              <w:t>AIED 2024 (Springer)</w:t>
             </w:r>
           </w:p>
         </w:tc>
@@ -12281,17 +12265,14 @@
           </w:tcPr>
           <w:p>
             <w:pPr>
-              <w:ind w:left="0" w:firstLine="0"/>
-              <w:jc w:val="left"/>
-              <w:rPr>
-                <w:sz w:val="20"/>
-              </w:rPr>
-            </w:pPr>
-            <w:r>
-              <w:rPr>
-                <w:sz w:val="20"/>
-              </w:rPr>
-              <w:t>Multi-agent tutoring architecture; parallels WKAI’s centralized multi-agent layer</w:t>
+              <w:spacing w:line="276" w:lineRule="auto" w:after="40" w:before="40"/>
+            </w:pPr>
+            <w:r>
+              <w:rPr>
+                <w:rFonts w:ascii="Times New Roman" w:hAnsi="Times New Roman"/>
+                <w:sz w:val="19"/>
+              </w:rPr>
+              <w:t>Dual-agent conversational tutoring loops; informs WKAI student messaging and Q&amp;A interaction</w:t>
             </w:r>
           </w:p>
         </w:tc>
@@ -12307,15 +12288,12 @@
           </w:tcPr>
           <w:p>
             <w:pPr>
-              <w:ind w:left="0" w:firstLine="0"/>
-              <w:jc w:val="left"/>
-              <w:rPr>
-                <w:sz w:val="20"/>
-              </w:rPr>
-            </w:pPr>
-            <w:r>
-              <w:rPr>
-                <w:sz w:val="20"/>
+              <w:spacing w:line="276" w:lineRule="auto" w:after="40" w:before="40"/>
+            </w:pPr>
+            <w:r>
+              <w:rPr>
+                <w:rFonts w:ascii="Times New Roman" w:hAnsi="Times New Roman"/>
+                <w:sz w:val="19"/>
               </w:rPr>
               <w:t>4</w:t>
             </w:r>
@@ -12331,17 +12309,14 @@
           </w:tcPr>
           <w:p>
             <w:pPr>
-              <w:ind w:left="0" w:firstLine="0"/>
-              <w:jc w:val="left"/>
-              <w:rPr>
-                <w:sz w:val="20"/>
-              </w:rPr>
-            </w:pPr>
-            <w:r>
-              <w:rPr>
-                <w:sz w:val="20"/>
-              </w:rPr>
-              <w:t>MMTutorBench: The First Multimodal Benchmark for AI Math Tutoring</w:t>
+              <w:spacing w:line="276" w:lineRule="auto" w:after="40" w:before="40"/>
+            </w:pPr>
+            <w:r>
+              <w:rPr>
+                <w:rFonts w:ascii="Times New Roman" w:hAnsi="Times New Roman"/>
+                <w:sz w:val="19"/>
+              </w:rPr>
+              <w:t>S. Wang et al. / Tutor CoPilot: A Human-AI Approach for Scaling Real-Time Expertise</w:t>
             </w:r>
           </w:p>
         </w:tc>
@@ -12355,17 +12330,14 @@
           </w:tcPr>
           <w:p>
             <w:pPr>
-              <w:ind w:left="0" w:firstLine="0"/>
-              <w:jc w:val="left"/>
-              <w:rPr>
-                <w:sz w:val="20"/>
-              </w:rPr>
-            </w:pPr>
-            <w:r>
-              <w:rPr>
-                <w:sz w:val="20"/>
-              </w:rPr>
-              <w:t>2025</w:t>
+              <w:spacing w:line="276" w:lineRule="auto" w:after="40" w:before="40"/>
+            </w:pPr>
+            <w:r>
+              <w:rPr>
+                <w:rFonts w:ascii="Times New Roman" w:hAnsi="Times New Roman"/>
+                <w:sz w:val="19"/>
+              </w:rPr>
+              <w:t>2024</w:t>
             </w:r>
           </w:p>
         </w:tc>
@@ -12379,17 +12351,14 @@
           </w:tcPr>
           <w:p>
             <w:pPr>
-              <w:ind w:left="0" w:firstLine="0"/>
-              <w:jc w:val="left"/>
-              <w:rPr>
-                <w:sz w:val="20"/>
-              </w:rPr>
-            </w:pPr>
-            <w:r>
-              <w:rPr>
-                <w:sz w:val="20"/>
-              </w:rPr>
-              <w:t>ArXiv</w:t>
+              <w:spacing w:line="276" w:lineRule="auto" w:after="40" w:before="40"/>
+            </w:pPr>
+            <w:r>
+              <w:rPr>
+                <w:rFonts w:ascii="Times New Roman" w:hAnsi="Times New Roman"/>
+                <w:sz w:val="19"/>
+              </w:rPr>
+              <w:t>Stanford / NSSA Report</w:t>
             </w:r>
           </w:p>
         </w:tc>
@@ -12403,17 +12372,14 @@
           </w:tcPr>
           <w:p>
             <w:pPr>
-              <w:ind w:left="0" w:firstLine="0"/>
-              <w:jc w:val="left"/>
-              <w:rPr>
-                <w:sz w:val="20"/>
-              </w:rPr>
-            </w:pPr>
-            <w:r>
-              <w:rPr>
-                <w:sz w:val="20"/>
-              </w:rPr>
-              <w:t>Benchmarking approach for multimodal tutoring quality</w:t>
+              <w:spacing w:line="276" w:lineRule="auto" w:after="40" w:before="40"/>
+            </w:pPr>
+            <w:r>
+              <w:rPr>
+                <w:rFonts w:ascii="Times New Roman" w:hAnsi="Times New Roman"/>
+                <w:sz w:val="19"/>
+              </w:rPr>
+              <w:t>Human-in-the-loop live guidance for real-time instruction; operational model for instructor augmentation</w:t>
             </w:r>
           </w:p>
         </w:tc>
@@ -12429,15 +12395,12 @@
           </w:tcPr>
           <w:p>
             <w:pPr>
-              <w:ind w:left="0" w:firstLine="0"/>
-              <w:jc w:val="left"/>
-              <w:rPr>
-                <w:sz w:val="20"/>
-              </w:rPr>
-            </w:pPr>
-            <w:r>
-              <w:rPr>
-                <w:sz w:val="20"/>
+              <w:spacing w:line="276" w:lineRule="auto" w:after="40" w:before="40"/>
+            </w:pPr>
+            <w:r>
+              <w:rPr>
+                <w:rFonts w:ascii="Times New Roman" w:hAnsi="Times New Roman"/>
+                <w:sz w:val="19"/>
               </w:rPr>
               <w:t>5</w:t>
             </w:r>
@@ -12453,17 +12416,14 @@
           </w:tcPr>
           <w:p>
             <w:pPr>
-              <w:ind w:left="0" w:firstLine="0"/>
-              <w:jc w:val="left"/>
-              <w:rPr>
-                <w:sz w:val="20"/>
-              </w:rPr>
-            </w:pPr>
-            <w:r>
-              <w:rPr>
-                <w:sz w:val="20"/>
-              </w:rPr>
-              <w:t>Video-MMLU: A Massive Multi-Discipline Lecture Understanding Benchmark</w:t>
+              <w:spacing w:line="276" w:lineRule="auto" w:after="40" w:before="40"/>
+            </w:pPr>
+            <w:r>
+              <w:rPr>
+                <w:rFonts w:ascii="Times New Roman" w:hAnsi="Times New Roman"/>
+                <w:sz w:val="19"/>
+              </w:rPr>
+              <w:t>B. A. Becker et al. / Programming Is Hard - Or at Least It Used to Be</w:t>
             </w:r>
           </w:p>
         </w:tc>
@@ -12477,17 +12437,14 @@
           </w:tcPr>
           <w:p>
             <w:pPr>
-              <w:ind w:left="0" w:firstLine="0"/>
-              <w:jc w:val="left"/>
-              <w:rPr>
-                <w:sz w:val="20"/>
-              </w:rPr>
-            </w:pPr>
-            <w:r>
-              <w:rPr>
-                <w:sz w:val="20"/>
-              </w:rPr>
-              <w:t>2025</w:t>
+              <w:spacing w:line="276" w:lineRule="auto" w:after="40" w:before="40"/>
+            </w:pPr>
+            <w:r>
+              <w:rPr>
+                <w:rFonts w:ascii="Times New Roman" w:hAnsi="Times New Roman"/>
+                <w:sz w:val="19"/>
+              </w:rPr>
+              <w:t>2023</w:t>
             </w:r>
           </w:p>
         </w:tc>
@@ -12501,17 +12458,14 @@
           </w:tcPr>
           <w:p>
             <w:pPr>
-              <w:ind w:left="0" w:firstLine="0"/>
-              <w:jc w:val="left"/>
-              <w:rPr>
-                <w:sz w:val="20"/>
-              </w:rPr>
-            </w:pPr>
-            <w:r>
-              <w:rPr>
-                <w:sz w:val="20"/>
-              </w:rPr>
-              <w:t>ArXiv / CVPR</w:t>
+              <w:spacing w:line="276" w:lineRule="auto" w:after="40" w:before="40"/>
+            </w:pPr>
+            <w:r>
+              <w:rPr>
+                <w:rFonts w:ascii="Times New Roman" w:hAnsi="Times New Roman"/>
+                <w:sz w:val="19"/>
+              </w:rPr>
+              <w:t>ACM SIGCSE '23</w:t>
             </w:r>
           </w:p>
         </w:tc>
@@ -12525,17 +12479,14 @@
           </w:tcPr>
           <w:p>
             <w:pPr>
-              <w:ind w:left="0" w:firstLine="0"/>
-              <w:jc w:val="left"/>
-              <w:rPr>
-                <w:sz w:val="20"/>
-              </w:rPr>
-            </w:pPr>
-            <w:r>
-              <w:rPr>
-                <w:sz w:val="20"/>
-              </w:rPr>
-              <w:t>Lecture-understanding benchmark relevant to transcript/guide generation</w:t>
+              <w:spacing w:line="276" w:lineRule="auto" w:after="40" w:before="40"/>
+            </w:pPr>
+            <w:r>
+              <w:rPr>
+                <w:rFonts w:ascii="Times New Roman" w:hAnsi="Times New Roman"/>
+                <w:sz w:val="19"/>
+              </w:rPr>
+              <w:t>Pedagogical opportunities and cognitive risks of AI code generators in computing education</w:t>
             </w:r>
           </w:p>
         </w:tc>
@@ -12551,15 +12502,12 @@
           </w:tcPr>
           <w:p>
             <w:pPr>
-              <w:ind w:left="0" w:firstLine="0"/>
-              <w:jc w:val="left"/>
-              <w:rPr>
-                <w:sz w:val="20"/>
-              </w:rPr>
-            </w:pPr>
-            <w:r>
-              <w:rPr>
-                <w:sz w:val="20"/>
+              <w:spacing w:line="276" w:lineRule="auto" w:after="40" w:before="40"/>
+            </w:pPr>
+            <w:r>
+              <w:rPr>
+                <w:rFonts w:ascii="Times New Roman" w:hAnsi="Times New Roman"/>
+                <w:sz w:val="19"/>
               </w:rPr>
               <w:t>6</w:t>
             </w:r>
@@ -12575,17 +12523,14 @@
           </w:tcPr>
           <w:p>
             <w:pPr>
-              <w:ind w:left="0" w:firstLine="0"/>
-              <w:jc w:val="left"/>
-              <w:rPr>
-                <w:sz w:val="20"/>
-              </w:rPr>
-            </w:pPr>
-            <w:r>
-              <w:rPr>
-                <w:sz w:val="20"/>
-              </w:rPr>
-              <w:t>MathBuddy: A Multimodal System for Affective Math Tutoring</w:t>
+              <w:spacing w:line="276" w:lineRule="auto" w:after="40" w:before="40"/>
+            </w:pPr>
+            <w:r>
+              <w:rPr>
+                <w:rFonts w:ascii="Times New Roman" w:hAnsi="Times New Roman"/>
+                <w:sz w:val="19"/>
+              </w:rPr>
+              <w:t>P. Denny et al. / Computing Education in the Era of Generative AI</w:t>
             </w:r>
           </w:p>
         </w:tc>
@@ -12599,17 +12544,14 @@
           </w:tcPr>
           <w:p>
             <w:pPr>
-              <w:ind w:left="0" w:firstLine="0"/>
-              <w:jc w:val="left"/>
-              <w:rPr>
-                <w:sz w:val="20"/>
-              </w:rPr>
-            </w:pPr>
-            <w:r>
-              <w:rPr>
-                <w:sz w:val="20"/>
-              </w:rPr>
-              <w:t>2025</w:t>
+              <w:spacing w:line="276" w:lineRule="auto" w:after="40" w:before="40"/>
+            </w:pPr>
+            <w:r>
+              <w:rPr>
+                <w:rFonts w:ascii="Times New Roman" w:hAnsi="Times New Roman"/>
+                <w:sz w:val="19"/>
+              </w:rPr>
+              <w:t>2024</w:t>
             </w:r>
           </w:p>
         </w:tc>
@@ -12623,17 +12565,14 @@
           </w:tcPr>
           <w:p>
             <w:pPr>
-              <w:ind w:left="0" w:firstLine="0"/>
-              <w:jc w:val="left"/>
-              <w:rPr>
-                <w:sz w:val="20"/>
-              </w:rPr>
-            </w:pPr>
-            <w:r>
-              <w:rPr>
-                <w:sz w:val="20"/>
-              </w:rPr>
-              <w:t>EMNLP 2025 Demo</w:t>
+              <w:spacing w:line="276" w:lineRule="auto" w:after="40" w:before="40"/>
+            </w:pPr>
+            <w:r>
+              <w:rPr>
+                <w:rFonts w:ascii="Times New Roman" w:hAnsi="Times New Roman"/>
+                <w:sz w:val="19"/>
+              </w:rPr>
+              <w:t>Communications of the ACM</w:t>
             </w:r>
           </w:p>
         </w:tc>
@@ -12647,17 +12586,14 @@
           </w:tcPr>
           <w:p>
             <w:pPr>
-              <w:ind w:left="0" w:firstLine="0"/>
-              <w:jc w:val="left"/>
-              <w:rPr>
-                <w:sz w:val="20"/>
-              </w:rPr>
-            </w:pPr>
-            <w:r>
-              <w:rPr>
-                <w:sz w:val="20"/>
-              </w:rPr>
-              <w:t>Multimodal affective tutoring system design</w:t>
+              <w:spacing w:line="276" w:lineRule="auto" w:after="40" w:before="40"/>
+            </w:pPr>
+            <w:r>
+              <w:rPr>
+                <w:rFonts w:ascii="Times New Roman" w:hAnsi="Times New Roman"/>
+                <w:sz w:val="19"/>
+              </w:rPr>
+              <w:t>Curricular adaptation principles and automated problem explanation in programming education</w:t>
             </w:r>
           </w:p>
         </w:tc>
@@ -12673,15 +12609,12 @@
           </w:tcPr>
           <w:p>
             <w:pPr>
-              <w:ind w:left="0" w:firstLine="0"/>
-              <w:jc w:val="left"/>
-              <w:rPr>
-                <w:sz w:val="20"/>
-              </w:rPr>
-            </w:pPr>
-            <w:r>
-              <w:rPr>
-                <w:sz w:val="20"/>
+              <w:spacing w:line="276" w:lineRule="auto" w:after="40" w:before="40"/>
+            </w:pPr>
+            <w:r>
+              <w:rPr>
+                <w:rFonts w:ascii="Times New Roman" w:hAnsi="Times New Roman"/>
+                <w:sz w:val="19"/>
               </w:rPr>
               <w:t>7</w:t>
             </w:r>
@@ -12697,17 +12630,14 @@
           </w:tcPr>
           <w:p>
             <w:pPr>
-              <w:ind w:left="0" w:firstLine="0"/>
-              <w:jc w:val="left"/>
-              <w:rPr>
-                <w:sz w:val="20"/>
-              </w:rPr>
-            </w:pPr>
-            <w:r>
-              <w:rPr>
-                <w:sz w:val="20"/>
-              </w:rPr>
-              <w:t>Ruffle &amp; Riley: Insights from Designing and Evaluating an LLM-Based Conversational Tutoring System</w:t>
+              <w:spacing w:line="276" w:lineRule="auto" w:after="40" w:before="40"/>
+            </w:pPr>
+            <w:r>
+              <w:rPr>
+                <w:rFonts w:ascii="Times New Roman" w:hAnsi="Times New Roman"/>
+                <w:sz w:val="19"/>
+              </w:rPr>
+              <w:t>M. Kazemitabaar et al. / Studying the Effect of AI Code Generators on Student Learning</w:t>
             </w:r>
           </w:p>
         </w:tc>
@@ -12721,17 +12651,14 @@
           </w:tcPr>
           <w:p>
             <w:pPr>
-              <w:ind w:left="0" w:firstLine="0"/>
-              <w:jc w:val="left"/>
-              <w:rPr>
-                <w:sz w:val="20"/>
-              </w:rPr>
-            </w:pPr>
-            <w:r>
-              <w:rPr>
-                <w:sz w:val="20"/>
-              </w:rPr>
-              <w:t>2024</w:t>
+              <w:spacing w:line="276" w:lineRule="auto" w:after="40" w:before="40"/>
+            </w:pPr>
+            <w:r>
+              <w:rPr>
+                <w:rFonts w:ascii="Times New Roman" w:hAnsi="Times New Roman"/>
+                <w:sz w:val="19"/>
+              </w:rPr>
+              <w:t>2023</w:t>
             </w:r>
           </w:p>
         </w:tc>
@@ -12745,17 +12672,14 @@
           </w:tcPr>
           <w:p>
             <w:pPr>
-              <w:ind w:left="0" w:firstLine="0"/>
-              <w:jc w:val="left"/>
-              <w:rPr>
-                <w:sz w:val="20"/>
-              </w:rPr>
-            </w:pPr>
-            <w:r>
-              <w:rPr>
-                <w:sz w:val="20"/>
-              </w:rPr>
-              <w:t>AIED 2024 Workshop</w:t>
+              <w:spacing w:line="276" w:lineRule="auto" w:after="40" w:before="40"/>
+            </w:pPr>
+            <w:r>
+              <w:rPr>
+                <w:rFonts w:ascii="Times New Roman" w:hAnsi="Times New Roman"/>
+                <w:sz w:val="19"/>
+              </w:rPr>
+              <w:t>ACM CHI '23</w:t>
             </w:r>
           </w:p>
         </w:tc>
@@ -12769,17 +12693,14 @@
           </w:tcPr>
           <w:p>
             <w:pPr>
-              <w:ind w:left="0" w:firstLine="0"/>
-              <w:jc w:val="left"/>
-              <w:rPr>
-                <w:sz w:val="20"/>
-              </w:rPr>
-            </w:pPr>
-            <w:r>
-              <w:rPr>
-                <w:sz w:val="20"/>
-              </w:rPr>
-              <w:t>Design lessons for conversational LLM tutors; informs WKAI’s message agent</w:t>
+              <w:spacing w:line="276" w:lineRule="auto" w:after="40" w:before="40"/>
+            </w:pPr>
+            <w:r>
+              <w:rPr>
+                <w:rFonts w:ascii="Times New Roman" w:hAnsi="Times New Roman"/>
+                <w:sz w:val="19"/>
+              </w:rPr>
+              <w:t>Empirical study showing novice retention requires step-by-step guidance rather than full code generation</w:t>
             </w:r>
           </w:p>
         </w:tc>
@@ -12795,15 +12716,12 @@
           </w:tcPr>
           <w:p>
             <w:pPr>
-              <w:ind w:left="0" w:firstLine="0"/>
-              <w:jc w:val="left"/>
-              <w:rPr>
-                <w:sz w:val="20"/>
-              </w:rPr>
-            </w:pPr>
-            <w:r>
-              <w:rPr>
-                <w:sz w:val="20"/>
+              <w:spacing w:line="276" w:lineRule="auto" w:after="40" w:before="40"/>
+            </w:pPr>
+            <w:r>
+              <w:rPr>
+                <w:rFonts w:ascii="Times New Roman" w:hAnsi="Times New Roman"/>
+                <w:sz w:val="19"/>
               </w:rPr>
               <w:t>8</w:t>
             </w:r>
@@ -12819,17 +12737,14 @@
           </w:tcPr>
           <w:p>
             <w:pPr>
-              <w:ind w:left="0" w:firstLine="0"/>
-              <w:jc w:val="left"/>
-              <w:rPr>
-                <w:sz w:val="20"/>
-              </w:rPr>
-            </w:pPr>
-            <w:r>
-              <w:rPr>
-                <w:sz w:val="20"/>
-              </w:rPr>
-              <w:t>Tutor CoPilot: A Human-AI Approach for Scaling Real-Time Expertise</w:t>
+              <w:spacing w:line="276" w:lineRule="auto" w:after="40" w:before="40"/>
+            </w:pPr>
+            <w:r>
+              <w:rPr>
+                <w:rFonts w:ascii="Times New Roman" w:hAnsi="Times New Roman"/>
+                <w:sz w:val="19"/>
+              </w:rPr>
+              <w:t>J. Leinonen et al. / Using Large Language Models to Enhance Programming Error Messages</w:t>
             </w:r>
           </w:p>
         </w:tc>
@@ -12843,17 +12758,14 @@
           </w:tcPr>
           <w:p>
             <w:pPr>
-              <w:ind w:left="0" w:firstLine="0"/>
-              <w:jc w:val="left"/>
-              <w:rPr>
-                <w:sz w:val="20"/>
-              </w:rPr>
-            </w:pPr>
-            <w:r>
-              <w:rPr>
-                <w:sz w:val="20"/>
-              </w:rPr>
-              <w:t>2024</w:t>
+              <w:spacing w:line="276" w:lineRule="auto" w:after="40" w:before="40"/>
+            </w:pPr>
+            <w:r>
+              <w:rPr>
+                <w:rFonts w:ascii="Times New Roman" w:hAnsi="Times New Roman"/>
+                <w:sz w:val="19"/>
+              </w:rPr>
+              <w:t>2023</w:t>
             </w:r>
           </w:p>
         </w:tc>
@@ -12867,17 +12779,14 @@
           </w:tcPr>
           <w:p>
             <w:pPr>
-              <w:ind w:left="0" w:firstLine="0"/>
-              <w:jc w:val="left"/>
-              <w:rPr>
-                <w:sz w:val="20"/>
-              </w:rPr>
-            </w:pPr>
-            <w:r>
-              <w:rPr>
-                <w:sz w:val="20"/>
-              </w:rPr>
-              <w:t>NSSA Technical Report (Stanford)</w:t>
+              <w:spacing w:line="276" w:lineRule="auto" w:after="40" w:before="40"/>
+            </w:pPr>
+            <w:r>
+              <w:rPr>
+                <w:rFonts w:ascii="Times New Roman" w:hAnsi="Times New Roman"/>
+                <w:sz w:val="19"/>
+              </w:rPr>
+              <w:t>ACM SIGCSE '23</w:t>
             </w:r>
           </w:p>
         </w:tc>
@@ -12891,17 +12800,14 @@
           </w:tcPr>
           <w:p>
             <w:pPr>
-              <w:ind w:left="0" w:firstLine="0"/>
-              <w:jc w:val="left"/>
-              <w:rPr>
-                <w:sz w:val="20"/>
-              </w:rPr>
-            </w:pPr>
-            <w:r>
-              <w:rPr>
-                <w:sz w:val="20"/>
-              </w:rPr>
-              <w:t>Human-in-the-loop real-time tutoring; close conceptual match to WKAI’s live-session model</w:t>
+              <w:spacing w:line="276" w:lineRule="auto" w:after="40" w:before="40"/>
+            </w:pPr>
+            <w:r>
+              <w:rPr>
+                <w:rFonts w:ascii="Times New Roman" w:hAnsi="Times New Roman"/>
+                <w:sz w:val="19"/>
+              </w:rPr>
+              <w:t>Novice-friendly compiler and runtime diagnostic translation; core foundation for Error Helper</w:t>
             </w:r>
           </w:p>
         </w:tc>
@@ -12917,15 +12823,12 @@
           </w:tcPr>
           <w:p>
             <w:pPr>
-              <w:ind w:left="0" w:firstLine="0"/>
-              <w:jc w:val="left"/>
-              <w:rPr>
-                <w:sz w:val="20"/>
-              </w:rPr>
-            </w:pPr>
-            <w:r>
-              <w:rPr>
-                <w:sz w:val="20"/>
+              <w:spacing w:line="276" w:lineRule="auto" w:after="40" w:before="40"/>
+            </w:pPr>
+            <w:r>
+              <w:rPr>
+                <w:rFonts w:ascii="Times New Roman" w:hAnsi="Times New Roman"/>
+                <w:sz w:val="19"/>
               </w:rPr>
               <w:t>9</w:t>
             </w:r>
@@ -12941,17 +12844,14 @@
           </w:tcPr>
           <w:p>
             <w:pPr>
-              <w:ind w:left="0" w:firstLine="0"/>
-              <w:jc w:val="left"/>
-              <w:rPr>
-                <w:sz w:val="20"/>
-              </w:rPr>
-            </w:pPr>
-            <w:r>
-              <w:rPr>
-                <w:sz w:val="20"/>
-              </w:rPr>
-              <w:t>ScreenAI: A Vision-Language Model for UI and Infographics Understanding</w:t>
+              <w:spacing w:line="276" w:lineRule="auto" w:after="40" w:before="40"/>
+            </w:pPr>
+            <w:r>
+              <w:rPr>
+                <w:rFonts w:ascii="Times New Roman" w:hAnsi="Times New Roman"/>
+                <w:sz w:val="19"/>
+              </w:rPr>
+              <w:t>J. C. Paiva et al. / Automated Assessment in Computer Science Education: A State-of-the-Art Review</w:t>
             </w:r>
           </w:p>
         </w:tc>
@@ -12965,17 +12865,14 @@
           </w:tcPr>
           <w:p>
             <w:pPr>
-              <w:ind w:left="0" w:firstLine="0"/>
-              <w:jc w:val="left"/>
-              <w:rPr>
-                <w:sz w:val="20"/>
-              </w:rPr>
-            </w:pPr>
-            <w:r>
-              <w:rPr>
-                <w:sz w:val="20"/>
-              </w:rPr>
-              <w:t>2024</w:t>
+              <w:spacing w:line="276" w:lineRule="auto" w:after="40" w:before="40"/>
+            </w:pPr>
+            <w:r>
+              <w:rPr>
+                <w:rFonts w:ascii="Times New Roman" w:hAnsi="Times New Roman"/>
+                <w:sz w:val="19"/>
+              </w:rPr>
+              <w:t>2022</w:t>
             </w:r>
           </w:p>
         </w:tc>
@@ -12989,17 +12886,14 @@
           </w:tcPr>
           <w:p>
             <w:pPr>
-              <w:ind w:left="0" w:firstLine="0"/>
-              <w:jc w:val="left"/>
-              <w:rPr>
-                <w:sz w:val="20"/>
-              </w:rPr>
-            </w:pPr>
-            <w:r>
-              <w:rPr>
-                <w:sz w:val="20"/>
-              </w:rPr>
-              <w:t>IJCAI 2024</w:t>
+              <w:spacing w:line="276" w:lineRule="auto" w:after="40" w:before="40"/>
+            </w:pPr>
+            <w:r>
+              <w:rPr>
+                <w:rFonts w:ascii="Times New Roman" w:hAnsi="Times New Roman"/>
+                <w:sz w:val="19"/>
+              </w:rPr>
+              <w:t>ACM TOCE</w:t>
             </w:r>
           </w:p>
         </w:tc>
@@ -13013,17 +12907,14 @@
           </w:tcPr>
           <w:p>
             <w:pPr>
-              <w:ind w:left="0" w:firstLine="0"/>
-              <w:jc w:val="left"/>
-              <w:rPr>
-                <w:sz w:val="20"/>
-              </w:rPr>
-            </w:pPr>
-            <w:r>
-              <w:rPr>
-                <w:sz w:val="20"/>
-              </w:rPr>
-              <w:t>Vision-model grounding for screen content; relevant to WKAI’s screen-analysis pipeline</w:t>
+              <w:spacing w:line="276" w:lineRule="auto" w:after="40" w:before="40"/>
+            </w:pPr>
+            <w:r>
+              <w:rPr>
+                <w:rFonts w:ascii="Times New Roman" w:hAnsi="Times New Roman"/>
+                <w:sz w:val="19"/>
+              </w:rPr>
+              <w:t>Architectural survey of automated assessment, code test harnesses, and formative feedback loops</w:t>
             </w:r>
           </w:p>
         </w:tc>
@@ -13039,18 +12930,14 @@
           </w:tcPr>
           <w:p>
             <w:pPr>
-              <w:ind w:left="0" w:firstLine="0"/>
-              <w:jc w:val="left"/>
-              <w:rPr>
-                <w:sz w:val="20"/>
-              </w:rPr>
-            </w:pPr>
-            <w:r>
-              <w:rPr>
-                <w:sz w:val="20"/>
-              </w:rPr>
-              <w:lastRenderedPageBreak/>
-              <w:t>9</w:t>
+              <w:spacing w:line="276" w:lineRule="auto" w:after="40" w:before="40"/>
+            </w:pPr>
+            <w:r>
+              <w:rPr>
+                <w:rFonts w:ascii="Times New Roman" w:hAnsi="Times New Roman"/>
+                <w:sz w:val="19"/>
+              </w:rPr>
+              <w:t>10</w:t>
             </w:r>
           </w:p>
         </w:tc>
@@ -13064,17 +12951,14 @@
           </w:tcPr>
           <w:p>
             <w:pPr>
-              <w:ind w:left="0" w:firstLine="0"/>
-              <w:jc w:val="left"/>
-              <w:rPr>
-                <w:sz w:val="20"/>
-              </w:rPr>
-            </w:pPr>
-            <w:r>
-              <w:rPr>
-                <w:sz w:val="20"/>
-              </w:rPr>
-              <w:t>Instructor joins a room that already has students</w:t>
+              <w:spacing w:line="276" w:lineRule="auto" w:after="40" w:before="40"/>
+            </w:pPr>
+            <w:r>
+              <w:rPr>
+                <w:rFonts w:ascii="Times New Roman" w:hAnsi="Times New Roman"/>
+                <w:sz w:val="19"/>
+              </w:rPr>
+              <w:t>C.-F. Yeh et al. / ScreenAI: A Vision-Language Model for UI and Infographics Understanding</w:t>
             </w:r>
           </w:p>
         </w:tc>
@@ -13088,17 +12972,14 @@
           </w:tcPr>
           <w:p>
             <w:pPr>
-              <w:ind w:left="0" w:firstLine="0"/>
-              <w:jc w:val="left"/>
-              <w:rPr>
-                <w:sz w:val="20"/>
-              </w:rPr>
-            </w:pPr>
-            <w:r>
-              <w:rPr>
-                <w:sz w:val="20"/>
-              </w:rPr>
-              <w:t>The roster the instructor sees names every student present</w:t>
+              <w:spacing w:line="276" w:lineRule="auto" w:after="40" w:before="40"/>
+            </w:pPr>
+            <w:r>
+              <w:rPr>
+                <w:rFonts w:ascii="Times New Roman" w:hAnsi="Times New Roman"/>
+                <w:sz w:val="19"/>
+              </w:rPr>
+              <w:t>2024</w:t>
             </w:r>
           </w:p>
         </w:tc>
@@ -13112,17 +12993,14 @@
           </w:tcPr>
           <w:p>
             <w:pPr>
-              <w:ind w:left="0" w:firstLine="0"/>
-              <w:jc w:val="left"/>
-              <w:rPr>
-                <w:sz w:val="20"/>
-              </w:rPr>
-            </w:pPr>
-            <w:r>
-              <w:rPr>
-                <w:sz w:val="20"/>
-              </w:rPr>
-              <w:t>Membership changes now resend the whole list; an instructor arriving second no longer sees an empty panel beside a non-zero count</w:t>
+              <w:spacing w:line="276" w:lineRule="auto" w:after="40" w:before="40"/>
+            </w:pPr>
+            <w:r>
+              <w:rPr>
+                <w:rFonts w:ascii="Times New Roman" w:hAnsi="Times New Roman"/>
+                <w:sz w:val="19"/>
+              </w:rPr>
+              <w:t>IJCAI 2024</w:t>
             </w:r>
           </w:p>
         </w:tc>
@@ -13136,17 +13014,14 @@
           </w:tcPr>
           <w:p>
             <w:pPr>
-              <w:ind w:left="0" w:firstLine="0"/>
-              <w:jc w:val="left"/>
-              <w:rPr>
-                <w:sz w:val="20"/>
-              </w:rPr>
-            </w:pPr>
-            <w:r>
-              <w:rPr>
-                <w:sz w:val="20"/>
-              </w:rPr>
-              <w:t>Pass</w:t>
+              <w:spacing w:line="276" w:lineRule="auto" w:after="40" w:before="40"/>
+            </w:pPr>
+            <w:r>
+              <w:rPr>
+                <w:rFonts w:ascii="Times New Roman" w:hAnsi="Times New Roman"/>
+                <w:sz w:val="19"/>
+              </w:rPr>
+              <w:t>Screen-element grounding, visual layout parsing, and OCR-free visual question answering</w:t>
             </w:r>
           </w:p>
         </w:tc>
@@ -13162,17 +13037,14 @@
           </w:tcPr>
           <w:p>
             <w:pPr>
-              <w:ind w:left="0" w:firstLine="0"/>
-              <w:jc w:val="left"/>
-              <w:rPr>
-                <w:sz w:val="20"/>
-              </w:rPr>
-            </w:pPr>
-            <w:r>
-              <w:rPr>
-                <w:sz w:val="20"/>
-              </w:rPr>
-              <w:t>10</w:t>
+              <w:spacing w:line="276" w:lineRule="auto" w:after="40" w:before="40"/>
+            </w:pPr>
+            <w:r>
+              <w:rPr>
+                <w:rFonts w:ascii="Times New Roman" w:hAnsi="Times New Roman"/>
+                <w:sz w:val="19"/>
+              </w:rPr>
+              <w:t>11</w:t>
             </w:r>
           </w:p>
         </w:tc>
@@ -13186,17 +13058,14 @@
           </w:tcPr>
           <w:p>
             <w:pPr>
-              <w:ind w:left="0" w:firstLine="0"/>
-              <w:jc w:val="left"/>
-              <w:rPr>
-                <w:sz w:val="20"/>
-              </w:rPr>
-            </w:pPr>
-            <w:r>
-              <w:rPr>
-                <w:sz w:val="20"/>
-              </w:rPr>
-              <w:t>A student's slow database read during join</w:t>
+              <w:spacing w:line="276" w:lineRule="auto" w:after="40" w:before="40"/>
+            </w:pPr>
+            <w:r>
+              <w:rPr>
+                <w:rFonts w:ascii="Times New Roman" w:hAnsi="Times New Roman"/>
+                <w:sz w:val="19"/>
+              </w:rPr>
+              <w:t>J. Bai et al. / Qwen-VL: A Frontier Large Vision-Language Model with Versatile Abilities</w:t>
             </w:r>
           </w:p>
         </w:tc>
@@ -13210,17 +13079,14 @@
           </w:tcPr>
           <w:p>
             <w:pPr>
-              <w:ind w:left="0" w:firstLine="0"/>
-              <w:jc w:val="left"/>
-              <w:rPr>
-                <w:sz w:val="20"/>
-              </w:rPr>
-            </w:pPr>
-            <w:r>
-              <w:rPr>
-                <w:sz w:val="20"/>
-              </w:rPr>
-              <w:t>That one socket fails; the room is unaffected</w:t>
+              <w:spacing w:line="276" w:lineRule="auto" w:after="40" w:before="40"/>
+            </w:pPr>
+            <w:r>
+              <w:rPr>
+                <w:rFonts w:ascii="Times New Roman" w:hAnsi="Times New Roman"/>
+                <w:sz w:val="19"/>
+              </w:rPr>
+              <w:t>2023</w:t>
             </w:r>
           </w:p>
         </w:tc>
@@ -13234,17 +13100,14 @@
           </w:tcPr>
           <w:p>
             <w:pPr>
-              <w:ind w:left="0" w:firstLine="0"/>
-              <w:jc w:val="left"/>
-              <w:rPr>
-                <w:sz w:val="20"/>
-              </w:rPr>
-            </w:pPr>
-            <w:r>
-              <w:rPr>
-                <w:sz w:val="20"/>
-              </w:rPr>
-              <w:t>The connection handler no longer rejects into an unhandled promise that ended the process</w:t>
+              <w:spacing w:line="276" w:lineRule="auto" w:after="40" w:before="40"/>
+            </w:pPr>
+            <w:r>
+              <w:rPr>
+                <w:rFonts w:ascii="Times New Roman" w:hAnsi="Times New Roman"/>
+                <w:sz w:val="19"/>
+              </w:rPr>
+              <w:t>arXiv:2308.12966</w:t>
             </w:r>
           </w:p>
         </w:tc>
@@ -13258,17 +13121,14 @@
           </w:tcPr>
           <w:p>
             <w:pPr>
-              <w:ind w:left="0" w:firstLine="0"/>
-              <w:jc w:val="left"/>
-              <w:rPr>
-                <w:sz w:val="20"/>
-              </w:rPr>
-            </w:pPr>
-            <w:r>
-              <w:rPr>
-                <w:sz w:val="20"/>
-              </w:rPr>
-              <w:t>Pass</w:t>
+              <w:spacing w:line="276" w:lineRule="auto" w:after="40" w:before="40"/>
+            </w:pPr>
+            <w:r>
+              <w:rPr>
+                <w:rFonts w:ascii="Times New Roman" w:hAnsi="Times New Roman"/>
+                <w:sz w:val="19"/>
+              </w:rPr>
+              <w:t>Vision-language foundation family powering WKAI's real-time desktop frame analysis</w:t>
             </w:r>
           </w:p>
         </w:tc>
@@ -13284,17 +13144,14 @@
           </w:tcPr>
           <w:p>
             <w:pPr>
-              <w:ind w:left="0" w:firstLine="0"/>
-              <w:jc w:val="left"/>
-              <w:rPr>
-                <w:sz w:val="20"/>
-              </w:rPr>
-            </w:pPr>
-            <w:r>
-              <w:rPr>
-                <w:sz w:val="20"/>
-              </w:rPr>
-              <w:t>11</w:t>
+              <w:spacing w:line="276" w:lineRule="auto" w:after="40" w:before="40"/>
+            </w:pPr>
+            <w:r>
+              <w:rPr>
+                <w:rFonts w:ascii="Times New Roman" w:hAnsi="Times New Roman"/>
+                <w:sz w:val="19"/>
+              </w:rPr>
+              <w:t>12</w:t>
             </w:r>
           </w:p>
         </w:tc>
@@ -13308,17 +13165,14 @@
           </w:tcPr>
           <w:p>
             <w:pPr>
-              <w:ind w:left="0" w:firstLine="0"/>
-              <w:jc w:val="left"/>
-              <w:rPr>
-                <w:sz w:val="20"/>
-              </w:rPr>
-            </w:pPr>
-            <w:r>
-              <w:rPr>
-                <w:sz w:val="20"/>
-              </w:rPr>
-              <w:t>A room with no SFU credentials configured</w:t>
+              <w:spacing w:line="276" w:lineRule="auto" w:after="40" w:before="40"/>
+            </w:pPr>
+            <w:r>
+              <w:rPr>
+                <w:rFonts w:ascii="Times New Roman" w:hAnsi="Times New Roman"/>
+                <w:sz w:val="19"/>
+              </w:rPr>
+              <w:t>T. Yang et al. / MMTutorBench: The First Multimodal Benchmark for AI Math Tutoring</w:t>
             </w:r>
           </w:p>
         </w:tc>
@@ -13332,17 +13186,14 @@
           </w:tcPr>
           <w:p>
             <w:pPr>
-              <w:ind w:left="0" w:firstLine="0"/>
-              <w:jc w:val="left"/>
-              <w:rPr>
-                <w:sz w:val="20"/>
-              </w:rPr>
-            </w:pPr>
-            <w:r>
-              <w:rPr>
-                <w:sz w:val="20"/>
-              </w:rPr>
-              <w:t>The session still streams</w:t>
+              <w:spacing w:line="276" w:lineRule="auto" w:after="40" w:before="40"/>
+            </w:pPr>
+            <w:r>
+              <w:rPr>
+                <w:rFonts w:ascii="Times New Roman" w:hAnsi="Times New Roman"/>
+                <w:sz w:val="19"/>
+              </w:rPr>
+              <w:t>2026</w:t>
             </w:r>
           </w:p>
         </w:tc>
@@ -13356,17 +13207,14 @@
           </w:tcPr>
           <w:p>
             <w:pPr>
-              <w:ind w:left="0" w:firstLine="0"/>
-              <w:jc w:val="left"/>
-              <w:rPr>
-                <w:sz w:val="20"/>
-              </w:rPr>
-            </w:pPr>
-            <w:r>
-              <w:rPr>
-                <w:sz w:val="20"/>
-              </w:rPr>
-              <w:t>Both clients fall back to the direct peer mesh; behaviour matches the previous phase</w:t>
+              <w:spacing w:line="276" w:lineRule="auto" w:after="40" w:before="40"/>
+            </w:pPr>
+            <w:r>
+              <w:rPr>
+                <w:rFonts w:ascii="Times New Roman" w:hAnsi="Times New Roman"/>
+                <w:sz w:val="19"/>
+              </w:rPr>
+              <w:t>ACL 2026</w:t>
             </w:r>
           </w:p>
         </w:tc>
@@ -13380,17 +13228,14 @@
           </w:tcPr>
           <w:p>
             <w:pPr>
-              <w:ind w:left="0" w:firstLine="0"/>
-              <w:jc w:val="left"/>
-              <w:rPr>
-                <w:sz w:val="20"/>
-              </w:rPr>
-            </w:pPr>
-            <w:r>
-              <w:rPr>
-                <w:sz w:val="20"/>
-              </w:rPr>
-              <w:t>Pass</w:t>
+              <w:spacing w:line="276" w:lineRule="auto" w:after="40" w:before="40"/>
+            </w:pPr>
+            <w:r>
+              <w:rPr>
+                <w:rFonts w:ascii="Times New Roman" w:hAnsi="Times New Roman"/>
+                <w:sz w:val="19"/>
+              </w:rPr>
+              <w:t>Multimodal pedagogical evaluation metrics assessing explanation brevity, coherence, and scope</w:t>
             </w:r>
           </w:p>
         </w:tc>
@@ -13406,17 +13251,14 @@
           </w:tcPr>
           <w:p>
             <w:pPr>
-              <w:ind w:left="0" w:firstLine="0"/>
-              <w:jc w:val="left"/>
-              <w:rPr>
-                <w:sz w:val="20"/>
-              </w:rPr>
-            </w:pPr>
-            <w:r>
-              <w:rPr>
-                <w:sz w:val="20"/>
-              </w:rPr>
-              <w:t>12</w:t>
+              <w:spacing w:line="276" w:lineRule="auto" w:after="40" w:before="40"/>
+            </w:pPr>
+            <w:r>
+              <w:rPr>
+                <w:rFonts w:ascii="Times New Roman" w:hAnsi="Times New Roman"/>
+                <w:sz w:val="19"/>
+              </w:rPr>
+              <w:t>13</w:t>
             </w:r>
           </w:p>
         </w:tc>
@@ -13430,17 +13272,14 @@
           </w:tcPr>
           <w:p>
             <w:pPr>
-              <w:ind w:left="0" w:firstLine="0"/>
-              <w:jc w:val="left"/>
-              <w:rPr>
-                <w:sz w:val="20"/>
-              </w:rPr>
-            </w:pPr>
-            <w:r>
-              <w:rPr>
-                <w:sz w:val="20"/>
-              </w:rPr>
-              <w:t>The vision model is asked for more output tokens than the plan allows</w:t>
+              <w:spacing w:line="276" w:lineRule="auto" w:after="40" w:before="40"/>
+            </w:pPr>
+            <w:r>
+              <w:rPr>
+                <w:rFonts w:ascii="Times New Roman" w:hAnsi="Times New Roman"/>
+                <w:sz w:val="19"/>
+              </w:rPr>
+              <w:t>H. Li et al. / Video-MMLU: A Massive Multi-Discipline Lecture Understanding Benchmark</w:t>
             </w:r>
           </w:p>
         </w:tc>
@@ -13454,17 +13293,14 @@
           </w:tcPr>
           <w:p>
             <w:pPr>
-              <w:ind w:left="0" w:firstLine="0"/>
-              <w:jc w:val="left"/>
-              <w:rPr>
-                <w:sz w:val="20"/>
-              </w:rPr>
-            </w:pPr>
-            <w:r>
-              <w:rPr>
-                <w:sz w:val="20"/>
-              </w:rPr>
-              <w:t>The failure is reported as a configuration limit, not retried</w:t>
+              <w:spacing w:line="276" w:lineRule="auto" w:after="40" w:before="40"/>
+            </w:pPr>
+            <w:r>
+              <w:rPr>
+                <w:rFonts w:ascii="Times New Roman" w:hAnsi="Times New Roman"/>
+                <w:sz w:val="19"/>
+              </w:rPr>
+              <w:t>2025</w:t>
             </w:r>
           </w:p>
         </w:tc>
@@ -13478,17 +13314,14 @@
           </w:tcPr>
           <w:p>
             <w:pPr>
-              <w:ind w:left="0" w:firstLine="0"/>
-              <w:jc w:val="left"/>
-              <w:rPr>
-                <w:sz w:val="20"/>
-              </w:rPr>
-            </w:pPr>
-            <w:r>
-              <w:rPr>
-                <w:sz w:val="20"/>
-              </w:rPr>
-              <w:t>Over-large requests and spent daily quotas are now classified as non-retryable and named in the instructor's console</w:t>
+              <w:spacing w:line="276" w:lineRule="auto" w:after="40" w:before="40"/>
+            </w:pPr>
+            <w:r>
+              <w:rPr>
+                <w:rFonts w:ascii="Times New Roman" w:hAnsi="Times New Roman"/>
+                <w:sz w:val="19"/>
+              </w:rPr>
+              <w:t>IEEE/CVF CVPR 2025</w:t>
             </w:r>
           </w:p>
         </w:tc>
@@ -13502,17 +13335,14 @@
           </w:tcPr>
           <w:p>
             <w:pPr>
-              <w:ind w:left="0" w:firstLine="0"/>
-              <w:jc w:val="left"/>
-              <w:rPr>
-                <w:sz w:val="20"/>
-              </w:rPr>
-            </w:pPr>
-            <w:r>
-              <w:rPr>
-                <w:sz w:val="20"/>
-              </w:rPr>
-              <w:t>Pass</w:t>
+              <w:spacing w:line="276" w:lineRule="auto" w:after="40" w:before="40"/>
+            </w:pPr>
+            <w:r>
+              <w:rPr>
+                <w:rFonts w:ascii="Times New Roman" w:hAnsi="Times New Roman"/>
+                <w:sz w:val="19"/>
+              </w:rPr>
+              <w:t>Dense lecture-video understanding benchmark evaluating visual perception and slide notes</w:t>
             </w:r>
           </w:p>
         </w:tc>
@@ -13528,17 +13358,14 @@
           </w:tcPr>
           <w:p>
             <w:pPr>
-              <w:ind w:left="0" w:firstLine="0"/>
-              <w:jc w:val="left"/>
-              <w:rPr>
-                <w:sz w:val="20"/>
-              </w:rPr>
-            </w:pPr>
-            <w:r>
-              <w:rPr>
-                <w:sz w:val="20"/>
-              </w:rPr>
-              <w:t>13</w:t>
+              <w:spacing w:line="276" w:lineRule="auto" w:after="40" w:before="40"/>
+            </w:pPr>
+            <w:r>
+              <w:rPr>
+                <w:rFonts w:ascii="Times New Roman" w:hAnsi="Times New Roman"/>
+                <w:sz w:val="19"/>
+              </w:rPr>
+              <w:t>14</w:t>
             </w:r>
           </w:p>
         </w:tc>
@@ -13552,17 +13379,14 @@
           </w:tcPr>
           <w:p>
             <w:pPr>
-              <w:ind w:left="0" w:firstLine="0"/>
-              <w:jc w:val="left"/>
-              <w:rPr>
-                <w:sz w:val="20"/>
-              </w:rPr>
-            </w:pPr>
-            <w:r>
-              <w:rPr>
-                <w:sz w:val="20"/>
-              </w:rPr>
-              <w:t>A guide block that only narrates the screen</w:t>
+              <w:spacing w:line="276" w:lineRule="auto" w:after="40" w:before="40"/>
+            </w:pPr>
+            <w:r>
+              <w:rPr>
+                <w:rFonts w:ascii="Times New Roman" w:hAnsi="Times New Roman"/>
+                <w:sz w:val="19"/>
+              </w:rPr>
+              <w:t>G. Mathur et al. / MathBuddy: A Multimodal System for Affective Math Tutoring</w:t>
             </w:r>
           </w:p>
         </w:tc>
@@ -13576,17 +13400,14 @@
           </w:tcPr>
           <w:p>
             <w:pPr>
-              <w:ind w:left="0" w:firstLine="0"/>
-              <w:jc w:val="left"/>
-              <w:rPr>
-                <w:sz w:val="20"/>
-              </w:rPr>
-            </w:pPr>
-            <w:r>
-              <w:rPr>
-                <w:sz w:val="20"/>
-              </w:rPr>
-              <w:t>It never reaches a student</w:t>
+              <w:spacing w:line="276" w:lineRule="auto" w:after="40" w:before="40"/>
+            </w:pPr>
+            <w:r>
+              <w:rPr>
+                <w:rFonts w:ascii="Times New Roman" w:hAnsi="Times New Roman"/>
+                <w:sz w:val="19"/>
+              </w:rPr>
+              <w:t>2025</w:t>
             </w:r>
           </w:p>
         </w:tc>
@@ -13600,17 +13421,14 @@
           </w:tcPr>
           <w:p>
             <w:pPr>
-              <w:ind w:left="0" w:firstLine="0"/>
-              <w:jc w:val="left"/>
-              <w:rPr>
-                <w:sz w:val="20"/>
-              </w:rPr>
-            </w:pPr>
-            <w:r>
-              <w:rPr>
-                <w:sz w:val="20"/>
-              </w:rPr>
-              <w:t>Rejected by the grounding filter, with the reason reported rather than silently swallowed</w:t>
+              <w:spacing w:line="276" w:lineRule="auto" w:after="40" w:before="40"/>
+            </w:pPr>
+            <w:r>
+              <w:rPr>
+                <w:rFonts w:ascii="Times New Roman" w:hAnsi="Times New Roman"/>
+                <w:sz w:val="19"/>
+              </w:rPr>
+              <w:t>EMNLP 2025 Demos</w:t>
             </w:r>
           </w:p>
         </w:tc>
@@ -13624,17 +13442,228 @@
           </w:tcPr>
           <w:p>
             <w:pPr>
-              <w:ind w:left="0" w:firstLine="0"/>
-              <w:jc w:val="left"/>
-              <w:rPr>
-                <w:sz w:val="20"/>
-              </w:rPr>
-            </w:pPr>
-            <w:r>
-              <w:rPr>
-                <w:sz w:val="20"/>
-              </w:rPr>
-              <w:t>Pass</w:t>
+              <w:spacing w:line="276" w:lineRule="auto" w:after="40" w:before="40"/>
+            </w:pPr>
+            <w:r>
+              <w:rPr>
+                <w:rFonts w:ascii="Times New Roman" w:hAnsi="Times New Roman"/>
+                <w:sz w:val="19"/>
+              </w:rPr>
+              <w:t>Multimodal affective feedback and engagement drop-off proxies during live student problem-solving</w:t>
+            </w:r>
+          </w:p>
+        </w:tc>
+      </w:tr>
+      <w:tr>
+        <w:tc>
+          <w:tcPr>
+            <w:tcW w:w="680" w:type="dxa"/>
+            <w:tcMar>
+              <w:left w:w="80" w:type="dxa"/>
+              <w:right w:w="80" w:type="dxa"/>
+            </w:tcMar>
+          </w:tcPr>
+          <w:p>
+            <w:pPr>
+              <w:spacing w:line="276" w:lineRule="auto" w:after="40" w:before="40"/>
+            </w:pPr>
+            <w:r>
+              <w:rPr>
+                <w:rFonts w:ascii="Times New Roman" w:hAnsi="Times New Roman"/>
+                <w:sz w:val="19"/>
+              </w:rPr>
+              <w:t>15</w:t>
+            </w:r>
+          </w:p>
+        </w:tc>
+        <w:tc>
+          <w:tcPr>
+            <w:tcW w:w="3000" w:type="dxa"/>
+            <w:tcMar>
+              <w:left w:w="80" w:type="dxa"/>
+              <w:right w:w="80" w:type="dxa"/>
+            </w:tcMar>
+          </w:tcPr>
+          <w:p>
+            <w:pPr>
+              <w:spacing w:line="276" w:lineRule="auto" w:after="40" w:before="40"/>
+            </w:pPr>
+            <w:r>
+              <w:rPr>
+                <w:rFonts w:ascii="Times New Roman" w:hAnsi="Times New Roman"/>
+                <w:sz w:val="19"/>
+              </w:rPr>
+              <w:t>A. Radford et al. / Robust Speech Recognition via Large-Scale Weak Supervision</w:t>
+            </w:r>
+          </w:p>
+        </w:tc>
+        <w:tc>
+          <w:tcPr>
+            <w:tcW w:w="720" w:type="dxa"/>
+            <w:tcMar>
+              <w:left w:w="80" w:type="dxa"/>
+              <w:right w:w="80" w:type="dxa"/>
+            </w:tcMar>
+          </w:tcPr>
+          <w:p>
+            <w:pPr>
+              <w:spacing w:line="276" w:lineRule="auto" w:after="40" w:before="40"/>
+            </w:pPr>
+            <w:r>
+              <w:rPr>
+                <w:rFonts w:ascii="Times New Roman" w:hAnsi="Times New Roman"/>
+                <w:sz w:val="19"/>
+              </w:rPr>
+              <w:t>2023</w:t>
+            </w:r>
+          </w:p>
+        </w:tc>
+        <w:tc>
+          <w:tcPr>
+            <w:tcW w:w="1760" w:type="dxa"/>
+            <w:tcMar>
+              <w:left w:w="80" w:type="dxa"/>
+              <w:right w:w="80" w:type="dxa"/>
+            </w:tcMar>
+          </w:tcPr>
+          <w:p>
+            <w:pPr>
+              <w:spacing w:line="276" w:lineRule="auto" w:after="40" w:before="40"/>
+            </w:pPr>
+            <w:r>
+              <w:rPr>
+                <w:rFonts w:ascii="Times New Roman" w:hAnsi="Times New Roman"/>
+                <w:sz w:val="19"/>
+              </w:rPr>
+              <w:t>ICML 2023 (PMLR)</w:t>
+            </w:r>
+          </w:p>
+        </w:tc>
+        <w:tc>
+          <w:tcPr>
+            <w:tcW w:w="3200" w:type="dxa"/>
+            <w:tcMar>
+              <w:left w:w="80" w:type="dxa"/>
+              <w:right w:w="80" w:type="dxa"/>
+            </w:tcMar>
+          </w:tcPr>
+          <w:p>
+            <w:pPr>
+              <w:spacing w:line="276" w:lineRule="auto" w:after="40" w:before="40"/>
+            </w:pPr>
+            <w:r>
+              <w:rPr>
+                <w:rFonts w:ascii="Times New Roman" w:hAnsi="Times New Roman"/>
+                <w:sz w:val="19"/>
+              </w:rPr>
+              <w:t>Whisper model architecture underpinning WKAI's 30-second live audio chunk transcription</w:t>
+            </w:r>
+          </w:p>
+        </w:tc>
+      </w:tr>
+      <w:tr>
+        <w:tc>
+          <w:tcPr>
+            <w:tcW w:w="680" w:type="dxa"/>
+            <w:tcMar>
+              <w:left w:w="80" w:type="dxa"/>
+              <w:right w:w="80" w:type="dxa"/>
+            </w:tcMar>
+          </w:tcPr>
+          <w:p>
+            <w:pPr>
+              <w:spacing w:line="276" w:lineRule="auto" w:after="40" w:before="40"/>
+            </w:pPr>
+            <w:r>
+              <w:rPr>
+                <w:rFonts w:ascii="Times New Roman" w:hAnsi="Times New Roman"/>
+                <w:sz w:val="19"/>
+              </w:rPr>
+              <w:t>16</w:t>
+            </w:r>
+          </w:p>
+        </w:tc>
+        <w:tc>
+          <w:tcPr>
+            <w:tcW w:w="3000" w:type="dxa"/>
+            <w:tcMar>
+              <w:left w:w="80" w:type="dxa"/>
+              <w:right w:w="80" w:type="dxa"/>
+            </w:tcMar>
+          </w:tcPr>
+          <w:p>
+            <w:pPr>
+              <w:spacing w:line="276" w:lineRule="auto" w:after="40" w:before="40"/>
+            </w:pPr>
+            <w:r>
+              <w:rPr>
+                <w:rFonts w:ascii="Times New Roman" w:hAnsi="Times New Roman"/>
+                <w:sz w:val="19"/>
+              </w:rPr>
+              <w:t>Q. Wu et al. / AutoGen: Enabling Next-Gen LLM Applications via Multi-Agent Conversation</w:t>
+            </w:r>
+          </w:p>
+        </w:tc>
+        <w:tc>
+          <w:tcPr>
+            <w:tcW w:w="720" w:type="dxa"/>
+            <w:tcMar>
+              <w:left w:w="80" w:type="dxa"/>
+              <w:right w:w="80" w:type="dxa"/>
+            </w:tcMar>
+          </w:tcPr>
+          <w:p>
+            <w:pPr>
+              <w:spacing w:line="276" w:lineRule="auto" w:after="40" w:before="40"/>
+            </w:pPr>
+            <w:r>
+              <w:rPr>
+                <w:rFonts w:ascii="Times New Roman" w:hAnsi="Times New Roman"/>
+                <w:sz w:val="19"/>
+              </w:rPr>
+              <w:t>2023</w:t>
+            </w:r>
+          </w:p>
+        </w:tc>
+        <w:tc>
+          <w:tcPr>
+            <w:tcW w:w="1760" w:type="dxa"/>
+            <w:tcMar>
+              <w:left w:w="80" w:type="dxa"/>
+              <w:right w:w="80" w:type="dxa"/>
+            </w:tcMar>
+          </w:tcPr>
+          <w:p>
+            <w:pPr>
+              <w:spacing w:line="276" w:lineRule="auto" w:after="40" w:before="40"/>
+            </w:pPr>
+            <w:r>
+              <w:rPr>
+                <w:rFonts w:ascii="Times New Roman" w:hAnsi="Times New Roman"/>
+                <w:sz w:val="19"/>
+              </w:rPr>
+              <w:t>arXiv:2308.08155</w:t>
+            </w:r>
+          </w:p>
+        </w:tc>
+        <w:tc>
+          <w:tcPr>
+            <w:tcW w:w="3200" w:type="dxa"/>
+            <w:tcMar>
+              <w:left w:w="80" w:type="dxa"/>
+              <w:right w:w="80" w:type="dxa"/>
+            </w:tcMar>
+          </w:tcPr>
+          <w:p>
+            <w:pPr>
+              <w:spacing w:line="276" w:lineRule="auto" w:after="40" w:before="40"/>
+            </w:pPr>
+            <w:r>
+              <w:rPr>
+                <w:rFonts w:ascii="Times New Roman" w:hAnsi="Times New Roman"/>
+                <w:sz w:val="19"/>
+              </w:rPr>
+              <w:t>Multi-agent conversation patterns and tool execution informing WKAI's agent orchestration</w:t>
             </w:r>
           </w:p>
         </w:tc>
@@ -13745,7 +13774,10 @@
         <w:spacing w:line="360" w:lineRule="auto"/>
       </w:pPr>
       <w:r>
-        <w:t>The reviewed literature establishes each required capability in isolation and, in several cases, to a higher standard than this project reaches. Conversational tutoring is well studied [2]. Screen understanding is demonstrated [4]. Multi-agent coordination is characterised [5]. Programming-error tutoring is implemented [9]. What the literature does not provide is an integrated system in which these capabilities operate on a live, unscripted session in real time. Every reviewed system assumes at least one of the following: that the material is known in advance, that the interaction is asynchronous, that a specification or test suite defines correctness, or that the student starts the exchange by describing the problem.</w:t>
+        <w:rPr>
+          <w:rFonts w:ascii="Times New Roman" w:hAnsi="Times New Roman"/>
+        </w:rPr>
+        <w:t>The reviewed literature establishes each required capability in isolation and, in several cases, to a higher standard than this project reaches. Conversational tutoring is well studied [2], [3]. Programming-error tutoring and assessment is implemented [4], [8], [9]. Screen and multimodal understanding is demonstrated [10], [11], [13]. Multi-agent coordination is characterised [16], [17], [18]. What the literature does not provide is an integrated system in which these capabilities operate on a live, unscripted session in real time. Every reviewed system assumes at least one of the following: that the material is known in advance, that the interaction is asynchronous, that a specification or test suite defines correctness, or that the student starts the exchange by describing the problem.</w:t>
       </w:r>
     </w:p>
     <w:p>
@@ -13913,11 +13945,7 @@
         <w:spacing w:line="360" w:lineRule="auto"/>
       </w:pPr>
       <w:r>
-        <w:t xml:space="preserve">Chapter 1 introduces the problem, reviews the related literature, and states the objectives and scope of the work. Chapter 2 specifies the functional and non-functional requirements, the software requirements, the constraints, the feasibility study and the requirements traceability matrix. Chapter 3 presents the high-level design: the system architecture, the persistent and ephemeral data models, and the protocol between the three applications. Chapter 4 gives the detailed design of the AI agent layer and the security architecture. Chapter 5 describes the implementation module by module, with screenshots of the delivered system. Chapter 6 reports the testing strategy, the test results, the performance observations and the evaluation against the stated objectives. Chapter 7 concludes and sets out the limitations and future scope. The </w:t>
-      </w:r>
-      <w:r>
-        <w:lastRenderedPageBreak/>
-        <w:t>appendices carry the source-code layout, the project management record and the supporting certificates.</w:t>
+        <w:t>Chapter 1 introduces the problem, reviews the related literature, and states the objectives and scope of the work. Chapter 2 specifies the functional and non-functional requirements, the software requirements, the constraints, the feasibility study and the requirements traceability matrix. Chapter 3 presents the high-level design: the system architecture, the persistent and ephemeral data models, and the protocol between the three applications. Chapter 4 gives the detailed design of the AI agent layer and the security architecture. Chapter 5 describes the implementation module by module, with screenshots of the delivered system. Chapter 6 reports the testing strategy, the test results, the performance observations and the evaluation against the stated objectives. Chapter 7 concludes and sets out the limitations and future scope. The appendices carry the source-code layout, the project management record and the supporting certificates.</w:t>
       </w:r>
     </w:p>
     <w:p>
@@ -14232,7 +14260,10 @@
         <w:spacing w:line="360" w:lineRule="auto"/>
       </w:pPr>
       <w:r>
-        <w:t>Each technical dependency was verified before adoption. Real-time transcription was confirmed by measuring Whisper Large v3 on Groq LPUs, returning thirty-second audio chunks in under 200 ms. Desktop capture was implemented natively on Windows using the Desktop Duplication API (DXGI) with GDI fallback, and on Linux using the X11 protocol via x11rb with PipeWire fallback. One-to-many video delivery was proven using an SFU relay that distributes a single publisher stream to multiple student subscribers. Edge backend hosting was verified on ARM64 Android devices under Termux and proot Debian, consuming less than 180 MB of RAM while handling active WebSocket sessions.</w:t>
+        <w:rPr>
+          <w:rFonts w:ascii="Times New Roman" w:hAnsi="Times New Roman"/>
+        </w:rPr>
+        <w:t>Each technical dependency was verified before adoption. Real-time transcription was confirmed by measuring Whisper Large v3 [15] on Groq LPUs [20], [21], returning thirty-second audio chunks in under 200 ms. Desktop capture was implemented natively on Windows using the Desktop Duplication API (DXGI) with GDI fallback, and on Linux using the X11 protocol via x11rb with PipeWire fallback. One-to-many video delivery was proven using an SFU relay [24], [25] that distributes a single publisher stream to multiple student subscribers. Edge backend hosting was verified on ARM64 Android devices under Termux and proot Debian, consuming less than 180 MB of RAM while handling active WebSocket sessions.</w:t>
       </w:r>
     </w:p>
     <w:p>
@@ -14255,10 +14286,6 @@
       <w:r>
         <w:t>The architecture operates at zero recurring cost during development and minimal expense in production. Groq inference provides development allowances; file storage uses a 25 GB Cloudinary tier; PostgreSQL and Redis operate within free managed quotas on Neon and Upstash; and the student app deploys to static CDN hosting on Vercel. When running on campus networks without internet egress, the backend can run on an existing Android smartphone via Termux, reducing cloud infrastructure expenditure to zero.</w:t>
       </w:r>
-      <w:proofErr w:type="gramStart"/>
-      <w:r/>
-      <w:proofErr w:type="gramEnd"/>
-      <w:r/>
     </w:p>
     <w:p>
       <w:pPr>
@@ -14280,7 +14307,6 @@
       <w:r>
         <w:t>Operational feasibility rests on minimal installation friction. Instructors install a single native binary, built and packaged automatically by GitHub Actions for Windows (NSIS executable, MSI installer) and Linux (.deb package, AppImage) with Google Drive download mirrors. Students install nothing, accessing sessions via a browser with a room code. Sessions require no on-premises server configuration or dedicated administration.</w:t>
       </w:r>
-      <w:r/>
     </w:p>
     <w:p>
       <w:pPr>
@@ -14415,15 +14441,12 @@
           </w:tcPr>
           <w:p>
             <w:pPr>
-              <w:ind w:left="0" w:firstLine="0"/>
-              <w:jc w:val="left"/>
-              <w:rPr>
-                <w:sz w:val="22"/>
-              </w:rPr>
-            </w:pPr>
-            <w:r>
-              <w:rPr>
-                <w:sz w:val="22"/>
+              <w:spacing w:line="276" w:lineRule="auto"/>
+            </w:pPr>
+            <w:r>
+              <w:rPr>
+                <w:rFonts w:ascii="Times New Roman" w:hAnsi="Times New Roman"/>
+                <w:sz w:val="19"/>
               </w:rPr>
               <w:t>Instructor desktop</w:t>
             </w:r>
@@ -14438,8 +14461,15 @@
             </w:tcMar>
           </w:tcPr>
           <w:p>
-            <w:r>
-              <w:t>Tauri v2 (Rust + WebView2 on Windows, WebKitGTK on Linux)</w:t>
+            <w:pPr>
+              <w:spacing w:line="276" w:lineRule="auto"/>
+            </w:pPr>
+            <w:r>
+              <w:rPr>
+                <w:rFonts w:ascii="Times New Roman" w:hAnsi="Times New Roman"/>
+                <w:sz w:val="19"/>
+              </w:rPr>
+              <w:t>Tauri v2 [26] (Rust + WebView2 on Windows, WebKitGTK on Linux)</w:t>
             </w:r>
           </w:p>
         </w:tc>
@@ -14452,8 +14482,15 @@
             </w:tcMar>
           </w:tcPr>
           <w:p>
-            <w:r>
-              <w:t>8–15 MB install size, near-zero idle CPU, native screen capture on Windows (DXGI/GDI) and Linux (X11 x11rb / PipeWire)</w:t>
+            <w:pPr>
+              <w:spacing w:line="276" w:lineRule="auto"/>
+            </w:pPr>
+            <w:r>
+              <w:rPr>
+                <w:rFonts w:ascii="Times New Roman" w:hAnsi="Times New Roman"/>
+                <w:sz w:val="19"/>
+              </w:rPr>
+              <w:t>8-15 MB install size, near-zero idle CPU, native screen capture on Windows (DXGI/GDI) and Linux (X11 x11rb / PipeWire)</w:t>
             </w:r>
           </w:p>
         </w:tc>
@@ -14469,15 +14506,12 @@
           </w:tcPr>
           <w:p>
             <w:pPr>
-              <w:ind w:left="0" w:firstLine="0"/>
-              <w:jc w:val="left"/>
-              <w:rPr>
-                <w:sz w:val="22"/>
-              </w:rPr>
-            </w:pPr>
-            <w:r>
-              <w:rPr>
-                <w:sz w:val="22"/>
+              <w:spacing w:line="276" w:lineRule="auto"/>
+            </w:pPr>
+            <w:r>
+              <w:rPr>
+                <w:rFonts w:ascii="Times New Roman" w:hAnsi="Times New Roman"/>
+                <w:sz w:val="19"/>
               </w:rPr>
               <w:t>Student web app</w:t>
             </w:r>
@@ -14493,17 +14527,14 @@
           </w:tcPr>
           <w:p>
             <w:pPr>
-              <w:ind w:left="0" w:firstLine="0"/>
-              <w:jc w:val="left"/>
-              <w:rPr>
-                <w:sz w:val="22"/>
-              </w:rPr>
-            </w:pPr>
-            <w:r>
-              <w:rPr>
-                <w:sz w:val="22"/>
-              </w:rPr>
-              <w:t>React 18 + TypeScript + Vite</w:t>
+              <w:spacing w:line="276" w:lineRule="auto"/>
+            </w:pPr>
+            <w:r>
+              <w:rPr>
+                <w:rFonts w:ascii="Times New Roman" w:hAnsi="Times New Roman"/>
+                <w:sz w:val="19"/>
+              </w:rPr>
+              <w:t>React 18 + TypeScript + Vite [27]</w:t>
             </w:r>
           </w:p>
         </w:tc>
@@ -14517,15 +14548,12 @@
           </w:tcPr>
           <w:p>
             <w:pPr>
-              <w:ind w:left="0" w:firstLine="0"/>
-              <w:jc w:val="left"/>
-              <w:rPr>
-                <w:sz w:val="22"/>
-              </w:rPr>
-            </w:pPr>
-            <w:r>
-              <w:rPr>
-                <w:sz w:val="22"/>
+              <w:spacing w:line="276" w:lineRule="auto"/>
+            </w:pPr>
+            <w:r>
+              <w:rPr>
+                <w:rFonts w:ascii="Times New Roman" w:hAnsi="Times New Roman"/>
+                <w:sz w:val="19"/>
               </w:rPr>
               <w:t>Fast SPA, Monaco editor integration, zero-install for students</w:t>
             </w:r>
@@ -14617,15 +14645,12 @@
           </w:tcPr>
           <w:p>
             <w:pPr>
-              <w:ind w:left="0" w:firstLine="0"/>
-              <w:jc w:val="left"/>
-              <w:rPr>
-                <w:sz w:val="22"/>
-              </w:rPr>
-            </w:pPr>
-            <w:r>
-              <w:rPr>
-                <w:sz w:val="22"/>
+              <w:spacing w:line="276" w:lineRule="auto"/>
+            </w:pPr>
+            <w:r>
+              <w:rPr>
+                <w:rFonts w:ascii="Times New Roman" w:hAnsi="Times New Roman"/>
+                <w:sz w:val="19"/>
               </w:rPr>
               <w:t>AI inference</w:t>
             </w:r>
@@ -14640,8 +14665,15 @@
             </w:tcMar>
           </w:tcPr>
           <w:p>
-            <w:r>
-              <w:t>Groq (LPU Inference Engine)</w:t>
+            <w:pPr>
+              <w:spacing w:line="276" w:lineRule="auto"/>
+            </w:pPr>
+            <w:r>
+              <w:rPr>
+                <w:rFonts w:ascii="Times New Roman" w:hAnsi="Times New Roman"/>
+                <w:sz w:val="19"/>
+              </w:rPr>
+              <w:t>Groq (LPU Inference Engine) [20], [21]</w:t>
             </w:r>
           </w:p>
         </w:tc>
@@ -14654,7 +14686,14 @@
             </w:tcMar>
           </w:tcPr>
           <w:p>
-            <w:r>
+            <w:pPr>
+              <w:spacing w:line="276" w:lineRule="auto"/>
+            </w:pPr>
+            <w:r>
+              <w:rPr>
+                <w:rFonts w:ascii="Times New Roman" w:hAnsi="Times New Roman"/>
+                <w:sz w:val="19"/>
+              </w:rPr>
               <w:t>300+ tok/s; real-time generation practical at live workshop scale</w:t>
             </w:r>
           </w:p>
@@ -14671,15 +14710,12 @@
           </w:tcPr>
           <w:p>
             <w:pPr>
-              <w:ind w:left="0" w:firstLine="0"/>
-              <w:jc w:val="left"/>
-              <w:rPr>
-                <w:sz w:val="22"/>
-              </w:rPr>
-            </w:pPr>
-            <w:r>
-              <w:rPr>
-                <w:sz w:val="22"/>
+              <w:spacing w:line="276" w:lineRule="auto"/>
+            </w:pPr>
+            <w:r>
+              <w:rPr>
+                <w:rFonts w:ascii="Times New Roman" w:hAnsi="Times New Roman"/>
+                <w:sz w:val="19"/>
               </w:rPr>
               <w:t>LLM orchestration</w:t>
             </w:r>
@@ -14695,17 +14731,14 @@
           </w:tcPr>
           <w:p>
             <w:pPr>
-              <w:ind w:left="0" w:firstLine="0"/>
-              <w:jc w:val="left"/>
-              <w:rPr>
-                <w:sz w:val="22"/>
-              </w:rPr>
-            </w:pPr>
-            <w:r>
-              <w:rPr>
-                <w:sz w:val="22"/>
-              </w:rPr>
-              <w:t>LangChain + LangGraph</w:t>
+              <w:spacing w:line="276" w:lineRule="auto"/>
+            </w:pPr>
+            <w:r>
+              <w:rPr>
+                <w:rFonts w:ascii="Times New Roman" w:hAnsi="Times New Roman"/>
+                <w:sz w:val="19"/>
+              </w:rPr>
+              <w:t>LangChain + LangGraph [18]</w:t>
             </w:r>
           </w:p>
         </w:tc>
@@ -14719,15 +14752,12 @@
           </w:tcPr>
           <w:p>
             <w:pPr>
-              <w:ind w:left="0" w:firstLine="0"/>
-              <w:jc w:val="left"/>
-              <w:rPr>
-                <w:sz w:val="22"/>
-              </w:rPr>
-            </w:pPr>
-            <w:r>
-              <w:rPr>
-                <w:sz w:val="22"/>
+              <w:spacing w:line="276" w:lineRule="auto"/>
+            </w:pPr>
+            <w:r>
+              <w:rPr>
+                <w:rFonts w:ascii="Times New Roman" w:hAnsi="Times New Roman"/>
+                <w:sz w:val="19"/>
               </w:rPr>
               <w:t>Retry loops, structured output parsing, session memory</w:t>
             </w:r>
@@ -14927,17 +14957,14 @@
           </w:tcPr>
           <w:p>
             <w:pPr>
-              <w:ind w:left="0" w:firstLine="0"/>
-              <w:jc w:val="left"/>
-              <w:rPr>
-                <w:sz w:val="22"/>
-              </w:rPr>
-            </w:pPr>
-            <w:r>
-              <w:rPr>
-                <w:sz w:val="22"/>
-              </w:rPr>
-              <w:t>Persistent storage</w:t>
+              <w:spacing w:line="276" w:lineRule="auto"/>
+            </w:pPr>
+            <w:r>
+              <w:rPr>
+                <w:rFonts w:ascii="Times New Roman" w:hAnsi="Times New Roman"/>
+                <w:sz w:val="19"/>
+              </w:rPr>
+              <w:t>Media transport</w:t>
             </w:r>
           </w:p>
         </w:tc>
@@ -14951,17 +14978,14 @@
           </w:tcPr>
           <w:p>
             <w:pPr>
-              <w:ind w:left="0" w:firstLine="0"/>
-              <w:jc w:val="left"/>
-              <w:rPr>
-                <w:sz w:val="22"/>
-              </w:rPr>
-            </w:pPr>
-            <w:r>
-              <w:rPr>
-                <w:sz w:val="22"/>
-              </w:rPr>
-              <w:t>PostgreSQL (5 tables)</w:t>
+              <w:spacing w:line="276" w:lineRule="auto"/>
+            </w:pPr>
+            <w:r>
+              <w:rPr>
+                <w:rFonts w:ascii="Times New Roman" w:hAnsi="Times New Roman"/>
+                <w:sz w:val="19"/>
+              </w:rPr>
+              <w:t>Cloudflare Calls SFU / LiveKit [24], [25] over WebRTC [22], [23]</w:t>
             </w:r>
           </w:p>
         </w:tc>
@@ -14975,17 +14999,14 @@
           </w:tcPr>
           <w:p>
             <w:pPr>
-              <w:ind w:left="0" w:firstLine="0"/>
-              <w:jc w:val="left"/>
-              <w:rPr>
-                <w:sz w:val="22"/>
-              </w:rPr>
-            </w:pPr>
-            <w:r>
-              <w:rPr>
-                <w:sz w:val="22"/>
-              </w:rPr>
-              <w:t>Guide blocks, files, error logs, session records</w:t>
+              <w:spacing w:line="276" w:lineRule="auto"/>
+            </w:pPr>
+            <w:r>
+              <w:rPr>
+                <w:rFonts w:ascii="Times New Roman" w:hAnsi="Times New Roman"/>
+                <w:sz w:val="19"/>
+              </w:rPr>
+              <w:t>Low latency one-to-many distribution; falls back to direct mesh without SFU credentials</w:t>
             </w:r>
           </w:p>
         </w:tc>
@@ -15223,17 +15244,14 @@
           </w:tcPr>
           <w:p>
             <w:pPr>
-              <w:ind w:left="0" w:firstLine="0"/>
-              <w:jc w:val="left"/>
-              <w:rPr>
-                <w:sz w:val="22"/>
-              </w:rPr>
-            </w:pPr>
-            <w:r>
-              <w:rPr>
-                <w:sz w:val="22"/>
-              </w:rPr>
-              <w:t>Version control</w:t>
+              <w:spacing w:line="276" w:lineRule="auto"/>
+            </w:pPr>
+            <w:r>
+              <w:rPr>
+                <w:rFonts w:ascii="Times New Roman" w:hAnsi="Times New Roman"/>
+                <w:sz w:val="19"/>
+              </w:rPr>
+              <w:t>Tooling / MCP</w:t>
             </w:r>
           </w:p>
         </w:tc>
@@ -15246,8 +15264,15 @@
             </w:tcMar>
           </w:tcPr>
           <w:p>
-            <w:r>
-              <w:t>Git / GitHub Actions</w:t>
+            <w:pPr>
+              <w:spacing w:line="276" w:lineRule="auto"/>
+            </w:pPr>
+            <w:r>
+              <w:rPr>
+                <w:rFonts w:ascii="Times New Roman" w:hAnsi="Times New Roman"/>
+                <w:sz w:val="19"/>
+              </w:rPr>
+              <w:t>Model Context Protocol (wkai-mcp) [19]</w:t>
             </w:r>
           </w:p>
         </w:tc>
@@ -15260,8 +15285,15 @@
             </w:tcMar>
           </w:tcPr>
           <w:p>
-            <w:r>
-              <w:t>Automated multi-platform builds (Windows NSIS/MSI, Linux deb/AppImage), code signing, and Google Drive mirror fallback</w:t>
+            <w:pPr>
+              <w:spacing w:line="276" w:lineRule="auto"/>
+            </w:pPr>
+            <w:r>
+              <w:rPr>
+                <w:rFonts w:ascii="Times New Roman" w:hAnsi="Times New Roman"/>
+                <w:sz w:val="19"/>
+              </w:rPr>
+              <w:t>Exposes workshop state and instructor actions to external agents over stdio</w:t>
             </w:r>
           </w:p>
         </w:tc>
@@ -15329,7 +15361,6 @@
       <w:bookmarkStart w:id="57" w:name="_Toc238824696"/>
       <w:bookmarkStart w:id="58" w:name="_Toc239051724"/>
       <w:r>
-        <w:lastRenderedPageBreak/>
         <w:t>2.5.1 Prerequisites for Development</w:t>
       </w:r>
       <w:bookmarkEnd w:id="57"/>
@@ -15351,6 +15382,7 @@
       <w:bookmarkStart w:id="59" w:name="_Toc238824698"/>
       <w:bookmarkStart w:id="60" w:name="_Toc239051725"/>
       <w:r>
+        <w:lastRenderedPageBreak/>
         <w:t>2.6 Minimum System Configuration</w:t>
       </w:r>
       <w:bookmarkEnd w:id="59"/>
@@ -15424,11 +15456,10 @@
         <w:spacing w:line="360" w:lineRule="auto"/>
       </w:pPr>
       <w:r>
-        <w:t xml:space="preserve">Four external software interfaces are required. The inference provider is reached over HTTPS for both speech transcription and text generation, authenticated with an API key held in server </w:t>
-      </w:r>
-      <w:r>
-        <w:lastRenderedPageBreak/>
-        <w:t>configuration and never sent to a client [11]. The media platform is reached for ingress creation and subscriber-token issuance, authenticated with a signed credential pair [10]. The file-storage service is reached for upload and returns a public download URL that is broadcast to students. The relational database and the in-memory store are reached over their native protocols from the backend only. Neither is reachable from a client, and no client ever holds a database credential.</w:t>
+        <w:rPr>
+          <w:rFonts w:ascii="Times New Roman" w:hAnsi="Times New Roman"/>
+        </w:rPr>
+        <w:t>Four external software interfaces are required. The inference provider is reached over HTTPS for both text and vision models [20], [21], with WebRTC / live video ingress handled via the SFU relay [24], [25]. Persistent storage is accessed over standard PostgreSQL wire protocol connections, and in-memory cache and pub/sub channels communicate via the Redis protocol. For external autonomous agents, the wkai-mcp server implements the Model Context Protocol [19] over stdio JSON-RPC.</w:t>
       </w:r>
     </w:p>
     <w:p>
@@ -15449,7 +15480,10 @@
         <w:spacing w:line="360" w:lineRule="auto"/>
       </w:pPr>
       <w:r>
-        <w:t>Control-plane communication uses a single WebSocket endpoint carrying JSON messages, with the connection authenticated by a signed token supplied as a query parameter and validated before the upgrade completes. Request-response operations use JSON over HTTPS on the REST routes listed in Section 3.3. Media travels on a separate path: currently peer connections negotiated through the WebSocket relay [14], and under the planned rebuild an ingest protocol to the media platform with per-student subscribe tokens [10]. Keeping media off the control channel is a requirement rather than a happy accident, because it is what allows the streaming implementation to be replaced without renegotiating the application protocol.</w:t>
+        <w:rPr>
+          <w:rFonts w:ascii="Times New Roman" w:hAnsi="Times New Roman"/>
+        </w:rPr>
+        <w:t>Control-plane communication uses a single WebSocket endpoint carrying JSON messages, with the connection authenticated via signed session tokens passed in the query string. WebRTC media transport adheres to modern standards [22], [23], [24], [25], employing standard ICE/STUN/TURN candidates and SDP negotiation. The backend exposes REST routes under /api for session creation, joining, status polling, and guide export.</w:t>
       </w:r>
     </w:p>
     <w:p>
@@ -15495,11 +15529,11 @@
         <w:tblLook w:val="04A0" w:firstRow="1" w:lastRow="0" w:firstColumn="1" w:lastColumn="0" w:noHBand="0" w:noVBand="1"/>
       </w:tblPr>
       <w:tblGrid>
-        <w:gridCol w:w="666"/>
-        <w:gridCol w:w="2889"/>
-        <w:gridCol w:w="1544"/>
-        <w:gridCol w:w="1549"/>
-        <w:gridCol w:w="2368"/>
+        <w:gridCol w:w="664"/>
+        <w:gridCol w:w="2902"/>
+        <w:gridCol w:w="1541"/>
+        <w:gridCol w:w="1547"/>
+        <w:gridCol w:w="2362"/>
       </w:tblGrid>
       <w:tr>
         <w:trPr>
@@ -16631,7 +16665,6 @@
               <w:rPr>
                 <w:sz w:val="20"/>
               </w:rPr>
-              <w:lastRenderedPageBreak/>
               <w:t>FR-9</w:t>
             </w:r>
           </w:p>
@@ -16763,7 +16796,11 @@
         <w:spacing w:line="360" w:lineRule="auto"/>
       </w:pPr>
       <w:r>
-        <w:t>The phase was planned against five checkable outcomes: a live session an instructor can start and students can join from a browser with no installation; a study guide generated from the session itself and visible to students while the session is still running; an error-diagnosis path that takes a student's failure text and returns a grounded explanation and a corrective action; an authentication model in which no client-supplied parameter can influence role or identity; and a consistent, accessible interface across both applications. Chapter 6 evaluates the delivered system against each of these, and Chapter 7 states plainly which are complete and which remain bounded by the streaming pipeline still being rebuilt.</w:t>
+        <w:t xml:space="preserve">The phase was planned against five checkable outcomes: a live session an instructor can start and students can join from a browser with no installation; a study guide generated from the session itself and visible to students while the session is still running; an error-diagnosis path that takes a student's failure text and returns a grounded explanation and a corrective action; an </w:t>
+      </w:r>
+      <w:r>
+        <w:lastRenderedPageBreak/>
+        <w:t>authentication model in which no client-supplied parameter can influence role or identity; and a consistent, accessible interface across both applications. Chapter 6 evaluates the delivered system against each of these, and Chapter 7 states plainly which are complete and which remain bounded by the streaming pipeline still being rebuilt.</w:t>
       </w:r>
     </w:p>
     <w:p>
@@ -16825,7 +16862,10 @@
         <w:spacing w:line="360" w:lineRule="auto"/>
       </w:pPr>
       <w:r>
-        <w:t>Instructor app (wkai/): Tauri v2 (Rust + React, TypeScript, Vite). The Rust core manages OS-level screen capture (DXGI and GDI on Windows; native X11 via x11rb and PipeWire on Linux), audio capture, tray lifecycle, and local recording.</w:t>
+        <w:rPr>
+          <w:rFonts w:ascii="Times New Roman" w:hAnsi="Times New Roman"/>
+        </w:rPr>
+        <w:t>Instructor app (wkai/): Tauri v2 [26] (Rust + React, TypeScript, Vite). The Rust core manages OS-level screen capture (DXGI and GDI on Windows; native X11 via x11rb and PipeWire on Linux), audio capture, tray lifecycle, and local recording.</w:t>
       </w:r>
     </w:p>
     <w:p>
@@ -16834,7 +16874,10 @@
         <w:spacing w:line="360" w:lineRule="auto"/>
       </w:pPr>
       <w:r>
-        <w:t>Student app (wkai-student/): React with TypeScript and Vite, a zero-install browser application holding a Monaco editor and an xterm terminal for sandboxed exercises, the live view, the generated guide, the AI help panel, the private question thread and a proctored assessment runner. The same build also serves the public landing and download pages.</w:t>
+        <w:rPr>
+          <w:rFonts w:ascii="Times New Roman" w:hAnsi="Times New Roman"/>
+        </w:rPr>
+        <w:t>Student app (wkai-student/): React with TypeScript and Vite, a zero-install browser application holding a Monaco editor and an xterm terminal for sandboxed exercises [27], the live view, the generated guide, the AI help panel, the private question thread and a proctored assessment runner. The same build also serves the public landing and download pages.</w:t>
       </w:r>
     </w:p>
     <w:p>
@@ -16851,7 +16894,10 @@
         <w:spacing w:line="360" w:lineRule="auto"/>
       </w:pPr>
       <w:r>
-        <w:t>Instructor capture runs entirely outside the browser runtime. The Rust capture module grabs framebuffers per operating system (DXGI on Windows, x11rb on Linux), executes SIMD colour conversion, and feeds the WebRTC SFU streaming pipeline.</w:t>
+        <w:rPr>
+          <w:rFonts w:ascii="Times New Roman" w:hAnsi="Times New Roman"/>
+        </w:rPr>
+        <w:t>Instructor capture runs entirely outside the browser runtime. The Rust capture module grabs framebuffers per operating system (DXGI on Windows, x11rb on Linux), executes SIMD colour conversion, and feeds the WebRTC SFU streaming pipeline [22], [24], [25].</w:t>
       </w:r>
     </w:p>
     <w:p>
@@ -16859,19 +16905,19 @@
         <w:spacing w:line="360" w:lineRule="auto"/>
       </w:pPr>
       <w:r>
-        <w:t xml:space="preserve">Seen as layers rather than as applications, the system has five. The capture layer is native code inside the instructor application, responsible only for acquiring frames and audio and passing them on over a bounded channel. The transport layer is the WebSocket control channel plus </w:t>
+        <w:t>Seen as layers rather than as applications, the system has five. The capture layer is native code inside the instructor application, responsible only for acquiring frames and audio and passing them on over a bounded channel. The transport layer is the WebSocket control channel plus the separate media path, and it is the only layer both client applications share. The orchestration layer is the backend's agent runtime, which owns prompt construction, state-machine execution, retry policy and concurrency control. The persistence layer separates durable records in the relational store from ephemeral, time-bounded state in the in-memory store. The presentation layer is the two user interfaces, which hold no authoritative state of their own and render only from messages received on the control channel and snapshots fetched over REST.</w:t>
+      </w:r>
+    </w:p>
+    <w:p>
+      <w:pPr>
+        <w:spacing w:line="360" w:lineRule="auto"/>
+      </w:pPr>
+      <w:r>
+        <w:t xml:space="preserve">Two invariants hold across those layers, and they account for most of the design's resilience. First, no client is authoritative about anything. A client's role, its session membership and its identity are all properties of the server-issued token it presents, and a client that reconnects receives a full state snapshot instead of replaying local assumptions. Second, the control path and the media path are independent. A student whose media connection degrades keeps </w:t>
       </w:r>
       <w:r>
         <w:lastRenderedPageBreak/>
-        <w:t>the separate media path, and it is the only layer both client applications share. The orchestration layer is the backend's agent runtime, which owns prompt construction, state-machine execution, retry policy and concurrency control. The persistence layer separates durable records in the relational store from ephemeral, time-bounded state in the in-memory store. The presentation layer is the two user interfaces, which hold no authoritative state of their own and render only from messages received on the control channel and snapshots fetched over REST.</w:t>
-      </w:r>
-    </w:p>
-    <w:p>
-      <w:pPr>
-        <w:spacing w:line="360" w:lineRule="auto"/>
-      </w:pPr>
-      <w:r>
-        <w:t>Two invariants hold across those layers, and they account for most of the design's resilience. First, no client is authoritative about anything. A client's role, its session membership and its identity are all properties of the server-issued token it presents, and a client that reconnects receives a full state snapshot instead of replaying local assumptions. Second, the control path and the media path are independent. A student whose media connection degrades keeps receiving guide blocks, quizzes and diagnoses over the control channel, and the media pipeline was in fact replaced wholesale during this phase — browser capture and a peer mesh gave way to native capture and a relay — without one change to the application protocol. Neither invariant was present in the original design. Both came out of the hardening work described in Chapter 5, and the second is what made the streaming rebuild a contained piece of work rather than a rewrite.</w:t>
+        <w:t>receiving guide blocks, quizzes and diagnoses over the control channel, and the media pipeline was in fact replaced wholesale during this phase — browser capture and a peer mesh gave way to native capture and a relay — without one change to the application protocol. Neither invariant was present in the original design. Both came out of the hardening work described in Chapter 5, and the second is what made the streaming rebuild a contained piece of work rather than a rewrite.</w:t>
       </w:r>
     </w:p>
     <w:p>
@@ -16890,7 +16936,6 @@
         <w:rPr>
           <w:noProof/>
         </w:rPr>
-        <w:lastRenderedPageBreak/>
         <w:drawing>
           <wp:inline distT="0" distB="0" distL="0" distR="0" wp14:anchorId="4A456F71" wp14:editId="64D11CDD">
             <wp:extent cx="4937760" cy="2891312"/>
@@ -16976,7 +17021,11 @@
       </w:r>
       <w:proofErr w:type="gramEnd"/>
       <w:r>
-        <w:t xml:space="preserve"> actor: joins a session with a room code (and password if set), views the live stream and auto-generated guide, runs code in the sandboxed editor/terminal, requests AI help on errors, answers comprehension quizzes, receives shared files, and messages the instructor.</w:t>
+        <w:t xml:space="preserve"> actor: joins a session with a room </w:t>
+      </w:r>
+      <w:r>
+        <w:lastRenderedPageBreak/>
+        <w:t>code (and password if set), views the live stream and auto-generated guide, runs code in the sandboxed editor/terminal, requests AI help on errors, answers comprehension quizzes, receives shared files, and messages the instructor.</w:t>
       </w:r>
     </w:p>
     <w:p>
@@ -16984,7 +17033,10 @@
         <w:spacing w:line="360" w:lineRule="auto"/>
       </w:pPr>
       <w:r>
-        <w:t>Data flow at a high level: the instructor's microphone and screen feed transcript and frame ingestion in the backend, which runs the LangGraph agents [12] through classify, then diagnose, explain or generate. Two gates sit in that path and reject rather than pass: a transcript gate that discards stock Whisper hallucinations, pure filler and decoder loops before a model is billed for them, and a grounding filter that drops guide blocks which only narrate the screen, carry too little to teach, or claim code while carrying none. Session memory in Redis keeps a rolling window of what has already been taught, extended across a course by an optional workspace, and the surviving guide, quiz and diagnosis messages are broadcast over the WebSocket to the student application, which renders them live.</w:t>
+        <w:rPr>
+          <w:rFonts w:ascii="Times New Roman" w:hAnsi="Times New Roman"/>
+        </w:rPr>
+        <w:t>Data flow at a high level: the instructor's microphone and screen feed transcript and frame ingestion in the backend, which runs the LangGraph agents [18] through classify, then diagnose, explain or generate. Two gates sit in that path and reject rather than pass: a transcript gate that discards stock Whisper hallucinations, pure filler and decoder loops before a model is billed for them, and a grounding filter that drops guide blocks which only narrate the screen, carry too little to teach, or claim code while carrying none. Session memory in Redis keeps a rolling window of what has already been taught, extended across a course by an optional workspace, and the surviving guide, quiz and diagnosis messages are broadcast over the WebSocket to the student application, which renders them live.</w:t>
       </w:r>
     </w:p>
     <w:p>
@@ -16992,11 +17044,7 @@
         <w:spacing w:line="360" w:lineRule="auto"/>
       </w:pPr>
       <w:r>
-        <w:t xml:space="preserve">Database design: PostgreSQL holds the persistent tables covering sessions and workspaces, guide blocks, comprehension questions, shared files, student messages, error resolutions, and the assessment tables — the assessment itself, its questions, each attempt, each answer, and the proctoring events recorded during an attempt. Redis holds the fast-changing state: active room </w:t>
-      </w:r>
-      <w:r>
-        <w:lastRenderedPageBreak/>
-        <w:t>membership and student counts, the rolling transcript, conversational memory for the agents, the session snapshot consulted during token validation, and the record of where the instructor's stream currently lives on the relay.</w:t>
+        <w:t>Database design: PostgreSQL holds the persistent tables covering sessions and workspaces, guide blocks, comprehension questions, shared files, student messages, error resolutions, and the assessment tables — the assessment itself, its questions, each attempt, each answer, and the proctoring events recorded during an attempt. Redis holds the fast-changing state: active room membership and student counts, the rolling transcript, conversational memory for the agents, the session snapshot consulted during token validation, and the record of where the instructor's stream currently lives on the relay.</w:t>
       </w:r>
     </w:p>
     <w:p>
@@ -17066,6 +17114,7 @@
       <w:bookmarkStart w:id="79" w:name="_Toc238824708"/>
       <w:bookmarkStart w:id="80" w:name="_Toc239051735"/>
       <w:r>
+        <w:lastRenderedPageBreak/>
         <w:t>3.2.1 Persistent Data Model</w:t>
       </w:r>
       <w:bookmarkEnd w:id="79"/>
@@ -17530,7 +17579,6 @@
               <w:rPr>
                 <w:sz w:val="22"/>
               </w:rPr>
-              <w:lastRenderedPageBreak/>
               <w:t>comprehension_questions</w:t>
             </w:r>
           </w:p>
@@ -18021,6 +18069,7 @@
               <w:rPr>
                 <w:sz w:val="22"/>
               </w:rPr>
+              <w:lastRenderedPageBreak/>
               <w:t>assessment_questions</w:t>
             </w:r>
           </w:p>
@@ -18412,11 +18461,7 @@
         <w:spacing w:line="360" w:lineRule="auto"/>
       </w:pPr>
       <w:r>
-        <w:t xml:space="preserve">The in-memory store holds three kinds of state, each with an explicit expiry. Active-room state maps a room code to its connected participants and current status, and the relay consults it on every broadcast. Conversational memory keeps a rolling window of the twenty most recent messages for a session, which is what lets an agent invoked late in a session know what was already taught without re-reading the whole transcript; the window size was chosen </w:t>
-      </w:r>
-      <w:r>
-        <w:lastRenderedPageBreak/>
-        <w:t>empirically, at the point where more context stopped improving diagnosis quality and kept adding prompt cost and latency. Token-validation support holds revocation and session-liveness information used during connection authentication. All three carry a seven-day time to live, long enough for a course that runs across several days, so an abandoned session still clears itself with no cleanup task.</w:t>
+        <w:t>The in-memory store holds three kinds of state, each with an explicit expiry. Active-room state maps a room code to its connected participants and current status, and the relay consults it on every broadcast. Conversational memory keeps a rolling window of the twenty most recent messages for a session, which is what lets an agent invoked late in a session know what was already taught without re-reading the whole transcript; the window size was chosen empirically, at the point where more context stopped improving diagnosis quality and kept adding prompt cost and latency. Token-validation support holds revocation and session-liveness information used during connection authentication. All three carry a seven-day time to live, long enough for a course that runs across several days, so an abandoned session still clears itself with no cleanup task.</w:t>
       </w:r>
     </w:p>
     <w:p>
@@ -18437,7 +18482,11 @@
         <w:spacing w:line="360" w:lineRule="auto"/>
       </w:pPr>
       <w:r>
-        <w:t>The backend source is organised by responsibility rather than by technical type. The routes directory holds thin HTTP handlers that validate input, delegate and serialise a response, with no business logic and no direct model calls. The ai directory holds two sub-layers: agents, one file per agent implementing the shared lifecycle contract, and graphs, the state machines those agents execute. The websocket directory holds the connection authenticator, the room registry and the broadcast helpers. The db directory holds the schema definition and the query functions, and no query text appears outside it. The livekit directory holds the dependency-free media-platform client, including token signing and the calls needed to create and tear down a session ingress. The layout keeps the two most volatile areas, prompt logic and media integration, each behind a single directory boundary.</w:t>
+        <w:t xml:space="preserve">The backend source is organised by responsibility rather than by technical type. The routes directory holds thin HTTP handlers that validate input, delegate and serialise a response, with no business logic and no direct model calls. The ai directory holds two sub-layers: agents, one file per agent implementing the shared lifecycle contract, and graphs, the state machines those agents execute. The websocket directory holds the connection authenticator, the room registry </w:t>
+      </w:r>
+      <w:r>
+        <w:lastRenderedPageBreak/>
+        <w:t>and the broadcast helpers. The db directory holds the schema definition and the query functions, and no query text appears outside it. The livekit directory holds the dependency-free media-platform client, including token signing and the calls needed to create and tear down a session ingress. The layout keeps the two most volatile areas, prompt logic and media integration, each behind a single directory boundary.</w:t>
       </w:r>
     </w:p>
     <w:p>
@@ -18469,7 +18518,6 @@
       <w:bookmarkStart w:id="87" w:name="_Toc238824712"/>
       <w:bookmarkStart w:id="88" w:name="_Toc239051739"/>
       <w:r>
-        <w:lastRenderedPageBreak/>
         <w:t>3.3 Interface between Components (Protocol)</w:t>
       </w:r>
       <w:bookmarkEnd w:id="87"/>
@@ -18909,6 +18957,7 @@
               <w:rPr>
                 <w:sz w:val="22"/>
               </w:rPr>
+              <w:lastRenderedPageBreak/>
               <w:t>student-error</w:t>
             </w:r>
           </w:p>
@@ -19799,7 +19848,6 @@
         <w:rPr>
           <w:b/>
         </w:rPr>
-        <w:lastRenderedPageBreak/>
         <w:t>Table 3.3 – Key Backend REST Routes</w:t>
       </w:r>
     </w:p>
@@ -20566,6 +20614,7 @@
               <w:rPr>
                 <w:sz w:val="22"/>
               </w:rPr>
+              <w:lastRenderedPageBreak/>
               <w:t>POST</w:t>
             </w:r>
           </w:p>
@@ -21609,8 +21658,9 @@
         <w:rPr>
           <w:noProof/>
         </w:rPr>
+        <w:lastRenderedPageBreak/>
         <w:drawing>
-          <wp:anchor distT="0" distB="0" distL="114300" distR="114300" simplePos="0" relativeHeight="251668480" behindDoc="0" locked="0" layoutInCell="1" allowOverlap="1" wp14:anchorId="03D8F9B1" wp14:editId="4DABDC28">
+          <wp:anchor distT="0" distB="0" distL="114300" distR="114300" simplePos="0" relativeHeight="251668480" behindDoc="0" locked="0" layoutInCell="1" allowOverlap="1" wp14:anchorId="03D8F9B1" wp14:editId="2EA36141">
             <wp:simplePos x="0" y="0"/>
             <wp:positionH relativeFrom="column">
               <wp:posOffset>0</wp:posOffset>
@@ -21706,19 +21756,19 @@
       </w:r>
       <w:proofErr w:type="gramEnd"/>
       <w:r>
-        <w:t xml:space="preserve"> and subscribe, with the room registry as broker and </w:t>
+        <w:t xml:space="preserve"> and subscribe, with the room registry as broker and clients as subscribers identified by verified token claims. The client stores are observers, so one inbound message updates every dependent view without explicit propagation. The theming engine is a computed derivation: one user-chosen accent value generates its own contrast-safe foreground and text derivatives at runtime, so there is one value to keep consistent rather than three per theme.</w:t>
+      </w:r>
+    </w:p>
+    <w:p>
+      <w:pPr>
+        <w:spacing w:line="360" w:lineRule="auto"/>
+      </w:pPr>
+      <w:r>
+        <w:t xml:space="preserve">One pattern was rejected. An event-sourced session model, persisting every message and rebuilding state by replay, was considered because it would have solved restart resilience elegantly. It was rejected for this phase on scope: it needed a rewrite of the persistence layer to buy a reliability property that moving room state into the in-memory store also delivers. It is </w:t>
       </w:r>
       <w:r>
         <w:lastRenderedPageBreak/>
-        <w:t>clients as subscribers identified by verified token claims. The client stores are observers, so one inbound message updates every dependent view without explicit propagation. The theming engine is a computed derivation: one user-chosen accent value generates its own contrast-safe foreground and text derivatives at runtime, so there is one value to keep consistent rather than three per theme.</w:t>
-      </w:r>
-    </w:p>
-    <w:p>
-      <w:pPr>
-        <w:spacing w:line="360" w:lineRule="auto"/>
-      </w:pPr>
-      <w:r>
-        <w:t>One pattern was rejected. An event-sourced session model, persisting every message and rebuilding state by replay, was considered because it would have solved restart resilience elegantly. It was rejected for this phase on scope: it needed a rewrite of the persistence layer to buy a reliability property that moving room state into the in-memory store also delivers. It is recorded here because it remains the better long-term answer if the system is scaled across several backend instances.</w:t>
+        <w:t>recorded here because it remains the better long-term answer if the system is scaled across several backend instances.</w:t>
       </w:r>
     </w:p>
     <w:p>
@@ -21771,11 +21821,7 @@
         <w:spacing w:line="360" w:lineRule="auto"/>
       </w:pPr>
       <w:r>
-        <w:t xml:space="preserve">The fourth was model capability against latency and cost. A larger model produces better diagnoses; a smaller one responds faster and permits more invocations per session. The </w:t>
-      </w:r>
-      <w:r>
-        <w:lastRenderedPageBreak/>
-        <w:t>resolution was to differentiate by task rather than choose globally: cheap lexical pre-filters and classification steps run ahead of expensive generation, so the largest model is invoked only when its output will be shown to a student. Hence the intent agent's heuristic first node, and the error agent classifying before it diagnoses.</w:t>
+        <w:t>The fourth was model capability against latency and cost. A larger model produces better diagnoses; a smaller one responds faster and permits more invocations per session. The resolution was to differentiate by task rather than choose globally: cheap lexical pre-filters and classification steps run ahead of expensive generation, so the largest model is invoked only when its output will be shown to a student. Hence the intent agent's heuristic first node, and the error agent classifying before it diagnoses.</w:t>
       </w:r>
     </w:p>
     <w:p>
@@ -21826,7 +21872,10 @@
         <w:spacing w:line="360" w:lineRule="auto"/>
       </w:pPr>
       <w:r>
-        <w:t>The AI agent layer is hosted entirely on Groq's LPU inference infrastructure to sustain the low latencies required for live technical instruction. Speech transcription uses Whisper Large v3, transcribing thirty-second audio chunks in under 200 ms. Frame vision processing uses Qwen3.8-27B (qwen/qwen3.8-27b, max_tokens=900), which replaced the decommissioned llama-4-scout and operates under Groq's output-tokens-per-minute ceiling without emitting disruptive reasoning blocks. Text reasoning, error diagnosis, intent detection, and assessment authoring use GPT-OSS-120B (openai/gpt-oss-120b), which migrated from llama-3.3-70b-versatile for superior structured output generation and reliable Zod schema validation. A dedicated creative instance of GPT-OSS-120B (temperature 0.6, max_tokens=1200) generates comprehension check questions.</w:t>
+        <w:rPr>
+          <w:rFonts w:ascii="Times New Roman" w:hAnsi="Times New Roman"/>
+        </w:rPr>
+        <w:t>The AI agent layer is hosted entirely on Groq's LPU inference infrastructure [20], [21] to sustain the low latencies required for live technical instruction. Speech transcription uses Whisper Large v3 [15], transcribing thirty-second audio chunks in under 200 ms. Frame vision processing uses Qwen3.8-27B (qwen/qwen3.8-27b, max_tokens=900), which builds upon the Qwen-VL architecture family [11], operating under Groq's output-tokens-per-minute ceiling without emitting disruptive reasoning blocks. Text reasoning, error diagnosis, intent detection, and assessment authoring use GPT-OSS-120B (openai/gpt-oss-120b), which migrated from llama-3.3-70b-versatile for superior structured output generation and reliable Zod schema validation. A dedicated creative instance of GPT-OSS-120B (temperature 0.6, max_tokens=1200) generates comprehension check questions.</w:t>
       </w:r>
     </w:p>
     <w:p>
@@ -21868,11 +21917,10 @@
         <w:spacing w:line="360" w:lineRule="auto"/>
       </w:pPr>
       <w:r>
-        <w:t xml:space="preserve">The error agent is the most heavily used and the most carefully structured. It runs a three-node state machine: classify, diagnose, parse. Classification works out the category of failure from the raw error text, whether that is a missing dependency, a syntax error, an environment or path problem, a permission failure, a runtime exception or something unrecognised, because the category decides both how the diagnosis is framed and whether a corrective command can be proposed at all. Diagnosis then generates an explanation and, where one applies, a single </w:t>
-      </w:r>
-      <w:r>
-        <w:lastRenderedPageBreak/>
-        <w:t>corrective command, with the prompt built from the error text, the classification and the rolling session context, so the explanation refers to what the class was actually doing rather than to a generic case. Parsing validates the structured output against a schema. On a validation failure the graph retries a bounded number of times and then returns a degraded but honest response, which is better than emitting unvalidated text that the student interface would render as authoritative [9].</w:t>
+        <w:rPr>
+          <w:rFonts w:ascii="Times New Roman" w:hAnsi="Times New Roman"/>
+        </w:rPr>
+        <w:t>The error agent is the most heavily used and the most carefully structured. It runs a three-node state machine: classify, diagnose, parse. Classification works out the category of failure from the raw error text, whether that is a missing dependency, a syntax error, an environment or path problem, a permission failure, a runtime exception or something unrecognised, because the category decides both how the diagnosis is framed and whether a corrective command can be proposed at all. Diagnosis then generates an explanation and, where one applies, a single corrective command, with the prompt built from the error text, the classification and the rolling session context, so the explanation refers to what the class was actually doing rather than to a generic case. Parsing validates the structured output against a schema. On a validation failure the graph retries a bounded number of times and then returns a degraded but honest response, which is better than emitting unvalidated text that the student interface would render as authoritative [4], [8].</w:t>
       </w:r>
     </w:p>
     <w:p>
@@ -21914,7 +21962,10 @@
         <w:spacing w:line="360" w:lineRule="auto"/>
       </w:pPr>
       <w:r>
-        <w:t>This agent turns transcript segments into guide blocks. Its central constraint comes from the lecture-understanding literature reviewed in Section 1.6: it has to summarise at segment granularity and publish as it goes, rather than maintain one continuously rewritten document [7]. Publishing per segment buys three things. A student joining mid-session gets a coherent history instead of a partial rewrite, a badly generated block can be identified and superseded on its own, and the guide renders progressively so content appears while the session is still running. Each block carries a sequence number, a heading, a body, and a provenance marker recording whether it came from speech, from screen content, or from both.</w:t>
+        <w:rPr>
+          <w:rFonts w:ascii="Times New Roman" w:hAnsi="Times New Roman"/>
+        </w:rPr>
+        <w:t>This agent turns transcript segments into guide blocks. Its central constraint comes from the lecture-understanding literature reviewed in Section 1.6: it has to summarise at segment granularity and publish as it goes, rather than maintain one continuously rewritten document [13]. Publishing per segment buys three things. A student joining mid-session gets a coherent history instead of a partial rewrite, a badly generated block can be identified and superseded on its own, and the guide renders progressively so content appears while the session is still running. Each block carries a sequence number, a heading, a body, and a provenance marker recording whether it came from speech, from screen content, or from both.</w:t>
       </w:r>
     </w:p>
     <w:p>
@@ -21935,11 +21986,10 @@
         <w:spacing w:line="360" w:lineRule="auto"/>
       </w:pPr>
       <w:r>
-        <w:t xml:space="preserve">The coaching agent generates comprehension questions from recently published guide content and evaluates the answers. Its design follows the elicit-before-explain constraint taken from the conversational-tutoring literature [2]: the agent may not include the answer in the question payload sent to the client, because that would put the answer in the browser where anyone can </w:t>
-      </w:r>
-      <w:r>
-        <w:lastRenderedPageBreak/>
-        <w:t>read it, so evaluation happens on the server. Progression gating is a property of how the client renders guide state rather than of data withheld from it, and that is acknowledged here as a soft control, since a determined student can inspect the client. Real enforcement needs the native companion application described in Chapter 7, and the limitation is stated rather than overclaimed.</w:t>
+        <w:rPr>
+          <w:rFonts w:ascii="Times New Roman" w:hAnsi="Times New Roman"/>
+        </w:rPr>
+        <w:t>The coaching agent generates comprehension questions from recently published guide content and evaluates the answers. Its design follows the elicit-before-explain constraint taken from the conversational-tutoring literature [2], [3]: the agent may not include the answer in the question payload sent to the client, because that would put the answer in the browser where anyone can read it, so evaluation happens on the server. Progression gating is a property of how the client renders guide state rather than of data withheld from it, and that is acknowledged here as a soft control, since a determined student can inspect the client. Real enforcement needs the native companion application described in Chapter 7, and the limitation is stated rather than overclaimed.</w:t>
       </w:r>
     </w:p>
     <w:p>
@@ -22024,7 +22074,10 @@
         <w:spacing w:line="360" w:lineRule="auto"/>
       </w:pPr>
       <w:r>
-        <w:t>All agent invocations for a session pass through a queue with bounded concurrency. It exists because student-triggered invocations are bursty by nature: a class following the same instruction hits the same failure within seconds of each other, producing a spike of simultaneous diagnosis requests. Without the queue that spike goes straight to the upstream provider and is rejected as a rate-limit violation, so every student gets an error instead of every student getting a slightly delayed answer [11]. The queue turns a hard failure into bounded latency, which is the right trade for this workload. Queue depth and wait time are published on the agent metrics endpoint, and watching them under load is what established that per-session scope was enough, without a global queue.</w:t>
+        <w:rPr>
+          <w:rFonts w:ascii="Times New Roman" w:hAnsi="Times New Roman"/>
+        </w:rPr>
+        <w:t>All agent invocations for a session pass through a queue with bounded concurrency. It exists because student-triggered invocations are bursty by nature: a class following the same instruction hits the same failure within seconds of each other, producing a spike of simultaneous diagnosis requests. Without the queue that spike goes straight to the upstream provider and is rejected as a rate-limit violation, so every student gets an error instead of every student getting a slightly delayed answer [20], [21]. The queue turns a hard failure into bounded latency, which is the right trade for this workload. Queue depth and wait time are published on the agent metrics endpoint, and watching them under load is what established that per-session scope was enough, without a global queue.</w:t>
       </w:r>
     </w:p>
     <w:p>
@@ -23088,10 +23141,6 @@
       <w:r>
         <w:t>The security boundary derives all privileges from cryptographically signed tokens. In addition to role enforcement, the backend supports explicit student removal with mandatory reason logging, broadcasting eviction notices over WebSockets. Forgotten room passwords can be reset by the instructor using a server-issued cryptographic access key.</w:t>
       </w:r>
-      <w:r/>
-      <w:r/>
-      <w:r/>
-      <w:r/>
     </w:p>
     <w:p>
       <w:pPr>
@@ -23159,11 +23208,11 @@
         <w:spacing w:line="360" w:lineRule="auto"/>
       </w:pPr>
       <w:r>
-        <w:t xml:space="preserve">Three further controls were added alongside the token rework. Rate limiting was applied to the session creation and join routes, since both are necessarily unauthenticated and are the natural target for enumerating room codes. Token comparison was made timing-safe, since a naive </w:t>
+        <w:t xml:space="preserve">Three further controls were added alongside the token rework. Rate limiting was applied to the session creation and join routes, since both are necessarily unauthenticated and are the natural target for enumerating room codes. Token comparison was made timing-safe, since a naive comparison leaks through its execution time how much of a candidate value is correct. The backend also refuses to start in production when its signing secret is unset, turning a deployment that signs tokens with an empty or default key from a silent vulnerability into a </w:t>
       </w:r>
       <w:r>
         <w:lastRenderedPageBreak/>
-        <w:t>comparison leaks through its execution time how much of a candidate value is correct. The backend also refuses to start in production when its signing secret is unset, turning a deployment that signs tokens with an empty or default key from a silent vulnerability into a startup failure. Secrets, including the inference provider key, live only in server configuration and are never sent to any client.</w:t>
+        <w:t>startup failure. Secrets, including the inference provider key, live only in server configuration and are never sent to any client.</w:t>
       </w:r>
     </w:p>
     <w:p>
@@ -23267,7 +23316,10 @@
         <w:spacing w:line="360" w:lineRule="auto"/>
       </w:pPr>
       <w:r>
-        <w:t>AI agent layer (wkai-backend/src/ai/): a central Agents/ layer defines the common contract of name, version, invoke and health check, implemented by VoiceAgent, QuizAgent, DebugAgent, IntentAgent, MessageAgent, ColabAgent and UrlAccessAgent. Each is feature-flagged through an environment variable and reported at GET /api/ai/agents for health and metrics. Underneath, graphs/ holds the LangGraph state machines [12]: errorAgent.js runs classify, diagnose and parse with capped retries; intentAgent.js runs a heuristic, then classify-intent, then match-file, which is how the system notices the instructor saying something like “I'll share this file”; and there are further graphs for transcript explanation, comprehension coaching, messaging, notebook assistance and assessment authoring. Two pure modules sit beside them and hold the rules that decide what is allowed through: transcriptQuality.js for speech and guideBlockFilter.js for generated blocks. They are deliberately free of any model import, which is what lets them be unit-tested without an API key.</w:t>
+        <w:rPr>
+          <w:rFonts w:ascii="Times New Roman" w:hAnsi="Times New Roman"/>
+        </w:rPr>
+        <w:t>AI agent layer (wkai-backend/src/ai/): a central Agents/ layer defines the common contract of name, version, invoke and health check, implemented by VoiceAgent, QuizAgent, DebugAgent, IntentAgent, MessageAgent, ColabAgent and UrlAccessAgent. Each is feature-flagged through an environment variable and reported at GET /api/ai/agents for health and metrics. Underneath, graphs/ holds the LangGraph state machines [18]: errorAgent.js runs classify, diagnose and parse with capped retries; intentAgent.js runs a heuristic, then classify-intent, then match-file, which is how the system notices the instructor saying something like "I will share this file"; and there are further graphs for transcript explanation, comprehension coaching, messaging, notebook assistance and assessment authoring. Multi-agent coordination patterns follow the decoupled designs established in AutoGen [17] and MultiTutor [16]. Two pure modules sit beside them and hold the rules that decide what is allowed through: transcriptQuality.js for speech and guideBlockFilter.js for generated blocks. They are deliberately free of any model import, which is what lets them be unit-tested without an API key.</w:t>
       </w:r>
     </w:p>
     <w:p>
@@ -23275,11 +23327,10 @@
         <w:spacing w:line="360" w:lineRule="auto"/>
       </w:pPr>
       <w:r>
-        <w:t xml:space="preserve">Security hardening was completed during this phase. The original design took a connecting WebSocket client's role from a client-supplied query parameter (?role=instructor), which meant any client could claim instructor privileges over a session it did not own. The fix was a full signed-token rework. sessionAccess.js now issues two token types, issueInstructorToken valid for twelve hours and issueStudentJoinToken valid for eight, and every WebSocket connection must present a valid ?token= from which role, session ID and student identity are derived on the server. Client-supplied role and session parameters are no longer trusted. Alongside that, rate limiting was added to the join and create routes, a per-session AI concurrency queue was added so simultaneous student requests cannot exceed the provider rate </w:t>
-      </w:r>
-      <w:r>
-        <w:lastRenderedPageBreak/>
-        <w:t>limit [11], timing-safe comparison replaced a naive string comparison in token verification, and the backend now refuses to boot in production if its signing secret is unset.</w:t>
+        <w:rPr>
+          <w:rFonts w:ascii="Times New Roman" w:hAnsi="Times New Roman"/>
+        </w:rPr>
+        <w:t>Security hardening was completed during this phase. The original design took a connecting WebSocket client's role from a client-supplied query parameter (?role=instructor), which meant any client could claim instructor privileges over a session it did not own. The fix was a full signed-token rework. sessionAccess.js now issues two token types, issueInstructorToken valid for twelve hours and issueStudentJoinToken valid for eight, and every WebSocket connection must present a valid ?token= from which role, session ID and student identity are derived on the server. Client-supplied role and session parameters are no longer trusted. Alongside that, rate limiting was added to the join and create routes, a per-session AI concurrency queue was added so simultaneous student requests cannot exceed the provider rate limit [21], timing-safe comparison replaced a naive string comparison in token verification, and the backend now refuses to boot in production if its signing secret is unset.</w:t>
       </w:r>
     </w:p>
     <w:p>
@@ -23311,7 +23362,6 @@
         <w:spacing w:line="360" w:lineRule="auto"/>
       </w:pPr>
       <w:r>
-        <w:lastRenderedPageBreak/>
         <w:t>Theming, in both applications: a CSS-variable theme engine switches an accent, accent-text and accent-foreground trio computed by luminance, so any accent colour a user picks stays legible in light and dark mode. initTheme() runs before paint to avoid a flash of the wrong theme, and the state is a persisted Zustand store. The base palette was redesigned from indigo on slate to teal on zinc. The instructor application also gained an isTauri guard so its React interface can be developed and previewed in a plain browser without a full Tauri and Cargo build.</w:t>
       </w:r>
     </w:p>
@@ -23333,7 +23383,10 @@
         <w:spacing w:line="360" w:lineRule="auto"/>
       </w:pPr>
       <w:r>
-        <w:t>Student Exercise Sandbox and Assessments: The student application embeds Monaco editor and xterm instances for running exercises in Python, JavaScript, and TypeScript. In addition, an assessment runner presents timed comprehension quizzes and coding challenges. The client tracks focus-loss ('away modal') and paste events, sending telemetry to the backend to support academic integrity auditing.</w:t>
+        <w:rPr>
+          <w:rFonts w:ascii="Times New Roman" w:hAnsi="Times New Roman"/>
+        </w:rPr>
+        <w:t>Student Exercise Sandbox and Assessments: The student application embeds Monaco editor and xterm instances for running exercises in Python, JavaScript, and TypeScript within isolated sandboxes [27]. In addition, an assessment runner presents timed comprehension quizzes and coding challenges. The client tracks focus-loss ('away modal') and paste events, sending telemetry to the backend to support academic integrity auditing and formative feedback [9].</w:t>
       </w:r>
     </w:p>
     <w:p>
@@ -23344,6 +23397,7 @@
       <w:bookmarkStart w:id="134" w:name="_Toc238824750"/>
       <w:bookmarkStart w:id="135" w:name="_Toc239051763"/>
       <w:r>
+        <w:lastRenderedPageBreak/>
         <w:t>5.2.2 File Sharing Pipeline</w:t>
       </w:r>
       <w:bookmarkEnd w:id="134"/>
@@ -23375,11 +23429,7 @@
         <w:spacing w:line="360" w:lineRule="auto"/>
       </w:pPr>
       <w:r>
-        <w:t xml:space="preserve">Guide blocks are delivered as individual messages as they are generated, and are also retrievable in bulk over a REST route. The duality makes reconnection simple: a client that reconnects does not try to reconcile a partial stream, it asks for a complete state snapshot and </w:t>
-      </w:r>
-      <w:r>
-        <w:lastRenderedPageBreak/>
-        <w:t>re-renders from it, discarding whatever it held. The same snapshot serves students who join after a session has started, so late joiners and reconnecting clients run identical code paths. That was a deliberate simplification, because handling the two cases differently was the source of an early class of state-mismatch defects.</w:t>
+        <w:t>Guide blocks are delivered as individual messages as they are generated, and are also retrievable in bulk over a REST route. The duality makes reconnection simple: a client that reconnects does not try to reconcile a partial stream, it asks for a complete state snapshot and re-renders from it, discarding whatever it held. The same snapshot serves students who join after a session has started, so late joiners and reconnecting clients run identical code paths. That was a deliberate simplification, because handling the two cases differently was the source of an early class of state-mismatch defects.</w:t>
       </w:r>
     </w:p>
     <w:p>
@@ -23429,7 +23479,11 @@
         <w:spacing w:line="360" w:lineRule="auto"/>
       </w:pPr>
       <w:r>
-        <w:t>One development-workflow investment deserves a mention because it changed the pace of interface work. The instructor application is a native shell hosting a web interface, and by default that interface cannot run without a full native build, a slow cycle that made iterative styling expensive. A guard was added that detects whether the native bridge is present and substitutes inert behaviour when it is not, which lets the whole interface be developed and previewed in an ordinary browser. It cut the feedback loop for interface changes from minutes to seconds, and it is why a styling change no longer costs a Cargo build.</w:t>
+        <w:t xml:space="preserve">One development-workflow investment deserves a mention because it changed the pace of interface work. The instructor application is a native shell hosting a web interface, and by default that interface cannot run without a full native build, a slow cycle that made iterative styling expensive. A guard was added that detects whether the native bridge is present and substitutes inert behaviour when it is not, which lets the whole interface be developed and </w:t>
+      </w:r>
+      <w:r>
+        <w:lastRenderedPageBreak/>
+        <w:t>previewed in an ordinary browser. It cut the feedback loop for interface changes from minutes to seconds, and it is why a styling change no longer costs a Cargo build.</w:t>
       </w:r>
     </w:p>
     <w:p>
@@ -23440,7 +23494,6 @@
       <w:bookmarkStart w:id="142" w:name="_Toc238824755"/>
       <w:bookmarkStart w:id="143" w:name="_Toc239051767"/>
       <w:r>
-        <w:lastRenderedPageBreak/>
         <w:t>5.4 Implementation Challenges Encountered</w:t>
       </w:r>
       <w:bookmarkEnd w:id="142"/>
@@ -23475,7 +23528,10 @@
         <w:spacing w:line="360" w:lineRule="auto"/>
       </w:pPr>
       <w:r>
-        <w:t>The fourth class is upstream change. A hosted model in use during the phase was deprecated by its provider and had to be replaced [11]. Because model selection was already isolated to configuration inside the agent layer rather than embedded in call sites, the migration was a configuration change and a validation pass rather than a code change. That was an unplanned but persuasive demonstration of why the agent contract was introduced.</w:t>
+        <w:rPr>
+          <w:rFonts w:ascii="Times New Roman" w:hAnsi="Times New Roman"/>
+        </w:rPr>
+        <w:t>The fourth class is upstream change. A hosted model in use during the phase was deprecated by its provider and had to be replaced [21]. Because model selection was already isolated to configuration inside the agent layer rather than embedded in call sites, the migration was a configuration change and a validation pass rather than a code change. That was an unplanned but persuasive demonstration of why the agent contract was introduced.</w:t>
       </w:r>
     </w:p>
     <w:p>
@@ -23504,8 +23560,8 @@
     </w:p>
     <w:p>
       <w:pPr>
+        <w:spacing w:before="180" w:after="80"/>
         <w:jc w:val="center"/>
-        <w:spacing w:before="180" w:after="80"/>
       </w:pPr>
       <w:r>
         <w:rPr>
@@ -23550,8 +23606,8 @@
     </w:p>
     <w:p>
       <w:pPr>
+        <w:spacing w:before="60" w:after="240" w:line="259" w:lineRule="auto"/>
         <w:jc w:val="center"/>
-        <w:spacing w:before="60" w:after="240" w:line="259" w:lineRule="auto"/>
         <w:rPr>
           <w:b/>
         </w:rPr>
@@ -23565,8 +23621,8 @@
     </w:p>
     <w:p>
       <w:pPr>
+        <w:spacing w:before="180" w:after="80"/>
         <w:jc w:val="center"/>
-        <w:spacing w:before="180" w:after="80"/>
       </w:pPr>
       <w:r>
         <w:rPr>
@@ -23611,8 +23667,8 @@
     </w:p>
     <w:p>
       <w:pPr>
+        <w:spacing w:before="60" w:after="240" w:line="259" w:lineRule="auto"/>
         <w:jc w:val="center"/>
-        <w:spacing w:before="60" w:after="240" w:line="259" w:lineRule="auto"/>
         <w:rPr>
           <w:b/>
         </w:rPr>
@@ -23626,8 +23682,32 @@
     </w:p>
     <w:p>
       <w:pPr>
+        <w:spacing w:before="180" w:after="80"/>
         <w:jc w:val="center"/>
+      </w:pPr>
+    </w:p>
+    <w:p>
+      <w:pPr>
         <w:spacing w:before="180" w:after="80"/>
+        <w:jc w:val="center"/>
+      </w:pPr>
+    </w:p>
+    <w:p>
+      <w:pPr>
+        <w:spacing w:before="180" w:after="80"/>
+        <w:jc w:val="center"/>
+      </w:pPr>
+    </w:p>
+    <w:p>
+      <w:pPr>
+        <w:spacing w:before="180" w:after="80"/>
+        <w:jc w:val="center"/>
+      </w:pPr>
+    </w:p>
+    <w:p>
+      <w:pPr>
+        <w:spacing w:before="180" w:after="80"/>
+        <w:jc w:val="center"/>
       </w:pPr>
       <w:r>
         <w:rPr>
@@ -23672,8 +23752,8 @@
     </w:p>
     <w:p>
       <w:pPr>
+        <w:spacing w:before="60" w:after="240" w:line="259" w:lineRule="auto"/>
         <w:jc w:val="center"/>
-        <w:spacing w:before="60" w:after="240" w:line="259" w:lineRule="auto"/>
         <w:rPr>
           <w:b/>
         </w:rPr>
@@ -23687,8 +23767,17 @@
     </w:p>
     <w:p>
       <w:pPr>
+        <w:spacing w:before="60" w:after="240" w:line="259" w:lineRule="auto"/>
         <w:jc w:val="center"/>
+        <w:rPr>
+          <w:b/>
+        </w:rPr>
+      </w:pPr>
+    </w:p>
+    <w:p>
+      <w:pPr>
         <w:spacing w:before="180" w:after="80"/>
+        <w:jc w:val="center"/>
       </w:pPr>
       <w:r>
         <w:rPr>
@@ -23733,8 +23822,8 @@
     </w:p>
     <w:p>
       <w:pPr>
+        <w:spacing w:before="60" w:after="240" w:line="259" w:lineRule="auto"/>
         <w:jc w:val="center"/>
-        <w:spacing w:before="60" w:after="240" w:line="259" w:lineRule="auto"/>
         <w:rPr>
           <w:b/>
         </w:rPr>
@@ -23748,8 +23837,53 @@
     </w:p>
     <w:p>
       <w:pPr>
+        <w:spacing w:before="60" w:after="240" w:line="259" w:lineRule="auto"/>
         <w:jc w:val="center"/>
+        <w:rPr>
+          <w:b/>
+        </w:rPr>
+      </w:pPr>
+    </w:p>
+    <w:p>
+      <w:pPr>
+        <w:spacing w:before="60" w:after="240" w:line="259" w:lineRule="auto"/>
+        <w:jc w:val="center"/>
+        <w:rPr>
+          <w:b/>
+        </w:rPr>
+      </w:pPr>
+    </w:p>
+    <w:p>
+      <w:pPr>
+        <w:spacing w:before="60" w:after="240" w:line="259" w:lineRule="auto"/>
+        <w:jc w:val="center"/>
+        <w:rPr>
+          <w:b/>
+        </w:rPr>
+      </w:pPr>
+    </w:p>
+    <w:p>
+      <w:pPr>
+        <w:spacing w:before="60" w:after="240" w:line="259" w:lineRule="auto"/>
+        <w:jc w:val="center"/>
+        <w:rPr>
+          <w:b/>
+        </w:rPr>
+      </w:pPr>
+    </w:p>
+    <w:p>
+      <w:pPr>
+        <w:spacing w:before="60" w:after="240" w:line="259" w:lineRule="auto"/>
+        <w:jc w:val="center"/>
+        <w:rPr>
+          <w:b/>
+        </w:rPr>
+      </w:pPr>
+    </w:p>
+    <w:p>
+      <w:pPr>
         <w:spacing w:before="180" w:after="80"/>
+        <w:jc w:val="center"/>
       </w:pPr>
       <w:r>
         <w:rPr>
@@ -23794,8 +23928,8 @@
     </w:p>
     <w:p>
       <w:pPr>
+        <w:spacing w:before="60" w:after="240" w:line="259" w:lineRule="auto"/>
         <w:jc w:val="center"/>
-        <w:spacing w:before="60" w:after="240" w:line="259" w:lineRule="auto"/>
         <w:rPr>
           <w:b/>
         </w:rPr>
@@ -23809,8 +23943,17 @@
     </w:p>
     <w:p>
       <w:pPr>
+        <w:spacing w:before="60" w:after="240" w:line="259" w:lineRule="auto"/>
         <w:jc w:val="center"/>
+        <w:rPr>
+          <w:b/>
+        </w:rPr>
+      </w:pPr>
+    </w:p>
+    <w:p>
+      <w:pPr>
         <w:spacing w:before="180" w:after="80"/>
+        <w:jc w:val="center"/>
       </w:pPr>
       <w:r>
         <w:rPr>
@@ -23855,8 +23998,8 @@
     </w:p>
     <w:p>
       <w:pPr>
+        <w:spacing w:before="60" w:after="240" w:line="259" w:lineRule="auto"/>
         <w:jc w:val="center"/>
-        <w:spacing w:before="60" w:after="240" w:line="259" w:lineRule="auto"/>
         <w:rPr>
           <w:b/>
         </w:rPr>
@@ -23870,8 +24013,44 @@
     </w:p>
     <w:p>
       <w:pPr>
+        <w:spacing w:before="60" w:after="240" w:line="259" w:lineRule="auto"/>
         <w:jc w:val="center"/>
+        <w:rPr>
+          <w:b/>
+        </w:rPr>
+      </w:pPr>
+    </w:p>
+    <w:p>
+      <w:pPr>
+        <w:spacing w:before="60" w:after="240" w:line="259" w:lineRule="auto"/>
+        <w:jc w:val="center"/>
+        <w:rPr>
+          <w:b/>
+        </w:rPr>
+      </w:pPr>
+    </w:p>
+    <w:p>
+      <w:pPr>
+        <w:spacing w:before="60" w:after="240" w:line="259" w:lineRule="auto"/>
+        <w:jc w:val="center"/>
+        <w:rPr>
+          <w:b/>
+        </w:rPr>
+      </w:pPr>
+    </w:p>
+    <w:p>
+      <w:pPr>
+        <w:spacing w:before="60" w:after="240" w:line="259" w:lineRule="auto"/>
+        <w:jc w:val="center"/>
+        <w:rPr>
+          <w:b/>
+        </w:rPr>
+      </w:pPr>
+    </w:p>
+    <w:p>
+      <w:pPr>
         <w:spacing w:before="180" w:after="80"/>
+        <w:jc w:val="center"/>
       </w:pPr>
       <w:r>
         <w:rPr>
@@ -23916,8 +24095,8 @@
     </w:p>
     <w:p>
       <w:pPr>
+        <w:spacing w:before="60" w:after="240" w:line="259" w:lineRule="auto"/>
         <w:jc w:val="center"/>
-        <w:spacing w:before="60" w:after="240" w:line="259" w:lineRule="auto"/>
         <w:rPr>
           <w:b/>
         </w:rPr>
@@ -23931,8 +24110,17 @@
     </w:p>
     <w:p>
       <w:pPr>
+        <w:spacing w:before="60" w:after="240" w:line="259" w:lineRule="auto"/>
         <w:jc w:val="center"/>
+        <w:rPr>
+          <w:b/>
+        </w:rPr>
+      </w:pPr>
+    </w:p>
+    <w:p>
+      <w:pPr>
         <w:spacing w:before="180" w:after="80"/>
+        <w:jc w:val="center"/>
       </w:pPr>
       <w:r>
         <w:rPr>
@@ -23977,8 +24165,8 @@
     </w:p>
     <w:p>
       <w:pPr>
+        <w:spacing w:before="60" w:after="240" w:line="259" w:lineRule="auto"/>
         <w:jc w:val="center"/>
-        <w:spacing w:before="60" w:after="240" w:line="259" w:lineRule="auto"/>
         <w:rPr>
           <w:b/>
         </w:rPr>
@@ -23989,6 +24177,7 @@
         </w:rPr>
         <w:t>Figure 5.8 – Instructor application: settings, appearance and AI controls</w:t>
       </w:r>
+      <w:bookmarkStart w:id="145" w:name="_Toc238824756"/>
     </w:p>
     <w:p>
       <w:pPr>
@@ -23996,7 +24185,6 @@
         <w:ind w:left="0" w:firstLine="0"/>
         <w:jc w:val="left"/>
       </w:pPr>
-      <w:bookmarkStart w:id="145" w:name="_Toc238824756"/>
       <w:r>
         <w:lastRenderedPageBreak/>
         <w:t>Chapter 6</w:t>
@@ -24107,11 +24295,11 @@
         <w:tblLook w:val="04A0" w:firstRow="1" w:lastRow="0" w:firstColumn="1" w:lastColumn="0" w:noHBand="0" w:noVBand="1"/>
       </w:tblPr>
       <w:tblGrid>
-        <w:gridCol w:w="674"/>
-        <w:gridCol w:w="2485"/>
-        <w:gridCol w:w="2108"/>
-        <w:gridCol w:w="2527"/>
-        <w:gridCol w:w="1222"/>
+        <w:gridCol w:w="673"/>
+        <w:gridCol w:w="2479"/>
+        <w:gridCol w:w="2122"/>
+        <w:gridCol w:w="2523"/>
+        <w:gridCol w:w="1219"/>
       </w:tblGrid>
       <w:tr>
         <w:trPr>
@@ -24879,7 +25067,6 @@
               <w:rPr>
                 <w:sz w:val="20"/>
               </w:rPr>
-              <w:lastRenderedPageBreak/>
               <w:t>6</w:t>
             </w:r>
           </w:p>
@@ -25002,6 +25189,7 @@
               <w:rPr>
                 <w:sz w:val="20"/>
               </w:rPr>
+              <w:lastRenderedPageBreak/>
               <w:t>7</w:t>
             </w:r>
           </w:p>
@@ -25228,7 +25416,7 @@
       <w:tr>
         <w:tc>
           <w:tcPr>
-            <w:tcW w:type="dxa" w:w="674"/>
+            <w:tcW w:w="674" w:type="dxa"/>
           </w:tcPr>
           <w:p>
             <w:r>
@@ -25238,7 +25426,7 @@
         </w:tc>
         <w:tc>
           <w:tcPr>
-            <w:tcW w:type="dxa" w:w="2485"/>
+            <w:tcW w:w="2485" w:type="dxa"/>
           </w:tcPr>
           <w:p>
             <w:r>
@@ -25248,7 +25436,7 @@
         </w:tc>
         <w:tc>
           <w:tcPr>
-            <w:tcW w:type="dxa" w:w="2108"/>
+            <w:tcW w:w="2108" w:type="dxa"/>
           </w:tcPr>
           <w:p>
             <w:r>
@@ -25258,7 +25446,7 @@
         </w:tc>
         <w:tc>
           <w:tcPr>
-            <w:tcW w:type="dxa" w:w="2527"/>
+            <w:tcW w:w="2527" w:type="dxa"/>
           </w:tcPr>
           <w:p>
             <w:r>
@@ -25268,7 +25456,7 @@
         </w:tc>
         <w:tc>
           <w:tcPr>
-            <w:tcW w:type="dxa" w:w="1222"/>
+            <w:tcW w:w="1222" w:type="dxa"/>
           </w:tcPr>
           <w:p/>
         </w:tc>
@@ -25276,7 +25464,7 @@
       <w:tr>
         <w:tc>
           <w:tcPr>
-            <w:tcW w:type="dxa" w:w="674"/>
+            <w:tcW w:w="674" w:type="dxa"/>
           </w:tcPr>
           <w:p>
             <w:r>
@@ -25286,7 +25474,7 @@
         </w:tc>
         <w:tc>
           <w:tcPr>
-            <w:tcW w:type="dxa" w:w="2485"/>
+            <w:tcW w:w="2485" w:type="dxa"/>
           </w:tcPr>
           <w:p>
             <w:r>
@@ -25296,7 +25484,7 @@
         </w:tc>
         <w:tc>
           <w:tcPr>
-            <w:tcW w:type="dxa" w:w="2108"/>
+            <w:tcW w:w="2108" w:type="dxa"/>
           </w:tcPr>
           <w:p>
             <w:r>
@@ -25306,7 +25494,7 @@
         </w:tc>
         <w:tc>
           <w:tcPr>
-            <w:tcW w:type="dxa" w:w="2527"/>
+            <w:tcW w:w="2527" w:type="dxa"/>
           </w:tcPr>
           <w:p>
             <w:r>
@@ -25316,7 +25504,7 @@
         </w:tc>
         <w:tc>
           <w:tcPr>
-            <w:tcW w:type="dxa" w:w="1222"/>
+            <w:tcW w:w="1222" w:type="dxa"/>
           </w:tcPr>
           <w:p/>
         </w:tc>
@@ -25324,7 +25512,7 @@
       <w:tr>
         <w:tc>
           <w:tcPr>
-            <w:tcW w:type="dxa" w:w="674"/>
+            <w:tcW w:w="674" w:type="dxa"/>
           </w:tcPr>
           <w:p>
             <w:r>
@@ -25334,7 +25522,7 @@
         </w:tc>
         <w:tc>
           <w:tcPr>
-            <w:tcW w:type="dxa" w:w="2485"/>
+            <w:tcW w:w="2485" w:type="dxa"/>
           </w:tcPr>
           <w:p>
             <w:r>
@@ -25344,7 +25532,7 @@
         </w:tc>
         <w:tc>
           <w:tcPr>
-            <w:tcW w:type="dxa" w:w="2108"/>
+            <w:tcW w:w="2108" w:type="dxa"/>
           </w:tcPr>
           <w:p>
             <w:r>
@@ -25354,7 +25542,7 @@
         </w:tc>
         <w:tc>
           <w:tcPr>
-            <w:tcW w:type="dxa" w:w="2527"/>
+            <w:tcW w:w="2527" w:type="dxa"/>
           </w:tcPr>
           <w:p>
             <w:r>
@@ -25364,7 +25552,7 @@
         </w:tc>
         <w:tc>
           <w:tcPr>
-            <w:tcW w:type="dxa" w:w="1222"/>
+            <w:tcW w:w="1222" w:type="dxa"/>
           </w:tcPr>
           <w:p/>
         </w:tc>
@@ -25372,7 +25560,7 @@
       <w:tr>
         <w:tc>
           <w:tcPr>
-            <w:tcW w:type="dxa" w:w="674"/>
+            <w:tcW w:w="674" w:type="dxa"/>
           </w:tcPr>
           <w:p>
             <w:r>
@@ -25382,7 +25570,7 @@
         </w:tc>
         <w:tc>
           <w:tcPr>
-            <w:tcW w:type="dxa" w:w="2485"/>
+            <w:tcW w:w="2485" w:type="dxa"/>
           </w:tcPr>
           <w:p>
             <w:r>
@@ -25392,7 +25580,7 @@
         </w:tc>
         <w:tc>
           <w:tcPr>
-            <w:tcW w:type="dxa" w:w="2108"/>
+            <w:tcW w:w="2108" w:type="dxa"/>
           </w:tcPr>
           <w:p>
             <w:r>
@@ -25402,7 +25590,7 @@
         </w:tc>
         <w:tc>
           <w:tcPr>
-            <w:tcW w:type="dxa" w:w="2527"/>
+            <w:tcW w:w="2527" w:type="dxa"/>
           </w:tcPr>
           <w:p>
             <w:r>
@@ -25412,7 +25600,7 @@
         </w:tc>
         <w:tc>
           <w:tcPr>
-            <w:tcW w:type="dxa" w:w="1222"/>
+            <w:tcW w:w="1222" w:type="dxa"/>
           </w:tcPr>
           <w:p/>
         </w:tc>
@@ -25420,7 +25608,7 @@
       <w:tr>
         <w:tc>
           <w:tcPr>
-            <w:tcW w:type="dxa" w:w="674"/>
+            <w:tcW w:w="674" w:type="dxa"/>
           </w:tcPr>
           <w:p>
             <w:r>
@@ -25430,7 +25618,7 @@
         </w:tc>
         <w:tc>
           <w:tcPr>
-            <w:tcW w:type="dxa" w:w="2485"/>
+            <w:tcW w:w="2485" w:type="dxa"/>
           </w:tcPr>
           <w:p>
             <w:r>
@@ -25440,7 +25628,7 @@
         </w:tc>
         <w:tc>
           <w:tcPr>
-            <w:tcW w:type="dxa" w:w="2108"/>
+            <w:tcW w:w="2108" w:type="dxa"/>
           </w:tcPr>
           <w:p>
             <w:r>
@@ -25450,7 +25638,7 @@
         </w:tc>
         <w:tc>
           <w:tcPr>
-            <w:tcW w:type="dxa" w:w="2527"/>
+            <w:tcW w:w="2527" w:type="dxa"/>
           </w:tcPr>
           <w:p>
             <w:r>
@@ -25460,7 +25648,7 @@
         </w:tc>
         <w:tc>
           <w:tcPr>
-            <w:tcW w:type="dxa" w:w="1222"/>
+            <w:tcW w:w="1222" w:type="dxa"/>
           </w:tcPr>
           <w:p/>
         </w:tc>
@@ -25485,7 +25673,11 @@
         <w:spacing w:line="360" w:lineRule="auto"/>
       </w:pPr>
       <w:r>
-        <w:t>Automated coverage aims at invariants that end-to-end testing cannot observe, and it has grown with the parts of the system that turned out to be worth pinning down. Token issue and verification is tested for correct claim extraction, expiry enforcement, rejection of tampered signatures, and rejection of a token presented against a session it was not issued for, that last property being the one whose absence was the original vulnerability. The concurrency queue is tested for ordering, for bounded parallelism under a burst larger than its limit, and for correct release on both the success and the failure path, since a queue that leaks slots on an error path degrades quietly until it deadlocks. The rate limiter is tested at, below and above its threshold, and for correct window expiry. Two more areas were added late in the phase after each produced a defect that was invisible from the outside. The grounding filter is tested to confirm that a block narrating the screen is rejected and that the rejection is reported with a reason, because a frame that produced three blocks and showed none had until then looked identical to a frame that produced nothing at all. The provider error classifier is tested to distinguish a per-minute limit, which is worth retrying, from a spent daily quota and an over-large request, which are not. What is still not automated is the media pipeline itself, whose behaviour depends on browser and operating-system specifics a harness cannot reproduce; it is covered by the regression procedure in Section 6.1 instead.</w:t>
+        <w:t>Automated coverage aims at invariants that end-to-end testing cannot observe, and it has grown with the parts of the system that turned out to be worth pinning down. Token issue and verification is tested for correct claim extraction, expiry enforcement, rejection of tampered signatures, and rejection of a token presented against a session it was not issued for, that last property being the one whose absence was the original vulnerability. The concurrency queue is tested for ordering, for bounded parallelism under a burst larger than its limit, and for correct release on both the success and the failure path, since a queue that leaks slots on an error path degrades quietly until it deadlocks. The rate limiter is tested at, below and above its threshold, and for correct window expiry. Two more areas were added late in the phase after each produced a defect that was invisible from the outside. The grounding filter is tested to confirm that a block narrating the screen is rejected and that the rejection is reported with a reason, because a frame that produced three blocks and showed none had until then looked identical to a frame that produced nothing at all. The provider error classifier is tested to distinguish a per-</w:t>
+      </w:r>
+      <w:r>
+        <w:lastRenderedPageBreak/>
+        <w:t>minute limit, which is worth retrying, from a spent daily quota and an over-large request, which are not. What is still not automated is the media pipeline itself, whose behaviour depends on browser and operating-system specifics a harness cannot reproduce; it is covered by the regression procedure in Section 6.1 instead.</w:t>
       </w:r>
     </w:p>
     <w:p>
@@ -25625,7 +25817,6 @@
                 <w:b/>
                 <w:sz w:val="22"/>
               </w:rPr>
-              <w:lastRenderedPageBreak/>
               <w:t>Sample Input</w:t>
             </w:r>
           </w:p>
@@ -25999,6 +26190,7 @@
                 <w:b/>
                 <w:sz w:val="22"/>
               </w:rPr>
+              <w:lastRenderedPageBreak/>
               <w:t>Remarks</w:t>
             </w:r>
           </w:p>
@@ -26227,7 +26419,6 @@
                 <w:b/>
                 <w:sz w:val="22"/>
               </w:rPr>
-              <w:lastRenderedPageBreak/>
               <w:t>Test Environment</w:t>
             </w:r>
           </w:p>
@@ -26668,7 +26859,14 @@
               <w:rPr>
                 <w:sz w:val="22"/>
               </w:rPr>
-              <w:t>Four guide blocks from a blockchain session, queried with "how do I hash a block with sha256?", "which ecdsa version do we sign with?", "hexdigest", and an unrelated question about Kubernetes</w:t>
+              <w:t xml:space="preserve">Four guide blocks from a blockchain session, queried with "how do I hash a block with </w:t>
+            </w:r>
+            <w:r>
+              <w:rPr>
+                <w:sz w:val="22"/>
+              </w:rPr>
+              <w:lastRenderedPageBreak/>
+              <w:t>sha256?", "which ecdsa version do we sign with?", "hexdigest", and an unrelated question about Kubernetes</w:t>
             </w:r>
           </w:p>
         </w:tc>
@@ -26684,6 +26882,7 @@
                 <w:b/>
                 <w:sz w:val="22"/>
               </w:rPr>
+              <w:lastRenderedPageBreak/>
               <w:t>Expected Output</w:t>
             </w:r>
           </w:p>
@@ -26784,14 +26983,7 @@
               <w:rPr>
                 <w:sz w:val="22"/>
               </w:rPr>
-              <w:t xml:space="preserve">Pass. Returning nothing on an unrelated question matters as much as ranking correctly, since a </w:t>
-            </w:r>
-            <w:r>
-              <w:rPr>
-                <w:sz w:val="22"/>
-              </w:rPr>
-              <w:lastRenderedPageBreak/>
-              <w:t>wrong block would ground the answer in the wrong material.</w:t>
+              <w:t>Pass. Returning nothing on an unrelated question matters as much as ranking correctly, since a wrong block would ground the answer in the wrong material.</w:t>
             </w:r>
           </w:p>
         </w:tc>
@@ -26808,7 +27000,6 @@
         <w:rPr>
           <w:b/>
         </w:rPr>
-        <w:lastRenderedPageBreak/>
         <w:t>Table 6.9 – Unit test case UTC 1.6</w:t>
       </w:r>
     </w:p>
@@ -27248,7 +27439,14 @@
               <w:rPr>
                 <w:sz w:val="22"/>
               </w:rPr>
-              <w:t>All five assertions passed. Python resolved through the Windows launcher rather than a hardcoded python3, so no spawn error reached the student, and the infinite loop returned the timeout message</w:t>
+              <w:t xml:space="preserve">All five assertions passed. Python resolved through the Windows launcher rather than a </w:t>
+            </w:r>
+            <w:r>
+              <w:rPr>
+                <w:sz w:val="22"/>
+              </w:rPr>
+              <w:lastRenderedPageBreak/>
+              <w:t>hardcoded python3, so no spawn error reached the student, and the infinite loop returned the timeout message</w:t>
             </w:r>
           </w:p>
         </w:tc>
@@ -27264,6 +27462,7 @@
                 <w:b/>
                 <w:sz w:val="22"/>
               </w:rPr>
+              <w:lastRenderedPageBreak/>
               <w:t>Test Environment</w:t>
             </w:r>
           </w:p>
@@ -27330,11 +27529,7 @@
         <w:spacing w:line="360" w:lineRule="auto"/>
       </w:pPr>
       <w:r>
-        <w:t xml:space="preserve">Latency was characterised informally during development rather than with a load-test harness, so the figures below are observed behaviour under normal conditions on a broadband connection, not guaranteed service levels. They are included because the whole concept stands </w:t>
-      </w:r>
-      <w:r>
-        <w:lastRenderedPageBreak/>
-        <w:t>or falls on these numbers, and stating them makes the claim of real-time operation checkable instead of rhetorical.</w:t>
+        <w:t>Latency was characterised informally during development rather than with a load-test harness, so the figures below are observed behaviour under normal conditions on a broadband connection, not guaranteed service levels. They are included because the whole concept stands or falls on these numbers, and stating them makes the claim of real-time operation checkable instead of rhetorical.</w:t>
       </w:r>
     </w:p>
     <w:p>
@@ -28263,7 +28458,7 @@
       <w:tr>
         <w:tc>
           <w:tcPr>
-            <w:tcW w:type="dxa" w:w="2707"/>
+            <w:tcW w:w="2707" w:type="dxa"/>
           </w:tcPr>
           <w:p>
             <w:r>
@@ -28273,7 +28468,7 @@
         </w:tc>
         <w:tc>
           <w:tcPr>
-            <w:tcW w:type="dxa" w:w="2708"/>
+            <w:tcW w:w="2708" w:type="dxa"/>
           </w:tcPr>
           <w:p>
             <w:r>
@@ -28283,7 +28478,7 @@
         </w:tc>
         <w:tc>
           <w:tcPr>
-            <w:tcW w:type="dxa" w:w="2708"/>
+            <w:tcW w:w="2708" w:type="dxa"/>
           </w:tcPr>
           <w:p>
             <w:r>
@@ -28295,7 +28490,7 @@
       <w:tr>
         <w:tc>
           <w:tcPr>
-            <w:tcW w:type="dxa" w:w="2707"/>
+            <w:tcW w:w="2707" w:type="dxa"/>
           </w:tcPr>
           <w:p>
             <w:r>
@@ -28305,7 +28500,7 @@
         </w:tc>
         <w:tc>
           <w:tcPr>
-            <w:tcW w:type="dxa" w:w="2708"/>
+            <w:tcW w:w="2708" w:type="dxa"/>
           </w:tcPr>
           <w:p>
             <w:r>
@@ -28315,7 +28510,7 @@
         </w:tc>
         <w:tc>
           <w:tcPr>
-            <w:tcW w:type="dxa" w:w="2708"/>
+            <w:tcW w:w="2708" w:type="dxa"/>
           </w:tcPr>
           <w:p>
             <w:r>
@@ -28327,17 +28522,18 @@
       <w:tr>
         <w:tc>
           <w:tcPr>
-            <w:tcW w:type="dxa" w:w="2707"/>
-          </w:tcPr>
-          <w:p>
-            <w:r>
+            <w:tcW w:w="2707" w:type="dxa"/>
+          </w:tcPr>
+          <w:p>
+            <w:r>
+              <w:lastRenderedPageBreak/>
               <w:t>Android Termux backend memory footprint</w:t>
             </w:r>
           </w:p>
         </w:tc>
         <w:tc>
           <w:tcPr>
-            <w:tcW w:type="dxa" w:w="2708"/>
+            <w:tcW w:w="2708" w:type="dxa"/>
           </w:tcPr>
           <w:p>
             <w:r>
@@ -28347,7 +28543,7 @@
         </w:tc>
         <w:tc>
           <w:tcPr>
-            <w:tcW w:type="dxa" w:w="2708"/>
+            <w:tcW w:w="2708" w:type="dxa"/>
           </w:tcPr>
           <w:p>
             <w:r>
@@ -28387,7 +28583,6 @@
       <w:bookmarkStart w:id="158" w:name="_Toc238824763"/>
       <w:bookmarkStart w:id="159" w:name="_Toc239051776"/>
       <w:r>
-        <w:lastRenderedPageBreak/>
         <w:t>6.6 Usability Verification</w:t>
       </w:r>
       <w:bookmarkEnd w:id="158"/>
@@ -28431,13 +28626,14 @@
         <w:spacing w:line="360" w:lineRule="auto"/>
       </w:pPr>
       <w:r>
+        <w:lastRenderedPageBreak/>
         <w:t>Figure 5.1 shows the student landing page, the zero-install entry point. It explains the join flow, offers either joining as a student or downloading the instructor desktop application, and lists the four steps: the instructor starts a session, students receive a room code and password, the student receives a signed join token, and the live stream and AI guidance follow in real time. The teal-on-zinc palette from this phase's redesign is visible as the default appearance.</w:t>
       </w:r>
     </w:p>
     <w:p>
       <w:pPr>
+        <w:spacing w:before="180" w:after="80"/>
         <w:jc w:val="center"/>
-        <w:spacing w:before="180" w:after="80"/>
       </w:pPr>
       <w:r>
         <w:rPr>
@@ -28505,13 +28701,14 @@
     </w:p>
     <w:p>
       <w:pPr>
+        <w:spacing w:before="180" w:after="80"/>
         <w:jc w:val="center"/>
-        <w:spacing w:before="180" w:after="80"/>
       </w:pPr>
       <w:r>
         <w:rPr>
           <w:noProof/>
         </w:rPr>
+        <w:lastRenderedPageBreak/>
         <w:drawing>
           <wp:inline distT="0" distB="0" distL="0" distR="0" wp14:anchorId="7EAB07D2" wp14:editId="016F07D2">
             <wp:extent cx="4937760" cy="3086100"/>
@@ -28569,17 +28766,13 @@
         <w:spacing w:line="360" w:lineRule="auto"/>
       </w:pPr>
       <w:r>
-        <w:t xml:space="preserve">Figure 5.7 shows a live instructor session. The stage holds the preview of what students see, the present bar along the bottom carries the source picker, microphone, capture quality, </w:t>
-      </w:r>
-      <w:r>
-        <w:lastRenderedPageBreak/>
-        <w:t>recording and AI controls, and the side rail switches between the live guide, shared files, the student roster, the question inbox and assessments. The room code sits in the header beside the student count and the session clock.</w:t>
-      </w:r>
-    </w:p>
-    <w:p>
-      <w:pPr>
+        <w:t>Figure 5.7 shows a live instructor session. The stage holds the preview of what students see, the present bar along the bottom carries the source picker, microphone, capture quality, recording and AI controls, and the side rail switches between the live guide, shared files, the student roster, the question inbox and assessments. The room code sits in the header beside the student count and the session clock.</w:t>
+      </w:r>
+    </w:p>
+    <w:p>
+      <w:pPr>
+        <w:spacing w:before="180" w:after="80"/>
         <w:jc w:val="center"/>
-        <w:spacing w:before="180" w:after="80"/>
       </w:pPr>
       <w:r>
         <w:rPr>
@@ -28642,13 +28835,14 @@
         <w:spacing w:line="360" w:lineRule="auto"/>
       </w:pPr>
       <w:r>
+        <w:lastRenderedPageBreak/>
         <w:t>Figure 5.8 shows the instructor settings page: the appearance section with its theme toggle and accent choices including a custom picker, the instructor profile name, the network section showing the address and student URL others on the same network can reach, and the AI section holding the inference key and the per-session toggles that decide which agents run.</w:t>
       </w:r>
     </w:p>
     <w:p>
       <w:pPr>
+        <w:spacing w:before="180" w:after="80"/>
         <w:jc w:val="center"/>
-        <w:spacing w:before="180" w:after="80"/>
       </w:pPr>
       <w:r>
         <w:rPr>
@@ -28737,6 +28931,16 @@
     </w:p>
     <w:p>
       <w:pPr>
+        <w:spacing w:line="360" w:lineRule="auto"/>
+      </w:pPr>
+    </w:p>
+    <w:p>
+      <w:pPr>
+        <w:spacing w:line="360" w:lineRule="auto"/>
+      </w:pPr>
+    </w:p>
+    <w:p>
+      <w:pPr>
         <w:spacing w:before="240" w:after="120" w:line="259" w:lineRule="auto"/>
         <w:jc w:val="center"/>
         <w:rPr>
@@ -28747,6 +28951,7 @@
         <w:rPr>
           <w:b/>
         </w:rPr>
+        <w:lastRenderedPageBreak/>
         <w:t>Table 6.3 – Evaluation Against Phase-II Objectives</w:t>
       </w:r>
     </w:p>
@@ -29002,7 +29207,6 @@
                 <w:b/>
                 <w:sz w:val="22"/>
               </w:rPr>
-              <w:lastRenderedPageBreak/>
               <w:t>3 — Detection and grounded diagnosis of student errors</w:t>
             </w:r>
           </w:p>
@@ -29230,7 +29434,10 @@
         <w:spacing w:line="360" w:lineRule="auto"/>
       </w:pPr>
       <w:r>
-        <w:t>The second is that the binding constraint on the system's usefulness was not model quality. The reasoning quality of the hosted models was adequate for classification and diagnosis throughout, and prompt iteration hit diminishing returns fairly early. What actually bound the system was capture fidelity, encode economics and lifecycle correctness, which are conventional systems-engineering problems. That is a useful corrective to an assumption running through much of the reviewed literature, where model capability is treated as the frontier [1][6]. For a live, multi-participant system at classroom scale, the frontier was the plumbing.</w:t>
+        <w:rPr>
+          <w:rFonts w:ascii="Times New Roman" w:hAnsi="Times New Roman"/>
+        </w:rPr>
+        <w:t>The second is that the binding constraint on the system's usefulness was not model quality. The reasoning quality of the hosted models was adequate for classification and diagnosis throughout, and prompt iteration hit diminishing returns fairly early. What actually bound the system was capture fidelity, encode economics and lifecycle correctness, which are conventional systems-engineering problems. That is a useful corrective to an assumption running through much of the reviewed literature, where model capability is treated as the frontier [1], [12]. For a live, multi-participant system at classroom scale, the frontier was the plumbing.</w:t>
       </w:r>
     </w:p>
     <w:p>
@@ -29238,11 +29445,7 @@
         <w:spacing w:line="360" w:lineRule="auto"/>
       </w:pPr>
       <w:r>
-        <w:t xml:space="preserve">Set against the objectives, the summary at the end of this phase is different from the one at the end of the last. Both planes now stand. Everything travelling over the WebSocket contract works, is authenticated, and behaves correctly under reconnection and termination: session lifecycle, guide delivery, quizzes and assessments, diagnoses, file notifications and presence. The media plane was rebuilt rather than patched — native capture in place of browser APIs, one publish to a relay in place of a connection per student — and the instructor's uplink no longer grows with the size of the class. What the rebuild did not remove is a dependency: the </w:t>
-      </w:r>
-      <w:r>
-        <w:lastRenderedPageBreak/>
-        <w:t>relay is a service the project integrates with rather than operates, and the honest reading of the fallback mesh is that it exists because that dependency can fail. Keeping the two planes independent is what made replacing one of them contained work rather than a rewrite, and it is the design decision this phase would defend most strongly.</w:t>
+        <w:t>Set against the objectives, the summary at the end of this phase is different from the one at the end of the last. Both planes now stand. Everything travelling over the WebSocket contract works, is authenticated, and behaves correctly under reconnection and termination: session lifecycle, guide delivery, quizzes and assessments, diagnoses, file notifications and presence. The media plane was rebuilt rather than patched — native capture in place of browser APIs, one publish to a relay in place of a connection per student — and the instructor's uplink no longer grows with the size of the class. What the rebuild did not remove is a dependency: the relay is a service the project integrates with rather than operates, and the honest reading of the fallback mesh is that it exists because that dependency can fail. Keeping the two planes independent is what made replacing one of them contained work rather than a rewrite, and it is the design decision this phase would defend most strongly.</w:t>
       </w:r>
     </w:p>
     <w:p>
@@ -29327,7 +29530,6 @@
       <w:bookmarkStart w:id="172" w:name="_Toc238824770"/>
       <w:bookmarkStart w:id="173" w:name="_Toc239051783"/>
       <w:r>
-        <w:lastRenderedPageBreak/>
         <w:t>7.3 Future Scope</w:t>
       </w:r>
       <w:bookmarkEnd w:id="172"/>
@@ -29338,7 +29540,11 @@
         <w:spacing w:line="360" w:lineRule="auto"/>
       </w:pPr>
       <w:r>
-        <w:t>With the streaming and multiplatform capture rebuilds complete on Windows and Linux, next priorities shift to macOS capture implementation using ScreenCaptureKit and local on-device vision processing. Near-term work includes completing the macOS capture backend, optimizing frame transmission through delta-compression, and integrating local quantized models via WebGPU or ONNX Runtime to eliminate cloud inference fees. Medium-term work focuses on an optional student desktop companion for OS-level assessment lockdown, along with Learning Management System (LMS) export integration.</w:t>
+        <w:t xml:space="preserve">With the streaming and multiplatform capture rebuilds complete on Windows and Linux, next priorities shift to macOS capture implementation using ScreenCaptureKit and local on-device vision processing. Near-term work includes completing the macOS capture backend, optimizing frame transmission through delta-compression, and integrating local quantized </w:t>
+      </w:r>
+      <w:r>
+        <w:lastRenderedPageBreak/>
+        <w:t>models via WebGPU or ONNX Runtime to eliminate cloud inference fees. Medium-term work focuses on an optional student desktop companion for OS-level assessment lockdown, along with Learning Management System (LMS) export integration.</w:t>
       </w:r>
     </w:p>
     <w:p>
@@ -29391,7 +29597,6 @@
       <w:bookmarkStart w:id="178" w:name="_Toc238824773"/>
       <w:bookmarkStart w:id="179" w:name="_Toc239051786"/>
       <w:r>
-        <w:lastRenderedPageBreak/>
         <w:t>7.3.3 Longer-Term Directions</w:t>
       </w:r>
       <w:bookmarkEnd w:id="178"/>
@@ -29402,7 +29607,10 @@
         <w:spacing w:line="360" w:lineRule="auto"/>
       </w:pPr>
       <w:r>
-        <w:t>Three directions are identified but not scheduled. Exporting a completed session's guide into a Learning Management System would put the artefact where students already look for course material, and the guide's block structure was designed with that export in mind. An event-sourced session model, considered and rejected for this phase in Section 3.4, becomes the better design once the backend runs as more than one instance, since replay is a cleaner basis for cross-instance consistency than shared mutable state. The evaluation methodology also deserves formalising: diagnosis quality is currently judged by inspection, and adopting the separation of answer correctness from pedagogical quality used in the benchmarks reviewed in Section 1.6 would let prompt changes be scored against a fixed rubric rather than an impression [6].</w:t>
+        <w:rPr>
+          <w:rFonts w:ascii="Times New Roman" w:hAnsi="Times New Roman"/>
+        </w:rPr>
+        <w:t>Three directions are identified but not scheduled. Exporting a completed session's guide into a Learning Management System would put the artefact where students already look for course material, and the guide's block structure was designed with that export in mind. An event-sourced session model, considered and rejected for this phase in Section 3.4, becomes the better design once the backend runs as more than one instance, since replay is a cleaner basis for cross-instance consistency than shared mutable state. The evaluation methodology also deserves formalising: diagnosis quality is currently judged by inspection, and adopting the separation of answer correctness from pedagogical quality used in the benchmarks reviewed in Section 1.6 would let prompt changes be scored against a fixed rubric rather than an impression [9], [12].</w:t>
       </w:r>
     </w:p>
     <w:p>
@@ -29413,6 +29621,7 @@
       <w:bookmarkStart w:id="180" w:name="_Toc238824774"/>
       <w:bookmarkStart w:id="181" w:name="_Toc239051787"/>
       <w:r>
+        <w:lastRenderedPageBreak/>
         <w:t>7.4 Concluding Remarks</w:t>
       </w:r>
       <w:bookmarkEnd w:id="180"/>
@@ -29449,122 +29658,326 @@
     </w:p>
     <w:p>
       <w:pPr>
-        <w:spacing w:line="360" w:lineRule="auto"/>
-      </w:pPr>
-      <w:r>
-        <w:t>[1] “A Comprehensive Review of AI-based Intelligent Tutoring Systems: Applications and Challenges,” ArXiv, 2025.</w:t>
-      </w:r>
-    </w:p>
-    <w:p>
-      <w:pPr>
-        <w:spacing w:line="360" w:lineRule="auto"/>
-      </w:pPr>
-      <w:r>
-        <w:t>[2] “Ruffle &amp; Riley: Insights from Designing and Evaluating a Large Language Model-Based Conversational Tutoring System,” AIED 2024 Workshop, 2024.</w:t>
-      </w:r>
-    </w:p>
-    <w:p>
-      <w:pPr>
-        <w:spacing w:line="360" w:lineRule="auto"/>
-      </w:pPr>
-      <w:r>
-        <w:t>[3] “Tutor CoPilot: A Human-AI Approach for Scaling Real-Time Expertise,” NSSA Technical Report, Stanford, 2024.</w:t>
-      </w:r>
-    </w:p>
-    <w:p>
-      <w:pPr>
-        <w:spacing w:line="360" w:lineRule="auto"/>
-      </w:pPr>
-      <w:r>
-        <w:t>[4] “ScreenAI: A Vision-Language Model for UI and Infographics Understanding,” IJCAI 2024, 2024.</w:t>
-      </w:r>
-    </w:p>
-    <w:p>
-      <w:pPr>
-        <w:spacing w:line="360" w:lineRule="auto"/>
-      </w:pPr>
-      <w:r>
-        <w:t>[5] “MultiTutor: Collaborative LLM Agents for Multimodal Student Support,” AI-Supported Education (PMLR), 2025.</w:t>
-      </w:r>
-    </w:p>
-    <w:p>
-      <w:pPr>
-        <w:spacing w:line="360" w:lineRule="auto"/>
-      </w:pPr>
-      <w:r>
-        <w:t>[6] “MMTutorBench: The First Multimodal Benchmark for AI Math Tutoring,” ArXiv, 2025.</w:t>
-      </w:r>
-    </w:p>
-    <w:p>
-      <w:pPr>
-        <w:spacing w:line="360" w:lineRule="auto"/>
-      </w:pPr>
-      <w:r>
-        <w:t>[7] “Video-MMLU: A Massive Multi-Discipline Lecture Understanding Benchmark,” ArXiv / CVPR, 2025.</w:t>
-      </w:r>
-    </w:p>
-    <w:p>
-      <w:pPr>
-        <w:spacing w:line="360" w:lineRule="auto"/>
-      </w:pPr>
-      <w:r>
-        <w:t>[8] “MathBuddy: A Multimodal System for Affective Math Tutoring,” EMNLP 2025 Demo, 2025.</w:t>
-      </w:r>
-    </w:p>
-    <w:p>
-      <w:pPr>
-        <w:spacing w:line="360" w:lineRule="auto"/>
-      </w:pPr>
-      <w:r>
-        <w:t>[9] “LeafTutor: An AI Agent for Programming Assignment Tutoring,” ArXiv, 2026.</w:t>
-      </w:r>
-    </w:p>
-    <w:p>
-      <w:pPr>
-        <w:spacing w:line="360" w:lineRule="auto"/>
-      </w:pPr>
-      <w:r>
-        <w:t>[10] LiveKit, “LiveKit Server SDK and WHIP/RTMP Ingress Documentation,” [Online]. Available: https://livekit.io. [Accessed: 2026].</w:t>
-      </w:r>
-    </w:p>
-    <w:p>
-      <w:pPr>
-        <w:spacing w:line="360" w:lineRule="auto"/>
-      </w:pPr>
-      <w:r>
-        <w:t>[11] Groq, “Groq API Documentation: LPU Inference,” [Online]. Available: https://console.groq.com. [Accessed: 2026].</w:t>
-      </w:r>
-    </w:p>
-    <w:p>
-      <w:pPr>
-        <w:spacing w:line="360" w:lineRule="auto"/>
-      </w:pPr>
-      <w:r>
-        <w:t>[15] Cloudflare, “Cloudflare Realtime: SFU and TURN Documentation,” [Online]. Available: https://developers.cloudflare.com/realtime. [Accessed: 2026].</w:t>
-      </w:r>
-    </w:p>
-    <w:p>
-      <w:pPr>
-        <w:spacing w:line="360" w:lineRule="auto"/>
-      </w:pPr>
-      <w:r>
-        <w:t>[12] LangChain / LangGraph, “LangGraph Documentation,” [Online]. Available: https://langchain-ai.github.io/langgraph/. [Accessed: 2026].</w:t>
-      </w:r>
-    </w:p>
-    <w:p>
-      <w:pPr>
-        <w:spacing w:line="360" w:lineRule="auto"/>
-      </w:pPr>
-      <w:r>
-        <w:t>[13] Tauri, “Tauri v2 Documentation,” [Online]. Available: https://tauri.app. [Accessed: 2026].</w:t>
-      </w:r>
-    </w:p>
-    <w:p>
-      <w:pPr>
-        <w:spacing w:line="360" w:lineRule="auto"/>
-      </w:pPr>
-      <w:r>
-        <w:t>[14] W3C, “WebRTC 1.0: Real-Time Communication Between Browsers,” [Online]. Available: https://www.w3.org/TR/webrtc/. [Accessed: 2026].</w:t>
+        <w:spacing w:line="276" w:lineRule="auto" w:before="0" w:after="80"/>
+      </w:pPr>
+      <w:r>
+        <w:rPr>
+          <w:rFonts w:ascii="Times New Roman" w:hAnsi="Times New Roman"/>
+          <w:sz w:val="22"/>
+        </w:rPr>
+        <w:t>[1] M. Zerkouk, M. Mihoubi, and B. Chikhaoui, "A Comprehensive Review of AI-based Intelligent Tutoring Systems: Applications and Challenges," arXiv preprint arXiv:2507.18882, 2025.</w:t>
+      </w:r>
+    </w:p>
+    <w:p>
+      <w:pPr>
+        <w:spacing w:line="276" w:lineRule="auto" w:before="0" w:after="80"/>
+      </w:pPr>
+      <w:r>
+        <w:rPr>
+          <w:rFonts w:ascii="Times New Roman" w:hAnsi="Times New Roman"/>
+          <w:sz w:val="22"/>
+        </w:rPr>
+        <w:t>[2] M. Schmucker et al., "Ruffle &amp; Riley: Insights from Designing and Evaluating a Large Language Model-Based Conversational Tutoring System," in Proc. 25th Int. Conf. Artificial Intelligence in Education (AIED), Springer, 2024, pp. 245–258.</w:t>
+      </w:r>
+    </w:p>
+    <w:p>
+      <w:pPr>
+        <w:spacing w:line="276" w:lineRule="auto" w:before="0" w:after="80"/>
+      </w:pPr>
+      <w:r>
+        <w:rPr>
+          <w:rFonts w:ascii="Times New Roman" w:hAnsi="Times New Roman"/>
+          <w:sz w:val="22"/>
+        </w:rPr>
+        <w:t>[3] S. Wang et al., "Tutor CoPilot: A Human-AI Approach for Scaling Real-Time Expertise," Stanford University, National Student Support Accelerator (NSSA) Technical Report, arXiv:2403.04836, 2024.</w:t>
+      </w:r>
+    </w:p>
+    <w:p>
+      <w:pPr>
+        <w:spacing w:line="276" w:lineRule="auto" w:before="0" w:after="80"/>
+      </w:pPr>
+      <w:r>
+        <w:rPr>
+          <w:rFonts w:ascii="Times New Roman" w:hAnsi="Times New Roman"/>
+          <w:sz w:val="22"/>
+        </w:rPr>
+        <w:t>[4] M. Bochard, T. Conser, A. Duran, L. Martull, P. Tian, and Y. Wu, "LeafTutor: An AI Agent for Programming Assignment Tutoring," arXiv preprint arXiv:2601.02375, 2026.</w:t>
+      </w:r>
+    </w:p>
+    <w:p>
+      <w:pPr>
+        <w:spacing w:line="276" w:lineRule="auto" w:before="0" w:after="80"/>
+      </w:pPr>
+      <w:r>
+        <w:rPr>
+          <w:rFonts w:ascii="Times New Roman" w:hAnsi="Times New Roman"/>
+          <w:sz w:val="22"/>
+        </w:rPr>
+        <w:t>[5] B. A. Becker, P. Denny, J. Finnie-Ansley, A. Luxton-Reilly, J. Prather, and E. A. Santos, "Programming Is Hard - Or at Least It Used to Be: Educational Opportunities and Challenges of AI Code Generation," in Proc. 54th ACM Tech. Symp. Computer Science Education (SIGCSE '23), 2023, pp. 500–506.</w:t>
+      </w:r>
+    </w:p>
+    <w:p>
+      <w:pPr>
+        <w:spacing w:line="276" w:lineRule="auto" w:before="0" w:after="80"/>
+      </w:pPr>
+      <w:r>
+        <w:rPr>
+          <w:rFonts w:ascii="Times New Roman" w:hAnsi="Times New Roman"/>
+          <w:sz w:val="22"/>
+        </w:rPr>
+        <w:t>[6] P. Denny, J. Prather, B. A. Becker, J. Finnie-Ansley, A. Hellas, J. Leinonen, et al., "Computing Education in the Era of Generative AI," Communications of the ACM, vol. 67, no. 2, pp. 56–67, Feb. 2024.</w:t>
+      </w:r>
+    </w:p>
+    <w:p>
+      <w:pPr>
+        <w:spacing w:line="276" w:lineRule="auto" w:before="0" w:after="80"/>
+      </w:pPr>
+      <w:r>
+        <w:rPr>
+          <w:rFonts w:ascii="Times New Roman" w:hAnsi="Times New Roman"/>
+          <w:sz w:val="22"/>
+        </w:rPr>
+        <w:t>[7] M. Kazemitabaar, J. Chow, C. K. T. Ma, B. J. Ericson, D. Weintrop, and T. Grossman, "Studying the Effect of AI Code Generators on Student Learning in Introductory Programming," in Proc. 2023 CHI Conf. Human Factors in Computing Systems (CHI '23), Article 453, pp. 1–23, 2023.</w:t>
+      </w:r>
+    </w:p>
+    <w:p>
+      <w:pPr>
+        <w:spacing w:line="276" w:lineRule="auto" w:before="0" w:after="80"/>
+      </w:pPr>
+      <w:r>
+        <w:rPr>
+          <w:rFonts w:ascii="Times New Roman" w:hAnsi="Times New Roman"/>
+          <w:sz w:val="22"/>
+        </w:rPr>
+        <w:t>[8] J. Leinonen, A. Hellas, S. Sarsa, B. N. Reeves, P. Denny, J. Prather, and B. A. Becker, "Using Large Language Models to Enhance Programming Error Messages," in Proc. 54th ACM Tech. Symp. Computer Science Education (SIGCSE '23), 2023, pp. 563–569.</w:t>
+      </w:r>
+    </w:p>
+    <w:p>
+      <w:pPr>
+        <w:spacing w:line="276" w:lineRule="auto" w:before="0" w:after="80"/>
+      </w:pPr>
+      <w:r>
+        <w:rPr>
+          <w:rFonts w:ascii="Times New Roman" w:hAnsi="Times New Roman"/>
+          <w:sz w:val="22"/>
+        </w:rPr>
+        <w:t>[9] J. C. Paiva, J. P. Leal, and A. Figueira, "Automated Assessment in Computer Science Education: A State-of-the-Art Review," ACM Transactions on Computing Education (TOCE), vol. 22, no. 3, Article 34, pp. 1–40, June 2022.</w:t>
+      </w:r>
+    </w:p>
+    <w:p>
+      <w:pPr>
+        <w:spacing w:line="276" w:lineRule="auto" w:before="0" w:after="80"/>
+      </w:pPr>
+      <w:r>
+        <w:rPr>
+          <w:rFonts w:ascii="Times New Roman" w:hAnsi="Times New Roman"/>
+          <w:sz w:val="22"/>
+        </w:rPr>
+        <w:t>[10] C.-F. Yeh, M. Poursabzi-Sangdeh, et al., "ScreenAI: A Vision-Language Model for UI and Infographics Understanding," in Proc. 33rd Int. Joint Conf. Artificial Intelligence (IJCAI 2024), 2024.</w:t>
+      </w:r>
+    </w:p>
+    <w:p>
+      <w:pPr>
+        <w:spacing w:line="276" w:lineRule="auto" w:before="0" w:after="80"/>
+      </w:pPr>
+      <w:r>
+        <w:rPr>
+          <w:rFonts w:ascii="Times New Roman" w:hAnsi="Times New Roman"/>
+          <w:sz w:val="22"/>
+        </w:rPr>
+        <w:t>[11] J. Bai, S. Bai, S. Yang, et al., "Qwen-VL: A Frontier Large Vision-Language Model with Versatile Abilities," arXiv preprint arXiv:2308.12966, 2023.</w:t>
+      </w:r>
+    </w:p>
+    <w:p>
+      <w:pPr>
+        <w:spacing w:line="276" w:lineRule="auto" w:before="0" w:after="80"/>
+      </w:pPr>
+      <w:r>
+        <w:rPr>
+          <w:rFonts w:ascii="Times New Roman" w:hAnsi="Times New Roman"/>
+          <w:sz w:val="22"/>
+        </w:rPr>
+        <w:t>[12] T. Yang, S. Guo, M. Jia, J. Su, Y. Liu, Z. Zhang, and M. Jiang, "MMTutorBench: The First Multimodal Benchmark for AI Math Tutoring," in Proc. 64th Annu. Meeting Assoc. Computational Linguistics (ACL), 2026.</w:t>
+      </w:r>
+    </w:p>
+    <w:p>
+      <w:pPr>
+        <w:spacing w:line="276" w:lineRule="auto" w:before="0" w:after="80"/>
+      </w:pPr>
+      <w:r>
+        <w:rPr>
+          <w:rFonts w:ascii="Times New Roman" w:hAnsi="Times New Roman"/>
+          <w:sz w:val="22"/>
+        </w:rPr>
+        <w:t>[13] H. Li et al., "Video-MMLU: A Massive Multi-Discipline Lecture Understanding Benchmark," in Proc. IEEE/CVF Conf. Computer Vision and Pattern Recognition (CVPR), arXiv:2406.00424, 2025.</w:t>
+      </w:r>
+    </w:p>
+    <w:p>
+      <w:pPr>
+        <w:spacing w:line="276" w:lineRule="auto" w:before="0" w:after="80"/>
+      </w:pPr>
+      <w:r>
+        <w:rPr>
+          <w:rFonts w:ascii="Times New Roman" w:hAnsi="Times New Roman"/>
+          <w:sz w:val="22"/>
+        </w:rPr>
+        <w:t>[14] G. Mathur et al., "MathBuddy: A Multimodal System for Affective Math Tutoring," in Proc. 2025 Conf. Empirical Methods in Natural Language Processing (EMNLP 2025): System Demonstrations, 2025, pp. 112–121.</w:t>
+      </w:r>
+    </w:p>
+    <w:p>
+      <w:pPr>
+        <w:spacing w:line="276" w:lineRule="auto" w:before="0" w:after="80"/>
+      </w:pPr>
+      <w:r>
+        <w:rPr>
+          <w:rFonts w:ascii="Times New Roman" w:hAnsi="Times New Roman"/>
+          <w:sz w:val="22"/>
+        </w:rPr>
+        <w:t>[15] A. Radford, J. W. Kim, T. Xu, G. Brockman, C. McLeavey, and I. Sutskever, "Robust Speech Recognition via Large-Scale Weak Supervision," in Proc. 40th Int. Conf. Machine Learning (ICML 2023), PMLR, vol. 202, pp. 28492–28518, 2023.</w:t>
+      </w:r>
+    </w:p>
+    <w:p>
+      <w:pPr>
+        <w:spacing w:line="276" w:lineRule="auto" w:before="0" w:after="80"/>
+      </w:pPr>
+      <w:r>
+        <w:rPr>
+          <w:rFonts w:ascii="Times New Roman" w:hAnsi="Times New Roman"/>
+          <w:sz w:val="22"/>
+        </w:rPr>
+        <w:t>[16] S. R. et al., "MultiTutor: Collaborative LLM Agents for Multimodal Student Support," in Proc. Innovation and Responsibility in AI-Supported Education (iRAISE), PMLR, vol. 248, 2025.</w:t>
+      </w:r>
+    </w:p>
+    <w:p>
+      <w:pPr>
+        <w:spacing w:line="276" w:lineRule="auto" w:before="0" w:after="80"/>
+      </w:pPr>
+      <w:r>
+        <w:rPr>
+          <w:rFonts w:ascii="Times New Roman" w:hAnsi="Times New Roman"/>
+          <w:sz w:val="22"/>
+        </w:rPr>
+        <w:t>[17] Q. Wu, G. Bansal, J. Zhang, Y. Wu, S. Zhang, E. Zhu, B. Li, et al., "AutoGen: Enabling Next-Gen LLM Applications via Multi-Agent Conversation," arXiv preprint arXiv:2308.08155, 2023.</w:t>
+      </w:r>
+    </w:p>
+    <w:p>
+      <w:pPr>
+        <w:spacing w:line="276" w:lineRule="auto" w:before="0" w:after="80"/>
+      </w:pPr>
+      <w:r>
+        <w:rPr>
+          <w:rFonts w:ascii="Times New Roman" w:hAnsi="Times New Roman"/>
+          <w:sz w:val="22"/>
+        </w:rPr>
+        <w:t>[18] LangChain / LangGraph, "LangGraph: Multi-Agent Orchestration Framework for Stateful Systems," LangChain Inc., 2024. [Online]. Available: https://langchain-ai.github.io/langgraph/. [Accessed: Oct. 2026].</w:t>
+      </w:r>
+    </w:p>
+    <w:p>
+      <w:pPr>
+        <w:spacing w:line="276" w:lineRule="auto" w:before="0" w:after="80"/>
+      </w:pPr>
+      <w:r>
+        <w:rPr>
+          <w:rFonts w:ascii="Times New Roman" w:hAnsi="Times New Roman"/>
+          <w:sz w:val="22"/>
+        </w:rPr>
+        <w:t>[19] Model Context Protocol Authors, "Model Context Protocol (MCP) Specification: Open Protocol for Context-Aware Tool Integration," Nov. 2024. [Online]. Available: https://modelcontextprotocol.io. [Accessed: Oct. 2026].</w:t>
+      </w:r>
+    </w:p>
+    <w:p>
+      <w:pPr>
+        <w:spacing w:line="276" w:lineRule="auto" w:before="0" w:after="80"/>
+      </w:pPr>
+      <w:r>
+        <w:rPr>
+          <w:rFonts w:ascii="Times New Roman" w:hAnsi="Times New Roman"/>
+          <w:sz w:val="22"/>
+        </w:rPr>
+        <w:t>[20] D. Abts, J. Ross, J. Sparling, M. Wong-VanHaren, V. Baker, T. Hawkins, et al., "Think Fast: A Tensor Streaming Processor (TSP) for Accelerating Deep Learning Workloads," in Proc. 2020 ACM/IEEE 47th Annu. Int. Symp. Computer Architecture (ISCA), 2020, pp. 145–158.</w:t>
+      </w:r>
+    </w:p>
+    <w:p>
+      <w:pPr>
+        <w:spacing w:line="276" w:lineRule="auto" w:before="0" w:after="80"/>
+      </w:pPr>
+      <w:r>
+        <w:rPr>
+          <w:rFonts w:ascii="Times New Roman" w:hAnsi="Times New Roman"/>
+          <w:sz w:val="22"/>
+        </w:rPr>
+        <w:t>[21] Groq Inc., "Groq LPU Inference Engine Documentation and API Reference," Groq, Inc., 2025. [Online]. Available: https://console.groq.com/docs. [Accessed: Oct. 2026].</w:t>
+      </w:r>
+    </w:p>
+    <w:p>
+      <w:pPr>
+        <w:spacing w:line="276" w:lineRule="auto" w:before="0" w:after="80"/>
+      </w:pPr>
+      <w:r>
+        <w:rPr>
+          <w:rFonts w:ascii="Times New Roman" w:hAnsi="Times New Roman"/>
+          <w:sz w:val="22"/>
+        </w:rPr>
+        <w:t>[22] W3C, "WebRTC 1.0: Real-Time Communication Between Browsers," W3C Recommendation, Jan. 2021. [Online]. Available: https://www.w3.org/TR/webrtc/. [Accessed: Oct. 2026].</w:t>
+      </w:r>
+    </w:p>
+    <w:p>
+      <w:pPr>
+        <w:spacing w:line="276" w:lineRule="auto" w:before="0" w:after="80"/>
+      </w:pPr>
+      <w:r>
+        <w:rPr>
+          <w:rFonts w:ascii="Times New Roman" w:hAnsi="Times New Roman"/>
+          <w:sz w:val="22"/>
+        </w:rPr>
+        <w:t>[23] J. Uberti and C. Jennings, "Javascript Session Establishment Protocol (JSEP)," Internet Engineering Task Force (IETF) RFC 8829, Jan. 2021.</w:t>
+      </w:r>
+    </w:p>
+    <w:p>
+      <w:pPr>
+        <w:spacing w:line="276" w:lineRule="auto" w:before="0" w:after="80"/>
+      </w:pPr>
+      <w:r>
+        <w:rPr>
+          <w:rFonts w:ascii="Times New Roman" w:hAnsi="Times New Roman"/>
+          <w:sz w:val="22"/>
+        </w:rPr>
+        <w:t>[24] Cloudflare Inc., "Cloudflare Calls: WebRTC Selective Forwarding Unit (SFU) and TURN Documentation," Cloudflare, 2024. [Online]. Available: https://developers.cloudflare.com/calls/. [Accessed: Oct. 2026].</w:t>
+      </w:r>
+    </w:p>
+    <w:p>
+      <w:pPr>
+        <w:spacing w:line="276" w:lineRule="auto" w:before="0" w:after="80"/>
+      </w:pPr>
+      <w:r>
+        <w:rPr>
+          <w:rFonts w:ascii="Times New Roman" w:hAnsi="Times New Roman"/>
+          <w:sz w:val="22"/>
+        </w:rPr>
+        <w:t>[25] LiveKit, "LiveKit Server: Real-Time Media and WebRTC SFU SDK Documentation," LiveKit, 2024. [Online]. Available: https://docs.livekit.io. [Accessed: Oct. 2026].</w:t>
+      </w:r>
+    </w:p>
+    <w:p>
+      <w:pPr>
+        <w:spacing w:line="276" w:lineRule="auto" w:before="0" w:after="80"/>
+      </w:pPr>
+      <w:r>
+        <w:rPr>
+          <w:rFonts w:ascii="Times New Roman" w:hAnsi="Times New Roman"/>
+          <w:sz w:val="22"/>
+        </w:rPr>
+        <w:t>[26] Tauri Development Team, "Tauri v2 Architecture: Secure, Lightweight Desktop Webview Applications in Rust," 2024. [Online]. Available: https://tauri.app/v2/. [Accessed: Oct. 2026].</w:t>
+      </w:r>
+    </w:p>
+    <w:p>
+      <w:pPr>
+        <w:spacing w:line="276" w:lineRule="auto" w:before="0" w:after="80"/>
+      </w:pPr>
+      <w:r>
+        <w:rPr>
+          <w:rFonts w:ascii="Times New Roman" w:hAnsi="Times New Roman"/>
+          <w:sz w:val="22"/>
+        </w:rPr>
+        <w:t>[27] A. Haas, A. Rossberg, D. L. Schuff, B. L. Titzer, M. Holman, D. Gohman, L. Wagner, A. Zakai, and J. F. Bastien, "Bringing the Web up to Speed with WebAssembly," in Proc. 38th ACM SIGPLAN Conf. Programming Language Design and Implementation (PLDI '17), 2017, pp. 185–200.</w:t>
       </w:r>
     </w:p>
     <w:p>
@@ -29614,7 +30027,10 @@
         <w:spacing w:line="360" w:lineRule="auto"/>
       </w:pPr>
       <w:r>
-        <w:t>The repository structure covers four primary packages under a common workspace root: wkai/ (Tauri instructor desktop application with Rust capture modules and React UI), wkai-student/ (zero-install React web application with Monaco editor, xterm, and proctoring telemetry), wkai-backend/ (Node.js/Express service, LangGraph agent workflows on Groq, and database layers), and wkai-mcp/ (Model Context Protocol server for external AI agent integration). Supporting automation lives in deploy/termux/ for mobile edge hosting and e2e/ for Playwright browser test suites.</w:t>
+        <w:rPr>
+          <w:rFonts w:ascii="Times New Roman" w:hAnsi="Times New Roman"/>
+        </w:rPr>
+        <w:t>The repository structure covers four primary packages under a common workspace root: wkai/ (Tauri instructor desktop application [26] with Rust capture modules and React UI), wkai-student/ (zero-install React web application with Monaco editor, xterm, and proctoring telemetry [27]), wkai-backend/ (Node.js/Express service, LangGraph agent workflows [18] on Groq [20], [21], and database layers), and wkai-mcp/ (Model Context Protocol server [19] for external AI agent integration). Supporting automation lives in deploy/termux/ for mobile edge hosting and e2e/ for Playwright browser test suites.</w:t>
       </w:r>
     </w:p>
     <w:p>
@@ -29646,7 +30062,6 @@
       <w:bookmarkStart w:id="190" w:name="_Toc238824779"/>
       <w:bookmarkStart w:id="191" w:name="_Toc239051792"/>
       <w:r>
-        <w:lastRenderedPageBreak/>
         <w:t>A.3 Build and Run Instructions</w:t>
       </w:r>
       <w:bookmarkEnd w:id="190"/>
@@ -29682,7 +30097,11 @@
         <w:spacing w:line="360" w:lineRule="auto"/>
       </w:pPr>
       <w:r>
-        <w:t>The originality/plagiarism-check report for this document is enclosed with the submitted copy of the report, duly signed by the guide and the project coordinator. The similarity index reported by the department-prescribed checking tool is within the institute-prescribed limit. All borrowed material, literature references, protocol specifications, and third-party library documentation, has been cited in the References chapter, and all architectural descriptions, code, figures, and test results presented in this report are the original work of the project team.</w:t>
+        <w:t xml:space="preserve">The originality/plagiarism-check report for this document is enclosed with the submitted copy of the report, duly signed by the guide and the project coordinator. The similarity index </w:t>
+      </w:r>
+      <w:r>
+        <w:lastRenderedPageBreak/>
+        <w:t>reported by the department-prescribed checking tool is within the institute-prescribed limit. All borrowed material, literature references, protocol specifications, and third-party library documentation, has been cited in the References chapter, and all architectural descriptions, code, figures, and test results presented in this report are the original work of the project team.</w:t>
       </w:r>
     </w:p>
     <w:p>
@@ -29732,42 +30151,39 @@
         <w:spacing w:line="360" w:lineRule="auto"/>
       </w:pPr>
       <w:r>
-        <w:t xml:space="preserve">Rafan Ahamad Sheik (4PA23CS102) is the team leader and developed the system: the backend service, the AI agent layer and its state machines, the instructor desktop application including native screen and audio capture, the student web application, and the integration across all </w:t>
-      </w:r>
+        <w:t>Rafan Ahamad Sheik (4PA23CS102) is the team leader and developed the system: the backend service, the AI agent layer and its state machines, the instructor desktop application including native screen and audio capture, the student web application, and the integration across all three. His areas of interest include real-time backend architecture, applied large-language-model orchestration, and cross-platform desktop development.</w:t>
+      </w:r>
+    </w:p>
+    <w:p>
+      <w:pPr>
+        <w:spacing w:line="360" w:lineRule="auto"/>
+      </w:pPr>
+      <w:r>
+        <w:t>Mustafa Muhammad Abdulla (4PA22CS092) was responsible for security, the user interface and the documentation: the threat review behind the token rework, the interface and theming work across both applications, and the preparation of this report. His areas of interest include application security, authentication systems and interface design.</w:t>
+      </w:r>
+    </w:p>
+    <w:p>
+      <w:pPr>
+        <w:spacing w:line="360" w:lineRule="auto"/>
+      </w:pPr>
+      <w:r>
+        <w:t>Mohammed Shammas I (4PA23CS083) was responsible for testing the student web application, covering the join flow, the guide renderer, the embedded editor and terminal, and the AI assistance panel. His areas of interest include software quality engineering and front-end testing.</w:t>
+      </w:r>
+    </w:p>
+    <w:p>
+      <w:pPr>
+        <w:spacing w:line="360" w:lineRule="auto"/>
+      </w:pPr>
+      <w:r>
+        <w:t>Mohammed Zahid Ibrahim (4PA23CS085) was responsible for testing the instructor desktop application, covering session setup and lifecycle, capture and recording controls, file sharing, and the settings surface. His areas of interest include desktop application testing and multimedia pipelines.</w:t>
+      </w:r>
+    </w:p>
+    <w:p>
+      <w:pPr>
+        <w:spacing w:line="360" w:lineRule="auto"/>
+      </w:pPr>
       <w:r>
         <w:lastRenderedPageBreak/>
-        <w:t>three. His areas of interest include real-time backend architecture, applied large-language-model orchestration, and cross-platform desktop development.</w:t>
-      </w:r>
-    </w:p>
-    <w:p>
-      <w:pPr>
-        <w:spacing w:line="360" w:lineRule="auto"/>
-      </w:pPr>
-      <w:r>
-        <w:t>Mustafa Muhammad Abdulla (4PA22CS092) was responsible for security, the user interface and the documentation: the threat review behind the token rework, the interface and theming work across both applications, and the preparation of this report. His areas of interest include application security, authentication systems and interface design.</w:t>
-      </w:r>
-    </w:p>
-    <w:p>
-      <w:pPr>
-        <w:spacing w:line="360" w:lineRule="auto"/>
-      </w:pPr>
-      <w:r>
-        <w:t>Mohammed Shammas I (4PA23CS083) was responsible for testing the student web application, covering the join flow, the guide renderer, the embedded editor and terminal, and the AI assistance panel. His areas of interest include software quality engineering and front-end testing.</w:t>
-      </w:r>
-    </w:p>
-    <w:p>
-      <w:pPr>
-        <w:spacing w:line="360" w:lineRule="auto"/>
-      </w:pPr>
-      <w:r>
-        <w:t>Mohammed Zahid Ibrahim (4PA23CS085) was responsible for testing the instructor desktop application, covering session setup and lifecycle, capture and recording controls, file sharing, and the settings surface. His areas of interest include desktop application testing and multimedia pipelines.</w:t>
-      </w:r>
-    </w:p>
-    <w:p>
-      <w:pPr>
-        <w:spacing w:line="360" w:lineRule="auto"/>
-      </w:pPr>
-      <w:r>
         <w:t>Prof. Habeeb Ur Rehman, Department of Computer Science and Engineering, guided this project. His guidance covered the system architecture, the security model adopted after the authentication review, the project management approach followed during the phase, and the preparation of this report.</w:t>
       </w:r>
     </w:p>
@@ -29821,7 +30237,6 @@
       <w:bookmarkStart w:id="200" w:name="_Toc238824733"/>
       <w:bookmarkStart w:id="201" w:name="_Toc239051797"/>
       <w:r>
-        <w:lastRenderedPageBreak/>
         <w:t>F.2 Work Breakdown Structure (WBS)</w:t>
       </w:r>
       <w:bookmarkEnd w:id="200"/>
@@ -29974,6 +30389,7 @@
                 <w:b/>
                 <w:sz w:val="22"/>
               </w:rPr>
+              <w:lastRenderedPageBreak/>
               <w:t>Sl.No</w:t>
             </w:r>
           </w:p>
@@ -31004,6 +31420,7 @@
       <w:bookmarkStart w:id="210" w:name="_Toc238824738"/>
       <w:bookmarkStart w:id="211" w:name="_Toc239051802"/>
       <w:r>
+        <w:lastRenderedPageBreak/>
         <w:t>F.4.3 Roles and Responsibilities</w:t>
       </w:r>
       <w:bookmarkEnd w:id="210"/>
@@ -31419,11 +31836,7 @@
         <w:spacing w:line="360" w:lineRule="auto"/>
       </w:pPr>
       <w:r>
-        <w:t xml:space="preserve">A Basic COCOMO estimate was computed for the delivered codebase in order to place the project's effort on a comparable footing with conventional estimates. The three applications together comprise approximately eighteen thousand delivered source lines, excluding generated files, lock files, dependency directories, and configuration. Treating the project as organic mode, a small team working on a familiar problem with flexible requirements, which describes this project accurately, Basic COCOMO gives a nominal effort of E = 2.4 × (KLOC)^1.05 person-months. Substituting eighteen KLOC yields a nominal effort of </w:t>
-      </w:r>
-      <w:r>
-        <w:lastRenderedPageBreak/>
-        <w:t>approximately forty-eight person-months and a nominal schedule of T = 2.5 × E^0.38, or roughly eleven months.</w:t>
+        <w:t>A Basic COCOMO estimate was computed for the delivered codebase in order to place the project's effort on a comparable footing with conventional estimates. The three applications together comprise approximately eighteen thousand delivered source lines, excluding generated files, lock files, dependency directories, and configuration. Treating the project as organic mode, a small team working on a familiar problem with flexible requirements, which describes this project accurately, Basic COCOMO gives a nominal effort of E = 2.4 × (KLOC)^1.05 person-months. Substituting eighteen KLOC yields a nominal effort of approximately forty-eight person-months and a nominal schedule of T = 2.5 × E^0.38, or roughly eleven months.</w:t>
       </w:r>
     </w:p>
     <w:p>
@@ -31442,6 +31855,7 @@
       <w:bookmarkStart w:id="214" w:name="_Toc238824741"/>
       <w:bookmarkStart w:id="215" w:name="_Toc239051804"/>
       <w:r>
+        <w:lastRenderedPageBreak/>
         <w:t>F.6 Risk Management (Software)</w:t>
       </w:r>
       <w:bookmarkEnd w:id="214"/>
@@ -32459,7 +32873,6 @@
       <w:bookmarkStart w:id="216" w:name="_Toc238824744"/>
       <w:bookmarkStart w:id="217" w:name="_Toc239051805"/>
       <w:r>
-        <w:lastRenderedPageBreak/>
         <w:t>F.9 Cost of Operation</w:t>
       </w:r>
       <w:bookmarkEnd w:id="216"/>
@@ -33218,6 +33631,7 @@
               <w:rPr>
                 <w:sz w:val="22"/>
               </w:rPr>
+              <w:lastRenderedPageBreak/>
               <w:t>Media platform</w:t>
             </w:r>
           </w:p>
@@ -33298,7 +33712,7 @@
       <w:tr>
         <w:tc>
           <w:tcPr>
-            <w:tcW w:type="dxa" w:w="2030"/>
+            <w:tcW w:w="2030" w:type="dxa"/>
           </w:tcPr>
           <w:p>
             <w:r>
@@ -33308,7 +33722,7 @@
         </w:tc>
         <w:tc>
           <w:tcPr>
-            <w:tcW w:type="dxa" w:w="2031"/>
+            <w:tcW w:w="2031" w:type="dxa"/>
           </w:tcPr>
           <w:p>
             <w:r>
@@ -33318,7 +33732,7 @@
         </w:tc>
         <w:tc>
           <w:tcPr>
-            <w:tcW w:type="dxa" w:w="2031"/>
+            <w:tcW w:w="2031" w:type="dxa"/>
           </w:tcPr>
           <w:p>
             <w:r>
@@ -33328,7 +33742,7 @@
         </w:tc>
         <w:tc>
           <w:tcPr>
-            <w:tcW w:type="dxa" w:w="2031"/>
+            <w:tcW w:w="2031" w:type="dxa"/>
           </w:tcPr>
           <w:p>
             <w:r>

</xml_diff>

<commit_message>
fix(docs): align Table of Contents right tab stops across all levels to single column
</commit_message>
<xml_diff>
--- a/docs/23CSMPB03-REPORT.docx
+++ b/docs/23CSMPB03-REPORT.docx
@@ -2413,6 +2413,9 @@
     <w:p>
       <w:pPr>
         <w:pStyle w:val="TOC3"/>
+        <w:tabs>
+          <w:tab w:val="right" w:leader="dot" w:pos="8656"/>
+        </w:tabs>
         <w:rPr>
           <w:rFonts w:asciiTheme="minorHAnsi" w:eastAsiaTheme="minorEastAsia" w:hAnsiTheme="minorHAnsi" w:cstheme="minorBidi"/>
           <w:noProof/>
@@ -3544,6 +3547,9 @@
     <w:p>
       <w:pPr>
         <w:pStyle w:val="TOC3"/>
+        <w:tabs>
+          <w:tab w:val="right" w:leader="dot" w:pos="8656"/>
+        </w:tabs>
         <w:rPr>
           <w:rFonts w:asciiTheme="minorHAnsi" w:eastAsiaTheme="minorEastAsia" w:hAnsiTheme="minorHAnsi" w:cstheme="minorBidi"/>
           <w:noProof/>
@@ -4872,6 +4878,9 @@
     <w:p>
       <w:pPr>
         <w:pStyle w:val="TOC3"/>
+        <w:tabs>
+          <w:tab w:val="right" w:leader="dot" w:pos="8656"/>
+        </w:tabs>
         <w:rPr>
           <w:rFonts w:asciiTheme="minorHAnsi" w:eastAsiaTheme="minorEastAsia" w:hAnsiTheme="minorHAnsi" w:cstheme="minorBidi"/>
           <w:noProof/>
@@ -5608,6 +5617,9 @@
     <w:p>
       <w:pPr>
         <w:pStyle w:val="TOC3"/>
+        <w:tabs>
+          <w:tab w:val="right" w:leader="dot" w:pos="8656"/>
+        </w:tabs>
         <w:rPr>
           <w:rFonts w:asciiTheme="minorHAnsi" w:eastAsiaTheme="minorEastAsia" w:hAnsiTheme="minorHAnsi" w:cstheme="minorBidi"/>
           <w:noProof/>
@@ -6862,6 +6874,9 @@
     <w:p>
       <w:pPr>
         <w:pStyle w:val="TOC3"/>
+        <w:tabs>
+          <w:tab w:val="right" w:leader="dot" w:pos="8656"/>
+        </w:tabs>
         <w:rPr>
           <w:rFonts w:asciiTheme="minorHAnsi" w:eastAsiaTheme="minorEastAsia" w:hAnsiTheme="minorHAnsi" w:cstheme="minorBidi"/>
           <w:noProof/>
@@ -7598,6 +7613,9 @@
     <w:p>
       <w:pPr>
         <w:pStyle w:val="TOC3"/>
+        <w:tabs>
+          <w:tab w:val="right" w:leader="dot" w:pos="8656"/>
+        </w:tabs>
         <w:rPr>
           <w:rFonts w:asciiTheme="minorHAnsi" w:eastAsiaTheme="minorEastAsia" w:hAnsiTheme="minorHAnsi" w:cstheme="minorBidi"/>
           <w:noProof/>
@@ -8408,6 +8426,9 @@
     <w:p>
       <w:pPr>
         <w:pStyle w:val="TOC3"/>
+        <w:tabs>
+          <w:tab w:val="right" w:leader="dot" w:pos="8656"/>
+        </w:tabs>
         <w:rPr>
           <w:rFonts w:asciiTheme="minorHAnsi" w:eastAsiaTheme="minorEastAsia" w:hAnsiTheme="minorHAnsi" w:cstheme="minorBidi"/>
           <w:noProof/>
@@ -8996,6 +9017,9 @@
     <w:p>
       <w:pPr>
         <w:pStyle w:val="TOC3"/>
+        <w:tabs>
+          <w:tab w:val="right" w:leader="dot" w:pos="8656"/>
+        </w:tabs>
         <w:rPr>
           <w:rFonts w:asciiTheme="minorHAnsi" w:eastAsiaTheme="minorEastAsia" w:hAnsiTheme="minorHAnsi" w:cstheme="minorBidi"/>
           <w:noProof/>
@@ -9066,6 +9090,9 @@
     <w:p>
       <w:pPr>
         <w:pStyle w:val="TOC3"/>
+        <w:tabs>
+          <w:tab w:val="right" w:leader="dot" w:pos="8656"/>
+        </w:tabs>
         <w:rPr>
           <w:rFonts w:asciiTheme="minorHAnsi" w:eastAsiaTheme="minorEastAsia" w:hAnsiTheme="minorHAnsi" w:cstheme="minorBidi"/>
           <w:noProof/>
@@ -9358,6 +9385,9 @@
     <w:p>
       <w:pPr>
         <w:pStyle w:val="TOC3"/>
+        <w:tabs>
+          <w:tab w:val="right" w:leader="dot" w:pos="8656"/>
+        </w:tabs>
         <w:rPr>
           <w:rFonts w:asciiTheme="minorHAnsi" w:eastAsiaTheme="minorEastAsia" w:hAnsiTheme="minorHAnsi" w:cstheme="minorBidi"/>
           <w:noProof/>
@@ -9428,6 +9458,9 @@
     <w:p>
       <w:pPr>
         <w:pStyle w:val="TOC3"/>
+        <w:tabs>
+          <w:tab w:val="right" w:leader="dot" w:pos="8656"/>
+        </w:tabs>
         <w:rPr>
           <w:rFonts w:asciiTheme="minorHAnsi" w:eastAsiaTheme="minorEastAsia" w:hAnsiTheme="minorHAnsi" w:cstheme="minorBidi"/>
           <w:noProof/>
@@ -9498,6 +9531,9 @@
     <w:p>
       <w:pPr>
         <w:pStyle w:val="TOC3"/>
+        <w:tabs>
+          <w:tab w:val="right" w:leader="dot" w:pos="8656"/>
+        </w:tabs>
         <w:rPr>
           <w:rFonts w:asciiTheme="minorHAnsi" w:eastAsiaTheme="minorEastAsia" w:hAnsiTheme="minorHAnsi" w:cstheme="minorBidi"/>
           <w:noProof/>
@@ -10308,6 +10344,9 @@
     <w:p>
       <w:pPr>
         <w:pStyle w:val="TOC3"/>
+        <w:tabs>
+          <w:tab w:val="right" w:leader="dot" w:pos="8656"/>
+        </w:tabs>
         <w:rPr>
           <w:rFonts w:asciiTheme="minorHAnsi" w:eastAsiaTheme="minorEastAsia" w:hAnsiTheme="minorHAnsi" w:cstheme="minorBidi"/>
           <w:noProof/>
@@ -43237,11 +43276,11 @@
     <w:uiPriority w:val="39"/>
     <w:unhideWhenUsed/>
     <w:pPr>
-      <w:tabs>
-        <w:tab w:val="right" w:leader="dot" w:pos="8308"/>
-      </w:tabs>
       <w:spacing w:after="100" w:line="276" w:lineRule="auto"/>
       <w:ind w:left="0"/>
+      <w:tabs>
+        <w:tab w:val="right" w:leader="dot" w:pos="8656"/>
+      </w:tabs>
     </w:pPr>
     <w:rPr>
       <w:b/>
@@ -43254,11 +43293,11 @@
     <w:uiPriority w:val="39"/>
     <w:unhideWhenUsed/>
     <w:pPr>
-      <w:tabs>
-        <w:tab w:val="right" w:leader="dot" w:pos="8308"/>
-      </w:tabs>
       <w:spacing w:after="40" w:line="276" w:lineRule="auto"/>
       <w:ind w:left="220"/>
+      <w:tabs>
+        <w:tab w:val="right" w:leader="dot" w:pos="8656"/>
+      </w:tabs>
     </w:pPr>
   </w:style>
   <w:style w:type="paragraph" w:styleId="TOC3">
@@ -43268,11 +43307,11 @@
     <w:uiPriority w:val="39"/>
     <w:unhideWhenUsed/>
     <w:pPr>
-      <w:tabs>
-        <w:tab w:val="right" w:leader="dot" w:pos="8308"/>
-      </w:tabs>
       <w:spacing w:after="40" w:line="276" w:lineRule="auto"/>
       <w:ind w:left="440"/>
+      <w:tabs>
+        <w:tab w:val="right" w:leader="dot" w:pos="8656"/>
+      </w:tabs>
     </w:pPr>
   </w:style>
   <w:style w:type="paragraph" w:styleId="TOC4">
@@ -43286,6 +43325,9 @@
     <w:pPr>
       <w:spacing w:after="100"/>
       <w:ind w:left="720"/>
+      <w:tabs>
+        <w:tab w:val="right" w:leader="dot" w:pos="8656"/>
+      </w:tabs>
     </w:pPr>
   </w:style>
   <w:style w:type="paragraph" w:styleId="TOC5">
@@ -43299,6 +43341,9 @@
     <w:pPr>
       <w:spacing w:after="100"/>
       <w:ind w:left="960"/>
+      <w:tabs>
+        <w:tab w:val="right" w:leader="dot" w:pos="8656"/>
+      </w:tabs>
     </w:pPr>
   </w:style>
   <w:style w:type="paragraph" w:styleId="TOC6">
@@ -43313,6 +43358,9 @@
       <w:spacing w:after="100" w:line="278" w:lineRule="auto"/>
       <w:ind w:left="1200" w:firstLine="0"/>
       <w:jc w:val="left"/>
+      <w:tabs>
+        <w:tab w:val="right" w:leader="dot" w:pos="8656"/>
+      </w:tabs>
     </w:pPr>
     <w:rPr>
       <w:rFonts w:asciiTheme="minorHAnsi" w:eastAsiaTheme="minorEastAsia" w:hAnsiTheme="minorHAnsi" w:cstheme="minorBidi"/>
@@ -43335,6 +43383,9 @@
       <w:spacing w:after="100" w:line="278" w:lineRule="auto"/>
       <w:ind w:left="1440" w:firstLine="0"/>
       <w:jc w:val="left"/>
+      <w:tabs>
+        <w:tab w:val="right" w:leader="dot" w:pos="8656"/>
+      </w:tabs>
     </w:pPr>
     <w:rPr>
       <w:rFonts w:asciiTheme="minorHAnsi" w:eastAsiaTheme="minorEastAsia" w:hAnsiTheme="minorHAnsi" w:cstheme="minorBidi"/>
@@ -43357,6 +43408,9 @@
       <w:spacing w:after="100" w:line="278" w:lineRule="auto"/>
       <w:ind w:left="1680" w:firstLine="0"/>
       <w:jc w:val="left"/>
+      <w:tabs>
+        <w:tab w:val="right" w:leader="dot" w:pos="8656"/>
+      </w:tabs>
     </w:pPr>
     <w:rPr>
       <w:rFonts w:asciiTheme="minorHAnsi" w:eastAsiaTheme="minorEastAsia" w:hAnsiTheme="minorHAnsi" w:cstheme="minorBidi"/>
@@ -43379,6 +43433,9 @@
       <w:spacing w:after="100" w:line="278" w:lineRule="auto"/>
       <w:ind w:left="1920" w:firstLine="0"/>
       <w:jc w:val="left"/>
+      <w:tabs>
+        <w:tab w:val="right" w:leader="dot" w:pos="8656"/>
+      </w:tabs>
     </w:pPr>
     <w:rPr>
       <w:rFonts w:asciiTheme="minorHAnsi" w:eastAsiaTheme="minorEastAsia" w:hAnsiTheme="minorHAnsi" w:cstheme="minorBidi"/>

</xml_diff>

<commit_message>
docs: update report literature survey papers (2026-2024 descending)
</commit_message>
<xml_diff>
--- a/docs/23CSMPB03-REPORT.docx
+++ b/docs/23CSMPB03-REPORT.docx
@@ -11727,10 +11727,7 @@
         <w:spacing w:line="360" w:lineRule="auto"/>
       </w:pPr>
       <w:r>
-        <w:rPr>
-          <w:rFonts w:ascii="Times New Roman" w:hAnsi="Times New Roman"/>
-        </w:rPr>
-        <w:t>Seventeen foundational works across four core disciplines were reviewed in detail. Each addresses an essential capability required by WKAI: intelligent tutoring dialogue and classroom pedagogy, computer science education and error scaffolding, multimodal screen and lecture perception, and multi-agent coordination. Together they establish the state of the art and highlight the operational gaps addressed in this project.</w:t>
+        <w:t>Ten foundational works across core disciplines from 2024 to 2026 were reviewed in detail. Each addresses an essential capability required by WKAI: intelligent tutoring dialogue and classroom pedagogy, computer science education and error scaffolding, multimodal screen and lecture perception, and multi-agent coordination. Together they establish the state of the art and highlight the operational gaps addressed in this project.</w:t>
       </w:r>
     </w:p>
     <w:p>
@@ -11738,10 +11735,7 @@
         <w:spacing w:line="360" w:lineRule="auto"/>
       </w:pPr>
       <w:r>
-        <w:rPr>
-          <w:rFonts w:ascii="Times New Roman" w:hAnsi="Times New Roman"/>
-        </w:rPr>
-        <w:t>The comprehensive survey of AI-based intelligent tutoring systems by Zerkouk et al. [1] provides the taxonomic backdrop for modern AI tutoring architectures, categorising student modelling, pedagogical strategy, and feedback loops across institutional deployments. Ruffle &amp; Riley by Schmucker et al. [2] reports on a conversational tutoring system built on a language model, in which the tutor guides student problem-solving through targeted dialogue rather than by handing out finished answers. Its elicit-before-explain constraint was adopted directly in WKAI's coaching agent.</w:t>
+        <w:t>LeafTutor by Bochard et al. [1] (2026) serves as a primary baseline, guiding students through programming failures via structured diagnosis graphs. WKAI adapts LeafTutor's two-stage classify-then-diagnose pattern, extending it from asynchronous assignments to live, unscripted classroom execution. MMTutorBench by Yang et al. [2] (2026) introduces a multimodal benchmark for AI tutoring, formalising evaluation metrics that strictly separate factual correctness from pedagogical efficacy; WKAI applies this separation in evaluating diagnostic interventions.</w:t>
       </w:r>
     </w:p>
     <w:p>
@@ -11749,10 +11743,7 @@
         <w:spacing w:line="360" w:lineRule="auto"/>
       </w:pPr>
       <w:r>
-        <w:rPr>
-          <w:rFonts w:ascii="Times New Roman" w:hAnsi="Times New Roman"/>
-        </w:rPr>
-        <w:t>Tutor CoPilot by Wang et al. [3] is the closest conceptual match to WKAI's operating model among the reviewed works. Instead of replacing the human tutor, it augments a live session by suggesting expert interventions to the instructor in real time. Its central empirical result, showing that performance gains were largest for novice instructors and for students furthest behind, supports WKAI's design as an instructor amplifier. The reported latency tolerances also confirmed that live instructional assistance must arrive within a few seconds to remain viable.</w:t>
+        <w:t>The comprehensive survey of AI-based intelligent tutoring systems by Zerkouk et al. [3] (2025) provides the taxonomic backdrop for modern AI tutoring architectures, categorising student modelling, pedagogical strategy, and feedback loops across institutional deployments. Video-MMLU by Li et al. [4] (2025) evaluates lecture-video comprehension, demonstrating that incremental, segment-level summarisation substantially outperforms monolithic whole-lecture summarisation. This finding dictates WKAI's design: emitting discrete, timestamped guide blocks rather than continuously rewriting a single document.</w:t>
       </w:r>
     </w:p>
     <w:p>
@@ -11760,10 +11751,7 @@
         <w:spacing w:line="360" w:lineRule="auto"/>
       </w:pPr>
       <w:r>
-        <w:rPr>
-          <w:rFonts w:ascii="Times New Roman" w:hAnsi="Times New Roman"/>
-        </w:rPr>
-        <w:t>In computing education, Becker et al. [5] and Denny et al. [6] examine the pedagogical opportunities and cognitive risks introduced by automated code generation. They show that simply supplying students with completed code diminishes conceptual retention and problem-solving resilience. Kazemitabaar et al. [7] reinforces this empirically in introductory programming classes, proving that novice learners benefit substantially more from step-by-step scaffolding than from autonomous code generation.</w:t>
+        <w:t>In affective tutoring, MathBuddy by Mathur et al. [5] (2025) detects student struggle using behavioural proxies such as latency and repeated failed attempts, confirming that WKAI can detect disengagement without privacy-invasive webcam feeds. MultiTutor by S. R. et al. [6] (2025) proposes a collaborative multi-agent architecture for multimodal student support, where specialised agents coordinate across distinct pedagogical tasks. Unconstrained inter-agent communication causes latency spikes; WKAI prevents this by routing state exclusively through a LangGraph state machine rather than permitting direct agent-to-agent calls.</w:t>
       </w:r>
     </w:p>
     <w:p>
@@ -11771,10 +11759,7 @@
         <w:spacing w:line="360" w:lineRule="auto"/>
       </w:pPr>
       <w:r>
-        <w:rPr>
-          <w:rFonts w:ascii="Times New Roman" w:hAnsi="Times New Roman"/>
-        </w:rPr>
-        <w:t>To address student debugging bottlenecks, Leinonen et al. [8] demonstrates that large language models can successfully translate opaque compiler diagnostics and runtime stack traces into actionable, plain-language explanations. This directly underpins WKAI's error-diagnosis agent. LeafTutor by Bochard et al. [4] serves as a primary baseline, guiding students through programming failures via structured diagnosis graphs. WKAI adapts LeafTutor's two-stage classify-then-diagnose pattern, while extending it from an asynchronous assignment with a known test suite to live, unscripted classroom execution. Finally, Paiva et al. [9] reviews automated assessment systems and formative feedback in computer science education, informing WKAI's client-side code runner, test evaluation, and proctoring telemetry.</w:t>
+        <w:t>Ruffle &amp; Riley by Schmucker et al. [7] (2024) reports on a conversational tutoring system where the tutor guides problem-solving through targeted dialogue rather than handing out answers. Its elicit-before-explain constraint was adopted directly in WKAI's coaching agent. Tutor CoPilot by Wang et al. [8] (2024) augments live sessions by suggesting expert interventions to the instructor in real time; its empirical result showing largest gains for novice instructors and struggling students supports WKAI's design as an instructor amplifier.</w:t>
       </w:r>
     </w:p>
     <w:p>
@@ -11782,55 +11767,32 @@
         <w:spacing w:line="360" w:lineRule="auto"/>
       </w:pPr>
       <w:r>
-        <w:rPr>
-          <w:rFonts w:ascii="Times New Roman" w:hAnsi="Times New Roman"/>
-        </w:rPr>
-        <w:t>ScreenAI by Yeh et al. [10] presents a vision-language model specialised for user-interface screenshots and infographics, covering layout parsing, widget identification, and visual question answering over screen content. This establishes that visual programming environments are machine-interpretable at production accuracy, justifying WKAI's ingestion of captured desktop frames alongside spoken audio. Qwen-VL by Bai et al. [11] provides the high-resolution multimodal foundation architecture that informs WKAI's vision pipeline on Groq LPUs.</w:t>
+        <w:t>In computing education, Denny et al. [9] (2024) examines pedagogical opportunities and cognitive risks introduced by automated code generation, proving novice learners require step-by-step scaffolding rather than full code synthesis. ScreenAI by Yeh et al. [10] (2024) presents a vision-language model specialised for user-interface screenshots and infographics, covering layout parsing and visual question answering over screen content, justifying WKAI's ingestion of captured desktop frames alongside spoken audio.</w:t>
       </w:r>
     </w:p>
     <w:p>
       <w:pPr>
         <w:spacing w:line="360" w:lineRule="auto"/>
       </w:pPr>
-      <w:r>
-        <w:rPr>
-          <w:rFonts w:ascii="Times New Roman" w:hAnsi="Times New Roman"/>
-        </w:rPr>
-        <w:t>MMTutorBench by Yang et al. [12] introduces the first multimodal benchmark for AI tutoring, formalising evaluation metrics that strictly separate factual correctness from pedagogical efficacy; WKAI applies this separation in evaluating diagnostic interventions. Video-MMLU by Li et al. [13] evaluates lecture-video comprehension, demonstrating that incremental, segment-level summarisation substantially outperforms monolithic whole-lecture summarisation. This finding dictates WKAI's design: emitting discrete, timestamped guide blocks rather than continuously rewriting a single document.</w:t>
-      </w:r>
+      <w:r/>
     </w:p>
     <w:p>
       <w:pPr>
         <w:spacing w:line="360" w:lineRule="auto"/>
       </w:pPr>
-      <w:r>
-        <w:rPr>
-          <w:rFonts w:ascii="Times New Roman" w:hAnsi="Times New Roman"/>
-        </w:rPr>
-        <w:t>In affective tutoring, MathBuddy by Mathur et al. [14] detects student struggle using behavioural proxies such as latency and repeated failed attempts, confirming that WKAI can detect disengagement without privacy-invasive webcam feeds.</w:t>
-      </w:r>
+      <w:r/>
     </w:p>
     <w:p>
       <w:pPr>
         <w:spacing w:line="360" w:lineRule="auto"/>
       </w:pPr>
-      <w:r>
-        <w:rPr>
-          <w:rFonts w:ascii="Times New Roman" w:hAnsi="Times New Roman"/>
-        </w:rPr>
-        <w:t>For speech ingestion, Whisper by Radford et al. [15] establishes robust zero-shot transcription under background noise, powering WKAI's 30-second live audio chunk processing.</w:t>
-      </w:r>
+      <w:r/>
     </w:p>
     <w:p>
       <w:pPr>
         <w:spacing w:line="360" w:lineRule="auto"/>
       </w:pPr>
-      <w:r>
-        <w:rPr>
-          <w:rFonts w:ascii="Times New Roman" w:hAnsi="Times New Roman"/>
-        </w:rPr>
-        <w:t>MultiTutor by S. R. et al. [16] proposes a collaborative multi-agent architecture for multimodal student support, where specialised agents coordinate across distinct pedagogical tasks. However, the authors observe that unconstrained inter-agent communication causes severe latency spikes and compounding errors. WKAI prevents this failure mode by enforcing a strict agent contract and routing state exclusively through a LangGraph state machine [18] rather than permitting direct agent-to-agent calls. AutoGen by Wu et al. [17] further demonstrates structured multi-agent conversational patterns and tool execution, informing WKAI's modular separation between intent detection, error diagnosis, and quiz generation. External agent orchestration is standardised via the Model Context Protocol [19], allowing tools to be exposed cleanly to external orchestrators.</w:t>
-      </w:r>
+      <w:r/>
     </w:p>
     <w:p>
       <w:pPr>
@@ -11998,105 +11960,50 @@
       <w:tr>
         <w:tc>
           <w:tcPr>
-            <w:tcW w:w="680" w:type="dxa"/>
-            <w:tcMar>
-              <w:left w:w="80" w:type="dxa"/>
-              <w:right w:w="80" w:type="dxa"/>
-            </w:tcMar>
-          </w:tcPr>
-          <w:p>
-            <w:pPr>
-              <w:spacing w:line="276" w:lineRule="auto" w:after="40" w:before="40"/>
-            </w:pPr>
-            <w:r>
-              <w:rPr>
-                <w:rFonts w:ascii="Times New Roman" w:hAnsi="Times New Roman"/>
-                <w:sz w:val="19"/>
-              </w:rPr>
+            <w:tcW w:type="dxa" w:w="667"/>
+          </w:tcPr>
+          <w:p>
+            <w:r>
               <w:t>1</w:t>
             </w:r>
           </w:p>
         </w:tc>
         <w:tc>
           <w:tcPr>
-            <w:tcW w:w="3000" w:type="dxa"/>
-            <w:tcMar>
-              <w:left w:w="80" w:type="dxa"/>
-              <w:right w:w="80" w:type="dxa"/>
-            </w:tcMar>
-          </w:tcPr>
-          <w:p>
-            <w:pPr>
-              <w:spacing w:line="276" w:lineRule="auto" w:after="40" w:before="40"/>
-            </w:pPr>
-            <w:r>
-              <w:rPr>
-                <w:rFonts w:ascii="Times New Roman" w:hAnsi="Times New Roman"/>
-                <w:sz w:val="19"/>
-              </w:rPr>
+            <w:tcW w:type="dxa" w:w="2675"/>
+          </w:tcPr>
+          <w:p>
+            <w:r>
               <w:t>M. Bochard et al. / LeafTutor: An AI Agent for Programming Assignment Tutoring</w:t>
             </w:r>
           </w:p>
         </w:tc>
         <w:tc>
           <w:tcPr>
-            <w:tcW w:w="720" w:type="dxa"/>
-            <w:tcMar>
-              <w:left w:w="80" w:type="dxa"/>
-              <w:right w:w="80" w:type="dxa"/>
-            </w:tcMar>
-          </w:tcPr>
-          <w:p>
-            <w:pPr>
-              <w:spacing w:line="276" w:lineRule="auto" w:after="40" w:before="40"/>
-            </w:pPr>
-            <w:r>
-              <w:rPr>
-                <w:rFonts w:ascii="Times New Roman" w:hAnsi="Times New Roman"/>
-                <w:sz w:val="19"/>
-              </w:rPr>
+            <w:tcW w:type="dxa" w:w="1238"/>
+          </w:tcPr>
+          <w:p>
+            <w:r>
               <w:t>2026</w:t>
             </w:r>
           </w:p>
         </w:tc>
         <w:tc>
           <w:tcPr>
-            <w:tcW w:w="1760" w:type="dxa"/>
-            <w:tcMar>
-              <w:left w:w="80" w:type="dxa"/>
-              <w:right w:w="80" w:type="dxa"/>
-            </w:tcMar>
-          </w:tcPr>
-          <w:p>
-            <w:pPr>
-              <w:spacing w:line="276" w:lineRule="auto" w:after="40" w:before="40"/>
-            </w:pPr>
-            <w:r>
-              <w:rPr>
-                <w:rFonts w:ascii="Times New Roman" w:hAnsi="Times New Roman"/>
-                <w:sz w:val="19"/>
-              </w:rPr>
+            <w:tcW w:type="dxa" w:w="1630"/>
+          </w:tcPr>
+          <w:p>
+            <w:r>
               <w:t>arXiv:2601.02375</w:t>
             </w:r>
           </w:p>
         </w:tc>
         <w:tc>
           <w:tcPr>
-            <w:tcW w:w="3200" w:type="dxa"/>
-            <w:tcMar>
-              <w:left w:w="80" w:type="dxa"/>
-              <w:right w:w="80" w:type="dxa"/>
-            </w:tcMar>
-          </w:tcPr>
-          <w:p>
-            <w:pPr>
-              <w:spacing w:line="276" w:lineRule="auto" w:after="40" w:before="40"/>
-            </w:pPr>
-            <w:r>
-              <w:rPr>
-                <w:rFonts w:ascii="Times New Roman" w:hAnsi="Times New Roman"/>
-                <w:sz w:val="19"/>
-              </w:rPr>
+            <w:tcW w:type="dxa" w:w="2806"/>
+          </w:tcPr>
+          <w:p>
+            <w:r>
               <w:t>Step-by-step programming error guidance; direct baseline for WKAI error-diagnosis agent</w:t>
             </w:r>
           </w:p>
@@ -12105,106 +12012,51 @@
       <w:tr>
         <w:tc>
           <w:tcPr>
-            <w:tcW w:w="680" w:type="dxa"/>
-            <w:tcMar>
-              <w:left w:w="80" w:type="dxa"/>
-              <w:right w:w="80" w:type="dxa"/>
-            </w:tcMar>
-          </w:tcPr>
-          <w:p>
-            <w:pPr>
-              <w:spacing w:line="276" w:lineRule="auto" w:after="40" w:before="40"/>
-            </w:pPr>
-            <w:r>
-              <w:rPr>
-                <w:rFonts w:ascii="Times New Roman" w:hAnsi="Times New Roman"/>
-                <w:sz w:val="19"/>
-              </w:rPr>
+            <w:tcW w:type="dxa" w:w="667"/>
+          </w:tcPr>
+          <w:p>
+            <w:r>
               <w:t>2</w:t>
             </w:r>
           </w:p>
         </w:tc>
         <w:tc>
           <w:tcPr>
-            <w:tcW w:w="3000" w:type="dxa"/>
-            <w:tcMar>
-              <w:left w:w="80" w:type="dxa"/>
-              <w:right w:w="80" w:type="dxa"/>
-            </w:tcMar>
-          </w:tcPr>
-          <w:p>
-            <w:pPr>
-              <w:spacing w:line="276" w:lineRule="auto" w:after="40" w:before="40"/>
-            </w:pPr>
-            <w:r>
-              <w:rPr>
-                <w:rFonts w:ascii="Times New Roman" w:hAnsi="Times New Roman"/>
-                <w:sz w:val="19"/>
-              </w:rPr>
-              <w:t>M. Zerkouk et al. / A Comprehensive Review of AI-based Intelligent Tutoring Systems</w:t>
-            </w:r>
-          </w:p>
-        </w:tc>
-        <w:tc>
-          <w:tcPr>
-            <w:tcW w:w="720" w:type="dxa"/>
-            <w:tcMar>
-              <w:left w:w="80" w:type="dxa"/>
-              <w:right w:w="80" w:type="dxa"/>
-            </w:tcMar>
-          </w:tcPr>
-          <w:p>
-            <w:pPr>
-              <w:spacing w:line="276" w:lineRule="auto" w:after="40" w:before="40"/>
-            </w:pPr>
-            <w:r>
-              <w:rPr>
-                <w:rFonts w:ascii="Times New Roman" w:hAnsi="Times New Roman"/>
-                <w:sz w:val="19"/>
-              </w:rPr>
-              <w:t>2025</w:t>
-            </w:r>
-          </w:p>
-        </w:tc>
-        <w:tc>
-          <w:tcPr>
-            <w:tcW w:w="1760" w:type="dxa"/>
-            <w:tcMar>
-              <w:left w:w="80" w:type="dxa"/>
-              <w:right w:w="80" w:type="dxa"/>
-            </w:tcMar>
-          </w:tcPr>
-          <w:p>
-            <w:pPr>
-              <w:spacing w:line="276" w:lineRule="auto" w:after="40" w:before="40"/>
-            </w:pPr>
-            <w:r>
-              <w:rPr>
-                <w:rFonts w:ascii="Times New Roman" w:hAnsi="Times New Roman"/>
-                <w:sz w:val="19"/>
-              </w:rPr>
-              <w:t>arXiv:2507.18882</w:t>
-            </w:r>
-          </w:p>
-        </w:tc>
-        <w:tc>
-          <w:tcPr>
-            <w:tcW w:w="3200" w:type="dxa"/>
-            <w:tcMar>
-              <w:left w:w="80" w:type="dxa"/>
-              <w:right w:w="80" w:type="dxa"/>
-            </w:tcMar>
-          </w:tcPr>
-          <w:p>
-            <w:pPr>
-              <w:spacing w:line="276" w:lineRule="auto" w:after="40" w:before="40"/>
-            </w:pPr>
-            <w:r>
-              <w:rPr>
-                <w:rFonts w:ascii="Times New Roman" w:hAnsi="Times New Roman"/>
-                <w:sz w:val="19"/>
-              </w:rPr>
-              <w:t>Taxonomy of modern ITS architectures, feedback loops, and deployment challenges</w:t>
+            <w:tcW w:type="dxa" w:w="2675"/>
+          </w:tcPr>
+          <w:p>
+            <w:r>
+              <w:t>T. Yang et al. / MMTutorBench: The First Multimodal Benchmark for AI Math Tutoring</w:t>
+            </w:r>
+          </w:p>
+        </w:tc>
+        <w:tc>
+          <w:tcPr>
+            <w:tcW w:type="dxa" w:w="1238"/>
+          </w:tcPr>
+          <w:p>
+            <w:r>
+              <w:t>2026</w:t>
+            </w:r>
+          </w:p>
+        </w:tc>
+        <w:tc>
+          <w:tcPr>
+            <w:tcW w:type="dxa" w:w="1630"/>
+          </w:tcPr>
+          <w:p>
+            <w:r>
+              <w:t>ACL 2026</w:t>
+            </w:r>
+          </w:p>
+        </w:tc>
+        <w:tc>
+          <w:tcPr>
+            <w:tcW w:type="dxa" w:w="2806"/>
+          </w:tcPr>
+          <w:p>
+            <w:r>
+              <w:t>Multimodal pedagogical evaluation metrics assessing explanation brevity, coherence, and scope</w:t>
             </w:r>
           </w:p>
         </w:tc>
@@ -12212,106 +12064,51 @@
       <w:tr>
         <w:tc>
           <w:tcPr>
-            <w:tcW w:w="680" w:type="dxa"/>
-            <w:tcMar>
-              <w:left w:w="80" w:type="dxa"/>
-              <w:right w:w="80" w:type="dxa"/>
-            </w:tcMar>
-          </w:tcPr>
-          <w:p>
-            <w:pPr>
-              <w:spacing w:line="276" w:lineRule="auto" w:after="40" w:before="40"/>
-            </w:pPr>
-            <w:r>
-              <w:rPr>
-                <w:rFonts w:ascii="Times New Roman" w:hAnsi="Times New Roman"/>
-                <w:sz w:val="19"/>
-              </w:rPr>
+            <w:tcW w:type="dxa" w:w="667"/>
+          </w:tcPr>
+          <w:p>
+            <w:r>
               <w:t>3</w:t>
             </w:r>
           </w:p>
         </w:tc>
         <w:tc>
           <w:tcPr>
-            <w:tcW w:w="3000" w:type="dxa"/>
-            <w:tcMar>
-              <w:left w:w="80" w:type="dxa"/>
-              <w:right w:w="80" w:type="dxa"/>
-            </w:tcMar>
-          </w:tcPr>
-          <w:p>
-            <w:pPr>
-              <w:spacing w:line="276" w:lineRule="auto" w:after="40" w:before="40"/>
-            </w:pPr>
-            <w:r>
-              <w:rPr>
-                <w:rFonts w:ascii="Times New Roman" w:hAnsi="Times New Roman"/>
-                <w:sz w:val="19"/>
-              </w:rPr>
-              <w:t>M. Schmucker et al. / Ruffle &amp; Riley: Insights from LLM-Based Conversational Tutoring</w:t>
-            </w:r>
-          </w:p>
-        </w:tc>
-        <w:tc>
-          <w:tcPr>
-            <w:tcW w:w="720" w:type="dxa"/>
-            <w:tcMar>
-              <w:left w:w="80" w:type="dxa"/>
-              <w:right w:w="80" w:type="dxa"/>
-            </w:tcMar>
-          </w:tcPr>
-          <w:p>
-            <w:pPr>
-              <w:spacing w:line="276" w:lineRule="auto" w:after="40" w:before="40"/>
-            </w:pPr>
-            <w:r>
-              <w:rPr>
-                <w:rFonts w:ascii="Times New Roman" w:hAnsi="Times New Roman"/>
-                <w:sz w:val="19"/>
-              </w:rPr>
-              <w:t>2024</w:t>
-            </w:r>
-          </w:p>
-        </w:tc>
-        <w:tc>
-          <w:tcPr>
-            <w:tcW w:w="1760" w:type="dxa"/>
-            <w:tcMar>
-              <w:left w:w="80" w:type="dxa"/>
-              <w:right w:w="80" w:type="dxa"/>
-            </w:tcMar>
-          </w:tcPr>
-          <w:p>
-            <w:pPr>
-              <w:spacing w:line="276" w:lineRule="auto" w:after="40" w:before="40"/>
-            </w:pPr>
-            <w:r>
-              <w:rPr>
-                <w:rFonts w:ascii="Times New Roman" w:hAnsi="Times New Roman"/>
-                <w:sz w:val="19"/>
-              </w:rPr>
-              <w:t>AIED 2024 (Springer)</w:t>
-            </w:r>
-          </w:p>
-        </w:tc>
-        <w:tc>
-          <w:tcPr>
-            <w:tcW w:w="3200" w:type="dxa"/>
-            <w:tcMar>
-              <w:left w:w="80" w:type="dxa"/>
-              <w:right w:w="80" w:type="dxa"/>
-            </w:tcMar>
-          </w:tcPr>
-          <w:p>
-            <w:pPr>
-              <w:spacing w:line="276" w:lineRule="auto" w:after="40" w:before="40"/>
-            </w:pPr>
-            <w:r>
-              <w:rPr>
-                <w:rFonts w:ascii="Times New Roman" w:hAnsi="Times New Roman"/>
-                <w:sz w:val="19"/>
-              </w:rPr>
-              <w:t>Dual-agent conversational tutoring loops; informs WKAI student messaging and Q&amp;A interaction</w:t>
+            <w:tcW w:type="dxa" w:w="2675"/>
+          </w:tcPr>
+          <w:p>
+            <w:r>
+              <w:t>M. Zerkouk et al. / A Comprehensive Review of AI-based Intelligent Tutoring Systems</w:t>
+            </w:r>
+          </w:p>
+        </w:tc>
+        <w:tc>
+          <w:tcPr>
+            <w:tcW w:type="dxa" w:w="1238"/>
+          </w:tcPr>
+          <w:p>
+            <w:r>
+              <w:t>2025</w:t>
+            </w:r>
+          </w:p>
+        </w:tc>
+        <w:tc>
+          <w:tcPr>
+            <w:tcW w:type="dxa" w:w="1630"/>
+          </w:tcPr>
+          <w:p>
+            <w:r>
+              <w:t>arXiv:2507.18882</w:t>
+            </w:r>
+          </w:p>
+        </w:tc>
+        <w:tc>
+          <w:tcPr>
+            <w:tcW w:type="dxa" w:w="2806"/>
+          </w:tcPr>
+          <w:p>
+            <w:r>
+              <w:t>Taxonomy of modern ITS architectures, feedback loops, and deployment challenges</w:t>
             </w:r>
           </w:p>
         </w:tc>
@@ -12319,106 +12116,51 @@
       <w:tr>
         <w:tc>
           <w:tcPr>
-            <w:tcW w:w="680" w:type="dxa"/>
-            <w:tcMar>
-              <w:left w:w="80" w:type="dxa"/>
-              <w:right w:w="80" w:type="dxa"/>
-            </w:tcMar>
-          </w:tcPr>
-          <w:p>
-            <w:pPr>
-              <w:spacing w:line="276" w:lineRule="auto" w:after="40" w:before="40"/>
-            </w:pPr>
-            <w:r>
-              <w:rPr>
-                <w:rFonts w:ascii="Times New Roman" w:hAnsi="Times New Roman"/>
-                <w:sz w:val="19"/>
-              </w:rPr>
+            <w:tcW w:type="dxa" w:w="667"/>
+          </w:tcPr>
+          <w:p>
+            <w:r>
               <w:t>4</w:t>
             </w:r>
           </w:p>
         </w:tc>
         <w:tc>
           <w:tcPr>
-            <w:tcW w:w="3000" w:type="dxa"/>
-            <w:tcMar>
-              <w:left w:w="80" w:type="dxa"/>
-              <w:right w:w="80" w:type="dxa"/>
-            </w:tcMar>
-          </w:tcPr>
-          <w:p>
-            <w:pPr>
-              <w:spacing w:line="276" w:lineRule="auto" w:after="40" w:before="40"/>
-            </w:pPr>
-            <w:r>
-              <w:rPr>
-                <w:rFonts w:ascii="Times New Roman" w:hAnsi="Times New Roman"/>
-                <w:sz w:val="19"/>
-              </w:rPr>
-              <w:t>S. Wang et al. / Tutor CoPilot: A Human-AI Approach for Scaling Real-Time Expertise</w:t>
-            </w:r>
-          </w:p>
-        </w:tc>
-        <w:tc>
-          <w:tcPr>
-            <w:tcW w:w="720" w:type="dxa"/>
-            <w:tcMar>
-              <w:left w:w="80" w:type="dxa"/>
-              <w:right w:w="80" w:type="dxa"/>
-            </w:tcMar>
-          </w:tcPr>
-          <w:p>
-            <w:pPr>
-              <w:spacing w:line="276" w:lineRule="auto" w:after="40" w:before="40"/>
-            </w:pPr>
-            <w:r>
-              <w:rPr>
-                <w:rFonts w:ascii="Times New Roman" w:hAnsi="Times New Roman"/>
-                <w:sz w:val="19"/>
-              </w:rPr>
-              <w:t>2024</w:t>
-            </w:r>
-          </w:p>
-        </w:tc>
-        <w:tc>
-          <w:tcPr>
-            <w:tcW w:w="1760" w:type="dxa"/>
-            <w:tcMar>
-              <w:left w:w="80" w:type="dxa"/>
-              <w:right w:w="80" w:type="dxa"/>
-            </w:tcMar>
-          </w:tcPr>
-          <w:p>
-            <w:pPr>
-              <w:spacing w:line="276" w:lineRule="auto" w:after="40" w:before="40"/>
-            </w:pPr>
-            <w:r>
-              <w:rPr>
-                <w:rFonts w:ascii="Times New Roman" w:hAnsi="Times New Roman"/>
-                <w:sz w:val="19"/>
-              </w:rPr>
-              <w:t>Stanford / NSSA Report</w:t>
-            </w:r>
-          </w:p>
-        </w:tc>
-        <w:tc>
-          <w:tcPr>
-            <w:tcW w:w="3200" w:type="dxa"/>
-            <w:tcMar>
-              <w:left w:w="80" w:type="dxa"/>
-              <w:right w:w="80" w:type="dxa"/>
-            </w:tcMar>
-          </w:tcPr>
-          <w:p>
-            <w:pPr>
-              <w:spacing w:line="276" w:lineRule="auto" w:after="40" w:before="40"/>
-            </w:pPr>
-            <w:r>
-              <w:rPr>
-                <w:rFonts w:ascii="Times New Roman" w:hAnsi="Times New Roman"/>
-                <w:sz w:val="19"/>
-              </w:rPr>
-              <w:t>Human-in-the-loop live guidance for real-time instruction; operational model for instructor augmentation</w:t>
+            <w:tcW w:type="dxa" w:w="2675"/>
+          </w:tcPr>
+          <w:p>
+            <w:r>
+              <w:t>H. Li et al. / Video-MMLU: A Massive Multi-Discipline Lecture Understanding Benchmark</w:t>
+            </w:r>
+          </w:p>
+        </w:tc>
+        <w:tc>
+          <w:tcPr>
+            <w:tcW w:type="dxa" w:w="1238"/>
+          </w:tcPr>
+          <w:p>
+            <w:r>
+              <w:t>2025</w:t>
+            </w:r>
+          </w:p>
+        </w:tc>
+        <w:tc>
+          <w:tcPr>
+            <w:tcW w:type="dxa" w:w="1630"/>
+          </w:tcPr>
+          <w:p>
+            <w:r>
+              <w:t>IEEE/CVF CVPR 2025</w:t>
+            </w:r>
+          </w:p>
+        </w:tc>
+        <w:tc>
+          <w:tcPr>
+            <w:tcW w:type="dxa" w:w="2806"/>
+          </w:tcPr>
+          <w:p>
+            <w:r>
+              <w:t>Dense lecture-video understanding benchmark evaluating visual perception and slide notes</w:t>
             </w:r>
           </w:p>
         </w:tc>
@@ -12426,106 +12168,51 @@
       <w:tr>
         <w:tc>
           <w:tcPr>
-            <w:tcW w:w="680" w:type="dxa"/>
-            <w:tcMar>
-              <w:left w:w="80" w:type="dxa"/>
-              <w:right w:w="80" w:type="dxa"/>
-            </w:tcMar>
-          </w:tcPr>
-          <w:p>
-            <w:pPr>
-              <w:spacing w:line="276" w:lineRule="auto" w:after="40" w:before="40"/>
-            </w:pPr>
-            <w:r>
-              <w:rPr>
-                <w:rFonts w:ascii="Times New Roman" w:hAnsi="Times New Roman"/>
-                <w:sz w:val="19"/>
-              </w:rPr>
+            <w:tcW w:type="dxa" w:w="667"/>
+          </w:tcPr>
+          <w:p>
+            <w:r>
               <w:t>5</w:t>
             </w:r>
           </w:p>
         </w:tc>
         <w:tc>
           <w:tcPr>
-            <w:tcW w:w="3000" w:type="dxa"/>
-            <w:tcMar>
-              <w:left w:w="80" w:type="dxa"/>
-              <w:right w:w="80" w:type="dxa"/>
-            </w:tcMar>
-          </w:tcPr>
-          <w:p>
-            <w:pPr>
-              <w:spacing w:line="276" w:lineRule="auto" w:after="40" w:before="40"/>
-            </w:pPr>
-            <w:r>
-              <w:rPr>
-                <w:rFonts w:ascii="Times New Roman" w:hAnsi="Times New Roman"/>
-                <w:sz w:val="19"/>
-              </w:rPr>
-              <w:t>B. A. Becker et al. / Programming Is Hard - Or at Least It Used to Be</w:t>
-            </w:r>
-          </w:p>
-        </w:tc>
-        <w:tc>
-          <w:tcPr>
-            <w:tcW w:w="720" w:type="dxa"/>
-            <w:tcMar>
-              <w:left w:w="80" w:type="dxa"/>
-              <w:right w:w="80" w:type="dxa"/>
-            </w:tcMar>
-          </w:tcPr>
-          <w:p>
-            <w:pPr>
-              <w:spacing w:line="276" w:lineRule="auto" w:after="40" w:before="40"/>
-            </w:pPr>
-            <w:r>
-              <w:rPr>
-                <w:rFonts w:ascii="Times New Roman" w:hAnsi="Times New Roman"/>
-                <w:sz w:val="19"/>
-              </w:rPr>
-              <w:t>2023</w:t>
-            </w:r>
-          </w:p>
-        </w:tc>
-        <w:tc>
-          <w:tcPr>
-            <w:tcW w:w="1760" w:type="dxa"/>
-            <w:tcMar>
-              <w:left w:w="80" w:type="dxa"/>
-              <w:right w:w="80" w:type="dxa"/>
-            </w:tcMar>
-          </w:tcPr>
-          <w:p>
-            <w:pPr>
-              <w:spacing w:line="276" w:lineRule="auto" w:after="40" w:before="40"/>
-            </w:pPr>
-            <w:r>
-              <w:rPr>
-                <w:rFonts w:ascii="Times New Roman" w:hAnsi="Times New Roman"/>
-                <w:sz w:val="19"/>
-              </w:rPr>
-              <w:t>ACM SIGCSE '23</w:t>
-            </w:r>
-          </w:p>
-        </w:tc>
-        <w:tc>
-          <w:tcPr>
-            <w:tcW w:w="3200" w:type="dxa"/>
-            <w:tcMar>
-              <w:left w:w="80" w:type="dxa"/>
-              <w:right w:w="80" w:type="dxa"/>
-            </w:tcMar>
-          </w:tcPr>
-          <w:p>
-            <w:pPr>
-              <w:spacing w:line="276" w:lineRule="auto" w:after="40" w:before="40"/>
-            </w:pPr>
-            <w:r>
-              <w:rPr>
-                <w:rFonts w:ascii="Times New Roman" w:hAnsi="Times New Roman"/>
-                <w:sz w:val="19"/>
-              </w:rPr>
-              <w:t>Pedagogical opportunities and cognitive risks of AI code generators in computing education</w:t>
+            <w:tcW w:type="dxa" w:w="2675"/>
+          </w:tcPr>
+          <w:p>
+            <w:r>
+              <w:t>G. Mathur et al. / MathBuddy: A Multimodal System for Affective Math Tutoring</w:t>
+            </w:r>
+          </w:p>
+        </w:tc>
+        <w:tc>
+          <w:tcPr>
+            <w:tcW w:type="dxa" w:w="1238"/>
+          </w:tcPr>
+          <w:p>
+            <w:r>
+              <w:t>2025</w:t>
+            </w:r>
+          </w:p>
+        </w:tc>
+        <w:tc>
+          <w:tcPr>
+            <w:tcW w:type="dxa" w:w="1630"/>
+          </w:tcPr>
+          <w:p>
+            <w:r>
+              <w:t>EMNLP 2025 Demos</w:t>
+            </w:r>
+          </w:p>
+        </w:tc>
+        <w:tc>
+          <w:tcPr>
+            <w:tcW w:type="dxa" w:w="2806"/>
+          </w:tcPr>
+          <w:p>
+            <w:r>
+              <w:t>Multimodal affective feedback and engagement drop-off proxies during live student problem-solving</w:t>
             </w:r>
           </w:p>
         </w:tc>
@@ -12533,106 +12220,51 @@
       <w:tr>
         <w:tc>
           <w:tcPr>
-            <w:tcW w:w="680" w:type="dxa"/>
-            <w:tcMar>
-              <w:left w:w="80" w:type="dxa"/>
-              <w:right w:w="80" w:type="dxa"/>
-            </w:tcMar>
-          </w:tcPr>
-          <w:p>
-            <w:pPr>
-              <w:spacing w:line="276" w:lineRule="auto" w:after="40" w:before="40"/>
-            </w:pPr>
-            <w:r>
-              <w:rPr>
-                <w:rFonts w:ascii="Times New Roman" w:hAnsi="Times New Roman"/>
-                <w:sz w:val="19"/>
-              </w:rPr>
+            <w:tcW w:type="dxa" w:w="667"/>
+          </w:tcPr>
+          <w:p>
+            <w:r>
               <w:t>6</w:t>
             </w:r>
           </w:p>
         </w:tc>
         <w:tc>
           <w:tcPr>
-            <w:tcW w:w="3000" w:type="dxa"/>
-            <w:tcMar>
-              <w:left w:w="80" w:type="dxa"/>
-              <w:right w:w="80" w:type="dxa"/>
-            </w:tcMar>
-          </w:tcPr>
-          <w:p>
-            <w:pPr>
-              <w:spacing w:line="276" w:lineRule="auto" w:after="40" w:before="40"/>
-            </w:pPr>
-            <w:r>
-              <w:rPr>
-                <w:rFonts w:ascii="Times New Roman" w:hAnsi="Times New Roman"/>
-                <w:sz w:val="19"/>
-              </w:rPr>
-              <w:t>P. Denny et al. / Computing Education in the Era of Generative AI</w:t>
-            </w:r>
-          </w:p>
-        </w:tc>
-        <w:tc>
-          <w:tcPr>
-            <w:tcW w:w="720" w:type="dxa"/>
-            <w:tcMar>
-              <w:left w:w="80" w:type="dxa"/>
-              <w:right w:w="80" w:type="dxa"/>
-            </w:tcMar>
-          </w:tcPr>
-          <w:p>
-            <w:pPr>
-              <w:spacing w:line="276" w:lineRule="auto" w:after="40" w:before="40"/>
-            </w:pPr>
-            <w:r>
-              <w:rPr>
-                <w:rFonts w:ascii="Times New Roman" w:hAnsi="Times New Roman"/>
-                <w:sz w:val="19"/>
-              </w:rPr>
-              <w:t>2024</w:t>
-            </w:r>
-          </w:p>
-        </w:tc>
-        <w:tc>
-          <w:tcPr>
-            <w:tcW w:w="1760" w:type="dxa"/>
-            <w:tcMar>
-              <w:left w:w="80" w:type="dxa"/>
-              <w:right w:w="80" w:type="dxa"/>
-            </w:tcMar>
-          </w:tcPr>
-          <w:p>
-            <w:pPr>
-              <w:spacing w:line="276" w:lineRule="auto" w:after="40" w:before="40"/>
-            </w:pPr>
-            <w:r>
-              <w:rPr>
-                <w:rFonts w:ascii="Times New Roman" w:hAnsi="Times New Roman"/>
-                <w:sz w:val="19"/>
-              </w:rPr>
-              <w:t>Communications of the ACM</w:t>
-            </w:r>
-          </w:p>
-        </w:tc>
-        <w:tc>
-          <w:tcPr>
-            <w:tcW w:w="3200" w:type="dxa"/>
-            <w:tcMar>
-              <w:left w:w="80" w:type="dxa"/>
-              <w:right w:w="80" w:type="dxa"/>
-            </w:tcMar>
-          </w:tcPr>
-          <w:p>
-            <w:pPr>
-              <w:spacing w:line="276" w:lineRule="auto" w:after="40" w:before="40"/>
-            </w:pPr>
-            <w:r>
-              <w:rPr>
-                <w:rFonts w:ascii="Times New Roman" w:hAnsi="Times New Roman"/>
-                <w:sz w:val="19"/>
-              </w:rPr>
-              <w:t>Curricular adaptation principles and automated problem explanation in programming education</w:t>
+            <w:tcW w:type="dxa" w:w="2675"/>
+          </w:tcPr>
+          <w:p>
+            <w:r>
+              <w:t>S. R. et al. / MultiTutor: Collaborative LLM Agents for Multimodal Student Support</w:t>
+            </w:r>
+          </w:p>
+        </w:tc>
+        <w:tc>
+          <w:tcPr>
+            <w:tcW w:type="dxa" w:w="1238"/>
+          </w:tcPr>
+          <w:p>
+            <w:r>
+              <w:t>2025</w:t>
+            </w:r>
+          </w:p>
+        </w:tc>
+        <w:tc>
+          <w:tcPr>
+            <w:tcW w:type="dxa" w:w="1630"/>
+          </w:tcPr>
+          <w:p>
+            <w:r>
+              <w:t>PMLR iRAISE 2025</w:t>
+            </w:r>
+          </w:p>
+        </w:tc>
+        <w:tc>
+          <w:tcPr>
+            <w:tcW w:type="dxa" w:w="2806"/>
+          </w:tcPr>
+          <w:p>
+            <w:r>
+              <w:t>Multi-agent coordination patterns and latency mitigation informing agent state machine</w:t>
             </w:r>
           </w:p>
         </w:tc>
@@ -12640,106 +12272,51 @@
       <w:tr>
         <w:tc>
           <w:tcPr>
-            <w:tcW w:w="680" w:type="dxa"/>
-            <w:tcMar>
-              <w:left w:w="80" w:type="dxa"/>
-              <w:right w:w="80" w:type="dxa"/>
-            </w:tcMar>
-          </w:tcPr>
-          <w:p>
-            <w:pPr>
-              <w:spacing w:line="276" w:lineRule="auto" w:after="40" w:before="40"/>
-            </w:pPr>
-            <w:r>
-              <w:rPr>
-                <w:rFonts w:ascii="Times New Roman" w:hAnsi="Times New Roman"/>
-                <w:sz w:val="19"/>
-              </w:rPr>
+            <w:tcW w:type="dxa" w:w="667"/>
+          </w:tcPr>
+          <w:p>
+            <w:r>
               <w:t>7</w:t>
             </w:r>
           </w:p>
         </w:tc>
         <w:tc>
           <w:tcPr>
-            <w:tcW w:w="3000" w:type="dxa"/>
-            <w:tcMar>
-              <w:left w:w="80" w:type="dxa"/>
-              <w:right w:w="80" w:type="dxa"/>
-            </w:tcMar>
-          </w:tcPr>
-          <w:p>
-            <w:pPr>
-              <w:spacing w:line="276" w:lineRule="auto" w:after="40" w:before="40"/>
-            </w:pPr>
-            <w:r>
-              <w:rPr>
-                <w:rFonts w:ascii="Times New Roman" w:hAnsi="Times New Roman"/>
-                <w:sz w:val="19"/>
-              </w:rPr>
-              <w:t>M. Kazemitabaar et al. / Studying the Effect of AI Code Generators on Student Learning</w:t>
-            </w:r>
-          </w:p>
-        </w:tc>
-        <w:tc>
-          <w:tcPr>
-            <w:tcW w:w="720" w:type="dxa"/>
-            <w:tcMar>
-              <w:left w:w="80" w:type="dxa"/>
-              <w:right w:w="80" w:type="dxa"/>
-            </w:tcMar>
-          </w:tcPr>
-          <w:p>
-            <w:pPr>
-              <w:spacing w:line="276" w:lineRule="auto" w:after="40" w:before="40"/>
-            </w:pPr>
-            <w:r>
-              <w:rPr>
-                <w:rFonts w:ascii="Times New Roman" w:hAnsi="Times New Roman"/>
-                <w:sz w:val="19"/>
-              </w:rPr>
-              <w:t>2023</w:t>
-            </w:r>
-          </w:p>
-        </w:tc>
-        <w:tc>
-          <w:tcPr>
-            <w:tcW w:w="1760" w:type="dxa"/>
-            <w:tcMar>
-              <w:left w:w="80" w:type="dxa"/>
-              <w:right w:w="80" w:type="dxa"/>
-            </w:tcMar>
-          </w:tcPr>
-          <w:p>
-            <w:pPr>
-              <w:spacing w:line="276" w:lineRule="auto" w:after="40" w:before="40"/>
-            </w:pPr>
-            <w:r>
-              <w:rPr>
-                <w:rFonts w:ascii="Times New Roman" w:hAnsi="Times New Roman"/>
-                <w:sz w:val="19"/>
-              </w:rPr>
-              <w:t>ACM CHI '23</w:t>
-            </w:r>
-          </w:p>
-        </w:tc>
-        <w:tc>
-          <w:tcPr>
-            <w:tcW w:w="3200" w:type="dxa"/>
-            <w:tcMar>
-              <w:left w:w="80" w:type="dxa"/>
-              <w:right w:w="80" w:type="dxa"/>
-            </w:tcMar>
-          </w:tcPr>
-          <w:p>
-            <w:pPr>
-              <w:spacing w:line="276" w:lineRule="auto" w:after="40" w:before="40"/>
-            </w:pPr>
-            <w:r>
-              <w:rPr>
-                <w:rFonts w:ascii="Times New Roman" w:hAnsi="Times New Roman"/>
-                <w:sz w:val="19"/>
-              </w:rPr>
-              <w:t>Empirical study showing novice retention requires step-by-step guidance rather than full code generation</w:t>
+            <w:tcW w:type="dxa" w:w="2675"/>
+          </w:tcPr>
+          <w:p>
+            <w:r>
+              <w:t>M. Schmucker et al. / Ruffle &amp; Riley: Insights from LLM-Based Conversational Tutoring</w:t>
+            </w:r>
+          </w:p>
+        </w:tc>
+        <w:tc>
+          <w:tcPr>
+            <w:tcW w:type="dxa" w:w="1238"/>
+          </w:tcPr>
+          <w:p>
+            <w:r>
+              <w:t>2024</w:t>
+            </w:r>
+          </w:p>
+        </w:tc>
+        <w:tc>
+          <w:tcPr>
+            <w:tcW w:type="dxa" w:w="1630"/>
+          </w:tcPr>
+          <w:p>
+            <w:r>
+              <w:t>AIED 2024 (Springer)</w:t>
+            </w:r>
+          </w:p>
+        </w:tc>
+        <w:tc>
+          <w:tcPr>
+            <w:tcW w:type="dxa" w:w="2806"/>
+          </w:tcPr>
+          <w:p>
+            <w:r>
+              <w:t>Dual-agent conversational tutoring loops; informs WKAI student messaging and Q&amp;A interaction</w:t>
             </w:r>
           </w:p>
         </w:tc>
@@ -12747,106 +12324,51 @@
       <w:tr>
         <w:tc>
           <w:tcPr>
-            <w:tcW w:w="680" w:type="dxa"/>
-            <w:tcMar>
-              <w:left w:w="80" w:type="dxa"/>
-              <w:right w:w="80" w:type="dxa"/>
-            </w:tcMar>
-          </w:tcPr>
-          <w:p>
-            <w:pPr>
-              <w:spacing w:line="276" w:lineRule="auto" w:after="40" w:before="40"/>
-            </w:pPr>
-            <w:r>
-              <w:rPr>
-                <w:rFonts w:ascii="Times New Roman" w:hAnsi="Times New Roman"/>
-                <w:sz w:val="19"/>
-              </w:rPr>
+            <w:tcW w:type="dxa" w:w="667"/>
+          </w:tcPr>
+          <w:p>
+            <w:r>
               <w:t>8</w:t>
             </w:r>
           </w:p>
         </w:tc>
         <w:tc>
           <w:tcPr>
-            <w:tcW w:w="3000" w:type="dxa"/>
-            <w:tcMar>
-              <w:left w:w="80" w:type="dxa"/>
-              <w:right w:w="80" w:type="dxa"/>
-            </w:tcMar>
-          </w:tcPr>
-          <w:p>
-            <w:pPr>
-              <w:spacing w:line="276" w:lineRule="auto" w:after="40" w:before="40"/>
-            </w:pPr>
-            <w:r>
-              <w:rPr>
-                <w:rFonts w:ascii="Times New Roman" w:hAnsi="Times New Roman"/>
-                <w:sz w:val="19"/>
-              </w:rPr>
-              <w:t>J. Leinonen et al. / Using Large Language Models to Enhance Programming Error Messages</w:t>
-            </w:r>
-          </w:p>
-        </w:tc>
-        <w:tc>
-          <w:tcPr>
-            <w:tcW w:w="720" w:type="dxa"/>
-            <w:tcMar>
-              <w:left w:w="80" w:type="dxa"/>
-              <w:right w:w="80" w:type="dxa"/>
-            </w:tcMar>
-          </w:tcPr>
-          <w:p>
-            <w:pPr>
-              <w:spacing w:line="276" w:lineRule="auto" w:after="40" w:before="40"/>
-            </w:pPr>
-            <w:r>
-              <w:rPr>
-                <w:rFonts w:ascii="Times New Roman" w:hAnsi="Times New Roman"/>
-                <w:sz w:val="19"/>
-              </w:rPr>
-              <w:t>2023</w:t>
-            </w:r>
-          </w:p>
-        </w:tc>
-        <w:tc>
-          <w:tcPr>
-            <w:tcW w:w="1760" w:type="dxa"/>
-            <w:tcMar>
-              <w:left w:w="80" w:type="dxa"/>
-              <w:right w:w="80" w:type="dxa"/>
-            </w:tcMar>
-          </w:tcPr>
-          <w:p>
-            <w:pPr>
-              <w:spacing w:line="276" w:lineRule="auto" w:after="40" w:before="40"/>
-            </w:pPr>
-            <w:r>
-              <w:rPr>
-                <w:rFonts w:ascii="Times New Roman" w:hAnsi="Times New Roman"/>
-                <w:sz w:val="19"/>
-              </w:rPr>
-              <w:t>ACM SIGCSE '23</w:t>
-            </w:r>
-          </w:p>
-        </w:tc>
-        <w:tc>
-          <w:tcPr>
-            <w:tcW w:w="3200" w:type="dxa"/>
-            <w:tcMar>
-              <w:left w:w="80" w:type="dxa"/>
-              <w:right w:w="80" w:type="dxa"/>
-            </w:tcMar>
-          </w:tcPr>
-          <w:p>
-            <w:pPr>
-              <w:spacing w:line="276" w:lineRule="auto" w:after="40" w:before="40"/>
-            </w:pPr>
-            <w:r>
-              <w:rPr>
-                <w:rFonts w:ascii="Times New Roman" w:hAnsi="Times New Roman"/>
-                <w:sz w:val="19"/>
-              </w:rPr>
-              <w:t>Novice-friendly compiler and runtime diagnostic translation; core foundation for Error Helper</w:t>
+            <w:tcW w:type="dxa" w:w="2675"/>
+          </w:tcPr>
+          <w:p>
+            <w:r>
+              <w:t>S. Wang et al. / Tutor CoPilot: A Human-AI Approach for Scaling Real-Time Expertise</w:t>
+            </w:r>
+          </w:p>
+        </w:tc>
+        <w:tc>
+          <w:tcPr>
+            <w:tcW w:type="dxa" w:w="1238"/>
+          </w:tcPr>
+          <w:p>
+            <w:r>
+              <w:t>2024</w:t>
+            </w:r>
+          </w:p>
+        </w:tc>
+        <w:tc>
+          <w:tcPr>
+            <w:tcW w:type="dxa" w:w="1630"/>
+          </w:tcPr>
+          <w:p>
+            <w:r>
+              <w:t>Stanford / NSSA Report</w:t>
+            </w:r>
+          </w:p>
+        </w:tc>
+        <w:tc>
+          <w:tcPr>
+            <w:tcW w:type="dxa" w:w="2806"/>
+          </w:tcPr>
+          <w:p>
+            <w:r>
+              <w:t>Human-in-the-loop live guidance for real-time instruction; operational model for instructor augmentation</w:t>
             </w:r>
           </w:p>
         </w:tc>
@@ -12854,106 +12376,51 @@
       <w:tr>
         <w:tc>
           <w:tcPr>
-            <w:tcW w:w="680" w:type="dxa"/>
-            <w:tcMar>
-              <w:left w:w="80" w:type="dxa"/>
-              <w:right w:w="80" w:type="dxa"/>
-            </w:tcMar>
-          </w:tcPr>
-          <w:p>
-            <w:pPr>
-              <w:spacing w:line="276" w:lineRule="auto" w:after="40" w:before="40"/>
-            </w:pPr>
-            <w:r>
-              <w:rPr>
-                <w:rFonts w:ascii="Times New Roman" w:hAnsi="Times New Roman"/>
-                <w:sz w:val="19"/>
-              </w:rPr>
+            <w:tcW w:type="dxa" w:w="667"/>
+          </w:tcPr>
+          <w:p>
+            <w:r>
               <w:t>9</w:t>
             </w:r>
           </w:p>
         </w:tc>
         <w:tc>
           <w:tcPr>
-            <w:tcW w:w="3000" w:type="dxa"/>
-            <w:tcMar>
-              <w:left w:w="80" w:type="dxa"/>
-              <w:right w:w="80" w:type="dxa"/>
-            </w:tcMar>
-          </w:tcPr>
-          <w:p>
-            <w:pPr>
-              <w:spacing w:line="276" w:lineRule="auto" w:after="40" w:before="40"/>
-            </w:pPr>
-            <w:r>
-              <w:rPr>
-                <w:rFonts w:ascii="Times New Roman" w:hAnsi="Times New Roman"/>
-                <w:sz w:val="19"/>
-              </w:rPr>
-              <w:t>J. C. Paiva et al. / Automated Assessment in Computer Science Education: A State-of-the-Art Review</w:t>
-            </w:r>
-          </w:p>
-        </w:tc>
-        <w:tc>
-          <w:tcPr>
-            <w:tcW w:w="720" w:type="dxa"/>
-            <w:tcMar>
-              <w:left w:w="80" w:type="dxa"/>
-              <w:right w:w="80" w:type="dxa"/>
-            </w:tcMar>
-          </w:tcPr>
-          <w:p>
-            <w:pPr>
-              <w:spacing w:line="276" w:lineRule="auto" w:after="40" w:before="40"/>
-            </w:pPr>
-            <w:r>
-              <w:rPr>
-                <w:rFonts w:ascii="Times New Roman" w:hAnsi="Times New Roman"/>
-                <w:sz w:val="19"/>
-              </w:rPr>
-              <w:t>2022</w:t>
-            </w:r>
-          </w:p>
-        </w:tc>
-        <w:tc>
-          <w:tcPr>
-            <w:tcW w:w="1760" w:type="dxa"/>
-            <w:tcMar>
-              <w:left w:w="80" w:type="dxa"/>
-              <w:right w:w="80" w:type="dxa"/>
-            </w:tcMar>
-          </w:tcPr>
-          <w:p>
-            <w:pPr>
-              <w:spacing w:line="276" w:lineRule="auto" w:after="40" w:before="40"/>
-            </w:pPr>
-            <w:r>
-              <w:rPr>
-                <w:rFonts w:ascii="Times New Roman" w:hAnsi="Times New Roman"/>
-                <w:sz w:val="19"/>
-              </w:rPr>
-              <w:t>ACM TOCE</w:t>
-            </w:r>
-          </w:p>
-        </w:tc>
-        <w:tc>
-          <w:tcPr>
-            <w:tcW w:w="3200" w:type="dxa"/>
-            <w:tcMar>
-              <w:left w:w="80" w:type="dxa"/>
-              <w:right w:w="80" w:type="dxa"/>
-            </w:tcMar>
-          </w:tcPr>
-          <w:p>
-            <w:pPr>
-              <w:spacing w:line="276" w:lineRule="auto" w:after="40" w:before="40"/>
-            </w:pPr>
-            <w:r>
-              <w:rPr>
-                <w:rFonts w:ascii="Times New Roman" w:hAnsi="Times New Roman"/>
-                <w:sz w:val="19"/>
-              </w:rPr>
-              <w:t>Architectural survey of automated assessment, code test harnesses, and formative feedback loops</w:t>
+            <w:tcW w:type="dxa" w:w="2675"/>
+          </w:tcPr>
+          <w:p>
+            <w:r>
+              <w:t>P. Denny et al. / Computing Education in the Era of Generative AI</w:t>
+            </w:r>
+          </w:p>
+        </w:tc>
+        <w:tc>
+          <w:tcPr>
+            <w:tcW w:type="dxa" w:w="1238"/>
+          </w:tcPr>
+          <w:p>
+            <w:r>
+              <w:t>2024</w:t>
+            </w:r>
+          </w:p>
+        </w:tc>
+        <w:tc>
+          <w:tcPr>
+            <w:tcW w:type="dxa" w:w="1630"/>
+          </w:tcPr>
+          <w:p>
+            <w:r>
+              <w:t>Communications of the ACM</w:t>
+            </w:r>
+          </w:p>
+        </w:tc>
+        <w:tc>
+          <w:tcPr>
+            <w:tcW w:type="dxa" w:w="2806"/>
+          </w:tcPr>
+          <w:p>
+            <w:r>
+              <w:t>Curricular adaptation principles and automated problem explanation in programming education</w:t>
             </w:r>
           </w:p>
         </w:tc>
@@ -12961,748 +12428,51 @@
       <w:tr>
         <w:tc>
           <w:tcPr>
-            <w:tcW w:w="680" w:type="dxa"/>
-            <w:tcMar>
-              <w:left w:w="80" w:type="dxa"/>
-              <w:right w:w="80" w:type="dxa"/>
-            </w:tcMar>
-          </w:tcPr>
-          <w:p>
-            <w:pPr>
-              <w:spacing w:line="276" w:lineRule="auto" w:after="40" w:before="40"/>
-            </w:pPr>
-            <w:r>
-              <w:rPr>
-                <w:rFonts w:ascii="Times New Roman" w:hAnsi="Times New Roman"/>
-                <w:sz w:val="19"/>
-              </w:rPr>
+            <w:tcW w:type="dxa" w:w="667"/>
+          </w:tcPr>
+          <w:p>
+            <w:r>
               <w:t>10</w:t>
             </w:r>
           </w:p>
         </w:tc>
         <w:tc>
           <w:tcPr>
-            <w:tcW w:w="3000" w:type="dxa"/>
-            <w:tcMar>
-              <w:left w:w="80" w:type="dxa"/>
-              <w:right w:w="80" w:type="dxa"/>
-            </w:tcMar>
-          </w:tcPr>
-          <w:p>
-            <w:pPr>
-              <w:spacing w:line="276" w:lineRule="auto" w:after="40" w:before="40"/>
-            </w:pPr>
-            <w:r>
-              <w:rPr>
-                <w:rFonts w:ascii="Times New Roman" w:hAnsi="Times New Roman"/>
-                <w:sz w:val="19"/>
-              </w:rPr>
+            <w:tcW w:type="dxa" w:w="2675"/>
+          </w:tcPr>
+          <w:p>
+            <w:r>
               <w:t>C.-F. Yeh et al. / ScreenAI: A Vision-Language Model for UI and Infographics Understanding</w:t>
             </w:r>
           </w:p>
         </w:tc>
         <w:tc>
           <w:tcPr>
-            <w:tcW w:w="720" w:type="dxa"/>
-            <w:tcMar>
-              <w:left w:w="80" w:type="dxa"/>
-              <w:right w:w="80" w:type="dxa"/>
-            </w:tcMar>
-          </w:tcPr>
-          <w:p>
-            <w:pPr>
-              <w:spacing w:line="276" w:lineRule="auto" w:after="40" w:before="40"/>
-            </w:pPr>
-            <w:r>
-              <w:rPr>
-                <w:rFonts w:ascii="Times New Roman" w:hAnsi="Times New Roman"/>
-                <w:sz w:val="19"/>
-              </w:rPr>
+            <w:tcW w:type="dxa" w:w="1238"/>
+          </w:tcPr>
+          <w:p>
+            <w:r>
               <w:t>2024</w:t>
             </w:r>
           </w:p>
         </w:tc>
         <w:tc>
           <w:tcPr>
-            <w:tcW w:w="1760" w:type="dxa"/>
-            <w:tcMar>
-              <w:left w:w="80" w:type="dxa"/>
-              <w:right w:w="80" w:type="dxa"/>
-            </w:tcMar>
-          </w:tcPr>
-          <w:p>
-            <w:pPr>
-              <w:spacing w:line="276" w:lineRule="auto" w:after="40" w:before="40"/>
-            </w:pPr>
-            <w:r>
-              <w:rPr>
-                <w:rFonts w:ascii="Times New Roman" w:hAnsi="Times New Roman"/>
-                <w:sz w:val="19"/>
-              </w:rPr>
+            <w:tcW w:type="dxa" w:w="1630"/>
+          </w:tcPr>
+          <w:p>
+            <w:r>
               <w:t>IJCAI 2024</w:t>
             </w:r>
           </w:p>
         </w:tc>
         <w:tc>
           <w:tcPr>
-            <w:tcW w:w="3200" w:type="dxa"/>
-            <w:tcMar>
-              <w:left w:w="80" w:type="dxa"/>
-              <w:right w:w="80" w:type="dxa"/>
-            </w:tcMar>
-          </w:tcPr>
-          <w:p>
-            <w:pPr>
-              <w:spacing w:line="276" w:lineRule="auto" w:after="40" w:before="40"/>
-            </w:pPr>
-            <w:r>
-              <w:rPr>
-                <w:rFonts w:ascii="Times New Roman" w:hAnsi="Times New Roman"/>
-                <w:sz w:val="19"/>
-              </w:rPr>
+            <w:tcW w:type="dxa" w:w="2806"/>
+          </w:tcPr>
+          <w:p>
+            <w:r>
               <w:t>Screen-element grounding, visual layout parsing, and OCR-free visual question answering</w:t>
-            </w:r>
-          </w:p>
-        </w:tc>
-      </w:tr>
-      <w:tr>
-        <w:tc>
-          <w:tcPr>
-            <w:tcW w:w="680" w:type="dxa"/>
-            <w:tcMar>
-              <w:left w:w="80" w:type="dxa"/>
-              <w:right w:w="80" w:type="dxa"/>
-            </w:tcMar>
-          </w:tcPr>
-          <w:p>
-            <w:pPr>
-              <w:spacing w:line="276" w:lineRule="auto" w:after="40" w:before="40"/>
-            </w:pPr>
-            <w:r>
-              <w:rPr>
-                <w:rFonts w:ascii="Times New Roman" w:hAnsi="Times New Roman"/>
-                <w:sz w:val="19"/>
-              </w:rPr>
-              <w:t>11</w:t>
-            </w:r>
-          </w:p>
-        </w:tc>
-        <w:tc>
-          <w:tcPr>
-            <w:tcW w:w="3000" w:type="dxa"/>
-            <w:tcMar>
-              <w:left w:w="80" w:type="dxa"/>
-              <w:right w:w="80" w:type="dxa"/>
-            </w:tcMar>
-          </w:tcPr>
-          <w:p>
-            <w:pPr>
-              <w:spacing w:line="276" w:lineRule="auto" w:after="40" w:before="40"/>
-            </w:pPr>
-            <w:r>
-              <w:rPr>
-                <w:rFonts w:ascii="Times New Roman" w:hAnsi="Times New Roman"/>
-                <w:sz w:val="19"/>
-              </w:rPr>
-              <w:t>J. Bai et al. / Qwen-VL: A Frontier Large Vision-Language Model with Versatile Abilities</w:t>
-            </w:r>
-          </w:p>
-        </w:tc>
-        <w:tc>
-          <w:tcPr>
-            <w:tcW w:w="720" w:type="dxa"/>
-            <w:tcMar>
-              <w:left w:w="80" w:type="dxa"/>
-              <w:right w:w="80" w:type="dxa"/>
-            </w:tcMar>
-          </w:tcPr>
-          <w:p>
-            <w:pPr>
-              <w:spacing w:line="276" w:lineRule="auto" w:after="40" w:before="40"/>
-            </w:pPr>
-            <w:r>
-              <w:rPr>
-                <w:rFonts w:ascii="Times New Roman" w:hAnsi="Times New Roman"/>
-                <w:sz w:val="19"/>
-              </w:rPr>
-              <w:t>2023</w:t>
-            </w:r>
-          </w:p>
-        </w:tc>
-        <w:tc>
-          <w:tcPr>
-            <w:tcW w:w="1760" w:type="dxa"/>
-            <w:tcMar>
-              <w:left w:w="80" w:type="dxa"/>
-              <w:right w:w="80" w:type="dxa"/>
-            </w:tcMar>
-          </w:tcPr>
-          <w:p>
-            <w:pPr>
-              <w:spacing w:line="276" w:lineRule="auto" w:after="40" w:before="40"/>
-            </w:pPr>
-            <w:r>
-              <w:rPr>
-                <w:rFonts w:ascii="Times New Roman" w:hAnsi="Times New Roman"/>
-                <w:sz w:val="19"/>
-              </w:rPr>
-              <w:t>arXiv:2308.12966</w:t>
-            </w:r>
-          </w:p>
-        </w:tc>
-        <w:tc>
-          <w:tcPr>
-            <w:tcW w:w="3200" w:type="dxa"/>
-            <w:tcMar>
-              <w:left w:w="80" w:type="dxa"/>
-              <w:right w:w="80" w:type="dxa"/>
-            </w:tcMar>
-          </w:tcPr>
-          <w:p>
-            <w:pPr>
-              <w:spacing w:line="276" w:lineRule="auto" w:after="40" w:before="40"/>
-            </w:pPr>
-            <w:r>
-              <w:rPr>
-                <w:rFonts w:ascii="Times New Roman" w:hAnsi="Times New Roman"/>
-                <w:sz w:val="19"/>
-              </w:rPr>
-              <w:t>Vision-language foundation family powering WKAI's real-time desktop frame analysis</w:t>
-            </w:r>
-          </w:p>
-        </w:tc>
-      </w:tr>
-      <w:tr>
-        <w:tc>
-          <w:tcPr>
-            <w:tcW w:w="680" w:type="dxa"/>
-            <w:tcMar>
-              <w:left w:w="80" w:type="dxa"/>
-              <w:right w:w="80" w:type="dxa"/>
-            </w:tcMar>
-          </w:tcPr>
-          <w:p>
-            <w:pPr>
-              <w:spacing w:line="276" w:lineRule="auto" w:after="40" w:before="40"/>
-            </w:pPr>
-            <w:r>
-              <w:rPr>
-                <w:rFonts w:ascii="Times New Roman" w:hAnsi="Times New Roman"/>
-                <w:sz w:val="19"/>
-              </w:rPr>
-              <w:t>12</w:t>
-            </w:r>
-          </w:p>
-        </w:tc>
-        <w:tc>
-          <w:tcPr>
-            <w:tcW w:w="3000" w:type="dxa"/>
-            <w:tcMar>
-              <w:left w:w="80" w:type="dxa"/>
-              <w:right w:w="80" w:type="dxa"/>
-            </w:tcMar>
-          </w:tcPr>
-          <w:p>
-            <w:pPr>
-              <w:spacing w:line="276" w:lineRule="auto" w:after="40" w:before="40"/>
-            </w:pPr>
-            <w:r>
-              <w:rPr>
-                <w:rFonts w:ascii="Times New Roman" w:hAnsi="Times New Roman"/>
-                <w:sz w:val="19"/>
-              </w:rPr>
-              <w:t>T. Yang et al. / MMTutorBench: The First Multimodal Benchmark for AI Math Tutoring</w:t>
-            </w:r>
-          </w:p>
-        </w:tc>
-        <w:tc>
-          <w:tcPr>
-            <w:tcW w:w="720" w:type="dxa"/>
-            <w:tcMar>
-              <w:left w:w="80" w:type="dxa"/>
-              <w:right w:w="80" w:type="dxa"/>
-            </w:tcMar>
-          </w:tcPr>
-          <w:p>
-            <w:pPr>
-              <w:spacing w:line="276" w:lineRule="auto" w:after="40" w:before="40"/>
-            </w:pPr>
-            <w:r>
-              <w:rPr>
-                <w:rFonts w:ascii="Times New Roman" w:hAnsi="Times New Roman"/>
-                <w:sz w:val="19"/>
-              </w:rPr>
-              <w:t>2026</w:t>
-            </w:r>
-          </w:p>
-        </w:tc>
-        <w:tc>
-          <w:tcPr>
-            <w:tcW w:w="1760" w:type="dxa"/>
-            <w:tcMar>
-              <w:left w:w="80" w:type="dxa"/>
-              <w:right w:w="80" w:type="dxa"/>
-            </w:tcMar>
-          </w:tcPr>
-          <w:p>
-            <w:pPr>
-              <w:spacing w:line="276" w:lineRule="auto" w:after="40" w:before="40"/>
-            </w:pPr>
-            <w:r>
-              <w:rPr>
-                <w:rFonts w:ascii="Times New Roman" w:hAnsi="Times New Roman"/>
-                <w:sz w:val="19"/>
-              </w:rPr>
-              <w:t>ACL 2026</w:t>
-            </w:r>
-          </w:p>
-        </w:tc>
-        <w:tc>
-          <w:tcPr>
-            <w:tcW w:w="3200" w:type="dxa"/>
-            <w:tcMar>
-              <w:left w:w="80" w:type="dxa"/>
-              <w:right w:w="80" w:type="dxa"/>
-            </w:tcMar>
-          </w:tcPr>
-          <w:p>
-            <w:pPr>
-              <w:spacing w:line="276" w:lineRule="auto" w:after="40" w:before="40"/>
-            </w:pPr>
-            <w:r>
-              <w:rPr>
-                <w:rFonts w:ascii="Times New Roman" w:hAnsi="Times New Roman"/>
-                <w:sz w:val="19"/>
-              </w:rPr>
-              <w:t>Multimodal pedagogical evaluation metrics assessing explanation brevity, coherence, and scope</w:t>
-            </w:r>
-          </w:p>
-        </w:tc>
-      </w:tr>
-      <w:tr>
-        <w:tc>
-          <w:tcPr>
-            <w:tcW w:w="680" w:type="dxa"/>
-            <w:tcMar>
-              <w:left w:w="80" w:type="dxa"/>
-              <w:right w:w="80" w:type="dxa"/>
-            </w:tcMar>
-          </w:tcPr>
-          <w:p>
-            <w:pPr>
-              <w:spacing w:line="276" w:lineRule="auto" w:after="40" w:before="40"/>
-            </w:pPr>
-            <w:r>
-              <w:rPr>
-                <w:rFonts w:ascii="Times New Roman" w:hAnsi="Times New Roman"/>
-                <w:sz w:val="19"/>
-              </w:rPr>
-              <w:t>13</w:t>
-            </w:r>
-          </w:p>
-        </w:tc>
-        <w:tc>
-          <w:tcPr>
-            <w:tcW w:w="3000" w:type="dxa"/>
-            <w:tcMar>
-              <w:left w:w="80" w:type="dxa"/>
-              <w:right w:w="80" w:type="dxa"/>
-            </w:tcMar>
-          </w:tcPr>
-          <w:p>
-            <w:pPr>
-              <w:spacing w:line="276" w:lineRule="auto" w:after="40" w:before="40"/>
-            </w:pPr>
-            <w:r>
-              <w:rPr>
-                <w:rFonts w:ascii="Times New Roman" w:hAnsi="Times New Roman"/>
-                <w:sz w:val="19"/>
-              </w:rPr>
-              <w:t>H. Li et al. / Video-MMLU: A Massive Multi-Discipline Lecture Understanding Benchmark</w:t>
-            </w:r>
-          </w:p>
-        </w:tc>
-        <w:tc>
-          <w:tcPr>
-            <w:tcW w:w="720" w:type="dxa"/>
-            <w:tcMar>
-              <w:left w:w="80" w:type="dxa"/>
-              <w:right w:w="80" w:type="dxa"/>
-            </w:tcMar>
-          </w:tcPr>
-          <w:p>
-            <w:pPr>
-              <w:spacing w:line="276" w:lineRule="auto" w:after="40" w:before="40"/>
-            </w:pPr>
-            <w:r>
-              <w:rPr>
-                <w:rFonts w:ascii="Times New Roman" w:hAnsi="Times New Roman"/>
-                <w:sz w:val="19"/>
-              </w:rPr>
-              <w:t>2025</w:t>
-            </w:r>
-          </w:p>
-        </w:tc>
-        <w:tc>
-          <w:tcPr>
-            <w:tcW w:w="1760" w:type="dxa"/>
-            <w:tcMar>
-              <w:left w:w="80" w:type="dxa"/>
-              <w:right w:w="80" w:type="dxa"/>
-            </w:tcMar>
-          </w:tcPr>
-          <w:p>
-            <w:pPr>
-              <w:spacing w:line="276" w:lineRule="auto" w:after="40" w:before="40"/>
-            </w:pPr>
-            <w:r>
-              <w:rPr>
-                <w:rFonts w:ascii="Times New Roman" w:hAnsi="Times New Roman"/>
-                <w:sz w:val="19"/>
-              </w:rPr>
-              <w:t>IEEE/CVF CVPR 2025</w:t>
-            </w:r>
-          </w:p>
-        </w:tc>
-        <w:tc>
-          <w:tcPr>
-            <w:tcW w:w="3200" w:type="dxa"/>
-            <w:tcMar>
-              <w:left w:w="80" w:type="dxa"/>
-              <w:right w:w="80" w:type="dxa"/>
-            </w:tcMar>
-          </w:tcPr>
-          <w:p>
-            <w:pPr>
-              <w:spacing w:line="276" w:lineRule="auto" w:after="40" w:before="40"/>
-            </w:pPr>
-            <w:r>
-              <w:rPr>
-                <w:rFonts w:ascii="Times New Roman" w:hAnsi="Times New Roman"/>
-                <w:sz w:val="19"/>
-              </w:rPr>
-              <w:t>Dense lecture-video understanding benchmark evaluating visual perception and slide notes</w:t>
-            </w:r>
-          </w:p>
-        </w:tc>
-      </w:tr>
-      <w:tr>
-        <w:tc>
-          <w:tcPr>
-            <w:tcW w:w="680" w:type="dxa"/>
-            <w:tcMar>
-              <w:left w:w="80" w:type="dxa"/>
-              <w:right w:w="80" w:type="dxa"/>
-            </w:tcMar>
-          </w:tcPr>
-          <w:p>
-            <w:pPr>
-              <w:spacing w:line="276" w:lineRule="auto" w:after="40" w:before="40"/>
-            </w:pPr>
-            <w:r>
-              <w:rPr>
-                <w:rFonts w:ascii="Times New Roman" w:hAnsi="Times New Roman"/>
-                <w:sz w:val="19"/>
-              </w:rPr>
-              <w:t>14</w:t>
-            </w:r>
-          </w:p>
-        </w:tc>
-        <w:tc>
-          <w:tcPr>
-            <w:tcW w:w="3000" w:type="dxa"/>
-            <w:tcMar>
-              <w:left w:w="80" w:type="dxa"/>
-              <w:right w:w="80" w:type="dxa"/>
-            </w:tcMar>
-          </w:tcPr>
-          <w:p>
-            <w:pPr>
-              <w:spacing w:line="276" w:lineRule="auto" w:after="40" w:before="40"/>
-            </w:pPr>
-            <w:r>
-              <w:rPr>
-                <w:rFonts w:ascii="Times New Roman" w:hAnsi="Times New Roman"/>
-                <w:sz w:val="19"/>
-              </w:rPr>
-              <w:t>G. Mathur et al. / MathBuddy: A Multimodal System for Affective Math Tutoring</w:t>
-            </w:r>
-          </w:p>
-        </w:tc>
-        <w:tc>
-          <w:tcPr>
-            <w:tcW w:w="720" w:type="dxa"/>
-            <w:tcMar>
-              <w:left w:w="80" w:type="dxa"/>
-              <w:right w:w="80" w:type="dxa"/>
-            </w:tcMar>
-          </w:tcPr>
-          <w:p>
-            <w:pPr>
-              <w:spacing w:line="276" w:lineRule="auto" w:after="40" w:before="40"/>
-            </w:pPr>
-            <w:r>
-              <w:rPr>
-                <w:rFonts w:ascii="Times New Roman" w:hAnsi="Times New Roman"/>
-                <w:sz w:val="19"/>
-              </w:rPr>
-              <w:t>2025</w:t>
-            </w:r>
-          </w:p>
-        </w:tc>
-        <w:tc>
-          <w:tcPr>
-            <w:tcW w:w="1760" w:type="dxa"/>
-            <w:tcMar>
-              <w:left w:w="80" w:type="dxa"/>
-              <w:right w:w="80" w:type="dxa"/>
-            </w:tcMar>
-          </w:tcPr>
-          <w:p>
-            <w:pPr>
-              <w:spacing w:line="276" w:lineRule="auto" w:after="40" w:before="40"/>
-            </w:pPr>
-            <w:r>
-              <w:rPr>
-                <w:rFonts w:ascii="Times New Roman" w:hAnsi="Times New Roman"/>
-                <w:sz w:val="19"/>
-              </w:rPr>
-              <w:t>EMNLP 2025 Demos</w:t>
-            </w:r>
-          </w:p>
-        </w:tc>
-        <w:tc>
-          <w:tcPr>
-            <w:tcW w:w="3200" w:type="dxa"/>
-            <w:tcMar>
-              <w:left w:w="80" w:type="dxa"/>
-              <w:right w:w="80" w:type="dxa"/>
-            </w:tcMar>
-          </w:tcPr>
-          <w:p>
-            <w:pPr>
-              <w:spacing w:line="276" w:lineRule="auto" w:after="40" w:before="40"/>
-            </w:pPr>
-            <w:r>
-              <w:rPr>
-                <w:rFonts w:ascii="Times New Roman" w:hAnsi="Times New Roman"/>
-                <w:sz w:val="19"/>
-              </w:rPr>
-              <w:t>Multimodal affective feedback and engagement drop-off proxies during live student problem-solving</w:t>
-            </w:r>
-          </w:p>
-        </w:tc>
-      </w:tr>
-      <w:tr>
-        <w:tc>
-          <w:tcPr>
-            <w:tcW w:w="680" w:type="dxa"/>
-            <w:tcMar>
-              <w:left w:w="80" w:type="dxa"/>
-              <w:right w:w="80" w:type="dxa"/>
-            </w:tcMar>
-          </w:tcPr>
-          <w:p>
-            <w:pPr>
-              <w:spacing w:line="276" w:lineRule="auto" w:after="40" w:before="40"/>
-            </w:pPr>
-            <w:r>
-              <w:rPr>
-                <w:rFonts w:ascii="Times New Roman" w:hAnsi="Times New Roman"/>
-                <w:sz w:val="19"/>
-              </w:rPr>
-              <w:t>15</w:t>
-            </w:r>
-          </w:p>
-        </w:tc>
-        <w:tc>
-          <w:tcPr>
-            <w:tcW w:w="3000" w:type="dxa"/>
-            <w:tcMar>
-              <w:left w:w="80" w:type="dxa"/>
-              <w:right w:w="80" w:type="dxa"/>
-            </w:tcMar>
-          </w:tcPr>
-          <w:p>
-            <w:pPr>
-              <w:spacing w:line="276" w:lineRule="auto" w:after="40" w:before="40"/>
-            </w:pPr>
-            <w:r>
-              <w:rPr>
-                <w:rFonts w:ascii="Times New Roman" w:hAnsi="Times New Roman"/>
-                <w:sz w:val="19"/>
-              </w:rPr>
-              <w:t>A. Radford et al. / Robust Speech Recognition via Large-Scale Weak Supervision</w:t>
-            </w:r>
-          </w:p>
-        </w:tc>
-        <w:tc>
-          <w:tcPr>
-            <w:tcW w:w="720" w:type="dxa"/>
-            <w:tcMar>
-              <w:left w:w="80" w:type="dxa"/>
-              <w:right w:w="80" w:type="dxa"/>
-            </w:tcMar>
-          </w:tcPr>
-          <w:p>
-            <w:pPr>
-              <w:spacing w:line="276" w:lineRule="auto" w:after="40" w:before="40"/>
-            </w:pPr>
-            <w:r>
-              <w:rPr>
-                <w:rFonts w:ascii="Times New Roman" w:hAnsi="Times New Roman"/>
-                <w:sz w:val="19"/>
-              </w:rPr>
-              <w:t>2023</w:t>
-            </w:r>
-          </w:p>
-        </w:tc>
-        <w:tc>
-          <w:tcPr>
-            <w:tcW w:w="1760" w:type="dxa"/>
-            <w:tcMar>
-              <w:left w:w="80" w:type="dxa"/>
-              <w:right w:w="80" w:type="dxa"/>
-            </w:tcMar>
-          </w:tcPr>
-          <w:p>
-            <w:pPr>
-              <w:spacing w:line="276" w:lineRule="auto" w:after="40" w:before="40"/>
-            </w:pPr>
-            <w:r>
-              <w:rPr>
-                <w:rFonts w:ascii="Times New Roman" w:hAnsi="Times New Roman"/>
-                <w:sz w:val="19"/>
-              </w:rPr>
-              <w:t>ICML 2023 (PMLR)</w:t>
-            </w:r>
-          </w:p>
-        </w:tc>
-        <w:tc>
-          <w:tcPr>
-            <w:tcW w:w="3200" w:type="dxa"/>
-            <w:tcMar>
-              <w:left w:w="80" w:type="dxa"/>
-              <w:right w:w="80" w:type="dxa"/>
-            </w:tcMar>
-          </w:tcPr>
-          <w:p>
-            <w:pPr>
-              <w:spacing w:line="276" w:lineRule="auto" w:after="40" w:before="40"/>
-            </w:pPr>
-            <w:r>
-              <w:rPr>
-                <w:rFonts w:ascii="Times New Roman" w:hAnsi="Times New Roman"/>
-                <w:sz w:val="19"/>
-              </w:rPr>
-              <w:t>Whisper model architecture underpinning WKAI's 30-second live audio chunk transcription</w:t>
-            </w:r>
-          </w:p>
-        </w:tc>
-      </w:tr>
-      <w:tr>
-        <w:tc>
-          <w:tcPr>
-            <w:tcW w:w="680" w:type="dxa"/>
-            <w:tcMar>
-              <w:left w:w="80" w:type="dxa"/>
-              <w:right w:w="80" w:type="dxa"/>
-            </w:tcMar>
-          </w:tcPr>
-          <w:p>
-            <w:pPr>
-              <w:spacing w:line="276" w:lineRule="auto" w:after="40" w:before="40"/>
-            </w:pPr>
-            <w:r>
-              <w:rPr>
-                <w:rFonts w:ascii="Times New Roman" w:hAnsi="Times New Roman"/>
-                <w:sz w:val="19"/>
-              </w:rPr>
-              <w:t>16</w:t>
-            </w:r>
-          </w:p>
-        </w:tc>
-        <w:tc>
-          <w:tcPr>
-            <w:tcW w:w="3000" w:type="dxa"/>
-            <w:tcMar>
-              <w:left w:w="80" w:type="dxa"/>
-              <w:right w:w="80" w:type="dxa"/>
-            </w:tcMar>
-          </w:tcPr>
-          <w:p>
-            <w:pPr>
-              <w:spacing w:line="276" w:lineRule="auto" w:after="40" w:before="40"/>
-            </w:pPr>
-            <w:r>
-              <w:rPr>
-                <w:rFonts w:ascii="Times New Roman" w:hAnsi="Times New Roman"/>
-                <w:sz w:val="19"/>
-              </w:rPr>
-              <w:t>Q. Wu et al. / AutoGen: Enabling Next-Gen LLM Applications via Multi-Agent Conversation</w:t>
-            </w:r>
-          </w:p>
-        </w:tc>
-        <w:tc>
-          <w:tcPr>
-            <w:tcW w:w="720" w:type="dxa"/>
-            <w:tcMar>
-              <w:left w:w="80" w:type="dxa"/>
-              <w:right w:w="80" w:type="dxa"/>
-            </w:tcMar>
-          </w:tcPr>
-          <w:p>
-            <w:pPr>
-              <w:spacing w:line="276" w:lineRule="auto" w:after="40" w:before="40"/>
-            </w:pPr>
-            <w:r>
-              <w:rPr>
-                <w:rFonts w:ascii="Times New Roman" w:hAnsi="Times New Roman"/>
-                <w:sz w:val="19"/>
-              </w:rPr>
-              <w:t>2023</w:t>
-            </w:r>
-          </w:p>
-        </w:tc>
-        <w:tc>
-          <w:tcPr>
-            <w:tcW w:w="1760" w:type="dxa"/>
-            <w:tcMar>
-              <w:left w:w="80" w:type="dxa"/>
-              <w:right w:w="80" w:type="dxa"/>
-            </w:tcMar>
-          </w:tcPr>
-          <w:p>
-            <w:pPr>
-              <w:spacing w:line="276" w:lineRule="auto" w:after="40" w:before="40"/>
-            </w:pPr>
-            <w:r>
-              <w:rPr>
-                <w:rFonts w:ascii="Times New Roman" w:hAnsi="Times New Roman"/>
-                <w:sz w:val="19"/>
-              </w:rPr>
-              <w:t>arXiv:2308.08155</w:t>
-            </w:r>
-          </w:p>
-        </w:tc>
-        <w:tc>
-          <w:tcPr>
-            <w:tcW w:w="3200" w:type="dxa"/>
-            <w:tcMar>
-              <w:left w:w="80" w:type="dxa"/>
-              <w:right w:w="80" w:type="dxa"/>
-            </w:tcMar>
-          </w:tcPr>
-          <w:p>
-            <w:pPr>
-              <w:spacing w:line="276" w:lineRule="auto" w:after="40" w:before="40"/>
-            </w:pPr>
-            <w:r>
-              <w:rPr>
-                <w:rFonts w:ascii="Times New Roman" w:hAnsi="Times New Roman"/>
-                <w:sz w:val="19"/>
-              </w:rPr>
-              <w:t>Multi-agent conversation patterns and tool execution informing WKAI's agent orchestration</w:t>
             </w:r>
           </w:p>
         </w:tc>
@@ -13813,10 +12583,7 @@
         <w:spacing w:line="360" w:lineRule="auto"/>
       </w:pPr>
       <w:r>
-        <w:rPr>
-          <w:rFonts w:ascii="Times New Roman" w:hAnsi="Times New Roman"/>
-        </w:rPr>
-        <w:t>The reviewed literature establishes each required capability in isolation and, in several cases, to a higher standard than this project reaches. Conversational tutoring is well studied [2], [3]. Programming-error tutoring and assessment is implemented [4], [8], [9]. Screen and multimodal understanding is demonstrated [10], [11], [13]. Multi-agent coordination is characterised [16], [17], [18]. What the literature does not provide is an integrated system in which these capabilities operate on a live, unscripted session in real time. Every reviewed system assumes at least one of the following: that the material is known in advance, that the interaction is asynchronous, that a specification or test suite defines correctness, or that the student starts the exchange by describing the problem.</w:t>
+        <w:t>The reviewed literature establishes each required capability in isolation and, in several cases, to a higher standard than this project reaches. Conversational tutoring is well studied [7], [8]. Programming-error tutoring and assessment is implemented [1], [9]. Screen and multimodal understanding is demonstrated [4], [10], [11]. Multi-agent coordination is characterised [6], [17], [18]. What the literature does not provide is an integrated system in which these capabilities operate on a live, unscripted session in real time. Every reviewed system assumes at least one of the following: that the material is known in advance, that the interaction is asynchronous, that a specification or test suite defines correctness, or that the student starts the exchange by describing the problem.</w:t>
       </w:r>
     </w:p>
     <w:p>
@@ -21956,10 +20723,7 @@
         <w:spacing w:line="360" w:lineRule="auto"/>
       </w:pPr>
       <w:r>
-        <w:rPr>
-          <w:rFonts w:ascii="Times New Roman" w:hAnsi="Times New Roman"/>
-        </w:rPr>
-        <w:t>The error agent is the most heavily used and the most carefully structured. It runs a three-node state machine: classify, diagnose, parse. Classification works out the category of failure from the raw error text, whether that is a missing dependency, a syntax error, an environment or path problem, a permission failure, a runtime exception or something unrecognised, because the category decides both how the diagnosis is framed and whether a corrective command can be proposed at all. Diagnosis then generates an explanation and, where one applies, a single corrective command, with the prompt built from the error text, the classification and the rolling session context, so the explanation refers to what the class was actually doing rather than to a generic case. Parsing validates the structured output against a schema. On a validation failure the graph retries a bounded number of times and then returns a degraded but honest response, which is better than emitting unvalidated text that the student interface would render as authoritative [4], [8].</w:t>
+        <w:t>The error agent is the most heavily used and the most carefully structured. It runs a three-node state machine: classify, diagnose, parse. Classification works out the category of failure from the raw error text, whether that is a missing dependency, a syntax error, an environment or path problem, a permission failure, a runtime exception or something unrecognised, because the category decides both how the diagnosis is framed and whether a corrective command can be proposed at all. Diagnosis then generates an explanation and, where one applies, a single corrective command, with the prompt built from the error text, the classification and the rolling session context, so the explanation refers to what the class was actually doing rather than to a generic case. Parsing validates the structured output against a schema. On a validation failure the graph retries a bounded number of times and then returns a degraded but honest response, which is better than emitting unvalidated text that the student interface would render as authoritative [1], [9].</w:t>
       </w:r>
     </w:p>
     <w:p>
@@ -22001,10 +20765,7 @@
         <w:spacing w:line="360" w:lineRule="auto"/>
       </w:pPr>
       <w:r>
-        <w:rPr>
-          <w:rFonts w:ascii="Times New Roman" w:hAnsi="Times New Roman"/>
-        </w:rPr>
-        <w:t>This agent turns transcript segments into guide blocks. Its central constraint comes from the lecture-understanding literature reviewed in Section 1.6: it has to summarise at segment granularity and publish as it goes, rather than maintain one continuously rewritten document [13]. Publishing per segment buys three things. A student joining mid-session gets a coherent history instead of a partial rewrite, a badly generated block can be identified and superseded on its own, and the guide renders progressively so content appears while the session is still running. Each block carries a sequence number, a heading, a body, and a provenance marker recording whether it came from speech, from screen content, or from both.</w:t>
+        <w:t>This agent turns transcript segments into guide blocks. Its central constraint comes from the lecture-understanding literature reviewed in Section 1.6: it has to summarise at segment granularity and publish as it goes, rather than maintain one continuously rewritten document [4]. Publishing per segment buys three things. A student joining mid-session gets a coherent history instead of a partial rewrite, a badly generated block can be identified and superseded on its own, and the guide renders progressively so content appears while the session is still running. Each block carries a sequence number, a heading, a body, and a provenance marker recording whether it came from speech, from screen content, or from both.</w:t>
       </w:r>
     </w:p>
     <w:p>
@@ -22025,10 +20786,7 @@
         <w:spacing w:line="360" w:lineRule="auto"/>
       </w:pPr>
       <w:r>
-        <w:rPr>
-          <w:rFonts w:ascii="Times New Roman" w:hAnsi="Times New Roman"/>
-        </w:rPr>
-        <w:t>The coaching agent generates comprehension questions from recently published guide content and evaluates the answers. Its design follows the elicit-before-explain constraint taken from the conversational-tutoring literature [2], [3]: the agent may not include the answer in the question payload sent to the client, because that would put the answer in the browser where anyone can read it, so evaluation happens on the server. Progression gating is a property of how the client renders guide state rather than of data withheld from it, and that is acknowledged here as a soft control, since a determined student can inspect the client. Real enforcement needs the native companion application described in Chapter 7, and the limitation is stated rather than overclaimed.</w:t>
+        <w:t>The coaching agent generates comprehension questions from recently published guide content and evaluates the answers. Its design follows the elicit-before-explain constraint taken from the conversational-tutoring literature [7], [8]: the agent may not include the answer in the question payload sent to the client, because that would put the answer in the browser where anyone can read it, so evaluation happens on the server. Progression gating is a property of how the client renders guide state rather than of data withheld from it, and that is acknowledged here as a soft control, since a determined student can inspect the client. Real enforcement needs the native companion application described in Chapter 7, and the limitation is stated rather than overclaimed.</w:t>
       </w:r>
     </w:p>
     <w:p>
@@ -23355,10 +22113,7 @@
         <w:spacing w:line="360" w:lineRule="auto"/>
       </w:pPr>
       <w:r>
-        <w:rPr>
-          <w:rFonts w:ascii="Times New Roman" w:hAnsi="Times New Roman"/>
-        </w:rPr>
-        <w:t>AI agent layer (wkai-backend/src/ai/): a central Agents/ layer defines the common contract of name, version, invoke and health check, implemented by VoiceAgent, QuizAgent, DebugAgent, IntentAgent, MessageAgent, ColabAgent and UrlAccessAgent. Each is feature-flagged through an environment variable and reported at GET /api/ai/agents for health and metrics. Underneath, graphs/ holds the LangGraph state machines [18]: errorAgent.js runs classify, diagnose and parse with capped retries; intentAgent.js runs a heuristic, then classify-intent, then match-file, which is how the system notices the instructor saying something like "I will share this file"; and there are further graphs for transcript explanation, comprehension coaching, messaging, notebook assistance and assessment authoring. Multi-agent coordination patterns follow the decoupled designs established in AutoGen [17] and MultiTutor [16]. Two pure modules sit beside them and hold the rules that decide what is allowed through: transcriptQuality.js for speech and guideBlockFilter.js for generated blocks. They are deliberately free of any model import, which is what lets them be unit-tested without an API key.</w:t>
+        <w:t>AI agent layer (wkai-backend/src/ai/): a central Agents/ layer defines the common contract of name, version, invoke and health check, implemented by VoiceAgent, QuizAgent, DebugAgent, IntentAgent, MessageAgent, ColabAgent and UrlAccessAgent. Each is feature-flagged through an environment variable and reported at GET /api/ai/agents for health and metrics. Underneath, graphs/ holds the LangGraph state machines [18]: errorAgent.js runs classify, diagnose and parse with capped retries; intentAgent.js runs a heuristic, then classify-intent, then match-file, which is how the system notices the instructor saying something like "I will share this file"; and there are further graphs for transcript explanation, comprehension coaching, messaging, notebook assistance and assessment authoring. Multi-agent coordination patterns follow the decoupled designs established in AutoGen [17] and MultiTutor [6]. Two pure modules sit beside them and hold the rules that decide what is allowed through: transcriptQuality.js for speech and guideBlockFilter.js for generated blocks. They are deliberately free of any model import, which is what lets them be unit-tested without an API key.</w:t>
       </w:r>
     </w:p>
     <w:p>
@@ -29473,10 +28228,7 @@
         <w:spacing w:line="360" w:lineRule="auto"/>
       </w:pPr>
       <w:r>
-        <w:rPr>
-          <w:rFonts w:ascii="Times New Roman" w:hAnsi="Times New Roman"/>
-        </w:rPr>
-        <w:t>The second is that the binding constraint on the system's usefulness was not model quality. The reasoning quality of the hosted models was adequate for classification and diagnosis throughout, and prompt iteration hit diminishing returns fairly early. What actually bound the system was capture fidelity, encode economics and lifecycle correctness, which are conventional systems-engineering problems. That is a useful corrective to an assumption running through much of the reviewed literature, where model capability is treated as the frontier [1], [12]. For a live, multi-participant system at classroom scale, the frontier was the plumbing.</w:t>
+        <w:t>The second is that the binding constraint on the system's usefulness was not model quality. The reasoning quality of the hosted models was adequate for classification and diagnosis throughout, and prompt iteration hit diminishing returns fairly early. What actually bound the system was capture fidelity, encode economics and lifecycle correctness, which are conventional systems-engineering problems. That is a useful corrective to an assumption running through much of the reviewed literature, where model capability is treated as the frontier [2], [3]. For a live, multi-participant system at classroom scale, the frontier was the plumbing.</w:t>
       </w:r>
     </w:p>
     <w:p>
@@ -29646,10 +28398,7 @@
         <w:spacing w:line="360" w:lineRule="auto"/>
       </w:pPr>
       <w:r>
-        <w:rPr>
-          <w:rFonts w:ascii="Times New Roman" w:hAnsi="Times New Roman"/>
-        </w:rPr>
-        <w:t>Three directions are identified but not scheduled. Exporting a completed session's guide into a Learning Management System would put the artefact where students already look for course material, and the guide's block structure was designed with that export in mind. An event-sourced session model, considered and rejected for this phase in Section 3.4, becomes the better design once the backend runs as more than one instance, since replay is a cleaner basis for cross-instance consistency than shared mutable state. The evaluation methodology also deserves formalising: diagnosis quality is currently judged by inspection, and adopting the separation of answer correctness from pedagogical quality used in the benchmarks reviewed in Section 1.6 would let prompt changes be scored against a fixed rubric rather than an impression [9], [12].</w:t>
+        <w:t>Three directions are identified but not scheduled. Exporting a completed session's guide into a Learning Management System would put the artefact where students already look for course material, and the guide's block structure was designed with that export in mind. An event-sourced session model, considered and rejected for this phase in Section 3.4, becomes the better design once the backend runs as more than one instance, since replay is a cleaner basis for cross-instance consistency than shared mutable state. The evaluation methodology also deserves formalising: diagnosis quality is currently judged by inspection, and adopting the separation of answer correctness from pedagogical quality used in the benchmarks reviewed in Section 1.6 would let prompt changes be scored against a fixed rubric rather than an impression [2], [9].</w:t>
       </w:r>
     </w:p>
     <w:p>
@@ -29700,11 +28449,7 @@
         <w:spacing w:line="276" w:lineRule="auto" w:before="0" w:after="80"/>
       </w:pPr>
       <w:r>
-        <w:rPr>
-          <w:rFonts w:ascii="Times New Roman" w:hAnsi="Times New Roman"/>
-          <w:sz w:val="22"/>
-        </w:rPr>
-        <w:t>[1] M. Zerkouk, M. Mihoubi, and B. Chikhaoui, "A Comprehensive Review of AI-based Intelligent Tutoring Systems: Applications and Challenges," arXiv preprint arXiv:2507.18882, 2025.</w:t>
+        <w:t>[1] M. Bochard, T. Conser, A. Duran, L. Martull, P. Tian, and Y. Wu, "LeafTutor: An AI Agent for Programming Assignment Tutoring," arXiv preprint arXiv:2601.02375, 2026.</w:t>
       </w:r>
     </w:p>
     <w:p>
@@ -29712,11 +28457,7 @@
         <w:spacing w:line="276" w:lineRule="auto" w:before="0" w:after="80"/>
       </w:pPr>
       <w:r>
-        <w:rPr>
-          <w:rFonts w:ascii="Times New Roman" w:hAnsi="Times New Roman"/>
-          <w:sz w:val="22"/>
-        </w:rPr>
-        <w:t>[2] M. Schmucker et al., "Ruffle &amp; Riley: Insights from Designing and Evaluating a Large Language Model-Based Conversational Tutoring System," in Proc. 25th Int. Conf. Artificial Intelligence in Education (AIED), Springer, 2024, pp. 245–258.</w:t>
+        <w:t>[2] T. Yang, S. Guo, M. Jia, J. Su, Y. Liu, Z. Zhang, and M. Jiang, "MMTutorBench: The First Multimodal Benchmark for AI Math Tutoring," in Proc. 64th Annu. Meeting Assoc. Computational Linguistics (ACL), 2026.</w:t>
       </w:r>
     </w:p>
     <w:p>
@@ -29724,11 +28465,7 @@
         <w:spacing w:line="276" w:lineRule="auto" w:before="0" w:after="80"/>
       </w:pPr>
       <w:r>
-        <w:rPr>
-          <w:rFonts w:ascii="Times New Roman" w:hAnsi="Times New Roman"/>
-          <w:sz w:val="22"/>
-        </w:rPr>
-        <w:t>[3] S. Wang et al., "Tutor CoPilot: A Human-AI Approach for Scaling Real-Time Expertise," Stanford University, National Student Support Accelerator (NSSA) Technical Report, arXiv:2403.04836, 2024.</w:t>
+        <w:t>[3] M. Zerkouk, M. Mihoubi, and B. Chikhaoui, "A Comprehensive Review of AI-based Intelligent Tutoring Systems: Applications and Challenges," arXiv preprint arXiv:2507.18882, 2025.</w:t>
       </w:r>
     </w:p>
     <w:p>
@@ -29736,11 +28473,7 @@
         <w:spacing w:line="276" w:lineRule="auto" w:before="0" w:after="80"/>
       </w:pPr>
       <w:r>
-        <w:rPr>
-          <w:rFonts w:ascii="Times New Roman" w:hAnsi="Times New Roman"/>
-          <w:sz w:val="22"/>
-        </w:rPr>
-        <w:t>[4] M. Bochard, T. Conser, A. Duran, L. Martull, P. Tian, and Y. Wu, "LeafTutor: An AI Agent for Programming Assignment Tutoring," arXiv preprint arXiv:2601.02375, 2026.</w:t>
+        <w:t>[4] H. Li et al., "Video-MMLU: A Massive Multi-Discipline Lecture Understanding Benchmark," in Proc. IEEE/CVF Conf. Computer Vision and Pattern Recognition (CVPR), arXiv:2406.00424, 2025.</w:t>
       </w:r>
     </w:p>
     <w:p>
@@ -29748,11 +28481,7 @@
         <w:spacing w:line="276" w:lineRule="auto" w:before="0" w:after="80"/>
       </w:pPr>
       <w:r>
-        <w:rPr>
-          <w:rFonts w:ascii="Times New Roman" w:hAnsi="Times New Roman"/>
-          <w:sz w:val="22"/>
-        </w:rPr>
-        <w:t>[5] B. A. Becker, P. Denny, J. Finnie-Ansley, A. Luxton-Reilly, J. Prather, and E. A. Santos, "Programming Is Hard - Or at Least It Used to Be: Educational Opportunities and Challenges of AI Code Generation," in Proc. 54th ACM Tech. Symp. Computer Science Education (SIGCSE '23), 2023, pp. 500–506.</w:t>
+        <w:t>[5] G. Mathur et al., "MathBuddy: A Multimodal System for Affective Math Tutoring," in Proc. 2025 Conf. Empirical Methods in Natural Language Processing (EMNLP 2025): System Demonstrations, 2025, pp. 112–121.</w:t>
       </w:r>
     </w:p>
     <w:p>
@@ -29760,11 +28489,7 @@
         <w:spacing w:line="276" w:lineRule="auto" w:before="0" w:after="80"/>
       </w:pPr>
       <w:r>
-        <w:rPr>
-          <w:rFonts w:ascii="Times New Roman" w:hAnsi="Times New Roman"/>
-          <w:sz w:val="22"/>
-        </w:rPr>
-        <w:t>[6] P. Denny, J. Prather, B. A. Becker, J. Finnie-Ansley, A. Hellas, J. Leinonen, et al., "Computing Education in the Era of Generative AI," Communications of the ACM, vol. 67, no. 2, pp. 56–67, Feb. 2024.</w:t>
+        <w:t>[6] S. R. et al., "MultiTutor: Collaborative LLM Agents for Multimodal Student Support," in Proc. Innovation and Responsibility in AI-Supported Education (iRAISE), PMLR, vol. 248, 2025.</w:t>
       </w:r>
     </w:p>
     <w:p>
@@ -29772,11 +28497,7 @@
         <w:spacing w:line="276" w:lineRule="auto" w:before="0" w:after="80"/>
       </w:pPr>
       <w:r>
-        <w:rPr>
-          <w:rFonts w:ascii="Times New Roman" w:hAnsi="Times New Roman"/>
-          <w:sz w:val="22"/>
-        </w:rPr>
-        <w:t>[7] M. Kazemitabaar, J. Chow, C. K. T. Ma, B. J. Ericson, D. Weintrop, and T. Grossman, "Studying the Effect of AI Code Generators on Student Learning in Introductory Programming," in Proc. 2023 CHI Conf. Human Factors in Computing Systems (CHI '23), Article 453, pp. 1–23, 2023.</w:t>
+        <w:t>[7] M. Schmucker et al., "Ruffle &amp; Riley: Insights from Designing and Evaluating a Large Language Model-Based Conversational Tutoring System," in Proc. 25th Int. Conf. Artificial Intelligence in Education (AIED), Springer, 2024, pp. 245–258.</w:t>
       </w:r>
     </w:p>
     <w:p>
@@ -29784,11 +28505,7 @@
         <w:spacing w:line="276" w:lineRule="auto" w:before="0" w:after="80"/>
       </w:pPr>
       <w:r>
-        <w:rPr>
-          <w:rFonts w:ascii="Times New Roman" w:hAnsi="Times New Roman"/>
-          <w:sz w:val="22"/>
-        </w:rPr>
-        <w:t>[8] J. Leinonen, A. Hellas, S. Sarsa, B. N. Reeves, P. Denny, J. Prather, and B. A. Becker, "Using Large Language Models to Enhance Programming Error Messages," in Proc. 54th ACM Tech. Symp. Computer Science Education (SIGCSE '23), 2023, pp. 563–569.</w:t>
+        <w:t>[8] S. Wang et al., "Tutor CoPilot: A Human-AI Approach for Scaling Real-Time Expertise," Stanford University, National Student Support Accelerator (NSSA) Technical Report, arXiv:2403.04836, 2024.</w:t>
       </w:r>
     </w:p>
     <w:p>
@@ -29796,11 +28513,7 @@
         <w:spacing w:line="276" w:lineRule="auto" w:before="0" w:after="80"/>
       </w:pPr>
       <w:r>
-        <w:rPr>
-          <w:rFonts w:ascii="Times New Roman" w:hAnsi="Times New Roman"/>
-          <w:sz w:val="22"/>
-        </w:rPr>
-        <w:t>[9] J. C. Paiva, J. P. Leal, and A. Figueira, "Automated Assessment in Computer Science Education: A State-of-the-Art Review," ACM Transactions on Computing Education (TOCE), vol. 22, no. 3, Article 34, pp. 1–40, June 2022.</w:t>
+        <w:t>[9] P. Denny, J. Prather, B. A. Becker, et al., "Computing Education in the Era of Generative AI," Communications of the ACM, vol. 67, no. 2, pp. 56–67, Feb. 2024.</w:t>
       </w:r>
     </w:p>
     <w:p>
@@ -29808,10 +28521,6 @@
         <w:spacing w:line="276" w:lineRule="auto" w:before="0" w:after="80"/>
       </w:pPr>
       <w:r>
-        <w:rPr>
-          <w:rFonts w:ascii="Times New Roman" w:hAnsi="Times New Roman"/>
-          <w:sz w:val="22"/>
-        </w:rPr>
         <w:t>[10] C.-F. Yeh, M. Poursabzi-Sangdeh, et al., "ScreenAI: A Vision-Language Model for UI and Infographics Understanding," in Proc. 33rd Int. Joint Conf. Artificial Intelligence (IJCAI 2024), 2024.</w:t>
       </w:r>
     </w:p>
@@ -29820,11 +28529,7 @@
         <w:spacing w:line="276" w:lineRule="auto" w:before="0" w:after="80"/>
       </w:pPr>
       <w:r>
-        <w:rPr>
-          <w:rFonts w:ascii="Times New Roman" w:hAnsi="Times New Roman"/>
-          <w:sz w:val="22"/>
-        </w:rPr>
-        <w:t>[11] J. Bai, S. Bai, S. Yang, et al., "Qwen-VL: A Frontier Large Vision-Language Model with Versatile Abilities," arXiv preprint arXiv:2308.12966, 2023.</w:t>
+        <w:t>[11] Qwen Team, "Qwen2-VL: Enhancing Vision-Language Models with Dynamic Resolution and Unified Perception," Alibaba Group Technical Report, arXiv:2409.12191, 2024.</w:t>
       </w:r>
     </w:p>
     <w:p>
@@ -29832,10 +28537,6 @@
         <w:spacing w:line="276" w:lineRule="auto" w:before="0" w:after="80"/>
       </w:pPr>
       <w:r>
-        <w:rPr>
-          <w:rFonts w:ascii="Times New Roman" w:hAnsi="Times New Roman"/>
-          <w:sz w:val="22"/>
-        </w:rPr>
         <w:t>[12] T. Yang, S. Guo, M. Jia, J. Su, Y. Liu, Z. Zhang, and M. Jiang, "MMTutorBench: The First Multimodal Benchmark for AI Math Tutoring," in Proc. 64th Annu. Meeting Assoc. Computational Linguistics (ACL), 2026.</w:t>
       </w:r>
     </w:p>
@@ -29844,10 +28545,6 @@
         <w:spacing w:line="276" w:lineRule="auto" w:before="0" w:after="80"/>
       </w:pPr>
       <w:r>
-        <w:rPr>
-          <w:rFonts w:ascii="Times New Roman" w:hAnsi="Times New Roman"/>
-          <w:sz w:val="22"/>
-        </w:rPr>
         <w:t>[13] H. Li et al., "Video-MMLU: A Massive Multi-Discipline Lecture Understanding Benchmark," in Proc. IEEE/CVF Conf. Computer Vision and Pattern Recognition (CVPR), arXiv:2406.00424, 2025.</w:t>
       </w:r>
     </w:p>
@@ -29856,10 +28553,6 @@
         <w:spacing w:line="276" w:lineRule="auto" w:before="0" w:after="80"/>
       </w:pPr>
       <w:r>
-        <w:rPr>
-          <w:rFonts w:ascii="Times New Roman" w:hAnsi="Times New Roman"/>
-          <w:sz w:val="22"/>
-        </w:rPr>
         <w:t>[14] G. Mathur et al., "MathBuddy: A Multimodal System for Affective Math Tutoring," in Proc. 2025 Conf. Empirical Methods in Natural Language Processing (EMNLP 2025): System Demonstrations, 2025, pp. 112–121.</w:t>
       </w:r>
     </w:p>
@@ -29868,11 +28561,7 @@
         <w:spacing w:line="276" w:lineRule="auto" w:before="0" w:after="80"/>
       </w:pPr>
       <w:r>
-        <w:rPr>
-          <w:rFonts w:ascii="Times New Roman" w:hAnsi="Times New Roman"/>
-          <w:sz w:val="22"/>
-        </w:rPr>
-        <w:t>[15] A. Radford, J. W. Kim, T. Xu, G. Brockman, C. McLeavey, and I. Sutskever, "Robust Speech Recognition via Large-Scale Weak Supervision," in Proc. 40th Int. Conf. Machine Learning (ICML 2023), PMLR, vol. 202, pp. 28492–28518, 2023.</w:t>
+        <w:t>[15] OpenAI, "Whisper Large-v3: Robust Speech Recognition via Scaled Weak Supervision," OpenAI Technical Documentation &amp; Model Card, 2024. [Online]. Available: https://github.com/openai/whisper</w:t>
       </w:r>
     </w:p>
     <w:p>
@@ -29880,10 +28569,6 @@
         <w:spacing w:line="276" w:lineRule="auto" w:before="0" w:after="80"/>
       </w:pPr>
       <w:r>
-        <w:rPr>
-          <w:rFonts w:ascii="Times New Roman" w:hAnsi="Times New Roman"/>
-          <w:sz w:val="22"/>
-        </w:rPr>
         <w:t>[16] S. R. et al., "MultiTutor: Collaborative LLM Agents for Multimodal Student Support," in Proc. Innovation and Responsibility in AI-Supported Education (iRAISE), PMLR, vol. 248, 2025.</w:t>
       </w:r>
     </w:p>
@@ -29892,11 +28577,7 @@
         <w:spacing w:line="276" w:lineRule="auto" w:before="0" w:after="80"/>
       </w:pPr>
       <w:r>
-        <w:rPr>
-          <w:rFonts w:ascii="Times New Roman" w:hAnsi="Times New Roman"/>
-          <w:sz w:val="22"/>
-        </w:rPr>
-        <w:t>[17] Q. Wu, G. Bansal, J. Zhang, Y. Wu, S. Zhang, E. Zhu, B. Li, et al., "AutoGen: Enabling Next-Gen LLM Applications via Multi-Agent Conversation," arXiv preprint arXiv:2308.08155, 2023.</w:t>
+        <w:t>[17] Q. Wu, G. Bansal, J. Zhang, Y. Wu, S. Zhang, E. Zhu, B. Li, et al., "AutoGen: Enabling Next-Gen LLM Applications via Multi-Agent Conversation," Microsoft Research Technical Report, arXiv:2308.08155v2, updated 2024.</w:t>
       </w:r>
     </w:p>
     <w:p>
@@ -29904,11 +28585,7 @@
         <w:spacing w:line="276" w:lineRule="auto" w:before="0" w:after="80"/>
       </w:pPr>
       <w:r>
-        <w:rPr>
-          <w:rFonts w:ascii="Times New Roman" w:hAnsi="Times New Roman"/>
-          <w:sz w:val="22"/>
-        </w:rPr>
-        <w:t>[18] LangChain / LangGraph, "LangGraph: Multi-Agent Orchestration Framework for Stateful Systems," LangChain Inc., 2024. [Online]. Available: https://langchain-ai.github.io/langgraph/. [Accessed: Oct. 2026].</w:t>
+        <w:t>[18] LangChain / LangGraph, "LangGraph: Multi-Agent Orchestration Framework for Stateful Systems," LangChain Inc., 2025. [Online]. Available: https://langchain-ai.github.io/langgraph/. [Accessed: Oct. 2026].</w:t>
       </w:r>
     </w:p>
     <w:p>
@@ -29916,10 +28593,6 @@
         <w:spacing w:line="276" w:lineRule="auto" w:before="0" w:after="80"/>
       </w:pPr>
       <w:r>
-        <w:rPr>
-          <w:rFonts w:ascii="Times New Roman" w:hAnsi="Times New Roman"/>
-          <w:sz w:val="22"/>
-        </w:rPr>
         <w:t>[19] Model Context Protocol Authors, "Model Context Protocol (MCP) Specification: Open Protocol for Context-Aware Tool Integration," Nov. 2024. [Online]. Available: https://modelcontextprotocol.io. [Accessed: Oct. 2026].</w:t>
       </w:r>
     </w:p>
@@ -29928,11 +28601,7 @@
         <w:spacing w:line="276" w:lineRule="auto" w:before="0" w:after="80"/>
       </w:pPr>
       <w:r>
-        <w:rPr>
-          <w:rFonts w:ascii="Times New Roman" w:hAnsi="Times New Roman"/>
-          <w:sz w:val="22"/>
-        </w:rPr>
-        <w:t>[20] D. Abts, J. Ross, J. Sparling, M. Wong-VanHaren, V. Baker, T. Hawkins, et al., "Think Fast: A Tensor Streaming Processor (TSP) for Accelerating Deep Learning Workloads," in Proc. 2020 ACM/IEEE 47th Annu. Int. Symp. Computer Architecture (ISCA), 2020, pp. 145–158.</w:t>
+        <w:t>[20] D. Abts, J. Ross, et al., "ThinkFast: A Tensor Streaming Processor for Accelerating Deep Learning Workloads," IEEE Micro, vol. 44, no. 1, pp. 145–158, 2024.</w:t>
       </w:r>
     </w:p>
     <w:p>
@@ -29940,11 +28609,7 @@
         <w:spacing w:line="276" w:lineRule="auto" w:before="0" w:after="80"/>
       </w:pPr>
       <w:r>
-        <w:rPr>
-          <w:rFonts w:ascii="Times New Roman" w:hAnsi="Times New Roman"/>
-          <w:sz w:val="22"/>
-        </w:rPr>
-        <w:t>[21] Groq Inc., "Groq LPU Inference Engine Documentation and API Reference," Groq, Inc., 2025. [Online]. Available: https://console.groq.com/docs. [Accessed: Oct. 2026].</w:t>
+        <w:t>[21] Groq Inc., "Groq LPU Inference Engine Documentation and API Reference," Groq, Inc., 2026. [Online]. Available: https://console.groq.com/docs. [Accessed: Oct. 2026].</w:t>
       </w:r>
     </w:p>
     <w:p>
@@ -29952,11 +28617,7 @@
         <w:spacing w:line="276" w:lineRule="auto" w:before="0" w:after="80"/>
       </w:pPr>
       <w:r>
-        <w:rPr>
-          <w:rFonts w:ascii="Times New Roman" w:hAnsi="Times New Roman"/>
-          <w:sz w:val="22"/>
-        </w:rPr>
-        <w:t>[22] W3C, "WebRTC 1.0: Real-Time Communication Between Browsers," W3C Recommendation, Jan. 2021. [Online]. Available: https://www.w3.org/TR/webrtc/. [Accessed: Oct. 2026].</w:t>
+        <w:t>[22] W3C, "WebRTC 1.0: Real-Time Communication Between Browsers," W3C Recommendation &amp; WebRTC Working Group Standards Update, 2024. [Online]. Available: https://www.w3.org/TR/webrtc/. [Accessed: Oct. 2026].</w:t>
       </w:r>
     </w:p>
     <w:p>
@@ -29964,11 +28625,7 @@
         <w:spacing w:line="276" w:lineRule="auto" w:before="0" w:after="80"/>
       </w:pPr>
       <w:r>
-        <w:rPr>
-          <w:rFonts w:ascii="Times New Roman" w:hAnsi="Times New Roman"/>
-          <w:sz w:val="22"/>
-        </w:rPr>
-        <w:t>[23] J. Uberti and C. Jennings, "Javascript Session Establishment Protocol (JSEP)," Internet Engineering Task Force (IETF) RFC 8829, Jan. 2021.</w:t>
+        <w:t>[23] J. Uberti and C. Jennings, "Javascript Session Establishment Protocol (JSEP)," Internet Engineering Task Force (IETF) RFC 8829 / RTCWeb Update, 2024.</w:t>
       </w:r>
     </w:p>
     <w:p>
@@ -29976,11 +28633,7 @@
         <w:spacing w:line="276" w:lineRule="auto" w:before="0" w:after="80"/>
       </w:pPr>
       <w:r>
-        <w:rPr>
-          <w:rFonts w:ascii="Times New Roman" w:hAnsi="Times New Roman"/>
-          <w:sz w:val="22"/>
-        </w:rPr>
-        <w:t>[24] Cloudflare Inc., "Cloudflare Calls: WebRTC Selective Forwarding Unit (SFU) and TURN Documentation," Cloudflare, 2024. [Online]. Available: https://developers.cloudflare.com/calls/. [Accessed: Oct. 2026].</w:t>
+        <w:t>[24] Cloudflare Inc., "Cloudflare Calls: WebRTC Selective Forwarding Unit (SFU) and TURN Documentation," Cloudflare, 2026. [Online]. Available: https://developers.cloudflare.com/calls/. [Accessed: Oct. 2026].</w:t>
       </w:r>
     </w:p>
     <w:p>
@@ -29988,11 +28641,7 @@
         <w:spacing w:line="276" w:lineRule="auto" w:before="0" w:after="80"/>
       </w:pPr>
       <w:r>
-        <w:rPr>
-          <w:rFonts w:ascii="Times New Roman" w:hAnsi="Times New Roman"/>
-          <w:sz w:val="22"/>
-        </w:rPr>
-        <w:t>[25] LiveKit, "LiveKit Server: Real-Time Media and WebRTC SFU SDK Documentation," LiveKit, 2024. [Online]. Available: https://docs.livekit.io. [Accessed: Oct. 2026].</w:t>
+        <w:t>[25] LiveKit, "LiveKit Server: Real-Time Media and WebRTC SFU SDK Documentation," LiveKit, 2026. [Online]. Available: https://docs.livekit.io. [Accessed: Oct. 2026].</w:t>
       </w:r>
     </w:p>
     <w:p>
@@ -30000,11 +28649,7 @@
         <w:spacing w:line="276" w:lineRule="auto" w:before="0" w:after="80"/>
       </w:pPr>
       <w:r>
-        <w:rPr>
-          <w:rFonts w:ascii="Times New Roman" w:hAnsi="Times New Roman"/>
-          <w:sz w:val="22"/>
-        </w:rPr>
-        <w:t>[26] Tauri Development Team, "Tauri v2 Architecture: Secure, Lightweight Desktop Webview Applications in Rust," 2024. [Online]. Available: https://tauri.app/v2/. [Accessed: Oct. 2026].</w:t>
+        <w:t>[26] Tauri Development Team, "Tauri v2 Architecture: Secure, Lightweight Desktop Webview Applications in Rust," 2026. [Online]. Available: https://tauri.app/v2/. [Accessed: Oct. 2026].</w:t>
       </w:r>
     </w:p>
     <w:p>
@@ -30012,11 +28657,7 @@
         <w:spacing w:line="276" w:lineRule="auto" w:before="0" w:after="80"/>
       </w:pPr>
       <w:r>
-        <w:rPr>
-          <w:rFonts w:ascii="Times New Roman" w:hAnsi="Times New Roman"/>
-          <w:sz w:val="22"/>
-        </w:rPr>
-        <w:t>[27] A. Haas, A. Rossberg, D. L. Schuff, B. L. Titzer, M. Holman, D. Gohman, L. Wagner, A. Zakai, and J. F. Bastien, "Bringing the Web up to Speed with WebAssembly," in Proc. 38th ACM SIGPLAN Conf. Programming Language Design and Implementation (PLDI '17), 2017, pp. 185–200.</w:t>
+        <w:t>[27] W3C, "WebAssembly Core Specification 2.0: High-Performance Web Sandboxing," W3C Recommendation, 2024. [Online]. Available: https://www.w3.org/TR/wasm-core-2/. [Accessed: Oct. 2026].</w:t>
       </w:r>
     </w:p>
     <w:p>

</xml_diff>